<commit_message>
Fix FMX workflow navigation clicks
</commit_message>
<xml_diff>
--- a/docs/guides/Delphi App Translation Studio Engineering Guide.docx
+++ b/docs/guides/Delphi App Translation Studio Engineering Guide.docx
@@ -28,7 +28,7 @@
           <w:noProof/>
         </w:rPr>
         <w:drawing>
-          <wp:inline distT="0" distB="0" distL="0" distR="0" wp14:anchorId="38989837" wp14:editId="511443C1">
+          <wp:inline distT="0" distB="0" distL="0" distR="0" wp14:anchorId="266196F5" wp14:editId="08E8EA48">
             <wp:extent cx="1371600" cy="1371600"/>
             <wp:effectExtent l="0" t="0" r="0" b="0"/>
             <wp:docPr id="1" name="Picture 1"/>
@@ -181,7 +181,7 @@
       <w:pPr>
         <w:pStyle w:val="Heading1"/>
       </w:pPr>
-      <w:bookmarkStart w:id="0" w:name="_Toc236945434"/>
+      <w:bookmarkStart w:id="0" w:name="_Toc236948145"/>
       <w:r>
         <w:lastRenderedPageBreak/>
         <w:t>Table of Contents</w:t>
@@ -207,7 +207,7 @@
       <w:r>
         <w:fldChar w:fldCharType="separate"/>
       </w:r>
-      <w:hyperlink w:anchor="_Toc236945434" w:history="1">
+      <w:hyperlink w:anchor="_Toc236948145" w:history="1">
         <w:r>
           <w:rPr>
             <w:rStyle w:val="Hyperlink"/>
@@ -234,7 +234,7 @@
             <w:noProof/>
             <w:webHidden/>
           </w:rPr>
-          <w:instrText xml:space="preserve"> PAGEREF _Toc236945434 \h </w:instrText>
+          <w:instrText xml:space="preserve"> PAGEREF _Toc236948145 \h </w:instrText>
         </w:r>
         <w:r>
           <w:rPr>
@@ -275,7 +275,7 @@
           <w:noProof/>
         </w:rPr>
       </w:pPr>
-      <w:hyperlink w:anchor="_Toc236945435" w:history="1">
+      <w:hyperlink w:anchor="_Toc236948146" w:history="1">
         <w:r>
           <w:rPr>
             <w:rStyle w:val="Hyperlink"/>
@@ -302,7 +302,7 @@
             <w:noProof/>
             <w:webHidden/>
           </w:rPr>
-          <w:instrText xml:space="preserve"> PAGEREF _Toc236945435 \h </w:instrText>
+          <w:instrText xml:space="preserve"> PAGEREF _Toc236948146 \h </w:instrText>
         </w:r>
         <w:r>
           <w:rPr>
@@ -343,7 +343,7 @@
           <w:noProof/>
         </w:rPr>
       </w:pPr>
-      <w:hyperlink w:anchor="_Toc236945436" w:history="1">
+      <w:hyperlink w:anchor="_Toc236948147" w:history="1">
         <w:r>
           <w:rPr>
             <w:rStyle w:val="Hyperlink"/>
@@ -370,7 +370,7 @@
             <w:noProof/>
             <w:webHidden/>
           </w:rPr>
-          <w:instrText xml:space="preserve"> PAGEREF _Toc236945436 \h </w:instrText>
+          <w:instrText xml:space="preserve"> PAGEREF _Toc236948147 \h </w:instrText>
         </w:r>
         <w:r>
           <w:rPr>
@@ -411,7 +411,7 @@
           <w:noProof/>
         </w:rPr>
       </w:pPr>
-      <w:hyperlink w:anchor="_Toc236945437" w:history="1">
+      <w:hyperlink w:anchor="_Toc236948148" w:history="1">
         <w:r>
           <w:rPr>
             <w:rStyle w:val="Hyperlink"/>
@@ -438,7 +438,7 @@
             <w:noProof/>
             <w:webHidden/>
           </w:rPr>
-          <w:instrText xml:space="preserve"> PAGEREF _Toc236945437 \h </w:instrText>
+          <w:instrText xml:space="preserve"> PAGEREF _Toc236948148 \h </w:instrText>
         </w:r>
         <w:r>
           <w:rPr>
@@ -479,7 +479,7 @@
           <w:noProof/>
         </w:rPr>
       </w:pPr>
-      <w:hyperlink w:anchor="_Toc236945438" w:history="1">
+      <w:hyperlink w:anchor="_Toc236948149" w:history="1">
         <w:r>
           <w:rPr>
             <w:rStyle w:val="Hyperlink"/>
@@ -506,7 +506,7 @@
             <w:noProof/>
             <w:webHidden/>
           </w:rPr>
-          <w:instrText xml:space="preserve"> PAGEREF _Toc236945438 \h </w:instrText>
+          <w:instrText xml:space="preserve"> PAGEREF _Toc236948149 \h </w:instrText>
         </w:r>
         <w:r>
           <w:rPr>
@@ -547,7 +547,7 @@
           <w:noProof/>
         </w:rPr>
       </w:pPr>
-      <w:hyperlink w:anchor="_Toc236945439" w:history="1">
+      <w:hyperlink w:anchor="_Toc236948150" w:history="1">
         <w:r>
           <w:rPr>
             <w:rStyle w:val="Hyperlink"/>
@@ -574,7 +574,7 @@
             <w:noProof/>
             <w:webHidden/>
           </w:rPr>
-          <w:instrText xml:space="preserve"> PAGEREF _Toc236945439 \h </w:instrText>
+          <w:instrText xml:space="preserve"> PAGEREF _Toc236948150 \h </w:instrText>
         </w:r>
         <w:r>
           <w:rPr>
@@ -615,7 +615,7 @@
           <w:noProof/>
         </w:rPr>
       </w:pPr>
-      <w:hyperlink w:anchor="_Toc236945440" w:history="1">
+      <w:hyperlink w:anchor="_Toc236948151" w:history="1">
         <w:r>
           <w:rPr>
             <w:rStyle w:val="Hyperlink"/>
@@ -642,7 +642,7 @@
             <w:noProof/>
             <w:webHidden/>
           </w:rPr>
-          <w:instrText xml:space="preserve"> PAGEREF _Toc236945440 \h </w:instrText>
+          <w:instrText xml:space="preserve"> PAGEREF _Toc236948151 \h </w:instrText>
         </w:r>
         <w:r>
           <w:rPr>
@@ -683,7 +683,7 @@
           <w:noProof/>
         </w:rPr>
       </w:pPr>
-      <w:hyperlink w:anchor="_Toc236945441" w:history="1">
+      <w:hyperlink w:anchor="_Toc236948152" w:history="1">
         <w:r>
           <w:rPr>
             <w:rStyle w:val="Hyperlink"/>
@@ -710,7 +710,7 @@
             <w:noProof/>
             <w:webHidden/>
           </w:rPr>
-          <w:instrText xml:space="preserve"> PAGEREF _Toc236945441 \h </w:instrText>
+          <w:instrText xml:space="preserve"> PAGEREF _Toc236948152 \h </w:instrText>
         </w:r>
         <w:r>
           <w:rPr>
@@ -751,7 +751,7 @@
           <w:noProof/>
         </w:rPr>
       </w:pPr>
-      <w:hyperlink w:anchor="_Toc236945442" w:history="1">
+      <w:hyperlink w:anchor="_Toc236948153" w:history="1">
         <w:r>
           <w:rPr>
             <w:rStyle w:val="Hyperlink"/>
@@ -778,7 +778,7 @@
             <w:noProof/>
             <w:webHidden/>
           </w:rPr>
-          <w:instrText xml:space="preserve"> PAGEREF _Toc236945442 \h </w:instrText>
+          <w:instrText xml:space="preserve"> PAGEREF _Toc236948153 \h </w:instrText>
         </w:r>
         <w:r>
           <w:rPr>
@@ -819,7 +819,7 @@
           <w:noProof/>
         </w:rPr>
       </w:pPr>
-      <w:hyperlink w:anchor="_Toc236945443" w:history="1">
+      <w:hyperlink w:anchor="_Toc236948154" w:history="1">
         <w:r>
           <w:rPr>
             <w:rStyle w:val="Hyperlink"/>
@@ -846,7 +846,7 @@
             <w:noProof/>
             <w:webHidden/>
           </w:rPr>
-          <w:instrText xml:space="preserve"> PAGEREF _Toc236945443 \h </w:instrText>
+          <w:instrText xml:space="preserve"> PAGEREF _Toc236948154 \h </w:instrText>
         </w:r>
         <w:r>
           <w:rPr>
@@ -887,7 +887,7 @@
           <w:noProof/>
         </w:rPr>
       </w:pPr>
-      <w:hyperlink w:anchor="_Toc236945444" w:history="1">
+      <w:hyperlink w:anchor="_Toc236948155" w:history="1">
         <w:r>
           <w:rPr>
             <w:rStyle w:val="Hyperlink"/>
@@ -914,7 +914,7 @@
             <w:noProof/>
             <w:webHidden/>
           </w:rPr>
-          <w:instrText xml:space="preserve"> PAGEREF _Toc236945444 \h </w:instrText>
+          <w:instrText xml:space="preserve"> PAGEREF _Toc236948155 \h </w:instrText>
         </w:r>
         <w:r>
           <w:rPr>
@@ -955,7 +955,7 @@
           <w:noProof/>
         </w:rPr>
       </w:pPr>
-      <w:hyperlink w:anchor="_Toc236945445" w:history="1">
+      <w:hyperlink w:anchor="_Toc236948156" w:history="1">
         <w:r>
           <w:rPr>
             <w:rStyle w:val="Hyperlink"/>
@@ -982,7 +982,7 @@
             <w:noProof/>
             <w:webHidden/>
           </w:rPr>
-          <w:instrText xml:space="preserve"> PAGEREF _Toc236945445 \h </w:instrText>
+          <w:instrText xml:space="preserve"> PAGEREF _Toc236948156 \h </w:instrText>
         </w:r>
         <w:r>
           <w:rPr>
@@ -1023,7 +1023,7 @@
           <w:noProof/>
         </w:rPr>
       </w:pPr>
-      <w:hyperlink w:anchor="_Toc236945446" w:history="1">
+      <w:hyperlink w:anchor="_Toc236948157" w:history="1">
         <w:r>
           <w:rPr>
             <w:rStyle w:val="Hyperlink"/>
@@ -1050,7 +1050,7 @@
             <w:noProof/>
             <w:webHidden/>
           </w:rPr>
-          <w:instrText xml:space="preserve"> PAGEREF _Toc236945446 \h </w:instrText>
+          <w:instrText xml:space="preserve"> PAGEREF _Toc236948157 \h </w:instrText>
         </w:r>
         <w:r>
           <w:rPr>
@@ -1091,7 +1091,7 @@
           <w:noProof/>
         </w:rPr>
       </w:pPr>
-      <w:hyperlink w:anchor="_Toc236945447" w:history="1">
+      <w:hyperlink w:anchor="_Toc236948158" w:history="1">
         <w:r>
           <w:rPr>
             <w:rStyle w:val="Hyperlink"/>
@@ -1118,7 +1118,7 @@
             <w:noProof/>
             <w:webHidden/>
           </w:rPr>
-          <w:instrText xml:space="preserve"> PAGEREF _Toc236945447 \h </w:instrText>
+          <w:instrText xml:space="preserve"> PAGEREF _Toc236948158 \h </w:instrText>
         </w:r>
         <w:r>
           <w:rPr>
@@ -1138,7 +1138,7 @@
             <w:noProof/>
             <w:webHidden/>
           </w:rPr>
-          <w:t>3</w:t>
+          <w:t>4</w:t>
         </w:r>
         <w:r>
           <w:rPr>
@@ -1159,7 +1159,7 @@
           <w:noProof/>
         </w:rPr>
       </w:pPr>
-      <w:hyperlink w:anchor="_Toc236945448" w:history="1">
+      <w:hyperlink w:anchor="_Toc236948159" w:history="1">
         <w:r>
           <w:rPr>
             <w:rStyle w:val="Hyperlink"/>
@@ -1186,7 +1186,7 @@
             <w:noProof/>
             <w:webHidden/>
           </w:rPr>
-          <w:instrText xml:space="preserve"> PAGEREF _Toc236945448 \h </w:instrText>
+          <w:instrText xml:space="preserve"> PAGEREF _Toc236948159 \h </w:instrText>
         </w:r>
         <w:r>
           <w:rPr>
@@ -1227,7 +1227,7 @@
           <w:noProof/>
         </w:rPr>
       </w:pPr>
-      <w:hyperlink w:anchor="_Toc236945449" w:history="1">
+      <w:hyperlink w:anchor="_Toc236948160" w:history="1">
         <w:r>
           <w:rPr>
             <w:rStyle w:val="Hyperlink"/>
@@ -1254,7 +1254,7 @@
             <w:noProof/>
             <w:webHidden/>
           </w:rPr>
-          <w:instrText xml:space="preserve"> PAGEREF _Toc236945449 \h </w:instrText>
+          <w:instrText xml:space="preserve"> PAGEREF _Toc236948160 \h </w:instrText>
         </w:r>
         <w:r>
           <w:rPr>
@@ -1295,7 +1295,7 @@
           <w:noProof/>
         </w:rPr>
       </w:pPr>
-      <w:hyperlink w:anchor="_Toc236945450" w:history="1">
+      <w:hyperlink w:anchor="_Toc236948161" w:history="1">
         <w:r>
           <w:rPr>
             <w:rStyle w:val="Hyperlink"/>
@@ -1322,7 +1322,7 @@
             <w:noProof/>
             <w:webHidden/>
           </w:rPr>
-          <w:instrText xml:space="preserve"> PAGEREF _Toc236945450 \h </w:instrText>
+          <w:instrText xml:space="preserve"> PAGEREF _Toc236948161 \h </w:instrText>
         </w:r>
         <w:r>
           <w:rPr>
@@ -1363,7 +1363,7 @@
           <w:noProof/>
         </w:rPr>
       </w:pPr>
-      <w:hyperlink w:anchor="_Toc236945451" w:history="1">
+      <w:hyperlink w:anchor="_Toc236948162" w:history="1">
         <w:r>
           <w:rPr>
             <w:rStyle w:val="Hyperlink"/>
@@ -1390,7 +1390,7 @@
             <w:noProof/>
             <w:webHidden/>
           </w:rPr>
-          <w:instrText xml:space="preserve"> PAGEREF _Toc236945451 \h </w:instrText>
+          <w:instrText xml:space="preserve"> PAGEREF _Toc236948162 \h </w:instrText>
         </w:r>
         <w:r>
           <w:rPr>
@@ -1410,7 +1410,7 @@
             <w:noProof/>
             <w:webHidden/>
           </w:rPr>
-          <w:t>4</w:t>
+          <w:t>5</w:t>
         </w:r>
         <w:r>
           <w:rPr>
@@ -1431,7 +1431,7 @@
           <w:noProof/>
         </w:rPr>
       </w:pPr>
-      <w:hyperlink w:anchor="_Toc236945452" w:history="1">
+      <w:hyperlink w:anchor="_Toc236948163" w:history="1">
         <w:r>
           <w:rPr>
             <w:rStyle w:val="Hyperlink"/>
@@ -1458,7 +1458,7 @@
             <w:noProof/>
             <w:webHidden/>
           </w:rPr>
-          <w:instrText xml:space="preserve"> PAGEREF _Toc236945452 \h </w:instrText>
+          <w:instrText xml:space="preserve"> PAGEREF _Toc236948163 \h </w:instrText>
         </w:r>
         <w:r>
           <w:rPr>
@@ -1499,7 +1499,7 @@
           <w:noProof/>
         </w:rPr>
       </w:pPr>
-      <w:hyperlink w:anchor="_Toc236945453" w:history="1">
+      <w:hyperlink w:anchor="_Toc236948164" w:history="1">
         <w:r>
           <w:rPr>
             <w:rStyle w:val="Hyperlink"/>
@@ -1526,7 +1526,7 @@
             <w:noProof/>
             <w:webHidden/>
           </w:rPr>
-          <w:instrText xml:space="preserve"> PAGEREF _Toc236945453 \h </w:instrText>
+          <w:instrText xml:space="preserve"> PAGEREF _Toc236948164 \h </w:instrText>
         </w:r>
         <w:r>
           <w:rPr>
@@ -1567,7 +1567,7 @@
           <w:noProof/>
         </w:rPr>
       </w:pPr>
-      <w:hyperlink w:anchor="_Toc236945454" w:history="1">
+      <w:hyperlink w:anchor="_Toc236948165" w:history="1">
         <w:r>
           <w:rPr>
             <w:rStyle w:val="Hyperlink"/>
@@ -1594,7 +1594,7 @@
             <w:noProof/>
             <w:webHidden/>
           </w:rPr>
-          <w:instrText xml:space="preserve"> PAGEREF _Toc236945454 \h </w:instrText>
+          <w:instrText xml:space="preserve"> PAGEREF _Toc236948165 \h </w:instrText>
         </w:r>
         <w:r>
           <w:rPr>
@@ -1635,7 +1635,7 @@
           <w:noProof/>
         </w:rPr>
       </w:pPr>
-      <w:hyperlink w:anchor="_Toc236945455" w:history="1">
+      <w:hyperlink w:anchor="_Toc236948166" w:history="1">
         <w:r>
           <w:rPr>
             <w:rStyle w:val="Hyperlink"/>
@@ -1662,7 +1662,7 @@
             <w:noProof/>
             <w:webHidden/>
           </w:rPr>
-          <w:instrText xml:space="preserve"> PAGEREF _Toc236945455 \h </w:instrText>
+          <w:instrText xml:space="preserve"> PAGEREF _Toc236948166 \h </w:instrText>
         </w:r>
         <w:r>
           <w:rPr>
@@ -1703,7 +1703,7 @@
           <w:noProof/>
         </w:rPr>
       </w:pPr>
-      <w:hyperlink w:anchor="_Toc236945456" w:history="1">
+      <w:hyperlink w:anchor="_Toc236948167" w:history="1">
         <w:r>
           <w:rPr>
             <w:rStyle w:val="Hyperlink"/>
@@ -1730,7 +1730,7 @@
             <w:noProof/>
             <w:webHidden/>
           </w:rPr>
-          <w:instrText xml:space="preserve"> PAGEREF _Toc236945456 \h </w:instrText>
+          <w:instrText xml:space="preserve"> PAGEREF _Toc236948167 \h </w:instrText>
         </w:r>
         <w:r>
           <w:rPr>
@@ -1771,7 +1771,7 @@
           <w:noProof/>
         </w:rPr>
       </w:pPr>
-      <w:hyperlink w:anchor="_Toc236945457" w:history="1">
+      <w:hyperlink w:anchor="_Toc236948168" w:history="1">
         <w:r>
           <w:rPr>
             <w:rStyle w:val="Hyperlink"/>
@@ -1798,7 +1798,7 @@
             <w:noProof/>
             <w:webHidden/>
           </w:rPr>
-          <w:instrText xml:space="preserve"> PAGEREF _Toc236945457 \h </w:instrText>
+          <w:instrText xml:space="preserve"> PAGEREF _Toc236948168 \h </w:instrText>
         </w:r>
         <w:r>
           <w:rPr>
@@ -1818,7 +1818,7 @@
             <w:noProof/>
             <w:webHidden/>
           </w:rPr>
-          <w:t>5</w:t>
+          <w:t>6</w:t>
         </w:r>
         <w:r>
           <w:rPr>
@@ -1839,7 +1839,7 @@
           <w:noProof/>
         </w:rPr>
       </w:pPr>
-      <w:hyperlink w:anchor="_Toc236945458" w:history="1">
+      <w:hyperlink w:anchor="_Toc236948169" w:history="1">
         <w:r>
           <w:rPr>
             <w:rStyle w:val="Hyperlink"/>
@@ -1866,7 +1866,7 @@
             <w:noProof/>
             <w:webHidden/>
           </w:rPr>
-          <w:instrText xml:space="preserve"> PAGEREF _Toc236945458 \h </w:instrText>
+          <w:instrText xml:space="preserve"> PAGEREF _Toc236948169 \h </w:instrText>
         </w:r>
         <w:r>
           <w:rPr>
@@ -1907,7 +1907,7 @@
           <w:noProof/>
         </w:rPr>
       </w:pPr>
-      <w:hyperlink w:anchor="_Toc236945459" w:history="1">
+      <w:hyperlink w:anchor="_Toc236948170" w:history="1">
         <w:r>
           <w:rPr>
             <w:rStyle w:val="Hyperlink"/>
@@ -1934,7 +1934,7 @@
             <w:noProof/>
             <w:webHidden/>
           </w:rPr>
-          <w:instrText xml:space="preserve"> PAGEREF _Toc236945459 \h </w:instrText>
+          <w:instrText xml:space="preserve"> PAGEREF _Toc236948170 \h </w:instrText>
         </w:r>
         <w:r>
           <w:rPr>
@@ -1975,7 +1975,7 @@
           <w:noProof/>
         </w:rPr>
       </w:pPr>
-      <w:hyperlink w:anchor="_Toc236945460" w:history="1">
+      <w:hyperlink w:anchor="_Toc236948171" w:history="1">
         <w:r>
           <w:rPr>
             <w:rStyle w:val="Hyperlink"/>
@@ -2002,7 +2002,7 @@
             <w:noProof/>
             <w:webHidden/>
           </w:rPr>
-          <w:instrText xml:space="preserve"> PAGEREF _Toc236945460 \h </w:instrText>
+          <w:instrText xml:space="preserve"> PAGEREF _Toc236948171 \h </w:instrText>
         </w:r>
         <w:r>
           <w:rPr>
@@ -2043,7 +2043,7 @@
           <w:noProof/>
         </w:rPr>
       </w:pPr>
-      <w:hyperlink w:anchor="_Toc236945461" w:history="1">
+      <w:hyperlink w:anchor="_Toc236948172" w:history="1">
         <w:r>
           <w:rPr>
             <w:rStyle w:val="Hyperlink"/>
@@ -2070,7 +2070,7 @@
             <w:noProof/>
             <w:webHidden/>
           </w:rPr>
-          <w:instrText xml:space="preserve"> PAGEREF _Toc236945461 \h </w:instrText>
+          <w:instrText xml:space="preserve"> PAGEREF _Toc236948172 \h </w:instrText>
         </w:r>
         <w:r>
           <w:rPr>
@@ -2090,7 +2090,7 @@
             <w:noProof/>
             <w:webHidden/>
           </w:rPr>
-          <w:t>6</w:t>
+          <w:t>7</w:t>
         </w:r>
         <w:r>
           <w:rPr>
@@ -2111,7 +2111,7 @@
           <w:noProof/>
         </w:rPr>
       </w:pPr>
-      <w:hyperlink w:anchor="_Toc236945462" w:history="1">
+      <w:hyperlink w:anchor="_Toc236948173" w:history="1">
         <w:r>
           <w:rPr>
             <w:rStyle w:val="Hyperlink"/>
@@ -2138,7 +2138,7 @@
             <w:noProof/>
             <w:webHidden/>
           </w:rPr>
-          <w:instrText xml:space="preserve"> PAGEREF _Toc236945462 \h </w:instrText>
+          <w:instrText xml:space="preserve"> PAGEREF _Toc236948173 \h </w:instrText>
         </w:r>
         <w:r>
           <w:rPr>
@@ -2179,7 +2179,7 @@
           <w:noProof/>
         </w:rPr>
       </w:pPr>
-      <w:hyperlink w:anchor="_Toc236945463" w:history="1">
+      <w:hyperlink w:anchor="_Toc236948174" w:history="1">
         <w:r>
           <w:rPr>
             <w:rStyle w:val="Hyperlink"/>
@@ -2206,7 +2206,7 @@
             <w:noProof/>
             <w:webHidden/>
           </w:rPr>
-          <w:instrText xml:space="preserve"> PAGEREF _Toc236945463 \h </w:instrText>
+          <w:instrText xml:space="preserve"> PAGEREF _Toc236948174 \h </w:instrText>
         </w:r>
         <w:r>
           <w:rPr>
@@ -2247,7 +2247,7 @@
           <w:noProof/>
         </w:rPr>
       </w:pPr>
-      <w:hyperlink w:anchor="_Toc236945464" w:history="1">
+      <w:hyperlink w:anchor="_Toc236948175" w:history="1">
         <w:r>
           <w:rPr>
             <w:rStyle w:val="Hyperlink"/>
@@ -2274,7 +2274,7 @@
             <w:noProof/>
             <w:webHidden/>
           </w:rPr>
-          <w:instrText xml:space="preserve"> PAGEREF _Toc236945464 \h </w:instrText>
+          <w:instrText xml:space="preserve"> PAGEREF _Toc236948175 \h </w:instrText>
         </w:r>
         <w:r>
           <w:rPr>
@@ -2338,7 +2338,7 @@
       <w:pPr>
         <w:pStyle w:val="Heading1"/>
       </w:pPr>
-      <w:bookmarkStart w:id="1" w:name="_Toc236945435"/>
+      <w:bookmarkStart w:id="1" w:name="_Toc236948146"/>
       <w:r>
         <w:lastRenderedPageBreak/>
         <w:t>1. Product Scope and Invariants</w:t>
@@ -2435,7 +2435,7 @@
       <w:pPr>
         <w:pStyle w:val="Heading1"/>
       </w:pPr>
-      <w:bookmarkStart w:id="2" w:name="_Toc236945436"/>
+      <w:bookmarkStart w:id="2" w:name="_Toc236948147"/>
       <w:r>
         <w:t>2. Repository and Build Layout</w:t>
       </w:r>
@@ -2889,7 +2889,7 @@
       <w:pPr>
         <w:pStyle w:val="Heading2"/>
       </w:pPr>
-      <w:bookmarkStart w:id="3" w:name="_Toc236945437"/>
+      <w:bookmarkStart w:id="3" w:name="_Toc236948148"/>
       <w:r>
         <w:t>2.1 Toolchain</w:t>
       </w:r>
@@ -2928,7 +2928,7 @@
       <w:pPr>
         <w:pStyle w:val="Heading1"/>
       </w:pPr>
-      <w:bookmarkStart w:id="4" w:name="_Toc236945438"/>
+      <w:bookmarkStart w:id="4" w:name="_Toc236948149"/>
       <w:r>
         <w:t>3. System Architecture</w:t>
       </w:r>
@@ -3400,7 +3400,7 @@
       <w:pPr>
         <w:pStyle w:val="Heading1"/>
       </w:pPr>
-      <w:bookmarkStart w:id="5" w:name="_Toc236945439"/>
+      <w:bookmarkStart w:id="5" w:name="_Toc236948150"/>
       <w:r>
         <w:t>4. Core Data Model and JSON</w:t>
       </w:r>
@@ -3420,7 +3420,7 @@
       <w:pPr>
         <w:pStyle w:val="Heading2"/>
       </w:pPr>
-      <w:bookmarkStart w:id="6" w:name="_Toc236945440"/>
+      <w:bookmarkStart w:id="6" w:name="_Toc236948151"/>
       <w:r>
         <w:t>4.1 Stable keys</w:t>
       </w:r>
@@ -3474,7 +3474,7 @@
       <w:pPr>
         <w:pStyle w:val="Heading2"/>
       </w:pPr>
-      <w:bookmarkStart w:id="7" w:name="_Toc236945441"/>
+      <w:bookmarkStart w:id="7" w:name="_Toc236948152"/>
       <w:r>
         <w:t>4.2 Development catalog</w:t>
       </w:r>
@@ -3523,7 +3523,7 @@
       <w:pPr>
         <w:pStyle w:val="Heading2"/>
       </w:pPr>
-      <w:bookmarkStart w:id="8" w:name="_Toc236945442"/>
+      <w:bookmarkStart w:id="8" w:name="_Toc236948153"/>
       <w:r>
         <w:t>4.3 Runtime pack</w:t>
       </w:r>
@@ -3584,7 +3584,7 @@
       <w:pPr>
         <w:pStyle w:val="Heading1"/>
       </w:pPr>
-      <w:bookmarkStart w:id="9" w:name="_Toc236945443"/>
+      <w:bookmarkStart w:id="9" w:name="_Toc236948154"/>
       <w:r>
         <w:t>5. Project Detection and Scanning</w:t>
       </w:r>
@@ -3614,7 +3614,7 @@
       <w:pPr>
         <w:pStyle w:val="Heading2"/>
       </w:pPr>
-      <w:bookmarkStart w:id="10" w:name="_Toc236945444"/>
+      <w:bookmarkStart w:id="10" w:name="_Toc236948155"/>
       <w:r>
         <w:t>5.1 Incremental merge</w:t>
       </w:r>
@@ -3726,7 +3726,7 @@
       <w:pPr>
         <w:pStyle w:val="Heading1"/>
       </w:pPr>
-      <w:bookmarkStart w:id="11" w:name="_Toc236945445"/>
+      <w:bookmarkStart w:id="11" w:name="_Toc236948156"/>
       <w:r>
         <w:t>6. Studio UI and Workflow State</w:t>
       </w:r>
@@ -3740,6 +3740,16 @@
       </w:pPr>
       <w:r>
         <w:t>DAT.Studio.MainForm.fmx contains the complete orange-and-blue interface. The workflow selection rectangle moves among seven persisted pages. DAT.Studio.MainForm.pas contains event and state logic only; it does not construct controls.</w:t>
+      </w:r>
+    </w:p>
+    <w:p>
+      <w:pPr>
+        <w:rPr>
+          <w:rFonts w:hint="eastAsia"/>
+        </w:rPr>
+      </w:pPr>
+      <w:r>
+        <w:t>Each workflow TLabel explicitly persists HitTest=True. FireMonkey labels default to HitTest=False, which would otherwise pass mouse events through the visible label even when an OnClick event is assigned. The setting remains editable in the Object Inspector.</w:t>
       </w:r>
     </w:p>
     <w:p>
@@ -3796,7 +3806,7 @@
       <w:pPr>
         <w:pStyle w:val="Heading1"/>
       </w:pPr>
-      <w:bookmarkStart w:id="12" w:name="_Toc236945446"/>
+      <w:bookmarkStart w:id="12" w:name="_Toc236948157"/>
       <w:r>
         <w:t>7. Provider Settings and Secret Storage</w:t>
       </w:r>
@@ -4114,7 +4124,7 @@
       <w:pPr>
         <w:pStyle w:val="Heading1"/>
       </w:pPr>
-      <w:bookmarkStart w:id="13" w:name="_Toc236945447"/>
+      <w:bookmarkStart w:id="13" w:name="_Toc236948158"/>
       <w:r>
         <w:t>8. Provider HTTP Clients</w:t>
       </w:r>
@@ -4447,7 +4457,7 @@
       <w:pPr>
         <w:pStyle w:val="Heading2"/>
       </w:pPr>
-      <w:bookmarkStart w:id="14" w:name="_Toc236945448"/>
+      <w:bookmarkStart w:id="14" w:name="_Toc236948159"/>
       <w:r>
         <w:t>8.1 Reliability and cancellation</w:t>
       </w:r>
@@ -4523,7 +4533,7 @@
       <w:pPr>
         <w:pStyle w:val="Heading2"/>
       </w:pPr>
-      <w:bookmarkStart w:id="15" w:name="_Toc236945449"/>
+      <w:bookmarkStart w:id="15" w:name="_Toc236948160"/>
       <w:r>
         <w:t>8.2 Official protocol references</w:t>
       </w:r>
@@ -4588,7 +4598,7 @@
       <w:pPr>
         <w:pStyle w:val="Heading1"/>
       </w:pPr>
-      <w:bookmarkStart w:id="16" w:name="_Toc236945450"/>
+      <w:bookmarkStart w:id="16" w:name="_Toc236948161"/>
       <w:r>
         <w:t>9. Bulk Translation and Review Semantics</w:t>
       </w:r>
@@ -4744,7 +4754,7 @@
       <w:pPr>
         <w:pStyle w:val="Heading1"/>
       </w:pPr>
-      <w:bookmarkStart w:id="17" w:name="_Toc236945451"/>
+      <w:bookmarkStart w:id="17" w:name="_Toc236948162"/>
       <w:r>
         <w:t>10. Validation and Runtime Pack Export</w:t>
       </w:r>
@@ -4774,7 +4784,7 @@
       <w:pPr>
         <w:pStyle w:val="Heading1"/>
       </w:pPr>
-      <w:bookmarkStart w:id="18" w:name="_Toc236945452"/>
+      <w:bookmarkStart w:id="18" w:name="_Toc236948163"/>
       <w:r>
         <w:t>11. Runtime Engine</w:t>
       </w:r>
@@ -4804,7 +4814,7 @@
       <w:pPr>
         <w:pStyle w:val="Heading2"/>
       </w:pPr>
-      <w:bookmarkStart w:id="19" w:name="_Toc236945453"/>
+      <w:bookmarkStart w:id="19" w:name="_Toc236948164"/>
       <w:r>
         <w:t>11.1 Deployment paths</w:t>
       </w:r>
@@ -4858,7 +4868,7 @@
       <w:pPr>
         <w:pStyle w:val="Heading1"/>
       </w:pPr>
-      <w:bookmarkStart w:id="20" w:name="_Toc236945454"/>
+      <w:bookmarkStart w:id="20" w:name="_Toc236948165"/>
       <w:r>
         <w:t>12. Integration Planning and Transactions</w:t>
       </w:r>
@@ -4888,7 +4898,7 @@
       <w:pPr>
         <w:pStyle w:val="Heading2"/>
       </w:pPr>
-      <w:bookmarkStart w:id="21" w:name="_Toc236945455"/>
+      <w:bookmarkStart w:id="21" w:name="_Toc236948166"/>
       <w:r>
         <w:t>12.1 Generated startup contract</w:t>
       </w:r>
@@ -4993,7 +5003,7 @@
       <w:pPr>
         <w:pStyle w:val="Heading1"/>
       </w:pPr>
-      <w:bookmarkStart w:id="22" w:name="_Toc236945456"/>
+      <w:bookmarkStart w:id="22" w:name="_Toc236948167"/>
       <w:r>
         <w:t>13. Self-Localization</w:t>
       </w:r>
@@ -5013,7 +5023,7 @@
       <w:pPr>
         <w:pStyle w:val="Heading1"/>
       </w:pPr>
-      <w:bookmarkStart w:id="23" w:name="_Toc236945457"/>
+      <w:bookmarkStart w:id="23" w:name="_Toc236948168"/>
       <w:r>
         <w:t>14. Error Handling and Diagnostics</w:t>
       </w:r>
@@ -5089,7 +5099,7 @@
       <w:pPr>
         <w:pStyle w:val="Heading1"/>
       </w:pPr>
-      <w:bookmarkStart w:id="24" w:name="_Toc236945458"/>
+      <w:bookmarkStart w:id="24" w:name="_Toc236948169"/>
       <w:r>
         <w:t>15. Test Strategy and Verified Matrix</w:t>
       </w:r>
@@ -5438,7 +5448,7 @@
       <w:pPr>
         <w:pStyle w:val="Heading2"/>
       </w:pPr>
-      <w:bookmarkStart w:id="25" w:name="_Toc236945459"/>
+      <w:bookmarkStart w:id="25" w:name="_Toc236948170"/>
       <w:r>
         <w:t>15.1 Live provider testing</w:t>
       </w:r>
@@ -5458,7 +5468,7 @@
       <w:pPr>
         <w:pStyle w:val="Heading1"/>
       </w:pPr>
-      <w:bookmarkStart w:id="26" w:name="_Toc236945460"/>
+      <w:bookmarkStart w:id="26" w:name="_Toc236948171"/>
       <w:r>
         <w:t>16. Security Review</w:t>
       </w:r>
@@ -5807,7 +5817,7 @@
       <w:pPr>
         <w:pStyle w:val="Heading1"/>
       </w:pPr>
-      <w:bookmarkStart w:id="27" w:name="_Toc236945461"/>
+      <w:bookmarkStart w:id="27" w:name="_Toc236948172"/>
       <w:r>
         <w:t>17. Release and Contribution Workflow</w:t>
       </w:r>
@@ -5970,7 +5980,7 @@
       <w:pPr>
         <w:pStyle w:val="Heading1"/>
       </w:pPr>
-      <w:bookmarkStart w:id="28" w:name="_Toc236945462"/>
+      <w:bookmarkStart w:id="28" w:name="_Toc236948173"/>
       <w:r>
         <w:t>18. Known Boundaries and Future-Compatible Design</w:t>
       </w:r>
@@ -6057,7 +6067,7 @@
       <w:pPr>
         <w:pStyle w:val="Heading1"/>
       </w:pPr>
-      <w:bookmarkStart w:id="29" w:name="_Toc236945463"/>
+      <w:bookmarkStart w:id="29" w:name="_Toc236948174"/>
       <w:r>
         <w:t>19. Documentation Generation</w:t>
       </w:r>
@@ -6077,7 +6087,7 @@
       <w:pPr>
         <w:pStyle w:val="Heading1"/>
       </w:pPr>
-      <w:bookmarkStart w:id="30" w:name="_Toc236945464"/>
+      <w:bookmarkStart w:id="30" w:name="_Toc236948175"/>
       <w:r>
         <w:t>20. Source References</w:t>
       </w:r>
@@ -6579,31 +6589,31 @@
       </w:rPr>
     </w:lvl>
   </w:abstractNum>
-  <w:num w:numId="1" w16cid:durableId="1003358370">
+  <w:num w:numId="1" w16cid:durableId="674381717">
     <w:abstractNumId w:val="8"/>
   </w:num>
-  <w:num w:numId="2" w16cid:durableId="885876424">
+  <w:num w:numId="2" w16cid:durableId="592712809">
     <w:abstractNumId w:val="6"/>
   </w:num>
-  <w:num w:numId="3" w16cid:durableId="1146360320">
+  <w:num w:numId="3" w16cid:durableId="1055929346">
     <w:abstractNumId w:val="5"/>
   </w:num>
-  <w:num w:numId="4" w16cid:durableId="2511842">
+  <w:num w:numId="4" w16cid:durableId="465855326">
     <w:abstractNumId w:val="4"/>
   </w:num>
-  <w:num w:numId="5" w16cid:durableId="1937863209">
+  <w:num w:numId="5" w16cid:durableId="526019312">
     <w:abstractNumId w:val="7"/>
   </w:num>
-  <w:num w:numId="6" w16cid:durableId="579101600">
+  <w:num w:numId="6" w16cid:durableId="695351504">
     <w:abstractNumId w:val="3"/>
   </w:num>
-  <w:num w:numId="7" w16cid:durableId="1140922231">
+  <w:num w:numId="7" w16cid:durableId="298146153">
     <w:abstractNumId w:val="2"/>
   </w:num>
-  <w:num w:numId="8" w16cid:durableId="1607420508">
+  <w:num w:numId="8" w16cid:durableId="652300080">
     <w:abstractNumId w:val="1"/>
   </w:num>
-  <w:num w:numId="9" w16cid:durableId="462046285">
+  <w:num w:numId="9" w16cid:durableId="1170370901">
     <w:abstractNumId w:val="0"/>
   </w:num>
 </w:numbering>
@@ -18033,7 +18043,7 @@
     <w:autoRedefine/>
     <w:uiPriority w:val="39"/>
     <w:unhideWhenUsed/>
-    <w:rsid w:val="0000468E"/>
+    <w:rsid w:val="00CD1C0B"/>
   </w:style>
   <w:style w:type="paragraph" w:styleId="TOC2">
     <w:name w:val="toc 2"/>
@@ -18042,7 +18052,7 @@
     <w:autoRedefine/>
     <w:uiPriority w:val="39"/>
     <w:unhideWhenUsed/>
-    <w:rsid w:val="0000468E"/>
+    <w:rsid w:val="00CD1C0B"/>
     <w:pPr>
       <w:ind w:left="190"/>
     </w:pPr>
@@ -18052,7 +18062,7 @@
     <w:basedOn w:val="DefaultParagraphFont"/>
     <w:uiPriority w:val="99"/>
     <w:unhideWhenUsed/>
-    <w:rsid w:val="0000468E"/>
+    <w:rsid w:val="00CD1C0B"/>
     <w:rPr>
       <w:color w:val="0000FF" w:themeColor="hyperlink"/>
       <w:u w:val="single"/>

</xml_diff>

<commit_message>
Add protected in-place AI translation workflow
</commit_message>
<xml_diff>
--- a/docs/guides/Delphi App Translation Studio Engineering Guide.docx
+++ b/docs/guides/Delphi App Translation Studio Engineering Guide.docx
@@ -13,7 +13,7 @@
           <w:noProof/>
         </w:rPr>
         <w:drawing>
-          <wp:inline distT="0" distB="0" distL="0" distR="0" wp14:anchorId="3134E240" wp14:editId="54D8798E">
+          <wp:inline distT="0" distB="0" distL="0" distR="0" wp14:anchorId="7F665DA5" wp14:editId="1523707D">
             <wp:extent cx="1371600" cy="1371600"/>
             <wp:effectExtent l="0" t="0" r="0" b="0"/>
             <wp:docPr id="1" name="Picture 1"/>
@@ -149,7 +149,7 @@
       <w:pPr>
         <w:pStyle w:val="Heading1"/>
       </w:pPr>
-      <w:bookmarkStart w:id="0" w:name="_Toc237003153"/>
+      <w:bookmarkStart w:id="0" w:name="_Toc237009617"/>
       <w:r>
         <w:lastRenderedPageBreak/>
         <w:t>Table of Contents</w:t>
@@ -163,13 +163,7 @@
           <w:tab w:val="right" w:leader="dot" w:pos="9350"/>
         </w:tabs>
         <w:rPr>
-          <w:rFonts w:asciiTheme="minorHAnsi" w:hAnsiTheme="minorHAnsi"/>
           <w:noProof/>
-          <w:color w:val="auto"/>
-          <w:kern w:val="2"/>
-          <w:sz w:val="24"/>
-          <w:szCs w:val="24"/>
-          <w14:ligatures w14:val="standardContextual"/>
         </w:rPr>
       </w:pPr>
       <w:r>
@@ -181,7 +175,7 @@
       <w:r>
         <w:fldChar w:fldCharType="separate"/>
       </w:r>
-      <w:hyperlink w:anchor="_Toc237003153" w:history="1">
+      <w:hyperlink w:anchor="_Toc237009617" w:history="1">
         <w:r>
           <w:rPr>
             <w:rStyle w:val="Hyperlink"/>
@@ -208,7 +202,7 @@
             <w:noProof/>
             <w:webHidden/>
           </w:rPr>
-          <w:instrText xml:space="preserve"> PAGEREF _Toc237003153 \h </w:instrText>
+          <w:instrText xml:space="preserve"> PAGEREF _Toc237009617 \h </w:instrText>
         </w:r>
         <w:r>
           <w:rPr>
@@ -246,16 +240,10 @@
           <w:tab w:val="right" w:leader="dot" w:pos="9350"/>
         </w:tabs>
         <w:rPr>
-          <w:rFonts w:asciiTheme="minorHAnsi" w:hAnsiTheme="minorHAnsi"/>
           <w:noProof/>
-          <w:color w:val="auto"/>
-          <w:kern w:val="2"/>
-          <w:sz w:val="24"/>
-          <w:szCs w:val="24"/>
-          <w14:ligatures w14:val="standardContextual"/>
         </w:rPr>
       </w:pPr>
-      <w:hyperlink w:anchor="_Toc237003154" w:history="1">
+      <w:hyperlink w:anchor="_Toc237009618" w:history="1">
         <w:r>
           <w:rPr>
             <w:rStyle w:val="Hyperlink"/>
@@ -282,7 +270,7 @@
             <w:noProof/>
             <w:webHidden/>
           </w:rPr>
-          <w:instrText xml:space="preserve"> PAGEREF _Toc237003154 \h </w:instrText>
+          <w:instrText xml:space="preserve"> PAGEREF _Toc237009618 \h </w:instrText>
         </w:r>
         <w:r>
           <w:rPr>
@@ -320,16 +308,10 @@
           <w:tab w:val="right" w:leader="dot" w:pos="9350"/>
         </w:tabs>
         <w:rPr>
-          <w:rFonts w:asciiTheme="minorHAnsi" w:hAnsiTheme="minorHAnsi"/>
           <w:noProof/>
-          <w:color w:val="auto"/>
-          <w:kern w:val="2"/>
-          <w:sz w:val="24"/>
-          <w:szCs w:val="24"/>
-          <w14:ligatures w14:val="standardContextual"/>
         </w:rPr>
       </w:pPr>
-      <w:hyperlink w:anchor="_Toc237003155" w:history="1">
+      <w:hyperlink w:anchor="_Toc237009619" w:history="1">
         <w:r>
           <w:rPr>
             <w:rStyle w:val="Hyperlink"/>
@@ -356,7 +338,7 @@
             <w:noProof/>
             <w:webHidden/>
           </w:rPr>
-          <w:instrText xml:space="preserve"> PAGEREF _Toc237003155 \h </w:instrText>
+          <w:instrText xml:space="preserve"> PAGEREF _Toc237009619 \h </w:instrText>
         </w:r>
         <w:r>
           <w:rPr>
@@ -394,16 +376,10 @@
           <w:tab w:val="right" w:leader="dot" w:pos="9350"/>
         </w:tabs>
         <w:rPr>
-          <w:rFonts w:asciiTheme="minorHAnsi" w:hAnsiTheme="minorHAnsi"/>
           <w:noProof/>
-          <w:color w:val="auto"/>
-          <w:kern w:val="2"/>
-          <w:sz w:val="24"/>
-          <w:szCs w:val="24"/>
-          <w14:ligatures w14:val="standardContextual"/>
         </w:rPr>
       </w:pPr>
-      <w:hyperlink w:anchor="_Toc237003156" w:history="1">
+      <w:hyperlink w:anchor="_Toc237009620" w:history="1">
         <w:r>
           <w:rPr>
             <w:rStyle w:val="Hyperlink"/>
@@ -430,7 +406,7 @@
             <w:noProof/>
             <w:webHidden/>
           </w:rPr>
-          <w:instrText xml:space="preserve"> PAGEREF _Toc237003156 \h </w:instrText>
+          <w:instrText xml:space="preserve"> PAGEREF _Toc237009620 \h </w:instrText>
         </w:r>
         <w:r>
           <w:rPr>
@@ -468,16 +444,10 @@
           <w:tab w:val="right" w:leader="dot" w:pos="9350"/>
         </w:tabs>
         <w:rPr>
-          <w:rFonts w:asciiTheme="minorHAnsi" w:hAnsiTheme="minorHAnsi"/>
           <w:noProof/>
-          <w:color w:val="auto"/>
-          <w:kern w:val="2"/>
-          <w:sz w:val="24"/>
-          <w:szCs w:val="24"/>
-          <w14:ligatures w14:val="standardContextual"/>
         </w:rPr>
       </w:pPr>
-      <w:hyperlink w:anchor="_Toc237003157" w:history="1">
+      <w:hyperlink w:anchor="_Toc237009621" w:history="1">
         <w:r>
           <w:rPr>
             <w:rStyle w:val="Hyperlink"/>
@@ -504,7 +474,7 @@
             <w:noProof/>
             <w:webHidden/>
           </w:rPr>
-          <w:instrText xml:space="preserve"> PAGEREF _Toc237003157 \h </w:instrText>
+          <w:instrText xml:space="preserve"> PAGEREF _Toc237009621 \h </w:instrText>
         </w:r>
         <w:r>
           <w:rPr>
@@ -542,16 +512,10 @@
           <w:tab w:val="right" w:leader="dot" w:pos="9350"/>
         </w:tabs>
         <w:rPr>
-          <w:rFonts w:asciiTheme="minorHAnsi" w:hAnsiTheme="minorHAnsi"/>
           <w:noProof/>
-          <w:color w:val="auto"/>
-          <w:kern w:val="2"/>
-          <w:sz w:val="24"/>
-          <w:szCs w:val="24"/>
-          <w14:ligatures w14:val="standardContextual"/>
         </w:rPr>
       </w:pPr>
-      <w:hyperlink w:anchor="_Toc237003158" w:history="1">
+      <w:hyperlink w:anchor="_Toc237009622" w:history="1">
         <w:r>
           <w:rPr>
             <w:rStyle w:val="Hyperlink"/>
@@ -578,7 +542,7 @@
             <w:noProof/>
             <w:webHidden/>
           </w:rPr>
-          <w:instrText xml:space="preserve"> PAGEREF _Toc237003158 \h </w:instrText>
+          <w:instrText xml:space="preserve"> PAGEREF _Toc237009622 \h </w:instrText>
         </w:r>
         <w:r>
           <w:rPr>
@@ -616,16 +580,10 @@
           <w:tab w:val="right" w:leader="dot" w:pos="9350"/>
         </w:tabs>
         <w:rPr>
-          <w:rFonts w:asciiTheme="minorHAnsi" w:hAnsiTheme="minorHAnsi"/>
           <w:noProof/>
-          <w:color w:val="auto"/>
-          <w:kern w:val="2"/>
-          <w:sz w:val="24"/>
-          <w:szCs w:val="24"/>
-          <w14:ligatures w14:val="standardContextual"/>
         </w:rPr>
       </w:pPr>
-      <w:hyperlink w:anchor="_Toc237003159" w:history="1">
+      <w:hyperlink w:anchor="_Toc237009623" w:history="1">
         <w:r>
           <w:rPr>
             <w:rStyle w:val="Hyperlink"/>
@@ -652,7 +610,7 @@
             <w:noProof/>
             <w:webHidden/>
           </w:rPr>
-          <w:instrText xml:space="preserve"> PAGEREF _Toc237003159 \h </w:instrText>
+          <w:instrText xml:space="preserve"> PAGEREF _Toc237009623 \h </w:instrText>
         </w:r>
         <w:r>
           <w:rPr>
@@ -690,16 +648,10 @@
           <w:tab w:val="right" w:leader="dot" w:pos="9350"/>
         </w:tabs>
         <w:rPr>
-          <w:rFonts w:asciiTheme="minorHAnsi" w:hAnsiTheme="minorHAnsi"/>
           <w:noProof/>
-          <w:color w:val="auto"/>
-          <w:kern w:val="2"/>
-          <w:sz w:val="24"/>
-          <w:szCs w:val="24"/>
-          <w14:ligatures w14:val="standardContextual"/>
         </w:rPr>
       </w:pPr>
-      <w:hyperlink w:anchor="_Toc237003160" w:history="1">
+      <w:hyperlink w:anchor="_Toc237009624" w:history="1">
         <w:r>
           <w:rPr>
             <w:rStyle w:val="Hyperlink"/>
@@ -726,7 +678,7 @@
             <w:noProof/>
             <w:webHidden/>
           </w:rPr>
-          <w:instrText xml:space="preserve"> PAGEREF _Toc237003160 \h </w:instrText>
+          <w:instrText xml:space="preserve"> PAGEREF _Toc237009624 \h </w:instrText>
         </w:r>
         <w:r>
           <w:rPr>
@@ -764,16 +716,10 @@
           <w:tab w:val="right" w:leader="dot" w:pos="9350"/>
         </w:tabs>
         <w:rPr>
-          <w:rFonts w:asciiTheme="minorHAnsi" w:hAnsiTheme="minorHAnsi"/>
           <w:noProof/>
-          <w:color w:val="auto"/>
-          <w:kern w:val="2"/>
-          <w:sz w:val="24"/>
-          <w:szCs w:val="24"/>
-          <w14:ligatures w14:val="standardContextual"/>
         </w:rPr>
       </w:pPr>
-      <w:hyperlink w:anchor="_Toc237003161" w:history="1">
+      <w:hyperlink w:anchor="_Toc237009625" w:history="1">
         <w:r>
           <w:rPr>
             <w:rStyle w:val="Hyperlink"/>
@@ -800,7 +746,7 @@
             <w:noProof/>
             <w:webHidden/>
           </w:rPr>
-          <w:instrText xml:space="preserve"> PAGEREF _Toc237003161 \h </w:instrText>
+          <w:instrText xml:space="preserve"> PAGEREF _Toc237009625 \h </w:instrText>
         </w:r>
         <w:r>
           <w:rPr>
@@ -838,16 +784,10 @@
           <w:tab w:val="right" w:leader="dot" w:pos="9350"/>
         </w:tabs>
         <w:rPr>
-          <w:rFonts w:asciiTheme="minorHAnsi" w:hAnsiTheme="minorHAnsi"/>
           <w:noProof/>
-          <w:color w:val="auto"/>
-          <w:kern w:val="2"/>
-          <w:sz w:val="24"/>
-          <w:szCs w:val="24"/>
-          <w14:ligatures w14:val="standardContextual"/>
         </w:rPr>
       </w:pPr>
-      <w:hyperlink w:anchor="_Toc237003162" w:history="1">
+      <w:hyperlink w:anchor="_Toc237009626" w:history="1">
         <w:r>
           <w:rPr>
             <w:rStyle w:val="Hyperlink"/>
@@ -874,7 +814,7 @@
             <w:noProof/>
             <w:webHidden/>
           </w:rPr>
-          <w:instrText xml:space="preserve"> PAGEREF _Toc237003162 \h </w:instrText>
+          <w:instrText xml:space="preserve"> PAGEREF _Toc237009626 \h </w:instrText>
         </w:r>
         <w:r>
           <w:rPr>
@@ -912,16 +852,10 @@
           <w:tab w:val="right" w:leader="dot" w:pos="9350"/>
         </w:tabs>
         <w:rPr>
-          <w:rFonts w:asciiTheme="minorHAnsi" w:hAnsiTheme="minorHAnsi"/>
           <w:noProof/>
-          <w:color w:val="auto"/>
-          <w:kern w:val="2"/>
-          <w:sz w:val="24"/>
-          <w:szCs w:val="24"/>
-          <w14:ligatures w14:val="standardContextual"/>
         </w:rPr>
       </w:pPr>
-      <w:hyperlink w:anchor="_Toc237003163" w:history="1">
+      <w:hyperlink w:anchor="_Toc237009627" w:history="1">
         <w:r>
           <w:rPr>
             <w:rStyle w:val="Hyperlink"/>
@@ -948,7 +882,7 @@
             <w:noProof/>
             <w:webHidden/>
           </w:rPr>
-          <w:instrText xml:space="preserve"> PAGEREF _Toc237003163 \h </w:instrText>
+          <w:instrText xml:space="preserve"> PAGEREF _Toc237009627 \h </w:instrText>
         </w:r>
         <w:r>
           <w:rPr>
@@ -986,16 +920,10 @@
           <w:tab w:val="right" w:leader="dot" w:pos="9350"/>
         </w:tabs>
         <w:rPr>
-          <w:rFonts w:asciiTheme="minorHAnsi" w:hAnsiTheme="minorHAnsi"/>
           <w:noProof/>
-          <w:color w:val="auto"/>
-          <w:kern w:val="2"/>
-          <w:sz w:val="24"/>
-          <w:szCs w:val="24"/>
-          <w14:ligatures w14:val="standardContextual"/>
         </w:rPr>
       </w:pPr>
-      <w:hyperlink w:anchor="_Toc237003164" w:history="1">
+      <w:hyperlink w:anchor="_Toc237009628" w:history="1">
         <w:r>
           <w:rPr>
             <w:rStyle w:val="Hyperlink"/>
@@ -1022,7 +950,7 @@
             <w:noProof/>
             <w:webHidden/>
           </w:rPr>
-          <w:instrText xml:space="preserve"> PAGEREF _Toc237003164 \h </w:instrText>
+          <w:instrText xml:space="preserve"> PAGEREF _Toc237009628 \h </w:instrText>
         </w:r>
         <w:r>
           <w:rPr>
@@ -1060,16 +988,10 @@
           <w:tab w:val="right" w:leader="dot" w:pos="9350"/>
         </w:tabs>
         <w:rPr>
-          <w:rFonts w:asciiTheme="minorHAnsi" w:hAnsiTheme="minorHAnsi"/>
           <w:noProof/>
-          <w:color w:val="auto"/>
-          <w:kern w:val="2"/>
-          <w:sz w:val="24"/>
-          <w:szCs w:val="24"/>
-          <w14:ligatures w14:val="standardContextual"/>
         </w:rPr>
       </w:pPr>
-      <w:hyperlink w:anchor="_Toc237003165" w:history="1">
+      <w:hyperlink w:anchor="_Toc237009629" w:history="1">
         <w:r>
           <w:rPr>
             <w:rStyle w:val="Hyperlink"/>
@@ -1096,7 +1018,7 @@
             <w:noProof/>
             <w:webHidden/>
           </w:rPr>
-          <w:instrText xml:space="preserve"> PAGEREF _Toc237003165 \h </w:instrText>
+          <w:instrText xml:space="preserve"> PAGEREF _Toc237009629 \h </w:instrText>
         </w:r>
         <w:r>
           <w:rPr>
@@ -1134,16 +1056,10 @@
           <w:tab w:val="right" w:leader="dot" w:pos="9350"/>
         </w:tabs>
         <w:rPr>
-          <w:rFonts w:asciiTheme="minorHAnsi" w:hAnsiTheme="minorHAnsi"/>
           <w:noProof/>
-          <w:color w:val="auto"/>
-          <w:kern w:val="2"/>
-          <w:sz w:val="24"/>
-          <w:szCs w:val="24"/>
-          <w14:ligatures w14:val="standardContextual"/>
         </w:rPr>
       </w:pPr>
-      <w:hyperlink w:anchor="_Toc237003166" w:history="1">
+      <w:hyperlink w:anchor="_Toc237009630" w:history="1">
         <w:r>
           <w:rPr>
             <w:rStyle w:val="Hyperlink"/>
@@ -1170,7 +1086,7 @@
             <w:noProof/>
             <w:webHidden/>
           </w:rPr>
-          <w:instrText xml:space="preserve"> PAGEREF _Toc237003166 \h </w:instrText>
+          <w:instrText xml:space="preserve"> PAGEREF _Toc237009630 \h </w:instrText>
         </w:r>
         <w:r>
           <w:rPr>
@@ -1208,16 +1124,10 @@
           <w:tab w:val="right" w:leader="dot" w:pos="9350"/>
         </w:tabs>
         <w:rPr>
-          <w:rFonts w:asciiTheme="minorHAnsi" w:hAnsiTheme="minorHAnsi"/>
           <w:noProof/>
-          <w:color w:val="auto"/>
-          <w:kern w:val="2"/>
-          <w:sz w:val="24"/>
-          <w:szCs w:val="24"/>
-          <w14:ligatures w14:val="standardContextual"/>
         </w:rPr>
       </w:pPr>
-      <w:hyperlink w:anchor="_Toc237003167" w:history="1">
+      <w:hyperlink w:anchor="_Toc237009631" w:history="1">
         <w:r>
           <w:rPr>
             <w:rStyle w:val="Hyperlink"/>
@@ -1244,7 +1154,7 @@
             <w:noProof/>
             <w:webHidden/>
           </w:rPr>
-          <w:instrText xml:space="preserve"> PAGEREF _Toc237003167 \h </w:instrText>
+          <w:instrText xml:space="preserve"> PAGEREF _Toc237009631 \h </w:instrText>
         </w:r>
         <w:r>
           <w:rPr>
@@ -1282,16 +1192,10 @@
           <w:tab w:val="right" w:leader="dot" w:pos="9350"/>
         </w:tabs>
         <w:rPr>
-          <w:rFonts w:asciiTheme="minorHAnsi" w:hAnsiTheme="minorHAnsi"/>
           <w:noProof/>
-          <w:color w:val="auto"/>
-          <w:kern w:val="2"/>
-          <w:sz w:val="24"/>
-          <w:szCs w:val="24"/>
-          <w14:ligatures w14:val="standardContextual"/>
         </w:rPr>
       </w:pPr>
-      <w:hyperlink w:anchor="_Toc237003168" w:history="1">
+      <w:hyperlink w:anchor="_Toc237009632" w:history="1">
         <w:r>
           <w:rPr>
             <w:rStyle w:val="Hyperlink"/>
@@ -1318,7 +1222,7 @@
             <w:noProof/>
             <w:webHidden/>
           </w:rPr>
-          <w:instrText xml:space="preserve"> PAGEREF _Toc237003168 \h </w:instrText>
+          <w:instrText xml:space="preserve"> PAGEREF _Toc237009632 \h </w:instrText>
         </w:r>
         <w:r>
           <w:rPr>
@@ -1356,22 +1260,16 @@
           <w:tab w:val="right" w:leader="dot" w:pos="9350"/>
         </w:tabs>
         <w:rPr>
-          <w:rFonts w:asciiTheme="minorHAnsi" w:hAnsiTheme="minorHAnsi"/>
           <w:noProof/>
-          <w:color w:val="auto"/>
-          <w:kern w:val="2"/>
-          <w:sz w:val="24"/>
-          <w:szCs w:val="24"/>
-          <w14:ligatures w14:val="standardContextual"/>
         </w:rPr>
       </w:pPr>
-      <w:hyperlink w:anchor="_Toc237003169" w:history="1">
+      <w:hyperlink w:anchor="_Toc237009633" w:history="1">
         <w:r>
           <w:rPr>
             <w:rStyle w:val="Hyperlink"/>
             <w:noProof/>
           </w:rPr>
-          <w:t>9. Translation Acquisition and Review Semantics</w:t>
+          <w:t>9. In-Place AI Translation and Alternatives</w:t>
         </w:r>
         <w:r>
           <w:rPr>
@@ -1392,7 +1290,7 @@
             <w:noProof/>
             <w:webHidden/>
           </w:rPr>
-          <w:instrText xml:space="preserve"> PAGEREF _Toc237003169 \h </w:instrText>
+          <w:instrText xml:space="preserve"> PAGEREF _Toc237009633 \h </w:instrText>
         </w:r>
         <w:r>
           <w:rPr>
@@ -1430,16 +1328,10 @@
           <w:tab w:val="right" w:leader="dot" w:pos="9350"/>
         </w:tabs>
         <w:rPr>
-          <w:rFonts w:asciiTheme="minorHAnsi" w:hAnsiTheme="minorHAnsi"/>
           <w:noProof/>
-          <w:color w:val="auto"/>
-          <w:kern w:val="2"/>
-          <w:sz w:val="24"/>
-          <w:szCs w:val="24"/>
-          <w14:ligatures w14:val="standardContextual"/>
         </w:rPr>
       </w:pPr>
-      <w:hyperlink w:anchor="_Toc237003170" w:history="1">
+      <w:hyperlink w:anchor="_Toc237009634" w:history="1">
         <w:r>
           <w:rPr>
             <w:rStyle w:val="Hyperlink"/>
@@ -1466,7 +1358,7 @@
             <w:noProof/>
             <w:webHidden/>
           </w:rPr>
-          <w:instrText xml:space="preserve"> PAGEREF _Toc237003170 \h </w:instrText>
+          <w:instrText xml:space="preserve"> PAGEREF _Toc237009634 \h </w:instrText>
         </w:r>
         <w:r>
           <w:rPr>
@@ -1504,16 +1396,10 @@
           <w:tab w:val="right" w:leader="dot" w:pos="9350"/>
         </w:tabs>
         <w:rPr>
-          <w:rFonts w:asciiTheme="minorHAnsi" w:hAnsiTheme="minorHAnsi"/>
           <w:noProof/>
-          <w:color w:val="auto"/>
-          <w:kern w:val="2"/>
-          <w:sz w:val="24"/>
-          <w:szCs w:val="24"/>
-          <w14:ligatures w14:val="standardContextual"/>
         </w:rPr>
       </w:pPr>
-      <w:hyperlink w:anchor="_Toc237003171" w:history="1">
+      <w:hyperlink w:anchor="_Toc237009635" w:history="1">
         <w:r>
           <w:rPr>
             <w:rStyle w:val="Hyperlink"/>
@@ -1540,7 +1426,7 @@
             <w:noProof/>
             <w:webHidden/>
           </w:rPr>
-          <w:instrText xml:space="preserve"> PAGEREF _Toc237003171 \h </w:instrText>
+          <w:instrText xml:space="preserve"> PAGEREF _Toc237009635 \h </w:instrText>
         </w:r>
         <w:r>
           <w:rPr>
@@ -1560,7 +1446,7 @@
             <w:noProof/>
             <w:webHidden/>
           </w:rPr>
-          <w:t>7</w:t>
+          <w:t>8</w:t>
         </w:r>
         <w:r>
           <w:rPr>
@@ -1578,16 +1464,10 @@
           <w:tab w:val="right" w:leader="dot" w:pos="9350"/>
         </w:tabs>
         <w:rPr>
-          <w:rFonts w:asciiTheme="minorHAnsi" w:hAnsiTheme="minorHAnsi"/>
           <w:noProof/>
-          <w:color w:val="auto"/>
-          <w:kern w:val="2"/>
-          <w:sz w:val="24"/>
-          <w:szCs w:val="24"/>
-          <w14:ligatures w14:val="standardContextual"/>
         </w:rPr>
       </w:pPr>
-      <w:hyperlink w:anchor="_Toc237003172" w:history="1">
+      <w:hyperlink w:anchor="_Toc237009636" w:history="1">
         <w:r>
           <w:rPr>
             <w:rStyle w:val="Hyperlink"/>
@@ -1614,7 +1494,7 @@
             <w:noProof/>
             <w:webHidden/>
           </w:rPr>
-          <w:instrText xml:space="preserve"> PAGEREF _Toc237003172 \h </w:instrText>
+          <w:instrText xml:space="preserve"> PAGEREF _Toc237009636 \h </w:instrText>
         </w:r>
         <w:r>
           <w:rPr>
@@ -1634,7 +1514,7 @@
             <w:noProof/>
             <w:webHidden/>
           </w:rPr>
-          <w:t>7</w:t>
+          <w:t>8</w:t>
         </w:r>
         <w:r>
           <w:rPr>
@@ -1652,16 +1532,10 @@
           <w:tab w:val="right" w:leader="dot" w:pos="9350"/>
         </w:tabs>
         <w:rPr>
-          <w:rFonts w:asciiTheme="minorHAnsi" w:hAnsiTheme="minorHAnsi"/>
           <w:noProof/>
-          <w:color w:val="auto"/>
-          <w:kern w:val="2"/>
-          <w:sz w:val="24"/>
-          <w:szCs w:val="24"/>
-          <w14:ligatures w14:val="standardContextual"/>
         </w:rPr>
       </w:pPr>
-      <w:hyperlink w:anchor="_Toc237003173" w:history="1">
+      <w:hyperlink w:anchor="_Toc237009637" w:history="1">
         <w:r>
           <w:rPr>
             <w:rStyle w:val="Hyperlink"/>
@@ -1688,7 +1562,7 @@
             <w:noProof/>
             <w:webHidden/>
           </w:rPr>
-          <w:instrText xml:space="preserve"> PAGEREF _Toc237003173 \h </w:instrText>
+          <w:instrText xml:space="preserve"> PAGEREF _Toc237009637 \h </w:instrText>
         </w:r>
         <w:r>
           <w:rPr>
@@ -1726,16 +1600,10 @@
           <w:tab w:val="right" w:leader="dot" w:pos="9350"/>
         </w:tabs>
         <w:rPr>
-          <w:rFonts w:asciiTheme="minorHAnsi" w:hAnsiTheme="minorHAnsi"/>
           <w:noProof/>
-          <w:color w:val="auto"/>
-          <w:kern w:val="2"/>
-          <w:sz w:val="24"/>
-          <w:szCs w:val="24"/>
-          <w14:ligatures w14:val="standardContextual"/>
         </w:rPr>
       </w:pPr>
-      <w:hyperlink w:anchor="_Toc237003174" w:history="1">
+      <w:hyperlink w:anchor="_Toc237009638" w:history="1">
         <w:r>
           <w:rPr>
             <w:rStyle w:val="Hyperlink"/>
@@ -1762,7 +1630,7 @@
             <w:noProof/>
             <w:webHidden/>
           </w:rPr>
-          <w:instrText xml:space="preserve"> PAGEREF _Toc237003174 \h </w:instrText>
+          <w:instrText xml:space="preserve"> PAGEREF _Toc237009638 \h </w:instrText>
         </w:r>
         <w:r>
           <w:rPr>
@@ -1800,16 +1668,10 @@
           <w:tab w:val="right" w:leader="dot" w:pos="9350"/>
         </w:tabs>
         <w:rPr>
-          <w:rFonts w:asciiTheme="minorHAnsi" w:hAnsiTheme="minorHAnsi"/>
           <w:noProof/>
-          <w:color w:val="auto"/>
-          <w:kern w:val="2"/>
-          <w:sz w:val="24"/>
-          <w:szCs w:val="24"/>
-          <w14:ligatures w14:val="standardContextual"/>
         </w:rPr>
       </w:pPr>
-      <w:hyperlink w:anchor="_Toc237003175" w:history="1">
+      <w:hyperlink w:anchor="_Toc237009639" w:history="1">
         <w:r>
           <w:rPr>
             <w:rStyle w:val="Hyperlink"/>
@@ -1836,7 +1698,7 @@
             <w:noProof/>
             <w:webHidden/>
           </w:rPr>
-          <w:instrText xml:space="preserve"> PAGEREF _Toc237003175 \h </w:instrText>
+          <w:instrText xml:space="preserve"> PAGEREF _Toc237009639 \h </w:instrText>
         </w:r>
         <w:r>
           <w:rPr>
@@ -1856,7 +1718,7 @@
             <w:noProof/>
             <w:webHidden/>
           </w:rPr>
-          <w:t>8</w:t>
+          <w:t>9</w:t>
         </w:r>
         <w:r>
           <w:rPr>
@@ -1874,16 +1736,10 @@
           <w:tab w:val="right" w:leader="dot" w:pos="9350"/>
         </w:tabs>
         <w:rPr>
-          <w:rFonts w:asciiTheme="minorHAnsi" w:hAnsiTheme="minorHAnsi"/>
           <w:noProof/>
-          <w:color w:val="auto"/>
-          <w:kern w:val="2"/>
-          <w:sz w:val="24"/>
-          <w:szCs w:val="24"/>
-          <w14:ligatures w14:val="standardContextual"/>
         </w:rPr>
       </w:pPr>
-      <w:hyperlink w:anchor="_Toc237003176" w:history="1">
+      <w:hyperlink w:anchor="_Toc237009640" w:history="1">
         <w:r>
           <w:rPr>
             <w:rStyle w:val="Hyperlink"/>
@@ -1910,7 +1766,7 @@
             <w:noProof/>
             <w:webHidden/>
           </w:rPr>
-          <w:instrText xml:space="preserve"> PAGEREF _Toc237003176 \h </w:instrText>
+          <w:instrText xml:space="preserve"> PAGEREF _Toc237009640 \h </w:instrText>
         </w:r>
         <w:r>
           <w:rPr>
@@ -1948,16 +1804,10 @@
           <w:tab w:val="right" w:leader="dot" w:pos="9350"/>
         </w:tabs>
         <w:rPr>
-          <w:rFonts w:asciiTheme="minorHAnsi" w:hAnsiTheme="minorHAnsi"/>
           <w:noProof/>
-          <w:color w:val="auto"/>
-          <w:kern w:val="2"/>
-          <w:sz w:val="24"/>
-          <w:szCs w:val="24"/>
-          <w14:ligatures w14:val="standardContextual"/>
         </w:rPr>
       </w:pPr>
-      <w:hyperlink w:anchor="_Toc237003177" w:history="1">
+      <w:hyperlink w:anchor="_Toc237009641" w:history="1">
         <w:r>
           <w:rPr>
             <w:rStyle w:val="Hyperlink"/>
@@ -1984,7 +1834,7 @@
             <w:noProof/>
             <w:webHidden/>
           </w:rPr>
-          <w:instrText xml:space="preserve"> PAGEREF _Toc237003177 \h </w:instrText>
+          <w:instrText xml:space="preserve"> PAGEREF _Toc237009641 \h </w:instrText>
         </w:r>
         <w:r>
           <w:rPr>
@@ -2022,16 +1872,10 @@
           <w:tab w:val="right" w:leader="dot" w:pos="9350"/>
         </w:tabs>
         <w:rPr>
-          <w:rFonts w:asciiTheme="minorHAnsi" w:hAnsiTheme="minorHAnsi"/>
           <w:noProof/>
-          <w:color w:val="auto"/>
-          <w:kern w:val="2"/>
-          <w:sz w:val="24"/>
-          <w:szCs w:val="24"/>
-          <w14:ligatures w14:val="standardContextual"/>
         </w:rPr>
       </w:pPr>
-      <w:hyperlink w:anchor="_Toc237003178" w:history="1">
+      <w:hyperlink w:anchor="_Toc237009642" w:history="1">
         <w:r>
           <w:rPr>
             <w:rStyle w:val="Hyperlink"/>
@@ -2058,7 +1902,7 @@
             <w:noProof/>
             <w:webHidden/>
           </w:rPr>
-          <w:instrText xml:space="preserve"> PAGEREF _Toc237003178 \h </w:instrText>
+          <w:instrText xml:space="preserve"> PAGEREF _Toc237009642 \h </w:instrText>
         </w:r>
         <w:r>
           <w:rPr>
@@ -2096,16 +1940,10 @@
           <w:tab w:val="right" w:leader="dot" w:pos="9350"/>
         </w:tabs>
         <w:rPr>
-          <w:rFonts w:asciiTheme="minorHAnsi" w:hAnsiTheme="minorHAnsi"/>
           <w:noProof/>
-          <w:color w:val="auto"/>
-          <w:kern w:val="2"/>
-          <w:sz w:val="24"/>
-          <w:szCs w:val="24"/>
-          <w14:ligatures w14:val="standardContextual"/>
         </w:rPr>
       </w:pPr>
-      <w:hyperlink w:anchor="_Toc237003179" w:history="1">
+      <w:hyperlink w:anchor="_Toc237009643" w:history="1">
         <w:r>
           <w:rPr>
             <w:rStyle w:val="Hyperlink"/>
@@ -2132,7 +1970,7 @@
             <w:noProof/>
             <w:webHidden/>
           </w:rPr>
-          <w:instrText xml:space="preserve"> PAGEREF _Toc237003179 \h </w:instrText>
+          <w:instrText xml:space="preserve"> PAGEREF _Toc237009643 \h </w:instrText>
         </w:r>
         <w:r>
           <w:rPr>
@@ -2170,16 +2008,10 @@
           <w:tab w:val="right" w:leader="dot" w:pos="9350"/>
         </w:tabs>
         <w:rPr>
-          <w:rFonts w:asciiTheme="minorHAnsi" w:hAnsiTheme="minorHAnsi"/>
           <w:noProof/>
-          <w:color w:val="auto"/>
-          <w:kern w:val="2"/>
-          <w:sz w:val="24"/>
-          <w:szCs w:val="24"/>
-          <w14:ligatures w14:val="standardContextual"/>
         </w:rPr>
       </w:pPr>
-      <w:hyperlink w:anchor="_Toc237003180" w:history="1">
+      <w:hyperlink w:anchor="_Toc237009644" w:history="1">
         <w:r>
           <w:rPr>
             <w:rStyle w:val="Hyperlink"/>
@@ -2206,7 +2038,7 @@
             <w:noProof/>
             <w:webHidden/>
           </w:rPr>
-          <w:instrText xml:space="preserve"> PAGEREF _Toc237003180 \h </w:instrText>
+          <w:instrText xml:space="preserve"> PAGEREF _Toc237009644 \h </w:instrText>
         </w:r>
         <w:r>
           <w:rPr>
@@ -2244,16 +2076,10 @@
           <w:tab w:val="right" w:leader="dot" w:pos="9350"/>
         </w:tabs>
         <w:rPr>
-          <w:rFonts w:asciiTheme="minorHAnsi" w:hAnsiTheme="minorHAnsi"/>
           <w:noProof/>
-          <w:color w:val="auto"/>
-          <w:kern w:val="2"/>
-          <w:sz w:val="24"/>
-          <w:szCs w:val="24"/>
-          <w14:ligatures w14:val="standardContextual"/>
         </w:rPr>
       </w:pPr>
-      <w:hyperlink w:anchor="_Toc237003181" w:history="1">
+      <w:hyperlink w:anchor="_Toc237009645" w:history="1">
         <w:r>
           <w:rPr>
             <w:rStyle w:val="Hyperlink"/>
@@ -2280,7 +2106,7 @@
             <w:noProof/>
             <w:webHidden/>
           </w:rPr>
-          <w:instrText xml:space="preserve"> PAGEREF _Toc237003181 \h </w:instrText>
+          <w:instrText xml:space="preserve"> PAGEREF _Toc237009645 \h </w:instrText>
         </w:r>
         <w:r>
           <w:rPr>
@@ -2300,7 +2126,7 @@
             <w:noProof/>
             <w:webHidden/>
           </w:rPr>
-          <w:t>11</w:t>
+          <w:t>12</w:t>
         </w:r>
         <w:r>
           <w:rPr>
@@ -2318,16 +2144,10 @@
           <w:tab w:val="right" w:leader="dot" w:pos="9350"/>
         </w:tabs>
         <w:rPr>
-          <w:rFonts w:asciiTheme="minorHAnsi" w:hAnsiTheme="minorHAnsi"/>
           <w:noProof/>
-          <w:color w:val="auto"/>
-          <w:kern w:val="2"/>
-          <w:sz w:val="24"/>
-          <w:szCs w:val="24"/>
-          <w14:ligatures w14:val="standardContextual"/>
         </w:rPr>
       </w:pPr>
-      <w:hyperlink w:anchor="_Toc237003182" w:history="1">
+      <w:hyperlink w:anchor="_Toc237009646" w:history="1">
         <w:r>
           <w:rPr>
             <w:rStyle w:val="Hyperlink"/>
@@ -2354,7 +2174,7 @@
             <w:noProof/>
             <w:webHidden/>
           </w:rPr>
-          <w:instrText xml:space="preserve"> PAGEREF _Toc237003182 \h </w:instrText>
+          <w:instrText xml:space="preserve"> PAGEREF _Toc237009646 \h </w:instrText>
         </w:r>
         <w:r>
           <w:rPr>
@@ -2374,7 +2194,7 @@
             <w:noProof/>
             <w:webHidden/>
           </w:rPr>
-          <w:t>11</w:t>
+          <w:t>12</w:t>
         </w:r>
         <w:r>
           <w:rPr>
@@ -2392,16 +2212,10 @@
           <w:tab w:val="right" w:leader="dot" w:pos="9350"/>
         </w:tabs>
         <w:rPr>
-          <w:rFonts w:asciiTheme="minorHAnsi" w:hAnsiTheme="minorHAnsi"/>
           <w:noProof/>
-          <w:color w:val="auto"/>
-          <w:kern w:val="2"/>
-          <w:sz w:val="24"/>
-          <w:szCs w:val="24"/>
-          <w14:ligatures w14:val="standardContextual"/>
         </w:rPr>
       </w:pPr>
-      <w:hyperlink w:anchor="_Toc237003183" w:history="1">
+      <w:hyperlink w:anchor="_Toc237009647" w:history="1">
         <w:r>
           <w:rPr>
             <w:rStyle w:val="Hyperlink"/>
@@ -2428,7 +2242,7 @@
             <w:noProof/>
             <w:webHidden/>
           </w:rPr>
-          <w:instrText xml:space="preserve"> PAGEREF _Toc237003183 \h </w:instrText>
+          <w:instrText xml:space="preserve"> PAGEREF _Toc237009647 \h </w:instrText>
         </w:r>
         <w:r>
           <w:rPr>
@@ -2448,7 +2262,7 @@
             <w:noProof/>
             <w:webHidden/>
           </w:rPr>
-          <w:t>11</w:t>
+          <w:t>12</w:t>
         </w:r>
         <w:r>
           <w:rPr>
@@ -2481,7 +2295,7 @@
       <w:pPr>
         <w:pStyle w:val="Heading1"/>
       </w:pPr>
-      <w:bookmarkStart w:id="1" w:name="_Toc237003154"/>
+      <w:bookmarkStart w:id="1" w:name="_Toc237009618"/>
       <w:r>
         <w:lastRenderedPageBreak/>
         <w:t>1. Product Scope and Invariants</w:t>
@@ -2550,7 +2364,7 @@
       <w:pPr>
         <w:pStyle w:val="Heading1"/>
       </w:pPr>
-      <w:bookmarkStart w:id="2" w:name="_Toc237003155"/>
+      <w:bookmarkStart w:id="2" w:name="_Toc237009619"/>
       <w:r>
         <w:t>2. Repository and Build Layout</w:t>
       </w:r>
@@ -2944,7 +2758,7 @@
       <w:pPr>
         <w:pStyle w:val="Heading2"/>
       </w:pPr>
-      <w:bookmarkStart w:id="3" w:name="_Toc237003156"/>
+      <w:bookmarkStart w:id="3" w:name="_Toc237009620"/>
       <w:r>
         <w:t>2.1 Toolchain</w:t>
       </w:r>
@@ -2978,7 +2792,7 @@
       <w:pPr>
         <w:pStyle w:val="Heading1"/>
       </w:pPr>
-      <w:bookmarkStart w:id="4" w:name="_Toc237003157"/>
+      <w:bookmarkStart w:id="4" w:name="_Toc237009621"/>
       <w:r>
         <w:t>3. System Architecture</w:t>
       </w:r>
@@ -3391,7 +3205,7 @@
       <w:pPr>
         <w:pStyle w:val="Heading1"/>
       </w:pPr>
-      <w:bookmarkStart w:id="5" w:name="_Toc237003158"/>
+      <w:bookmarkStart w:id="5" w:name="_Toc237009622"/>
       <w:r>
         <w:t>4. Core Data Model and JSON</w:t>
       </w:r>
@@ -3406,7 +3220,7 @@
       <w:pPr>
         <w:pStyle w:val="Heading2"/>
       </w:pPr>
-      <w:bookmarkStart w:id="6" w:name="_Toc237003159"/>
+      <w:bookmarkStart w:id="6" w:name="_Toc237009623"/>
       <w:r>
         <w:t>4.1 Stable keys</w:t>
       </w:r>
@@ -3448,7 +3262,7 @@
       <w:pPr>
         <w:pStyle w:val="Heading2"/>
       </w:pPr>
-      <w:bookmarkStart w:id="7" w:name="_Toc237003160"/>
+      <w:bookmarkStart w:id="7" w:name="_Toc237009624"/>
       <w:r>
         <w:t>4.2 Development catalog</w:t>
       </w:r>
@@ -3466,7 +3280,7 @@
       </w:r>
       <w:r>
         <w:br/>
-        <w:t xml:space="preserve">  "schemaVersion": 2,</w:t>
+        <w:t xml:space="preserve">  "schemaVersion": 3,</w:t>
       </w:r>
       <w:r>
         <w:br/>
@@ -3486,7 +3300,17 @@
       </w:r>
       <w:r>
         <w:br/>
-        <w:t xml:space="preserve">               "translatedText": "Salva", "status": "reviewed",</w:t>
+        <w:t xml:space="preserve">               "translatedText": "Salva", "status": "aiDraft",</w:t>
+      </w:r>
+      <w:r>
+        <w:br/>
+        <w:t xml:space="preserve">               "translationOrigin": "codex",</w:t>
+      </w:r>
+      <w:r>
+        <w:br/>
+      </w:r>
+      <w:r>
+        <w:t xml:space="preserve">               "translationConfidence": "high",</w:t>
       </w:r>
       <w:r>
         <w:br/>
@@ -3501,7 +3325,7 @@
       <w:pPr>
         <w:pStyle w:val="Heading2"/>
       </w:pPr>
-      <w:bookmarkStart w:id="8" w:name="_Toc237003161"/>
+      <w:bookmarkStart w:id="8" w:name="_Toc237009625"/>
       <w:r>
         <w:t>4.3 Runtime pack</w:t>
       </w:r>
@@ -3555,7 +3379,7 @@
       <w:pPr>
         <w:pStyle w:val="Heading1"/>
       </w:pPr>
-      <w:bookmarkStart w:id="9" w:name="_Toc237003162"/>
+      <w:bookmarkStart w:id="9" w:name="_Toc237009626"/>
       <w:r>
         <w:lastRenderedPageBreak/>
         <w:t>5. Project Detection and Scanning</w:t>
@@ -3576,7 +3400,7 @@
       <w:pPr>
         <w:pStyle w:val="Heading2"/>
       </w:pPr>
-      <w:bookmarkStart w:id="10" w:name="_Toc237003163"/>
+      <w:bookmarkStart w:id="10" w:name="_Toc237009627"/>
       <w:r>
         <w:t>5.1 Incremental merge</w:t>
       </w:r>
@@ -3658,7 +3482,7 @@
       <w:pPr>
         <w:pStyle w:val="Heading1"/>
       </w:pPr>
-      <w:bookmarkStart w:id="11" w:name="_Toc237003164"/>
+      <w:bookmarkStart w:id="11" w:name="_Toc237009628"/>
       <w:r>
         <w:t>6. Studio UI and Workflow State</w:t>
       </w:r>
@@ -3666,7 +3490,7 @@
     </w:p>
     <w:p>
       <w:r>
-        <w:t>DAT.Studio.MainForm.fmx contains the complete orange-and-blue interface. The workflow selection rectangle moves among the six required persisted pages and the separately labeled Optional Provider page. DAT.Studio.MainForm.pas contains event and state logic only; it does not construct controls.</w:t>
+        <w:t>DAT.Studio.MainForm.fmx contains the complete orange-and-blue interface. The workflow selection rectangle moves among Project, Scan, Translate, Validation, Export, Integration, and Provider Settings. Begin AI Mode, Copy Prompt, Reload AI Work, and the external-change timer are persisted designer objects. DAT.Studio.MainForm.pas contains event and state logic only; it does not construct controls.</w:t>
       </w:r>
     </w:p>
     <w:p>
@@ -3708,6 +3532,9 @@
           <w:p>
             <w:pPr>
               <w:pStyle w:val="Callout"/>
+              <w:rPr>
+                <w:rFonts w:hint="eastAsia"/>
+              </w:rPr>
             </w:pPr>
             <w:r>
               <w:rPr>
@@ -3727,7 +3554,7 @@
       <w:pPr>
         <w:pStyle w:val="Heading1"/>
       </w:pPr>
-      <w:bookmarkStart w:id="12" w:name="_Toc237003165"/>
+      <w:bookmarkStart w:id="12" w:name="_Toc237009629"/>
       <w:r>
         <w:lastRenderedPageBreak/>
         <w:t>7. Provider Settings and Secret Storage</w:t>
@@ -3996,7 +3823,7 @@
       <w:pPr>
         <w:pStyle w:val="Heading1"/>
       </w:pPr>
-      <w:bookmarkStart w:id="13" w:name="_Toc237003166"/>
+      <w:bookmarkStart w:id="13" w:name="_Toc237009630"/>
       <w:r>
         <w:t>8. Provider HTTP Clients</w:t>
       </w:r>
@@ -4288,7 +4115,7 @@
       <w:pPr>
         <w:pStyle w:val="Heading2"/>
       </w:pPr>
-      <w:bookmarkStart w:id="14" w:name="_Toc237003167"/>
+      <w:bookmarkStart w:id="14" w:name="_Toc237009631"/>
       <w:r>
         <w:t>8.1 Reliability and cancellation</w:t>
       </w:r>
@@ -4346,7 +4173,7 @@
       <w:pPr>
         <w:pStyle w:val="Heading2"/>
       </w:pPr>
-      <w:bookmarkStart w:id="15" w:name="_Toc237003168"/>
+      <w:bookmarkStart w:id="15" w:name="_Toc237009632"/>
       <w:r>
         <w:t>8.2 Official protocol references</w:t>
       </w:r>
@@ -4396,21 +4223,31 @@
       <w:pPr>
         <w:pStyle w:val="Heading1"/>
       </w:pPr>
-      <w:bookmarkStart w:id="16" w:name="_Toc237003169"/>
+      <w:bookmarkStart w:id="16" w:name="_Toc237009633"/>
       <w:r>
-        <w:t>9. Translation Acquisition and Review Semantics</w:t>
+        <w:t>9. In-Place AI Translation and Alternatives</w:t>
       </w:r>
       <w:bookmarkEnd w:id="16"/>
     </w:p>
     <w:p>
       <w:r>
-        <w:t>The canonical workflow is API-free: save development JSON or export UTF-8 CSV, obtain translations outside the Studio, stage an import, review the safety report, and explicitly apply it. The import engine maps rows by stable key, rejects duplicates and unknown keys, detects stale source text/checksums, and protects Reviewed or Approved entries. Accepted imported text receives Imported status.</w:t>
+        <w:t>The canonical workflow uses DAT.Core.AITranslation to coordinate direct edits to the saved development JSON. Begin saves an exact recovery snapshot, ensures the terminology profile, writes the agent contract, records the file SHA-256, and locks Studio editing. A designer-owned timer enables reload only after the same changed hash is stable across two checks.</w:t>
       </w:r>
     </w:p>
     <w:p>
       <w:r>
         <w:lastRenderedPageBreak/>
-        <w:t>Provider translation is optional. When requested, the Studio confirms the unresolved count, resolves the selected provider and credential, sends bounded ordered batches, and commits results only after the provider operation succeeds. Provider output receives Machine translated status.</w:t>
+        <w:t>Reload parses the external file and compares application, framework, language, locale formats, entry count/order, keys, source/checksums, context, developer notes, runtime classification, and wiring confirmation with the pre-session snapshot. Only Needs Translation, Source Changed, Error, and existing AI Draft entries are eligible. Machine-translated, Imported, Edited, Reviewed, Approved, Excluded, and Obsolete entries are protected. Any protected mutation rejects the reload.</w:t>
+      </w:r>
+    </w:p>
+    <w:p>
+      <w:r>
+        <w:t>Allowed changes are normalized to AI Draft while Codex/Claude origin, high/medium/low confidence, and review notes are retained. A metadata-only confirmation is retained when an existing translation remains correct after a source change.</w:t>
+      </w:r>
+    </w:p>
+    <w:p>
+      <w:r>
+        <w:t>CSV/JSON interchange, manual editing, and direct Google/DeepL translation remain alternatives. Provider output receives Machine translated status with its provider origin.</w:t>
       </w:r>
     </w:p>
     <w:p>
@@ -4439,6 +4276,22 @@
         <w:pStyle w:val="ListBullet"/>
       </w:pPr>
       <w:r>
+        <w:t>Translation origin is independent of linguistic status.</w:t>
+      </w:r>
+    </w:p>
+    <w:p>
+      <w:pPr>
+        <w:pStyle w:val="ListBullet"/>
+      </w:pPr>
+      <w:r>
+        <w:t>Low confidence, explicit AI notes, inconsistent repeated terms, and structural defects form the focused exception queue; a valid AI draft is not itself an exception.</w:t>
+      </w:r>
+    </w:p>
+    <w:p>
+      <w:pPr>
+        <w:pStyle w:val="ListBullet"/>
+      </w:pPr>
+      <w:r>
         <w:t>Structural validity, linguistic status, automatic runtime coverage, and manual wiring readiness are separate measures.</w:t>
       </w:r>
     </w:p>
@@ -4454,7 +4307,7 @@
       <w:pPr>
         <w:pStyle w:val="Heading1"/>
       </w:pPr>
-      <w:bookmarkStart w:id="17" w:name="_Toc237003170"/>
+      <w:bookmarkStart w:id="17" w:name="_Toc237009634"/>
       <w:r>
         <w:t>10. Validation and Runtime Pack Export</w:t>
       </w:r>
@@ -4462,7 +4315,7 @@
     </w:p>
     <w:p>
       <w:r>
-        <w:t>DAT.Validation.Catalog validates metadata, missing target text, duplicates, changed source, Delphi indexed and sequential Format arguments, accelerators, and status conditions. Export is blocked by errors. Manual resourcestring wiring is reported separately from structural errors. DAT.Core.RuntimePack serializes only runtime-required metadata and strings and records a source-catalog checksum.</w:t>
+        <w:t>DAT.Validation.Catalog validates metadata, missing target text, duplicates, changed source, Delphi indexed and sequential Format arguments, accelerators, low AI confidence, explicit AI review notes, inconsistent repeated-source terminology, and status conditions. Export is blocked by errors. Manual resourcestring wiring is reported separately from structural errors. DAT.Core.RuntimePack serializes only runtime-required metadata and strings and records a source-catalog checksum.</w:t>
       </w:r>
     </w:p>
     <w:p>
@@ -4474,8 +4327,9 @@
       <w:pPr>
         <w:pStyle w:val="Heading1"/>
       </w:pPr>
-      <w:bookmarkStart w:id="18" w:name="_Toc237003171"/>
+      <w:bookmarkStart w:id="18" w:name="_Toc237009635"/>
       <w:r>
+        <w:lastRenderedPageBreak/>
         <w:t>11. Runtime Engine</w:t>
       </w:r>
       <w:bookmarkEnd w:id="18"/>
@@ -4494,7 +4348,7 @@
       <w:pPr>
         <w:pStyle w:val="Heading2"/>
       </w:pPr>
-      <w:bookmarkStart w:id="19" w:name="_Toc237003172"/>
+      <w:bookmarkStart w:id="19" w:name="_Toc237009636"/>
       <w:r>
         <w:t>11.1 Deployment paths</w:t>
       </w:r>
@@ -4529,7 +4383,6 @@
         <w:pStyle w:val="ListBullet"/>
       </w:pPr>
       <w:r>
-        <w:lastRenderedPageBreak/>
         <w:t>Developer catalogs remain in the target source tree under Localization\Development.</w:t>
       </w:r>
     </w:p>
@@ -4537,7 +4390,7 @@
       <w:pPr>
         <w:pStyle w:val="Heading1"/>
       </w:pPr>
-      <w:bookmarkStart w:id="20" w:name="_Toc237003173"/>
+      <w:bookmarkStart w:id="20" w:name="_Toc237009637"/>
       <w:r>
         <w:t>12. Integration Planning and Transactions</w:t>
       </w:r>
@@ -4562,7 +4415,7 @@
       <w:pPr>
         <w:pStyle w:val="Heading2"/>
       </w:pPr>
-      <w:bookmarkStart w:id="21" w:name="_Toc237003174"/>
+      <w:bookmarkStart w:id="21" w:name="_Toc237009638"/>
       <w:r>
         <w:t>12.1 Generated startup contract</w:t>
       </w:r>
@@ -4597,6 +4450,7 @@
         <w:pStyle w:val="ListBullet"/>
       </w:pPr>
       <w:r>
+        <w:lastRenderedPageBreak/>
         <w:t>SelectLanguageMenuItem derives a locale from datLanguage_&lt;locale&gt; component names.</w:t>
       </w:r>
     </w:p>
@@ -4645,6 +4499,9 @@
           <w:p>
             <w:pPr>
               <w:pStyle w:val="Callout"/>
+              <w:rPr>
+                <w:rFonts w:hint="eastAsia"/>
+              </w:rPr>
             </w:pPr>
             <w:r>
               <w:rPr>
@@ -4664,7 +4521,7 @@
       <w:pPr>
         <w:pStyle w:val="Heading1"/>
       </w:pPr>
-      <w:bookmarkStart w:id="22" w:name="_Toc237003175"/>
+      <w:bookmarkStart w:id="22" w:name="_Toc237009639"/>
       <w:r>
         <w:t>13. Self-Localization</w:t>
       </w:r>
@@ -4679,9 +4536,8 @@
       <w:pPr>
         <w:pStyle w:val="Heading1"/>
       </w:pPr>
-      <w:bookmarkStart w:id="23" w:name="_Toc237003176"/>
+      <w:bookmarkStart w:id="23" w:name="_Toc237009640"/>
       <w:r>
-        <w:lastRenderedPageBreak/>
         <w:t>14. Error Handling and Diagnostics</w:t>
       </w:r>
       <w:bookmarkEnd w:id="23"/>
@@ -4738,7 +4594,7 @@
       <w:pPr>
         <w:pStyle w:val="Heading1"/>
       </w:pPr>
-      <w:bookmarkStart w:id="24" w:name="_Toc237003177"/>
+      <w:bookmarkStart w:id="24" w:name="_Toc237009641"/>
       <w:r>
         <w:t>15. Test Strategy and Verified Matrix</w:t>
       </w:r>
@@ -4829,7 +4685,7 @@
               <w:cnfStyle w:val="000000100000" w:firstRow="0" w:lastRow="0" w:firstColumn="0" w:lastColumn="0" w:oddVBand="0" w:evenVBand="0" w:oddHBand="1" w:evenHBand="0" w:firstRowFirstColumn="0" w:firstRowLastColumn="0" w:lastRowFirstColumn="0" w:lastRowLastColumn="0"/>
             </w:pPr>
             <w:r>
-              <w:t>Detection, scan-to-catalog, deterministic Italian CSV/JSON round-trip, review/approval, validation, runtime pack, preference, exact diff, integration, self change set.</w:t>
+              <w:t>Detection, scan-to-catalog, protected in-place AI session/reload, schema/provenance round-trip, independent CSV fallback, review/approval, validation, runtime pack, preference, exact diff, integration, self change set.</w:t>
             </w:r>
           </w:p>
         </w:tc>
@@ -4880,6 +4736,7 @@
           </w:tcPr>
           <w:p>
             <w:r>
+              <w:lastRenderedPageBreak/>
               <w:t>FMXRuntimeSmokeTests</w:t>
             </w:r>
           </w:p>
@@ -4926,7 +4783,7 @@
               <w:cnfStyle w:val="000000000000" w:firstRow="0" w:lastRow="0" w:firstColumn="0" w:lastColumn="0" w:oddVBand="0" w:evenVBand="0" w:oddHBand="0" w:evenHBand="0" w:firstRowFirstColumn="0" w:firstRowLastColumn="0" w:lastRowFirstColumn="0" w:lastRowLastColumn="0"/>
             </w:pPr>
             <w:r>
-              <w:t>Direct FMX stream/create, exact-review controls, linguistic action wiring, optional-provider activation.</w:t>
+              <w:t>Direct FMX stream/create, designer-owned in-place AI controls/timer, exact-review controls, linguistic action wiring, and provider alternative activation.</w:t>
             </w:r>
           </w:p>
         </w:tc>
@@ -4959,7 +4816,7 @@
               <w:cnfStyle w:val="000000100000" w:firstRow="0" w:lastRow="0" w:firstColumn="0" w:lastColumn="0" w:oddVBand="0" w:evenVBand="0" w:oddHBand="1" w:evenHBand="0" w:firstRowFirstColumn="0" w:firstRowLastColumn="0" w:lastRowFirstColumn="0" w:lastRowLastColumn="0"/>
             </w:pPr>
             <w:r>
-              <w:t>Both compilers, scan/CSV/validation pipeline, disposable integrated VCL/FMX builds, deployed Italian pack, and required Italian launch title.</w:t>
+              <w:t>Both compilers, protected in-place AI pilot pipeline, disposable integrated VCL/FMX builds, deployed Italian pack, and required Italian launch title.</w:t>
             </w:r>
           </w:p>
         </w:tc>
@@ -5032,18 +4889,17 @@
     </w:tbl>
     <w:p>
       <w:r>
-        <w:t xml:space="preserve">On August 7, 2026, the API-free reference pilots passed under both Win32 and Win64: real compilable VCL and FMX samples were scanned, translated through deterministic CSV/JSON interchange, reviewed, approved, validated, exported, integrated, built, deployed, and launched with the required Italian title. </w:t>
+        <w:t>On August 7, 2026, the release gate passed with real compilable VCL and FMX samples under both Win32 and Win64. Each sample was scanned, translated by a deterministic Codex-style direct edit of its canonical JSON, protected-field reviewed, reloaded as AI Draft with provenance, reviewed, approved, validated, exported, integrated, built, deployed, and launched with the required Italian title. Snapshot creation and protected mutation rejection passed. The Studio also built with zero warnings and errors in Debu</w:t>
       </w:r>
       <w:r>
-        <w:lastRenderedPageBreak/>
-        <w:t>Visual review confirmed translated representative controls without clipping. Final release validation also covers Debug and Release Studio builds, direct FMX form streaming, normal launch, and Italian self-localization.</w:t>
+        <w:t>g and Release for both architectures, streamed its FMX form directly, launched normally, and self-localized to Italian in all four configurations.</w:t>
       </w:r>
     </w:p>
     <w:p>
       <w:pPr>
         <w:pStyle w:val="Heading2"/>
       </w:pPr>
-      <w:bookmarkStart w:id="25" w:name="_Toc237003178"/>
+      <w:bookmarkStart w:id="25" w:name="_Toc237009642"/>
       <w:r>
         <w:t>15.1 Optional live provider testing</w:t>
       </w:r>
@@ -5051,14 +4907,14 @@
     </w:p>
     <w:p>
       <w:r>
-        <w:t>Automated fixtures must not contain live keys. Optional provider acceptance uses an owner-supplied restricted key through Optional Provider, confirms Test Connection, translates a small disposable catalog, checks Machine translated status, then removes or rotates the test key. Provider availability is external state and is not a release blocker for the API-free workflow or offline runtime.</w:t>
+        <w:t>Automated fixtures must not contain live keys. Optional provider acceptance uses an owner-supplied restricted key through Provider Settings, confirms Test Connection, translates a small disposable catalog, checks Machine translated status and provider provenance, then removes or rotates the test key. Provider availability is external state and is not a release blocker for the primary Codex/Claude workflow or offline runtime.</w:t>
       </w:r>
     </w:p>
     <w:p>
       <w:pPr>
         <w:pStyle w:val="Heading1"/>
       </w:pPr>
-      <w:bookmarkStart w:id="26" w:name="_Toc237003179"/>
+      <w:bookmarkStart w:id="26" w:name="_Toc237009643"/>
       <w:r>
         <w:t>16. Security Review</w:t>
       </w:r>
@@ -5135,6 +4991,7 @@
           </w:tcPr>
           <w:p>
             <w:r>
+              <w:lastRenderedPageBreak/>
               <w:t>Key committed to Git</w:t>
             </w:r>
           </w:p>
@@ -5330,7 +5187,7 @@
           </w:tcPr>
           <w:p>
             <w:r>
-              <w:t>Pack for wrong application</w:t>
+              <w:t>Agent corrupts catalog structure</w:t>
             </w:r>
           </w:p>
         </w:tc>
@@ -5344,6 +5201,38 @@
               <w:cnfStyle w:val="000000100000" w:firstRow="0" w:lastRow="0" w:firstColumn="0" w:lastColumn="0" w:oddVBand="0" w:evenVBand="0" w:oddHBand="1" w:evenHBand="0" w:firstRowFirstColumn="0" w:firstRowLastColumn="0" w:lastRowFirstColumn="0" w:lastRowLastColumn="0"/>
             </w:pPr>
             <w:r>
+              <w:t>Exact pre-session snapshot, protected-field comparison, all-or-nothing reload, and explicit recovery.</w:t>
+            </w:r>
+          </w:p>
+        </w:tc>
+      </w:tr>
+      <w:tr>
+        <w:trPr>
+          <w:cantSplit/>
+          <w:jc w:val="center"/>
+        </w:trPr>
+        <w:tc>
+          <w:tcPr>
+            <w:cnfStyle w:val="001000000000" w:firstRow="0" w:lastRow="0" w:firstColumn="1" w:lastColumn="0" w:oddVBand="0" w:evenVBand="0" w:oddHBand="0" w:evenHBand="0" w:firstRowFirstColumn="0" w:firstRowLastColumn="0" w:lastRowFirstColumn="0" w:lastRowLastColumn="0"/>
+            <w:tcW w:w="2700" w:type="dxa"/>
+            <w:vAlign w:val="center"/>
+          </w:tcPr>
+          <w:p>
+            <w:r>
+              <w:t>Pack for wrong application</w:t>
+            </w:r>
+          </w:p>
+        </w:tc>
+        <w:tc>
+          <w:tcPr>
+            <w:tcW w:w="6660" w:type="dxa"/>
+            <w:vAlign w:val="center"/>
+          </w:tcPr>
+          <w:p>
+            <w:pPr>
+              <w:cnfStyle w:val="000000000000" w:firstRow="0" w:lastRow="0" w:firstColumn="0" w:lastColumn="0" w:oddVBand="0" w:evenVBand="0" w:oddHBand="0" w:evenHBand="0" w:firstRowFirstColumn="0" w:firstRowLastColumn="0" w:lastRowFirstColumn="0" w:lastRowLastColumn="0"/>
+            </w:pPr>
+            <w:r>
               <w:t>applicationId validation in pack discovery/loading.</w:t>
             </w:r>
           </w:p>
@@ -5359,9 +5248,8 @@
       <w:pPr>
         <w:pStyle w:val="Heading1"/>
       </w:pPr>
-      <w:bookmarkStart w:id="27" w:name="_Toc237003180"/>
+      <w:bookmarkStart w:id="27" w:name="_Toc237009644"/>
       <w:r>
-        <w:lastRenderedPageBreak/>
         <w:t>17. Release and Contribution Workflow</w:t>
       </w:r>
       <w:bookmarkEnd w:id="27"/>
@@ -5478,8 +5366,9 @@
       <w:pPr>
         <w:pStyle w:val="Heading1"/>
       </w:pPr>
-      <w:bookmarkStart w:id="28" w:name="_Toc237003181"/>
+      <w:bookmarkStart w:id="28" w:name="_Toc237009645"/>
       <w:r>
+        <w:lastRenderedPageBreak/>
         <w:t>18. Known Boundaries and Future-Compatible Design</w:t>
       </w:r>
       <w:bookmarkEnd w:id="28"/>
@@ -5513,6 +5402,14 @@
         <w:pStyle w:val="ListBullet"/>
       </w:pPr>
       <w:r>
+        <w:t>The Studio prepares and monitors the workspace but does not launch or authenticate Codex or Claude; the developer starts the chosen agent with the generated contract.</w:t>
+      </w:r>
+    </w:p>
+    <w:p>
+      <w:pPr>
+        <w:pStyle w:val="ListBullet"/>
+      </w:pPr>
+      <w:r>
         <w:t>No automatic control resizing/reflow is performed.</w:t>
       </w:r>
     </w:p>
@@ -5544,7 +5441,7 @@
       <w:pPr>
         <w:pStyle w:val="Heading1"/>
       </w:pPr>
-      <w:bookmarkStart w:id="29" w:name="_Toc237003182"/>
+      <w:bookmarkStart w:id="29" w:name="_Toc237009646"/>
       <w:r>
         <w:t>19. Documentation Generation</w:t>
       </w:r>
@@ -5559,7 +5456,7 @@
       <w:pPr>
         <w:pStyle w:val="Heading1"/>
       </w:pPr>
-      <w:bookmarkStart w:id="30" w:name="_Toc237003183"/>
+      <w:bookmarkStart w:id="30" w:name="_Toc237009647"/>
       <w:r>
         <w:t>20. Source References</w:t>
       </w:r>
@@ -5586,7 +5483,6 @@
         <w:pStyle w:val="ListBullet"/>
       </w:pPr>
       <w:r>
-        <w:lastRenderedPageBreak/>
         <w:t>Windows CREDENTIAL structure: https://learn.microsoft.com/en-us/windows/win32/api/wincred/ns-wincred-credentialw</w:t>
       </w:r>
     </w:p>
@@ -6028,40 +5924,40 @@
       </w:rPr>
     </w:lvl>
   </w:abstractNum>
-  <w:num w:numId="1" w16cid:durableId="863057343">
+  <w:num w:numId="1" w16cid:durableId="1820229188">
     <w:abstractNumId w:val="8"/>
   </w:num>
-  <w:num w:numId="2" w16cid:durableId="828906464">
+  <w:num w:numId="2" w16cid:durableId="299773959">
     <w:abstractNumId w:val="6"/>
   </w:num>
-  <w:num w:numId="3" w16cid:durableId="45447902">
+  <w:num w:numId="3" w16cid:durableId="1819300345">
     <w:abstractNumId w:val="5"/>
   </w:num>
-  <w:num w:numId="4" w16cid:durableId="1963723668">
+  <w:num w:numId="4" w16cid:durableId="859046140">
     <w:abstractNumId w:val="4"/>
   </w:num>
-  <w:num w:numId="5" w16cid:durableId="1792161673">
+  <w:num w:numId="5" w16cid:durableId="554656325">
     <w:abstractNumId w:val="7"/>
   </w:num>
-  <w:num w:numId="6" w16cid:durableId="1695837501">
+  <w:num w:numId="6" w16cid:durableId="1593274723">
     <w:abstractNumId w:val="3"/>
   </w:num>
-  <w:num w:numId="7" w16cid:durableId="99381016">
+  <w:num w:numId="7" w16cid:durableId="801582366">
     <w:abstractNumId w:val="2"/>
   </w:num>
-  <w:num w:numId="8" w16cid:durableId="1114178383">
+  <w:num w:numId="8" w16cid:durableId="1844591158">
     <w:abstractNumId w:val="1"/>
   </w:num>
-  <w:num w:numId="9" w16cid:durableId="774447203">
+  <w:num w:numId="9" w16cid:durableId="1556965801">
     <w:abstractNumId w:val="0"/>
   </w:num>
-  <w:num w:numId="10" w16cid:durableId="1228227445">
+  <w:num w:numId="10" w16cid:durableId="828785202">
     <w:abstractNumId w:val="7"/>
     <w:lvlOverride w:ilvl="0">
       <w:startOverride w:val="1"/>
     </w:lvlOverride>
   </w:num>
-  <w:num w:numId="11" w16cid:durableId="1702782989">
+  <w:num w:numId="11" w16cid:durableId="214123379">
     <w:abstractNumId w:val="7"/>
     <w:lvlOverride w:ilvl="0">
       <w:startOverride w:val="1"/>
@@ -17488,7 +17384,7 @@
     <w:autoRedefine/>
     <w:uiPriority w:val="39"/>
     <w:unhideWhenUsed/>
-    <w:rsid w:val="00727965"/>
+    <w:rsid w:val="00FE2E4D"/>
     <w:pPr>
       <w:spacing w:after="100"/>
     </w:pPr>
@@ -17500,7 +17396,7 @@
     <w:autoRedefine/>
     <w:uiPriority w:val="39"/>
     <w:unhideWhenUsed/>
-    <w:rsid w:val="00727965"/>
+    <w:rsid w:val="00FE2E4D"/>
     <w:pPr>
       <w:spacing w:after="100"/>
       <w:ind w:left="220"/>
@@ -17511,7 +17407,7 @@
     <w:basedOn w:val="DefaultParagraphFont"/>
     <w:uiPriority w:val="99"/>
     <w:unhideWhenUsed/>
-    <w:rsid w:val="00727965"/>
+    <w:rsid w:val="00FE2E4D"/>
     <w:rPr>
       <w:color w:val="0000FF" w:themeColor="hyperlink"/>
       <w:u w:val="single"/>

</xml_diff>

<commit_message>
Add automatic agent translation and responsive maximized UI
</commit_message>
<xml_diff>
--- a/docs/guides/Delphi App Translation Studio Engineering Guide.docx
+++ b/docs/guides/Delphi App Translation Studio Engineering Guide.docx
@@ -13,7 +13,7 @@
           <w:noProof/>
         </w:rPr>
         <w:drawing>
-          <wp:inline distT="0" distB="0" distL="0" distR="0" wp14:anchorId="7F665DA5" wp14:editId="1523707D">
+          <wp:inline distT="0" distB="0" distL="0" distR="0" wp14:anchorId="5BD57C41" wp14:editId="280CABC5">
             <wp:extent cx="1371600" cy="1371600"/>
             <wp:effectExtent l="0" t="0" r="0" b="0"/>
             <wp:docPr id="1" name="Picture 1"/>
@@ -149,7 +149,7 @@
       <w:pPr>
         <w:pStyle w:val="Heading1"/>
       </w:pPr>
-      <w:bookmarkStart w:id="0" w:name="_Toc237009617"/>
+      <w:bookmarkStart w:id="0" w:name="_Toc237016607"/>
       <w:r>
         <w:lastRenderedPageBreak/>
         <w:t>Table of Contents</w:t>
@@ -175,7 +175,7 @@
       <w:r>
         <w:fldChar w:fldCharType="separate"/>
       </w:r>
-      <w:hyperlink w:anchor="_Toc237009617" w:history="1">
+      <w:hyperlink w:anchor="_Toc237016607" w:history="1">
         <w:r>
           <w:rPr>
             <w:rStyle w:val="Hyperlink"/>
@@ -202,7 +202,7 @@
             <w:noProof/>
             <w:webHidden/>
           </w:rPr>
-          <w:instrText xml:space="preserve"> PAGEREF _Toc237009617 \h </w:instrText>
+          <w:instrText xml:space="preserve"> PAGEREF _Toc237016607 \h </w:instrText>
         </w:r>
         <w:r>
           <w:rPr>
@@ -243,7 +243,7 @@
           <w:noProof/>
         </w:rPr>
       </w:pPr>
-      <w:hyperlink w:anchor="_Toc237009618" w:history="1">
+      <w:hyperlink w:anchor="_Toc237016608" w:history="1">
         <w:r>
           <w:rPr>
             <w:rStyle w:val="Hyperlink"/>
@@ -270,7 +270,7 @@
             <w:noProof/>
             <w:webHidden/>
           </w:rPr>
-          <w:instrText xml:space="preserve"> PAGEREF _Toc237009618 \h </w:instrText>
+          <w:instrText xml:space="preserve"> PAGEREF _Toc237016608 \h </w:instrText>
         </w:r>
         <w:r>
           <w:rPr>
@@ -311,7 +311,7 @@
           <w:noProof/>
         </w:rPr>
       </w:pPr>
-      <w:hyperlink w:anchor="_Toc237009619" w:history="1">
+      <w:hyperlink w:anchor="_Toc237016609" w:history="1">
         <w:r>
           <w:rPr>
             <w:rStyle w:val="Hyperlink"/>
@@ -338,7 +338,7 @@
             <w:noProof/>
             <w:webHidden/>
           </w:rPr>
-          <w:instrText xml:space="preserve"> PAGEREF _Toc237009619 \h </w:instrText>
+          <w:instrText xml:space="preserve"> PAGEREF _Toc237016609 \h </w:instrText>
         </w:r>
         <w:r>
           <w:rPr>
@@ -379,7 +379,7 @@
           <w:noProof/>
         </w:rPr>
       </w:pPr>
-      <w:hyperlink w:anchor="_Toc237009620" w:history="1">
+      <w:hyperlink w:anchor="_Toc237016610" w:history="1">
         <w:r>
           <w:rPr>
             <w:rStyle w:val="Hyperlink"/>
@@ -406,7 +406,7 @@
             <w:noProof/>
             <w:webHidden/>
           </w:rPr>
-          <w:instrText xml:space="preserve"> PAGEREF _Toc237009620 \h </w:instrText>
+          <w:instrText xml:space="preserve"> PAGEREF _Toc237016610 \h </w:instrText>
         </w:r>
         <w:r>
           <w:rPr>
@@ -447,7 +447,7 @@
           <w:noProof/>
         </w:rPr>
       </w:pPr>
-      <w:hyperlink w:anchor="_Toc237009621" w:history="1">
+      <w:hyperlink w:anchor="_Toc237016611" w:history="1">
         <w:r>
           <w:rPr>
             <w:rStyle w:val="Hyperlink"/>
@@ -474,7 +474,7 @@
             <w:noProof/>
             <w:webHidden/>
           </w:rPr>
-          <w:instrText xml:space="preserve"> PAGEREF _Toc237009621 \h </w:instrText>
+          <w:instrText xml:space="preserve"> PAGEREF _Toc237016611 \h </w:instrText>
         </w:r>
         <w:r>
           <w:rPr>
@@ -515,7 +515,7 @@
           <w:noProof/>
         </w:rPr>
       </w:pPr>
-      <w:hyperlink w:anchor="_Toc237009622" w:history="1">
+      <w:hyperlink w:anchor="_Toc237016612" w:history="1">
         <w:r>
           <w:rPr>
             <w:rStyle w:val="Hyperlink"/>
@@ -542,7 +542,7 @@
             <w:noProof/>
             <w:webHidden/>
           </w:rPr>
-          <w:instrText xml:space="preserve"> PAGEREF _Toc237009622 \h </w:instrText>
+          <w:instrText xml:space="preserve"> PAGEREF _Toc237016612 \h </w:instrText>
         </w:r>
         <w:r>
           <w:rPr>
@@ -583,7 +583,7 @@
           <w:noProof/>
         </w:rPr>
       </w:pPr>
-      <w:hyperlink w:anchor="_Toc237009623" w:history="1">
+      <w:hyperlink w:anchor="_Toc237016613" w:history="1">
         <w:r>
           <w:rPr>
             <w:rStyle w:val="Hyperlink"/>
@@ -610,7 +610,7 @@
             <w:noProof/>
             <w:webHidden/>
           </w:rPr>
-          <w:instrText xml:space="preserve"> PAGEREF _Toc237009623 \h </w:instrText>
+          <w:instrText xml:space="preserve"> PAGEREF _Toc237016613 \h </w:instrText>
         </w:r>
         <w:r>
           <w:rPr>
@@ -651,7 +651,7 @@
           <w:noProof/>
         </w:rPr>
       </w:pPr>
-      <w:hyperlink w:anchor="_Toc237009624" w:history="1">
+      <w:hyperlink w:anchor="_Toc237016614" w:history="1">
         <w:r>
           <w:rPr>
             <w:rStyle w:val="Hyperlink"/>
@@ -678,7 +678,7 @@
             <w:noProof/>
             <w:webHidden/>
           </w:rPr>
-          <w:instrText xml:space="preserve"> PAGEREF _Toc237009624 \h </w:instrText>
+          <w:instrText xml:space="preserve"> PAGEREF _Toc237016614 \h </w:instrText>
         </w:r>
         <w:r>
           <w:rPr>
@@ -719,7 +719,7 @@
           <w:noProof/>
         </w:rPr>
       </w:pPr>
-      <w:hyperlink w:anchor="_Toc237009625" w:history="1">
+      <w:hyperlink w:anchor="_Toc237016615" w:history="1">
         <w:r>
           <w:rPr>
             <w:rStyle w:val="Hyperlink"/>
@@ -746,7 +746,7 @@
             <w:noProof/>
             <w:webHidden/>
           </w:rPr>
-          <w:instrText xml:space="preserve"> PAGEREF _Toc237009625 \h </w:instrText>
+          <w:instrText xml:space="preserve"> PAGEREF _Toc237016615 \h </w:instrText>
         </w:r>
         <w:r>
           <w:rPr>
@@ -787,7 +787,7 @@
           <w:noProof/>
         </w:rPr>
       </w:pPr>
-      <w:hyperlink w:anchor="_Toc237009626" w:history="1">
+      <w:hyperlink w:anchor="_Toc237016616" w:history="1">
         <w:r>
           <w:rPr>
             <w:rStyle w:val="Hyperlink"/>
@@ -814,7 +814,7 @@
             <w:noProof/>
             <w:webHidden/>
           </w:rPr>
-          <w:instrText xml:space="preserve"> PAGEREF _Toc237009626 \h </w:instrText>
+          <w:instrText xml:space="preserve"> PAGEREF _Toc237016616 \h </w:instrText>
         </w:r>
         <w:r>
           <w:rPr>
@@ -855,7 +855,7 @@
           <w:noProof/>
         </w:rPr>
       </w:pPr>
-      <w:hyperlink w:anchor="_Toc237009627" w:history="1">
+      <w:hyperlink w:anchor="_Toc237016617" w:history="1">
         <w:r>
           <w:rPr>
             <w:rStyle w:val="Hyperlink"/>
@@ -882,7 +882,7 @@
             <w:noProof/>
             <w:webHidden/>
           </w:rPr>
-          <w:instrText xml:space="preserve"> PAGEREF _Toc237009627 \h </w:instrText>
+          <w:instrText xml:space="preserve"> PAGEREF _Toc237016617 \h </w:instrText>
         </w:r>
         <w:r>
           <w:rPr>
@@ -923,7 +923,7 @@
           <w:noProof/>
         </w:rPr>
       </w:pPr>
-      <w:hyperlink w:anchor="_Toc237009628" w:history="1">
+      <w:hyperlink w:anchor="_Toc237016618" w:history="1">
         <w:r>
           <w:rPr>
             <w:rStyle w:val="Hyperlink"/>
@@ -950,7 +950,7 @@
             <w:noProof/>
             <w:webHidden/>
           </w:rPr>
-          <w:instrText xml:space="preserve"> PAGEREF _Toc237009628 \h </w:instrText>
+          <w:instrText xml:space="preserve"> PAGEREF _Toc237016618 \h </w:instrText>
         </w:r>
         <w:r>
           <w:rPr>
@@ -991,13 +991,13 @@
           <w:noProof/>
         </w:rPr>
       </w:pPr>
-      <w:hyperlink w:anchor="_Toc237009629" w:history="1">
+      <w:hyperlink w:anchor="_Toc237016619" w:history="1">
         <w:r>
           <w:rPr>
             <w:rStyle w:val="Hyperlink"/>
             <w:noProof/>
           </w:rPr>
-          <w:t>7. Provider Settings and Secret Storage</w:t>
+          <w:t>7. Agent Execution, Provider Settings, and Secret Storage</w:t>
         </w:r>
         <w:r>
           <w:rPr>
@@ -1018,7 +1018,7 @@
             <w:noProof/>
             <w:webHidden/>
           </w:rPr>
-          <w:instrText xml:space="preserve"> PAGEREF _Toc237009629 \h </w:instrText>
+          <w:instrText xml:space="preserve"> PAGEREF _Toc237016619 \h </w:instrText>
         </w:r>
         <w:r>
           <w:rPr>
@@ -1059,7 +1059,7 @@
           <w:noProof/>
         </w:rPr>
       </w:pPr>
-      <w:hyperlink w:anchor="_Toc237009630" w:history="1">
+      <w:hyperlink w:anchor="_Toc237016620" w:history="1">
         <w:r>
           <w:rPr>
             <w:rStyle w:val="Hyperlink"/>
@@ -1086,7 +1086,7 @@
             <w:noProof/>
             <w:webHidden/>
           </w:rPr>
-          <w:instrText xml:space="preserve"> PAGEREF _Toc237009630 \h </w:instrText>
+          <w:instrText xml:space="preserve"> PAGEREF _Toc237016620 \h </w:instrText>
         </w:r>
         <w:r>
           <w:rPr>
@@ -1106,7 +1106,7 @@
             <w:noProof/>
             <w:webHidden/>
           </w:rPr>
-          <w:t>5</w:t>
+          <w:t>6</w:t>
         </w:r>
         <w:r>
           <w:rPr>
@@ -1127,7 +1127,7 @@
           <w:noProof/>
         </w:rPr>
       </w:pPr>
-      <w:hyperlink w:anchor="_Toc237009631" w:history="1">
+      <w:hyperlink w:anchor="_Toc237016621" w:history="1">
         <w:r>
           <w:rPr>
             <w:rStyle w:val="Hyperlink"/>
@@ -1154,7 +1154,7 @@
             <w:noProof/>
             <w:webHidden/>
           </w:rPr>
-          <w:instrText xml:space="preserve"> PAGEREF _Toc237009631 \h </w:instrText>
+          <w:instrText xml:space="preserve"> PAGEREF _Toc237016621 \h </w:instrText>
         </w:r>
         <w:r>
           <w:rPr>
@@ -1195,7 +1195,7 @@
           <w:noProof/>
         </w:rPr>
       </w:pPr>
-      <w:hyperlink w:anchor="_Toc237009632" w:history="1">
+      <w:hyperlink w:anchor="_Toc237016622" w:history="1">
         <w:r>
           <w:rPr>
             <w:rStyle w:val="Hyperlink"/>
@@ -1222,7 +1222,7 @@
             <w:noProof/>
             <w:webHidden/>
           </w:rPr>
-          <w:instrText xml:space="preserve"> PAGEREF _Toc237009632 \h </w:instrText>
+          <w:instrText xml:space="preserve"> PAGEREF _Toc237016622 \h </w:instrText>
         </w:r>
         <w:r>
           <w:rPr>
@@ -1263,7 +1263,7 @@
           <w:noProof/>
         </w:rPr>
       </w:pPr>
-      <w:hyperlink w:anchor="_Toc237009633" w:history="1">
+      <w:hyperlink w:anchor="_Toc237016623" w:history="1">
         <w:r>
           <w:rPr>
             <w:rStyle w:val="Hyperlink"/>
@@ -1290,7 +1290,7 @@
             <w:noProof/>
             <w:webHidden/>
           </w:rPr>
-          <w:instrText xml:space="preserve"> PAGEREF _Toc237009633 \h </w:instrText>
+          <w:instrText xml:space="preserve"> PAGEREF _Toc237016623 \h </w:instrText>
         </w:r>
         <w:r>
           <w:rPr>
@@ -1310,7 +1310,7 @@
             <w:noProof/>
             <w:webHidden/>
           </w:rPr>
-          <w:t>6</w:t>
+          <w:t>7</w:t>
         </w:r>
         <w:r>
           <w:rPr>
@@ -1331,7 +1331,7 @@
           <w:noProof/>
         </w:rPr>
       </w:pPr>
-      <w:hyperlink w:anchor="_Toc237009634" w:history="1">
+      <w:hyperlink w:anchor="_Toc237016624" w:history="1">
         <w:r>
           <w:rPr>
             <w:rStyle w:val="Hyperlink"/>
@@ -1358,7 +1358,7 @@
             <w:noProof/>
             <w:webHidden/>
           </w:rPr>
-          <w:instrText xml:space="preserve"> PAGEREF _Toc237009634 \h </w:instrText>
+          <w:instrText xml:space="preserve"> PAGEREF _Toc237016624 \h </w:instrText>
         </w:r>
         <w:r>
           <w:rPr>
@@ -1378,7 +1378,7 @@
             <w:noProof/>
             <w:webHidden/>
           </w:rPr>
-          <w:t>7</w:t>
+          <w:t>8</w:t>
         </w:r>
         <w:r>
           <w:rPr>
@@ -1399,7 +1399,7 @@
           <w:noProof/>
         </w:rPr>
       </w:pPr>
-      <w:hyperlink w:anchor="_Toc237009635" w:history="1">
+      <w:hyperlink w:anchor="_Toc237016625" w:history="1">
         <w:r>
           <w:rPr>
             <w:rStyle w:val="Hyperlink"/>
@@ -1426,7 +1426,7 @@
             <w:noProof/>
             <w:webHidden/>
           </w:rPr>
-          <w:instrText xml:space="preserve"> PAGEREF _Toc237009635 \h </w:instrText>
+          <w:instrText xml:space="preserve"> PAGEREF _Toc237016625 \h </w:instrText>
         </w:r>
         <w:r>
           <w:rPr>
@@ -1467,7 +1467,7 @@
           <w:noProof/>
         </w:rPr>
       </w:pPr>
-      <w:hyperlink w:anchor="_Toc237009636" w:history="1">
+      <w:hyperlink w:anchor="_Toc237016626" w:history="1">
         <w:r>
           <w:rPr>
             <w:rStyle w:val="Hyperlink"/>
@@ -1494,7 +1494,7 @@
             <w:noProof/>
             <w:webHidden/>
           </w:rPr>
-          <w:instrText xml:space="preserve"> PAGEREF _Toc237009636 \h </w:instrText>
+          <w:instrText xml:space="preserve"> PAGEREF _Toc237016626 \h </w:instrText>
         </w:r>
         <w:r>
           <w:rPr>
@@ -1535,7 +1535,7 @@
           <w:noProof/>
         </w:rPr>
       </w:pPr>
-      <w:hyperlink w:anchor="_Toc237009637" w:history="1">
+      <w:hyperlink w:anchor="_Toc237016627" w:history="1">
         <w:r>
           <w:rPr>
             <w:rStyle w:val="Hyperlink"/>
@@ -1562,7 +1562,7 @@
             <w:noProof/>
             <w:webHidden/>
           </w:rPr>
-          <w:instrText xml:space="preserve"> PAGEREF _Toc237009637 \h </w:instrText>
+          <w:instrText xml:space="preserve"> PAGEREF _Toc237016627 \h </w:instrText>
         </w:r>
         <w:r>
           <w:rPr>
@@ -1603,7 +1603,7 @@
           <w:noProof/>
         </w:rPr>
       </w:pPr>
-      <w:hyperlink w:anchor="_Toc237009638" w:history="1">
+      <w:hyperlink w:anchor="_Toc237016628" w:history="1">
         <w:r>
           <w:rPr>
             <w:rStyle w:val="Hyperlink"/>
@@ -1630,7 +1630,7 @@
             <w:noProof/>
             <w:webHidden/>
           </w:rPr>
-          <w:instrText xml:space="preserve"> PAGEREF _Toc237009638 \h </w:instrText>
+          <w:instrText xml:space="preserve"> PAGEREF _Toc237016628 \h </w:instrText>
         </w:r>
         <w:r>
           <w:rPr>
@@ -1650,7 +1650,7 @@
             <w:noProof/>
             <w:webHidden/>
           </w:rPr>
-          <w:t>8</w:t>
+          <w:t>9</w:t>
         </w:r>
         <w:r>
           <w:rPr>
@@ -1671,7 +1671,7 @@
           <w:noProof/>
         </w:rPr>
       </w:pPr>
-      <w:hyperlink w:anchor="_Toc237009639" w:history="1">
+      <w:hyperlink w:anchor="_Toc237016629" w:history="1">
         <w:r>
           <w:rPr>
             <w:rStyle w:val="Hyperlink"/>
@@ -1698,7 +1698,7 @@
             <w:noProof/>
             <w:webHidden/>
           </w:rPr>
-          <w:instrText xml:space="preserve"> PAGEREF _Toc237009639 \h </w:instrText>
+          <w:instrText xml:space="preserve"> PAGEREF _Toc237016629 \h </w:instrText>
         </w:r>
         <w:r>
           <w:rPr>
@@ -1739,7 +1739,7 @@
           <w:noProof/>
         </w:rPr>
       </w:pPr>
-      <w:hyperlink w:anchor="_Toc237009640" w:history="1">
+      <w:hyperlink w:anchor="_Toc237016630" w:history="1">
         <w:r>
           <w:rPr>
             <w:rStyle w:val="Hyperlink"/>
@@ -1766,7 +1766,7 @@
             <w:noProof/>
             <w:webHidden/>
           </w:rPr>
-          <w:instrText xml:space="preserve"> PAGEREF _Toc237009640 \h </w:instrText>
+          <w:instrText xml:space="preserve"> PAGEREF _Toc237016630 \h </w:instrText>
         </w:r>
         <w:r>
           <w:rPr>
@@ -1807,7 +1807,7 @@
           <w:noProof/>
         </w:rPr>
       </w:pPr>
-      <w:hyperlink w:anchor="_Toc237009641" w:history="1">
+      <w:hyperlink w:anchor="_Toc237016631" w:history="1">
         <w:r>
           <w:rPr>
             <w:rStyle w:val="Hyperlink"/>
@@ -1834,7 +1834,7 @@
             <w:noProof/>
             <w:webHidden/>
           </w:rPr>
-          <w:instrText xml:space="preserve"> PAGEREF _Toc237009641 \h </w:instrText>
+          <w:instrText xml:space="preserve"> PAGEREF _Toc237016631 \h </w:instrText>
         </w:r>
         <w:r>
           <w:rPr>
@@ -1854,7 +1854,7 @@
             <w:noProof/>
             <w:webHidden/>
           </w:rPr>
-          <w:t>9</w:t>
+          <w:t>10</w:t>
         </w:r>
         <w:r>
           <w:rPr>
@@ -1875,7 +1875,7 @@
           <w:noProof/>
         </w:rPr>
       </w:pPr>
-      <w:hyperlink w:anchor="_Toc237009642" w:history="1">
+      <w:hyperlink w:anchor="_Toc237016632" w:history="1">
         <w:r>
           <w:rPr>
             <w:rStyle w:val="Hyperlink"/>
@@ -1902,7 +1902,7 @@
             <w:noProof/>
             <w:webHidden/>
           </w:rPr>
-          <w:instrText xml:space="preserve"> PAGEREF _Toc237009642 \h </w:instrText>
+          <w:instrText xml:space="preserve"> PAGEREF _Toc237016632 \h </w:instrText>
         </w:r>
         <w:r>
           <w:rPr>
@@ -1943,7 +1943,7 @@
           <w:noProof/>
         </w:rPr>
       </w:pPr>
-      <w:hyperlink w:anchor="_Toc237009643" w:history="1">
+      <w:hyperlink w:anchor="_Toc237016633" w:history="1">
         <w:r>
           <w:rPr>
             <w:rStyle w:val="Hyperlink"/>
@@ -1970,7 +1970,7 @@
             <w:noProof/>
             <w:webHidden/>
           </w:rPr>
-          <w:instrText xml:space="preserve"> PAGEREF _Toc237009643 \h </w:instrText>
+          <w:instrText xml:space="preserve"> PAGEREF _Toc237016633 \h </w:instrText>
         </w:r>
         <w:r>
           <w:rPr>
@@ -1990,7 +1990,7 @@
             <w:noProof/>
             <w:webHidden/>
           </w:rPr>
-          <w:t>10</w:t>
+          <w:t>11</w:t>
         </w:r>
         <w:r>
           <w:rPr>
@@ -2011,7 +2011,7 @@
           <w:noProof/>
         </w:rPr>
       </w:pPr>
-      <w:hyperlink w:anchor="_Toc237009644" w:history="1">
+      <w:hyperlink w:anchor="_Toc237016634" w:history="1">
         <w:r>
           <w:rPr>
             <w:rStyle w:val="Hyperlink"/>
@@ -2038,7 +2038,7 @@
             <w:noProof/>
             <w:webHidden/>
           </w:rPr>
-          <w:instrText xml:space="preserve"> PAGEREF _Toc237009644 \h </w:instrText>
+          <w:instrText xml:space="preserve"> PAGEREF _Toc237016634 \h </w:instrText>
         </w:r>
         <w:r>
           <w:rPr>
@@ -2079,7 +2079,7 @@
           <w:noProof/>
         </w:rPr>
       </w:pPr>
-      <w:hyperlink w:anchor="_Toc237009645" w:history="1">
+      <w:hyperlink w:anchor="_Toc237016635" w:history="1">
         <w:r>
           <w:rPr>
             <w:rStyle w:val="Hyperlink"/>
@@ -2106,7 +2106,7 @@
             <w:noProof/>
             <w:webHidden/>
           </w:rPr>
-          <w:instrText xml:space="preserve"> PAGEREF _Toc237009645 \h </w:instrText>
+          <w:instrText xml:space="preserve"> PAGEREF _Toc237016635 \h </w:instrText>
         </w:r>
         <w:r>
           <w:rPr>
@@ -2147,7 +2147,7 @@
           <w:noProof/>
         </w:rPr>
       </w:pPr>
-      <w:hyperlink w:anchor="_Toc237009646" w:history="1">
+      <w:hyperlink w:anchor="_Toc237016636" w:history="1">
         <w:r>
           <w:rPr>
             <w:rStyle w:val="Hyperlink"/>
@@ -2174,7 +2174,7 @@
             <w:noProof/>
             <w:webHidden/>
           </w:rPr>
-          <w:instrText xml:space="preserve"> PAGEREF _Toc237009646 \h </w:instrText>
+          <w:instrText xml:space="preserve"> PAGEREF _Toc237016636 \h </w:instrText>
         </w:r>
         <w:r>
           <w:rPr>
@@ -2215,7 +2215,7 @@
           <w:noProof/>
         </w:rPr>
       </w:pPr>
-      <w:hyperlink w:anchor="_Toc237009647" w:history="1">
+      <w:hyperlink w:anchor="_Toc237016637" w:history="1">
         <w:r>
           <w:rPr>
             <w:rStyle w:val="Hyperlink"/>
@@ -2242,7 +2242,7 @@
             <w:noProof/>
             <w:webHidden/>
           </w:rPr>
-          <w:instrText xml:space="preserve"> PAGEREF _Toc237009647 \h </w:instrText>
+          <w:instrText xml:space="preserve"> PAGEREF _Toc237016637 \h </w:instrText>
         </w:r>
         <w:r>
           <w:rPr>
@@ -2295,7 +2295,7 @@
       <w:pPr>
         <w:pStyle w:val="Heading1"/>
       </w:pPr>
-      <w:bookmarkStart w:id="1" w:name="_Toc237009618"/>
+      <w:bookmarkStart w:id="1" w:name="_Toc237016608"/>
       <w:r>
         <w:lastRenderedPageBreak/>
         <w:t>1. Product Scope and Invariants</w:t>
@@ -2364,7 +2364,7 @@
       <w:pPr>
         <w:pStyle w:val="Heading1"/>
       </w:pPr>
-      <w:bookmarkStart w:id="2" w:name="_Toc237009619"/>
+      <w:bookmarkStart w:id="2" w:name="_Toc237016609"/>
       <w:r>
         <w:t>2. Repository and Build Layout</w:t>
       </w:r>
@@ -2473,7 +2473,7 @@
           </w:tcPr>
           <w:p>
             <w:r>
-              <w:t>source\scan</w:t>
+              <w:t>source\agent</w:t>
             </w:r>
           </w:p>
         </w:tc>
@@ -2487,6 +2487,39 @@
               <w:cnfStyle w:val="000000000000" w:firstRow="0" w:lastRow="0" w:firstColumn="0" w:lastColumn="0" w:oddVBand="0" w:evenVBand="0" w:oddHBand="0" w:evenHBand="0" w:firstRowFirstColumn="0" w:firstRowLastColumn="0" w:lastRowFirstColumn="0" w:lastRowLastColumn="0"/>
             </w:pPr>
             <w:r>
+              <w:t>Installed Codex/Claude command settings, detection, process execution, logging, and cancellation.</w:t>
+            </w:r>
+          </w:p>
+        </w:tc>
+      </w:tr>
+      <w:tr>
+        <w:trPr>
+          <w:cnfStyle w:val="000000100000" w:firstRow="0" w:lastRow="0" w:firstColumn="0" w:lastColumn="0" w:oddVBand="0" w:evenVBand="0" w:oddHBand="1" w:evenHBand="0" w:firstRowFirstColumn="0" w:firstRowLastColumn="0" w:lastRowFirstColumn="0" w:lastRowLastColumn="0"/>
+          <w:cantSplit/>
+          <w:jc w:val="center"/>
+        </w:trPr>
+        <w:tc>
+          <w:tcPr>
+            <w:cnfStyle w:val="001000000000" w:firstRow="0" w:lastRow="0" w:firstColumn="1" w:lastColumn="0" w:oddVBand="0" w:evenVBand="0" w:oddHBand="0" w:evenHBand="0" w:firstRowFirstColumn="0" w:firstRowLastColumn="0" w:lastRowFirstColumn="0" w:lastRowLastColumn="0"/>
+            <w:tcW w:w="2700" w:type="dxa"/>
+            <w:vAlign w:val="center"/>
+          </w:tcPr>
+          <w:p>
+            <w:r>
+              <w:t>source\scan</w:t>
+            </w:r>
+          </w:p>
+        </w:tc>
+        <w:tc>
+          <w:tcPr>
+            <w:tcW w:w="6660" w:type="dxa"/>
+            <w:vAlign w:val="center"/>
+          </w:tcPr>
+          <w:p>
+            <w:pPr>
+              <w:cnfStyle w:val="000000100000" w:firstRow="0" w:lastRow="0" w:firstColumn="0" w:lastColumn="0" w:oddVBand="0" w:evenVBand="0" w:oddHBand="1" w:evenHBand="0" w:firstRowFirstColumn="0" w:firstRowLastColumn="0" w:lastRowFirstColumn="0" w:lastRowLastColumn="0"/>
+            </w:pPr>
+            <w:r>
               <w:t>VCL/FMX form text, Pascal resourcestrings, extraction rules, diagnostics, incremental merge.</w:t>
             </w:r>
           </w:p>
@@ -2494,7 +2527,6 @@
       </w:tr>
       <w:tr>
         <w:trPr>
-          <w:cnfStyle w:val="000000100000" w:firstRow="0" w:lastRow="0" w:firstColumn="0" w:lastColumn="0" w:oddVBand="0" w:evenVBand="0" w:oddHBand="1" w:evenHBand="0" w:firstRowFirstColumn="0" w:firstRowLastColumn="0" w:lastRowFirstColumn="0" w:lastRowLastColumn="0"/>
           <w:cantSplit/>
           <w:jc w:val="center"/>
         </w:trPr>
@@ -2517,7 +2549,7 @@
           </w:tcPr>
           <w:p>
             <w:pPr>
-              <w:cnfStyle w:val="000000100000" w:firstRow="0" w:lastRow="0" w:firstColumn="0" w:lastColumn="0" w:oddVBand="0" w:evenVBand="0" w:oddHBand="1" w:evenHBand="0" w:firstRowFirstColumn="0" w:firstRowLastColumn="0" w:lastRowFirstColumn="0" w:lastRowLastColumn="0"/>
+              <w:cnfStyle w:val="000000000000" w:firstRow="0" w:lastRow="0" w:firstColumn="0" w:lastColumn="0" w:oddVBand="0" w:evenVBand="0" w:oddHBand="0" w:evenHBand="0" w:firstRowFirstColumn="0" w:firstRowLastColumn="0" w:lastRowFirstColumn="0" w:lastRowLastColumn="0"/>
             </w:pPr>
             <w:r>
               <w:t>Catalog safety and completeness checks.</w:t>
@@ -2527,6 +2559,7 @@
       </w:tr>
       <w:tr>
         <w:trPr>
+          <w:cnfStyle w:val="000000100000" w:firstRow="0" w:lastRow="0" w:firstColumn="0" w:lastColumn="0" w:oddVBand="0" w:evenVBand="0" w:oddHBand="1" w:evenHBand="0" w:firstRowFirstColumn="0" w:firstRowLastColumn="0" w:lastRowFirstColumn="0" w:lastRowLastColumn="0"/>
           <w:cantSplit/>
           <w:jc w:val="center"/>
         </w:trPr>
@@ -2549,7 +2582,7 @@
           </w:tcPr>
           <w:p>
             <w:pPr>
-              <w:cnfStyle w:val="000000000000" w:firstRow="0" w:lastRow="0" w:firstColumn="0" w:lastColumn="0" w:oddVBand="0" w:evenVBand="0" w:oddHBand="0" w:evenHBand="0" w:firstRowFirstColumn="0" w:firstRowLastColumn="0" w:lastRowFirstColumn="0" w:lastRowLastColumn="0"/>
+              <w:cnfStyle w:val="000000100000" w:firstRow="0" w:lastRow="0" w:firstColumn="0" w:lastColumn="0" w:oddVBand="0" w:evenVBand="0" w:oddHBand="1" w:evenHBand="0" w:firstRowFirstColumn="0" w:firstRowLastColumn="0" w:lastRowFirstColumn="0" w:lastRowLastColumn="0"/>
             </w:pPr>
             <w:r>
               <w:t>Provider types/settings, Credential Manager, DeepL/Google HTTPS client.</w:t>
@@ -2559,7 +2592,6 @@
       </w:tr>
       <w:tr>
         <w:trPr>
-          <w:cnfStyle w:val="000000100000" w:firstRow="0" w:lastRow="0" w:firstColumn="0" w:lastColumn="0" w:oddVBand="0" w:evenVBand="0" w:oddHBand="1" w:evenHBand="0" w:firstRowFirstColumn="0" w:firstRowLastColumn="0" w:lastRowFirstColumn="0" w:lastRowLastColumn="0"/>
           <w:cantSplit/>
           <w:jc w:val="center"/>
         </w:trPr>
@@ -2582,7 +2614,7 @@
           </w:tcPr>
           <w:p>
             <w:pPr>
-              <w:cnfStyle w:val="000000100000" w:firstRow="0" w:lastRow="0" w:firstColumn="0" w:lastColumn="0" w:oddVBand="0" w:evenVBand="0" w:oddHBand="1" w:evenHBand="0" w:firstRowFirstColumn="0" w:firstRowLastColumn="0" w:lastRowFirstColumn="0" w:lastRowLastColumn="0"/>
+              <w:cnfStyle w:val="000000000000" w:firstRow="0" w:lastRow="0" w:firstColumn="0" w:lastColumn="0" w:oddVBand="0" w:evenVBand="0" w:oddHBand="0" w:evenHBand="0" w:firstRowFirstColumn="0" w:firstRowLastColumn="0" w:lastRowFirstColumn="0" w:lastRowLastColumn="0"/>
             </w:pPr>
             <w:r>
               <w:t>Pack discovery/loading, preference, manager, VCL and FMX applicators.</w:t>
@@ -2592,6 +2624,7 @@
       </w:tr>
       <w:tr>
         <w:trPr>
+          <w:cnfStyle w:val="000000100000" w:firstRow="0" w:lastRow="0" w:firstColumn="0" w:lastColumn="0" w:oddVBand="0" w:evenVBand="0" w:oddHBand="1" w:evenHBand="0" w:firstRowFirstColumn="0" w:firstRowLastColumn="0" w:lastRowFirstColumn="0" w:lastRowLastColumn="0"/>
           <w:cantSplit/>
           <w:jc w:val="center"/>
         </w:trPr>
@@ -2603,6 +2636,7 @@
           </w:tcPr>
           <w:p>
             <w:r>
+              <w:lastRenderedPageBreak/>
               <w:t>source\integration</w:t>
             </w:r>
           </w:p>
@@ -2614,7 +2648,7 @@
           </w:tcPr>
           <w:p>
             <w:pPr>
-              <w:cnfStyle w:val="000000000000" w:firstRow="0" w:lastRow="0" w:firstColumn="0" w:lastColumn="0" w:oddVBand="0" w:evenVBand="0" w:oddHBand="0" w:evenHBand="0" w:firstRowFirstColumn="0" w:firstRowLastColumn="0" w:lastRowFirstColumn="0" w:lastRowLastColumn="0"/>
+              <w:cnfStyle w:val="000000100000" w:firstRow="0" w:lastRow="0" w:firstColumn="0" w:lastColumn="0" w:oddVBand="0" w:evenVBand="0" w:oddHBand="1" w:evenHBand="0" w:firstRowFirstColumn="0" w:firstRowLastColumn="0" w:lastRowFirstColumn="0" w:lastRowLastColumn="0"/>
             </w:pPr>
             <w:r>
               <w:t>Plan, resource/source rewriting, change sets, transaction, package generation.</w:t>
@@ -2624,7 +2658,6 @@
       </w:tr>
       <w:tr>
         <w:trPr>
-          <w:cnfStyle w:val="000000100000" w:firstRow="0" w:lastRow="0" w:firstColumn="0" w:lastColumn="0" w:oddVBand="0" w:evenVBand="0" w:oddHBand="1" w:evenHBand="0" w:firstRowFirstColumn="0" w:firstRowLastColumn="0" w:lastRowFirstColumn="0" w:lastRowLastColumn="0"/>
           <w:cantSplit/>
           <w:jc w:val="center"/>
         </w:trPr>
@@ -2647,7 +2680,7 @@
           </w:tcPr>
           <w:p>
             <w:pPr>
-              <w:cnfStyle w:val="000000100000" w:firstRow="0" w:lastRow="0" w:firstColumn="0" w:lastColumn="0" w:oddVBand="0" w:evenVBand="0" w:oddHBand="1" w:evenHBand="0" w:firstRowFirstColumn="0" w:firstRowLastColumn="0" w:lastRowFirstColumn="0" w:lastRowLastColumn="0"/>
+              <w:cnfStyle w:val="000000000000" w:firstRow="0" w:lastRow="0" w:firstColumn="0" w:lastColumn="0" w:oddVBand="0" w:evenVBand="0" w:oddHBand="0" w:evenHBand="0" w:firstRowFirstColumn="0" w:firstRowLastColumn="0" w:lastRowFirstColumn="0" w:lastRowLastColumn="0"/>
             </w:pPr>
             <w:r>
               <w:t>Designer-authored FMX UI and Studio self-localization.</w:t>
@@ -2657,6 +2690,7 @@
       </w:tr>
       <w:tr>
         <w:trPr>
+          <w:cnfStyle w:val="000000100000" w:firstRow="0" w:lastRow="0" w:firstColumn="0" w:lastColumn="0" w:oddVBand="0" w:evenVBand="0" w:oddHBand="1" w:evenHBand="0" w:firstRowFirstColumn="0" w:firstRowLastColumn="0" w:lastRowFirstColumn="0" w:lastRowLastColumn="0"/>
           <w:cantSplit/>
           <w:jc w:val="center"/>
         </w:trPr>
@@ -2668,7 +2702,6 @@
           </w:tcPr>
           <w:p>
             <w:r>
-              <w:lastRenderedPageBreak/>
               <w:t>source\schemas</w:t>
             </w:r>
           </w:p>
@@ -2680,7 +2713,7 @@
           </w:tcPr>
           <w:p>
             <w:pPr>
-              <w:cnfStyle w:val="000000000000" w:firstRow="0" w:lastRow="0" w:firstColumn="0" w:lastColumn="0" w:oddVBand="0" w:evenVBand="0" w:oddHBand="0" w:evenHBand="0" w:firstRowFirstColumn="0" w:firstRowLastColumn="0" w:lastRowFirstColumn="0" w:lastRowLastColumn="0"/>
+              <w:cnfStyle w:val="000000100000" w:firstRow="0" w:lastRow="0" w:firstColumn="0" w:lastColumn="0" w:oddVBand="0" w:evenVBand="0" w:oddHBand="1" w:evenHBand="0" w:firstRowFirstColumn="0" w:firstRowLastColumn="0" w:lastRowFirstColumn="0" w:lastRowLastColumn="0"/>
             </w:pPr>
             <w:r>
               <w:t>Development and runtime JSON Schemas.</w:t>
@@ -2690,7 +2723,6 @@
       </w:tr>
       <w:tr>
         <w:trPr>
-          <w:cnfStyle w:val="000000100000" w:firstRow="0" w:lastRow="0" w:firstColumn="0" w:lastColumn="0" w:oddVBand="0" w:evenVBand="0" w:oddHBand="1" w:evenHBand="0" w:firstRowFirstColumn="0" w:firstRowLastColumn="0" w:lastRowFirstColumn="0" w:lastRowLastColumn="0"/>
           <w:cantSplit/>
           <w:jc w:val="center"/>
         </w:trPr>
@@ -2713,7 +2745,7 @@
           </w:tcPr>
           <w:p>
             <w:pPr>
-              <w:cnfStyle w:val="000000100000" w:firstRow="0" w:lastRow="0" w:firstColumn="0" w:lastColumn="0" w:oddVBand="0" w:evenVBand="0" w:oddHBand="1" w:evenHBand="0" w:firstRowFirstColumn="0" w:firstRowLastColumn="0" w:lastRowFirstColumn="0" w:lastRowLastColumn="0"/>
+              <w:cnfStyle w:val="000000000000" w:firstRow="0" w:lastRow="0" w:firstColumn="0" w:lastColumn="0" w:oddVBand="0" w:evenVBand="0" w:oddHBand="0" w:evenHBand="0" w:firstRowFirstColumn="0" w:firstRowLastColumn="0" w:lastRowFirstColumn="0" w:lastRowLastColumn="0"/>
             </w:pPr>
             <w:r>
               <w:t>Foundation, runtime, integration, form-streaming, launch, and self-localization smoke tests.</w:t>
@@ -2723,6 +2755,7 @@
       </w:tr>
       <w:tr>
         <w:trPr>
+          <w:cnfStyle w:val="000000100000" w:firstRow="0" w:lastRow="0" w:firstColumn="0" w:lastColumn="0" w:oddVBand="0" w:evenVBand="0" w:oddHBand="1" w:evenHBand="0" w:firstRowFirstColumn="0" w:firstRowLastColumn="0" w:lastRowFirstColumn="0" w:lastRowLastColumn="0"/>
           <w:cantSplit/>
           <w:jc w:val="center"/>
         </w:trPr>
@@ -2745,7 +2778,7 @@
           </w:tcPr>
           <w:p>
             <w:pPr>
-              <w:cnfStyle w:val="000000000000" w:firstRow="0" w:lastRow="0" w:firstColumn="0" w:lastColumn="0" w:oddVBand="0" w:evenVBand="0" w:oddHBand="0" w:evenHBand="0" w:firstRowFirstColumn="0" w:firstRowLastColumn="0" w:lastRowFirstColumn="0" w:lastRowLastColumn="0"/>
+              <w:cnfStyle w:val="000000100000" w:firstRow="0" w:lastRow="0" w:firstColumn="0" w:lastColumn="0" w:oddVBand="0" w:evenVBand="0" w:oddHBand="1" w:evenHBand="0" w:firstRowFirstColumn="0" w:firstRowLastColumn="0" w:lastRowFirstColumn="0" w:lastRowLastColumn="0"/>
             </w:pPr>
             <w:r>
               <w:t>Product documentation, help source, and safe fixtures.</w:t>
@@ -2758,7 +2791,7 @@
       <w:pPr>
         <w:pStyle w:val="Heading2"/>
       </w:pPr>
-      <w:bookmarkStart w:id="3" w:name="_Toc237009620"/>
+      <w:bookmarkStart w:id="3" w:name="_Toc237016610"/>
       <w:r>
         <w:t>2.1 Toolchain</w:t>
       </w:r>
@@ -2792,7 +2825,7 @@
       <w:pPr>
         <w:pStyle w:val="Heading1"/>
       </w:pPr>
-      <w:bookmarkStart w:id="4" w:name="_Toc237009621"/>
+      <w:bookmarkStart w:id="4" w:name="_Toc237016611"/>
       <w:r>
         <w:t>3. System Architecture</w:t>
       </w:r>
@@ -3119,6 +3152,7 @@
           </w:tcPr>
           <w:p>
             <w:r>
+              <w:lastRenderedPageBreak/>
               <w:t>Integration</w:t>
             </w:r>
           </w:p>
@@ -3166,7 +3200,6 @@
           </w:tcPr>
           <w:p>
             <w:r>
-              <w:lastRenderedPageBreak/>
               <w:t>Runtime</w:t>
             </w:r>
           </w:p>
@@ -3205,7 +3238,7 @@
       <w:pPr>
         <w:pStyle w:val="Heading1"/>
       </w:pPr>
-      <w:bookmarkStart w:id="5" w:name="_Toc237009622"/>
+      <w:bookmarkStart w:id="5" w:name="_Toc237016612"/>
       <w:r>
         <w:t>4. Core Data Model and JSON</w:t>
       </w:r>
@@ -3220,7 +3253,7 @@
       <w:pPr>
         <w:pStyle w:val="Heading2"/>
       </w:pPr>
-      <w:bookmarkStart w:id="6" w:name="_Toc237009623"/>
+      <w:bookmarkStart w:id="6" w:name="_Toc237016613"/>
       <w:r>
         <w:t>4.1 Stable keys</w:t>
       </w:r>
@@ -3262,7 +3295,7 @@
       <w:pPr>
         <w:pStyle w:val="Heading2"/>
       </w:pPr>
-      <w:bookmarkStart w:id="7" w:name="_Toc237009624"/>
+      <w:bookmarkStart w:id="7" w:name="_Toc237016614"/>
       <w:r>
         <w:t>4.2 Development catalog</w:t>
       </w:r>
@@ -3325,7 +3358,7 @@
       <w:pPr>
         <w:pStyle w:val="Heading2"/>
       </w:pPr>
-      <w:bookmarkStart w:id="8" w:name="_Toc237009625"/>
+      <w:bookmarkStart w:id="8" w:name="_Toc237016615"/>
       <w:r>
         <w:t>4.3 Runtime pack</w:t>
       </w:r>
@@ -3372,6 +3405,7 @@
     </w:p>
     <w:p>
       <w:r>
+        <w:lastRenderedPageBreak/>
         <w:t>The schema files are source\schemas\development-project.schema.json and runtime-language-pack.schema.json. Changes require schema-version handling, round-trip fixtures, and compatibility notes.</w:t>
       </w:r>
     </w:p>
@@ -3379,9 +3413,8 @@
       <w:pPr>
         <w:pStyle w:val="Heading1"/>
       </w:pPr>
-      <w:bookmarkStart w:id="9" w:name="_Toc237009626"/>
-      <w:r>
-        <w:lastRenderedPageBreak/>
+      <w:bookmarkStart w:id="9" w:name="_Toc237016616"/>
+      <w:r>
         <w:t>5. Project Detection and Scanning</w:t>
       </w:r>
       <w:bookmarkEnd w:id="9"/>
@@ -3400,7 +3433,7 @@
       <w:pPr>
         <w:pStyle w:val="Heading2"/>
       </w:pPr>
-      <w:bookmarkStart w:id="10" w:name="_Toc237009627"/>
+      <w:bookmarkStart w:id="10" w:name="_Toc237016617"/>
       <w:r>
         <w:t>5.1 Incremental merge</w:t>
       </w:r>
@@ -3482,7 +3515,7 @@
       <w:pPr>
         <w:pStyle w:val="Heading1"/>
       </w:pPr>
-      <w:bookmarkStart w:id="11" w:name="_Toc237009628"/>
+      <w:bookmarkStart w:id="11" w:name="_Toc237016618"/>
       <w:r>
         <w:t>6. Studio UI and Workflow State</w:t>
       </w:r>
@@ -3490,7 +3523,10 @@
     </w:p>
     <w:p>
       <w:r>
-        <w:t>DAT.Studio.MainForm.fmx contains the complete orange-and-blue interface. The workflow selection rectangle moves among Project, Scan, Translate, Validation, Export, Integration, and Provider Settings. Begin AI Mode, Copy Prompt, Reload AI Work, and the external-change timer are persisted designer objects. DAT.Studio.MainForm.pas contains event and state logic only; it does not construct controls.</w:t>
+        <w:t xml:space="preserve">DAT.Studio.MainForm.fmx contains the complete orange-and-blue interface. The form persists WindowState=wsMaximized, uses client-aligned workflow cards, anchors resizable work areas to every relevant edge, and keeps the status card at the bottom. The workflow selection rectangle moves among Project, Scan, Translate, Validation, Export, Integration, and Engine Settings. Language and engine choices are designer-owned combo boxes. Translate Automatically, Cancel Translation, Prompt, Reload, agent configuration </w:t>
+      </w:r>
+      <w:r>
+        <w:t>controls, and the monitor timer are persisted designer objects. DAT.Studio.MainForm.pas contains event and state logic only; it does not construct controls.</w:t>
       </w:r>
     </w:p>
     <w:p>
@@ -3532,15 +3568,13 @@
           <w:p>
             <w:pPr>
               <w:pStyle w:val="Callout"/>
-              <w:rPr>
-                <w:rFonts w:hint="eastAsia"/>
-              </w:rPr>
             </w:pPr>
             <w:r>
               <w:rPr>
                 <w:b/>
                 <w:color w:val="234C80"/>
               </w:rPr>
+              <w:lastRenderedPageBreak/>
               <w:t xml:space="preserve">FMX validation requirement. </w:t>
             </w:r>
             <w:r>
@@ -3554,12 +3588,19 @@
       <w:pPr>
         <w:pStyle w:val="Heading1"/>
       </w:pPr>
-      <w:bookmarkStart w:id="12" w:name="_Toc237009629"/>
-      <w:r>
-        <w:lastRenderedPageBreak/>
-        <w:t>7. Provider Settings and Secret Storage</w:t>
+      <w:bookmarkStart w:id="12" w:name="_Toc237016619"/>
+      <w:r>
+        <w:t>7. Agent Execution, Provider Settings, and Secret Storage</w:t>
       </w:r>
       <w:bookmarkEnd w:id="12"/>
+    </w:p>
+    <w:p>
+      <w:r>
+        <w:t>DAT.Agent.Execution persists only the selected command-line engine, executable path, and model choice. It detects supported installations, starts the agent without a console window, passes the translation contract through inherited standard input, redirects stdout/stderr to a project-local diagnostic log, polls the process from the designer-owned timer, and supports controlled cancellation. Codex runs non-interactively with workspace-write sandboxing in the target project; Claude runs in print mode with str</w:t>
+      </w:r>
+      <w:r>
+        <w:t>eamed JSON and accepted workspace edits. Authentication remains owned by the installed vendor CLI.</w:t>
+      </w:r>
     </w:p>
     <w:p>
       <w:r>
@@ -3823,8 +3864,9 @@
       <w:pPr>
         <w:pStyle w:val="Heading1"/>
       </w:pPr>
-      <w:bookmarkStart w:id="13" w:name="_Toc237009630"/>
-      <w:r>
+      <w:bookmarkStart w:id="13" w:name="_Toc237016620"/>
+      <w:r>
+        <w:lastRenderedPageBreak/>
         <w:t>8. Provider HTTP Clients</w:t>
       </w:r>
       <w:bookmarkEnd w:id="13"/>
@@ -4001,7 +4043,6 @@
           </w:tcPr>
           <w:p>
             <w:r>
-              <w:lastRenderedPageBreak/>
               <w:t>DeepL API Pro</w:t>
             </w:r>
           </w:p>
@@ -4115,7 +4156,7 @@
       <w:pPr>
         <w:pStyle w:val="Heading2"/>
       </w:pPr>
-      <w:bookmarkStart w:id="14" w:name="_Toc237009631"/>
+      <w:bookmarkStart w:id="14" w:name="_Toc237016621"/>
       <w:r>
         <w:t>8.1 Reliability and cancellation</w:t>
       </w:r>
@@ -4173,7 +4214,7 @@
       <w:pPr>
         <w:pStyle w:val="Heading2"/>
       </w:pPr>
-      <w:bookmarkStart w:id="15" w:name="_Toc237009632"/>
+      <w:bookmarkStart w:id="15" w:name="_Toc237016622"/>
       <w:r>
         <w:t>8.2 Official protocol references</w:t>
       </w:r>
@@ -4216,6 +4257,7 @@
         <w:pStyle w:val="ListBullet"/>
       </w:pPr>
       <w:r>
+        <w:lastRenderedPageBreak/>
         <w:t>Google API-key best practices: https://docs.cloud.google.com/docs/authentication/api-keys-best-practices</w:t>
       </w:r>
     </w:p>
@@ -4223,7 +4265,7 @@
       <w:pPr>
         <w:pStyle w:val="Heading1"/>
       </w:pPr>
-      <w:bookmarkStart w:id="16" w:name="_Toc237009633"/>
+      <w:bookmarkStart w:id="16" w:name="_Toc237016623"/>
       <w:r>
         <w:t>9. In-Place AI Translation and Alternatives</w:t>
       </w:r>
@@ -4231,36 +4273,139 @@
     </w:p>
     <w:p>
       <w:r>
-        <w:t>The canonical workflow uses DAT.Core.AITranslation to coordinate direct edits to the saved development JSON. Begin saves an exact recovery snapshot, ensures the terminology profile, writes the agent contract, records the file SHA-256, and locks Studio editing. A designer-owned timer enables reload only after the same changed hash is stable across two checks.</w:t>
-      </w:r>
-    </w:p>
-    <w:p>
+        <w:t>The canonical workflow combines DAT.Core.AITranslation with DAT.Agent.Execution. Translate Automatically saves an exact recovery snapshot, ensures the terminology profile, writes the agent contract, records the file SHA-256, locks Studio editing, launches the selected signed-in command-line agent, supplies the complete task through standard input, and monitors both the child process and catalog from a designer-owned timer.</w:t>
+      </w:r>
+    </w:p>
+    <w:p>
+      <w:r>
+        <w:t>A zero process exit triggers protected reload and automatic save. A nonzero exit or developer cancellation restores the snapshot. Prompt and Reload remain explicit recovery controls for diagnosis or manually continued work; they are not required during the normal one-button path.</w:t>
+      </w:r>
+    </w:p>
+    <w:p>
+      <w:r>
+        <w:t>Reload parses the external file and compares application, framework, language, locale formats, entry count/order, keys, source/checksums, context, developer notes, runtime classification, and wiring confirmation with the pre-session snapshot. Only Needs Translation, Source Changed, Error, and existing AI Draft entries are eligible. Machine-translated, Imported, Edited, Reviewed, Approved, Excluded, and Obsolete entries are protected. Any protected mutation rejects the reload.</w:t>
+      </w:r>
+    </w:p>
+    <w:p>
+      <w:r>
+        <w:t>Allowed changes are normalized to AI Draft while Codex/Claude origin, high/medium/low confidence, and review notes are retained. A metadata-only confirmation is retained when an existing translation remains correct after a source change.</w:t>
+      </w:r>
+    </w:p>
+    <w:p>
+      <w:r>
+        <w:t>CSV/JSON interchange, manual editing, and direct Google/DeepL translation remain alternatives. Provider output receives Machine translated status with its provider origin.</w:t>
+      </w:r>
+    </w:p>
+    <w:p>
+      <w:r>
+        <w:t>The Studio never copies a translation from one stable key to another automatically. Exact-source matches are suggestions only. Explicit acceptance creates an Edited result and does not inherit Reviewed or Approved status.</w:t>
+      </w:r>
+    </w:p>
+    <w:p>
+      <w:pPr>
+        <w:pStyle w:val="ListBullet"/>
+      </w:pPr>
+      <w:r>
+        <w:t>Mark Reviewed requires nonblank translated text.</w:t>
+      </w:r>
+    </w:p>
+    <w:p>
+      <w:pPr>
+        <w:pStyle w:val="ListBullet"/>
+      </w:pPr>
+      <w:r>
+        <w:t>Approve requires the entry to have reached Reviewed first.</w:t>
+      </w:r>
+    </w:p>
+    <w:p>
+      <w:pPr>
+        <w:pStyle w:val="ListBullet"/>
+      </w:pPr>
+      <w:r>
+        <w:t>Translation origin is independent of linguistic status.</w:t>
+      </w:r>
+    </w:p>
+    <w:p>
+      <w:pPr>
+        <w:pStyle w:val="ListBullet"/>
+      </w:pPr>
+      <w:r>
+        <w:t>Low confidence, explicit AI notes, inconsistent repeated terms, and structural defects form the focused exception queue; a valid AI draft is not itself an exception.</w:t>
+      </w:r>
+    </w:p>
+    <w:p>
+      <w:pPr>
+        <w:pStyle w:val="ListBullet"/>
+      </w:pPr>
+      <w:r>
+        <w:t>Structural validity, linguistic status, automatic runtime coverage, and manual wiring readiness are separate measures.</w:t>
+      </w:r>
+    </w:p>
+    <w:p>
+      <w:pPr>
+        <w:pStyle w:val="ListBullet"/>
+      </w:pPr>
+      <w:r>
+        <w:t>A Pascal resourcestring remains manual wiring until the developer confirms the generated TranslateText call site.</w:t>
+      </w:r>
+    </w:p>
+    <w:p>
+      <w:pPr>
+        <w:pStyle w:val="Heading1"/>
+      </w:pPr>
+      <w:bookmarkStart w:id="17" w:name="_Toc237016624"/>
       <w:r>
         <w:lastRenderedPageBreak/>
-        <w:t>Reload parses the external file and compares application, framework, language, locale formats, entry count/order, keys, source/checksums, context, developer notes, runtime classification, and wiring confirmation with the pre-session snapshot. Only Needs Translation, Source Changed, Error, and existing AI Draft entries are eligible. Machine-translated, Imported, Edited, Reviewed, Approved, Excluded, and Obsolete entries are protected. Any protected mutation rejects the reload.</w:t>
-      </w:r>
-    </w:p>
-    <w:p>
-      <w:r>
-        <w:t>Allowed changes are normalized to AI Draft while Codex/Claude origin, high/medium/low confidence, and review notes are retained. A metadata-only confirmation is retained when an existing translation remains correct after a source change.</w:t>
-      </w:r>
-    </w:p>
-    <w:p>
-      <w:r>
-        <w:t>CSV/JSON interchange, manual editing, and direct Google/DeepL translation remain alternatives. Provider output receives Machine translated status with its provider origin.</w:t>
-      </w:r>
-    </w:p>
-    <w:p>
-      <w:r>
-        <w:t>The Studio never copies a translation from one stable key to another automatically. Exact-source matches are suggestions only. Explicit acceptance creates an Edited result and does not inherit Reviewed or Approved status.</w:t>
-      </w:r>
+        <w:t>10. Validation and Runtime Pack Export</w:t>
+      </w:r>
+      <w:bookmarkEnd w:id="17"/>
+    </w:p>
+    <w:p>
+      <w:r>
+        <w:t>DAT.Validation.Catalog validates metadata, missing target text, duplicates, changed source, Delphi indexed and sequential Format arguments, accelerators, low AI confidence, explicit AI review notes, inconsistent repeated-source terminology, and status conditions. Export is blocked by errors. Manual resourcestring wiring is reported separately from structural errors. DAT.Core.RuntimePack serializes only runtime-required metadata and strings and records a source-catalog checksum.</w:t>
+      </w:r>
+    </w:p>
+    <w:p>
+      <w:r>
+        <w:t>Locale data is retained in the runtime pack so DAT.Runtime.Manager can expose a pack-specific TFormatSettings without globally mutating the developer's source code.</w:t>
+      </w:r>
+    </w:p>
+    <w:p>
+      <w:pPr>
+        <w:pStyle w:val="Heading1"/>
+      </w:pPr>
+      <w:bookmarkStart w:id="18" w:name="_Toc237016625"/>
+      <w:r>
+        <w:t>11. Runtime Engine</w:t>
+      </w:r>
+      <w:bookmarkEnd w:id="18"/>
+    </w:p>
+    <w:p>
+      <w:r>
+        <w:t>DAT.Runtime.LanguagePack loads and discovers JSON packs, checks application identity, and provides fallback lookup. DAT.Runtime.Preference reads/writes the selected locale. DAT.Runtime.Manager owns the active pack, discovery, preference, translation lookup, and locale format settings.</w:t>
+      </w:r>
+    </w:p>
+    <w:p>
+      <w:r>
+        <w:t>DAT.Runtime.VCL and DAT.Runtime.FMX traverse existing component trees and supported collection properties. They apply values by stable key to already designer-created controls. Missing keys retain source text. The adapters do not create controls or rearrange layouts.</w:t>
+      </w:r>
+    </w:p>
+    <w:p>
+      <w:pPr>
+        <w:pStyle w:val="Heading2"/>
+      </w:pPr>
+      <w:bookmarkStart w:id="19" w:name="_Toc237016626"/>
+      <w:r>
+        <w:t>11.1 Deployment paths</w:t>
+      </w:r>
+      <w:bookmarkEnd w:id="19"/>
     </w:p>
     <w:p>
       <w:pPr>
         <w:pStyle w:val="ListBullet"/>
       </w:pPr>
       <w:r>
-        <w:t>Mark Reviewed requires nonblank translated text.</w:t>
+        <w:t>Packs: &lt;ExecutableDirectory&gt;\Localization\Languages\&lt;locale&gt;.json.</w:t>
       </w:r>
     </w:p>
     <w:p>
@@ -4268,7 +4413,7 @@
         <w:pStyle w:val="ListBullet"/>
       </w:pPr>
       <w:r>
-        <w:t>Approve requires the entry to have reached Reviewed first.</w:t>
+        <w:t>Preference: %LOCALAPPDATA%\&lt;ApplicationId&gt;\language.ini.</w:t>
       </w:r>
     </w:p>
     <w:p>
@@ -4276,7 +4421,7 @@
         <w:pStyle w:val="ListBullet"/>
       </w:pPr>
       <w:r>
-        <w:t>Translation origin is independent of linguistic status.</w:t>
+        <w:t>Studio preference: %LOCALAPPDATA%\DelphiAppTranslationStudio\language.ini.</w:t>
       </w:r>
     </w:p>
     <w:p>
@@ -4284,15 +4429,51 @@
         <w:pStyle w:val="ListBullet"/>
       </w:pPr>
       <w:r>
-        <w:t>Low confidence, explicit AI notes, inconsistent repeated terms, and structural defects form the focused exception queue; a valid AI draft is not itself an exception.</w:t>
-      </w:r>
+        <w:t>Developer catalogs remain in the target source tree under Localization\Development.</w:t>
+      </w:r>
+    </w:p>
+    <w:p>
+      <w:pPr>
+        <w:pStyle w:val="Heading1"/>
+      </w:pPr>
+      <w:bookmarkStart w:id="20" w:name="_Toc237016627"/>
+      <w:r>
+        <w:t>12. Integration Planning and Transactions</w:t>
+      </w:r>
+      <w:bookmarkEnd w:id="20"/>
+    </w:p>
+    <w:p>
+      <w:r>
+        <w:t>DAT.Integration.Plan builds a human-readable plan. DAT.Integration.Package creates the generated application unit, framework adapter, shared runtime units, JSON packs, language-menu manifest, and deployment script. DAT.Integration.Engine builds every proposed file change in memory. TIntegrationFileChange.ExactReviewText produces a complete line-numbered original/proposed LCS diff; generated files are shown in full.</w:t>
+      </w:r>
+    </w:p>
+    <w:p>
+      <w:r>
+        <w:t>The Studio records each selected preview file as viewed. The final review checkbox remains disabled until every file has been viewed, and Apply remains disabled until the checkbox is explicitly checked. DAT.Integration.Transaction then checks source state, creates a verified pre-change backup, writes files atomically, rolls back failures, and records a manifest for restore.</w:t>
+      </w:r>
+    </w:p>
+    <w:p>
+      <w:r>
+        <w:lastRenderedPageBreak/>
+        <w:t>DAT.Integration.MenuResource modifies text DFM/FMX menus idempotently and preserves designer editability. DAT.Integration.DelphiSource applies narrowly scoped DPR, PAS, and DPROJ wiring. For FMX, it preserves an existing root OnCreate handler or persists datTranslationFormCreate in the FMX and adds ApplyTranslation(Self) to its Pascal method. This respects the FMX form streaming lifecycle and avoids translating the first form from the DPR immediately after CreateForm.</w:t>
+      </w:r>
+    </w:p>
+    <w:p>
+      <w:pPr>
+        <w:pStyle w:val="Heading2"/>
+      </w:pPr>
+      <w:bookmarkStart w:id="21" w:name="_Toc237016628"/>
+      <w:r>
+        <w:t>12.1 Generated startup contract</w:t>
+      </w:r>
+      <w:bookmarkEnd w:id="21"/>
     </w:p>
     <w:p>
       <w:pPr>
         <w:pStyle w:val="ListBullet"/>
       </w:pPr>
       <w:r>
-        <w:t>Structural validity, linguistic status, automatic runtime coverage, and manual wiring readiness are separate measures.</w:t>
+        <w:t>InitializeTranslation runs before form creation.</w:t>
       </w:r>
     </w:p>
     <w:p>
@@ -4300,66 +4481,15 @@
         <w:pStyle w:val="ListBullet"/>
       </w:pPr>
       <w:r>
-        <w:t>A Pascal resourcestring remains manual wiring until the developer confirms the generated TranslateText call site.</w:t>
-      </w:r>
-    </w:p>
-    <w:p>
-      <w:pPr>
-        <w:pStyle w:val="Heading1"/>
-      </w:pPr>
-      <w:bookmarkStart w:id="17" w:name="_Toc237009634"/>
-      <w:r>
-        <w:t>10. Validation and Runtime Pack Export</w:t>
-      </w:r>
-      <w:bookmarkEnd w:id="17"/>
-    </w:p>
-    <w:p>
-      <w:r>
-        <w:t>DAT.Validation.Catalog validates metadata, missing target text, duplicates, changed source, Delphi indexed and sequential Format arguments, accelerators, low AI confidence, explicit AI review notes, inconsistent repeated-source terminology, and status conditions. Export is blocked by errors. Manual resourcestring wiring is reported separately from structural errors. DAT.Core.RuntimePack serializes only runtime-required metadata and strings and records a source-catalog checksum.</w:t>
-      </w:r>
-    </w:p>
-    <w:p>
-      <w:r>
-        <w:t>Locale data is retained in the runtime pack so DAT.Runtime.Manager can expose a pack-specific TFormatSettings without globally mutating the developer's source code.</w:t>
-      </w:r>
-    </w:p>
-    <w:p>
-      <w:pPr>
-        <w:pStyle w:val="Heading1"/>
-      </w:pPr>
-      <w:bookmarkStart w:id="18" w:name="_Toc237009635"/>
-      <w:r>
-        <w:lastRenderedPageBreak/>
-        <w:t>11. Runtime Engine</w:t>
-      </w:r>
-      <w:bookmarkEnd w:id="18"/>
-    </w:p>
-    <w:p>
-      <w:r>
-        <w:t>DAT.Runtime.LanguagePack loads and discovers JSON packs, checks application identity, and provides fallback lookup. DAT.Runtime.Preference reads/writes the selected locale. DAT.Runtime.Manager owns the active pack, discovery, preference, translation lookup, and locale format settings.</w:t>
-      </w:r>
-    </w:p>
-    <w:p>
-      <w:r>
-        <w:t>DAT.Runtime.VCL and DAT.Runtime.FMX traverse existing component trees and supported collection properties. They apply values by stable key to already designer-created controls. Missing keys retain source text. The adapters do not create controls or rearrange layouts.</w:t>
-      </w:r>
-    </w:p>
-    <w:p>
-      <w:pPr>
-        <w:pStyle w:val="Heading2"/>
-      </w:pPr>
-      <w:bookmarkStart w:id="19" w:name="_Toc237009636"/>
-      <w:r>
-        <w:t>11.1 Deployment paths</w:t>
-      </w:r>
-      <w:bookmarkEnd w:id="19"/>
+        <w:t>VCL applies the first created form through the DPR startup wiring.</w:t>
+      </w:r>
     </w:p>
     <w:p>
       <w:pPr>
         <w:pStyle w:val="ListBullet"/>
       </w:pPr>
       <w:r>
-        <w:t>Packs: &lt;ExecutableDirectory&gt;\Localization\Languages\&lt;locale&gt;.json.</w:t>
+        <w:t>FMX applies each form in its designer-persisted OnCreate handler after streaming is complete.</w:t>
       </w:r>
     </w:p>
     <w:p>
@@ -4367,90 +4497,6 @@
         <w:pStyle w:val="ListBullet"/>
       </w:pPr>
       <w:r>
-        <w:t>Preference: %LOCALAPPDATA%\&lt;ApplicationId&gt;\language.ini.</w:t>
-      </w:r>
-    </w:p>
-    <w:p>
-      <w:pPr>
-        <w:pStyle w:val="ListBullet"/>
-      </w:pPr>
-      <w:r>
-        <w:t>Studio preference: %LOCALAPPDATA%\DelphiAppTranslationStudio\language.ini.</w:t>
-      </w:r>
-    </w:p>
-    <w:p>
-      <w:pPr>
-        <w:pStyle w:val="ListBullet"/>
-      </w:pPr>
-      <w:r>
-        <w:t>Developer catalogs remain in the target source tree under Localization\Development.</w:t>
-      </w:r>
-    </w:p>
-    <w:p>
-      <w:pPr>
-        <w:pStyle w:val="Heading1"/>
-      </w:pPr>
-      <w:bookmarkStart w:id="20" w:name="_Toc237009637"/>
-      <w:r>
-        <w:t>12. Integration Planning and Transactions</w:t>
-      </w:r>
-      <w:bookmarkEnd w:id="20"/>
-    </w:p>
-    <w:p>
-      <w:r>
-        <w:t>DAT.Integration.Plan builds a human-readable plan. DAT.Integration.Package creates the generated application unit, framework adapter, shared runtime units, JSON packs, language-menu manifest, and deployment script. DAT.Integration.Engine builds every proposed file change in memory. TIntegrationFileChange.ExactReviewText produces a complete line-numbered original/proposed LCS diff; generated files are shown in full.</w:t>
-      </w:r>
-    </w:p>
-    <w:p>
-      <w:r>
-        <w:t>The Studio records each selected preview file as viewed. The final review checkbox remains disabled until every file has been viewed, and Apply remains disabled until the checkbox is explicitly checked. DAT.Integration.Transaction then checks source state, creates a verified pre-change backup, writes files atomically, rolls back failures, and records a manifest for restore.</w:t>
-      </w:r>
-    </w:p>
-    <w:p>
-      <w:r>
-        <w:t>DAT.Integration.MenuResource modifies text DFM/FMX menus idempotently and preserves designer editability. DAT.Integration.DelphiSource applies narrowly scoped DPR, PAS, and DPROJ wiring. For FMX, it preserves an existing root OnCreate handler or persists datTranslationFormCreate in the FMX and adds ApplyTranslation(Self) to its Pascal method. This respects the FMX form streaming lifecycle and avoids translating the first form from the DPR immediately after CreateForm.</w:t>
-      </w:r>
-    </w:p>
-    <w:p>
-      <w:pPr>
-        <w:pStyle w:val="Heading2"/>
-      </w:pPr>
-      <w:bookmarkStart w:id="21" w:name="_Toc237009638"/>
-      <w:r>
-        <w:t>12.1 Generated startup contract</w:t>
-      </w:r>
-      <w:bookmarkEnd w:id="21"/>
-    </w:p>
-    <w:p>
-      <w:pPr>
-        <w:pStyle w:val="ListBullet"/>
-      </w:pPr>
-      <w:r>
-        <w:t>InitializeTranslation runs before form creation.</w:t>
-      </w:r>
-    </w:p>
-    <w:p>
-      <w:pPr>
-        <w:pStyle w:val="ListBullet"/>
-      </w:pPr>
-      <w:r>
-        <w:t>VCL applies the first created form through the DPR startup wiring.</w:t>
-      </w:r>
-    </w:p>
-    <w:p>
-      <w:pPr>
-        <w:pStyle w:val="ListBullet"/>
-      </w:pPr>
-      <w:r>
-        <w:t>FMX applies each form in its designer-persisted OnCreate handler after streaming is complete.</w:t>
-      </w:r>
-    </w:p>
-    <w:p>
-      <w:pPr>
-        <w:pStyle w:val="ListBullet"/>
-      </w:pPr>
-      <w:r>
-        <w:lastRenderedPageBreak/>
         <w:t>SelectLanguageMenuItem derives a locale from datLanguage_&lt;locale&gt; component names.</w:t>
       </w:r>
     </w:p>
@@ -4499,9 +4545,6 @@
           <w:p>
             <w:pPr>
               <w:pStyle w:val="Callout"/>
-              <w:rPr>
-                <w:rFonts w:hint="eastAsia"/>
-              </w:rPr>
             </w:pPr>
             <w:r>
               <w:rPr>
@@ -4521,7 +4564,7 @@
       <w:pPr>
         <w:pStyle w:val="Heading1"/>
       </w:pPr>
-      <w:bookmarkStart w:id="22" w:name="_Toc237009639"/>
+      <w:bookmarkStart w:id="22" w:name="_Toc237016629"/>
       <w:r>
         <w:t>13. Self-Localization</w:t>
       </w:r>
@@ -4536,7 +4579,7 @@
       <w:pPr>
         <w:pStyle w:val="Heading1"/>
       </w:pPr>
-      <w:bookmarkStart w:id="23" w:name="_Toc237009640"/>
+      <w:bookmarkStart w:id="23" w:name="_Toc237016630"/>
       <w:r>
         <w:t>14. Error Handling and Diagnostics</w:t>
       </w:r>
@@ -4594,8 +4637,9 @@
       <w:pPr>
         <w:pStyle w:val="Heading1"/>
       </w:pPr>
-      <w:bookmarkStart w:id="24" w:name="_Toc237009641"/>
-      <w:r>
+      <w:bookmarkStart w:id="24" w:name="_Toc237016631"/>
+      <w:r>
+        <w:lastRenderedPageBreak/>
         <w:t>15. Test Strategy and Verified Matrix</w:t>
       </w:r>
       <w:bookmarkEnd w:id="24"/>
@@ -4736,7 +4780,6 @@
           </w:tcPr>
           <w:p>
             <w:r>
-              <w:lastRenderedPageBreak/>
               <w:t>FMXRuntimeSmokeTests</w:t>
             </w:r>
           </w:p>
@@ -4783,7 +4826,7 @@
               <w:cnfStyle w:val="000000000000" w:firstRow="0" w:lastRow="0" w:firstColumn="0" w:lastColumn="0" w:oddVBand="0" w:evenVBand="0" w:oddHBand="0" w:evenHBand="0" w:firstRowFirstColumn="0" w:firstRowLastColumn="0" w:lastRowFirstColumn="0" w:lastRowLastColumn="0"/>
             </w:pPr>
             <w:r>
-              <w:t>Direct FMX stream/create, designer-owned in-place AI controls/timer, exact-review controls, linguistic action wiring, and provider alternative activation.</w:t>
+              <w:t>Direct FMX stream/create, maximized client-aligned pages, designer-owned agent controls/timer, exact-review controls, linguistic action wiring, and provider alternative activation.</w:t>
             </w:r>
           </w:p>
         </w:tc>
@@ -4899,7 +4942,7 @@
       <w:pPr>
         <w:pStyle w:val="Heading2"/>
       </w:pPr>
-      <w:bookmarkStart w:id="25" w:name="_Toc237009642"/>
+      <w:bookmarkStart w:id="25" w:name="_Toc237016632"/>
       <w:r>
         <w:t>15.1 Optional live provider testing</w:t>
       </w:r>
@@ -4907,14 +4950,18 @@
     </w:p>
     <w:p>
       <w:r>
-        <w:t>Automated fixtures must not contain live keys. Optional provider acceptance uses an owner-supplied restricted key through Provider Settings, confirms Test Connection, translates a small disposable catalog, checks Machine translated status and provider provenance, then removes or rotates the test key. Provider availability is external state and is not a release blocker for the primary Codex/Claude workflow or offline runtime.</w:t>
+        <w:t xml:space="preserve">Automated fixtures must not contain live keys. Optional provider acceptance uses an owner-supplied restricted key through Engine Settings, confirms Test Connection, translates a small disposable catalog, </w:t>
+      </w:r>
+      <w:r>
+        <w:lastRenderedPageBreak/>
+        <w:t>checks Machine translated status and provider provenance, then removes or rotates the test key. Provider availability is external state and is not a release blocker for the primary Codex/Claude workflow or offline runtime.</w:t>
       </w:r>
     </w:p>
     <w:p>
       <w:pPr>
         <w:pStyle w:val="Heading1"/>
       </w:pPr>
-      <w:bookmarkStart w:id="26" w:name="_Toc237009643"/>
+      <w:bookmarkStart w:id="26" w:name="_Toc237016633"/>
       <w:r>
         <w:t>16. Security Review</w:t>
       </w:r>
@@ -4991,7 +5038,6 @@
           </w:tcPr>
           <w:p>
             <w:r>
-              <w:lastRenderedPageBreak/>
               <w:t>Key committed to Git</w:t>
             </w:r>
           </w:p>
@@ -5248,7 +5294,7 @@
       <w:pPr>
         <w:pStyle w:val="Heading1"/>
       </w:pPr>
-      <w:bookmarkStart w:id="27" w:name="_Toc237009644"/>
+      <w:bookmarkStart w:id="27" w:name="_Toc237016634"/>
       <w:r>
         <w:t>17. Release and Contribution Workflow</w:t>
       </w:r>
@@ -5287,6 +5333,7 @@
         </w:numPr>
       </w:pPr>
       <w:r>
+        <w:lastRenderedPageBreak/>
         <w:t>Keep UI edits in the FMX designer resource and source event logic separate.</w:t>
       </w:r>
     </w:p>
@@ -5366,19 +5413,132 @@
       <w:pPr>
         <w:pStyle w:val="Heading1"/>
       </w:pPr>
-      <w:bookmarkStart w:id="28" w:name="_Toc237009645"/>
+      <w:bookmarkStart w:id="28" w:name="_Toc237016635"/>
+      <w:r>
+        <w:t>18. Known Boundaries and Future-Compatible Design</w:t>
+      </w:r>
+      <w:bookmarkEnd w:id="28"/>
+    </w:p>
+    <w:p>
+      <w:pPr>
+        <w:pStyle w:val="ListBullet"/>
+      </w:pPr>
+      <w:r>
+        <w:t>Only Windows Win32/Win64 Delphi applications are supported.</w:t>
+      </w:r>
+    </w:p>
+    <w:p>
+      <w:pPr>
+        <w:pStyle w:val="ListBullet"/>
+      </w:pPr>
+      <w:r>
+        <w:t>Google Advanced v3, OAuth/service-account workflows, and other providers are not implemented.</w:t>
+      </w:r>
+    </w:p>
+    <w:p>
+      <w:pPr>
+        <w:pStyle w:val="ListBullet"/>
+      </w:pPr>
+      <w:r>
+        <w:t>Provider operations are optional explicit Studio actions; target runtime remains offline.</w:t>
+      </w:r>
+    </w:p>
+    <w:p>
+      <w:pPr>
+        <w:pStyle w:val="ListBullet"/>
+      </w:pPr>
+      <w:r>
+        <w:t>The Studio launches a separately installed Codex CLI or Claude Code command but never impersonates, embeds, or authenticates that service. The developer installs and signs in to the selected CLI using vendor-supported instructions; the Studio stores only non-secret command settings.</w:t>
+      </w:r>
+    </w:p>
+    <w:p>
+      <w:pPr>
+        <w:pStyle w:val="ListBullet"/>
+      </w:pPr>
+      <w:r>
+        <w:t>No automatic control resizing/reflow is performed.</w:t>
+      </w:r>
+    </w:p>
+    <w:p>
+      <w:pPr>
+        <w:pStyle w:val="ListBullet"/>
+      </w:pPr>
+      <w:r>
+        <w:t>Binary DFM conversion is outside the scanner.</w:t>
+      </w:r>
+    </w:p>
+    <w:p>
+      <w:pPr>
+        <w:pStyle w:val="ListBullet"/>
+      </w:pPr>
+      <w:r>
+        <w:t>The generated menu selection persists the locale; restarting is the conservative way to ensure every form and application-specific string is refreshed.</w:t>
+      </w:r>
+    </w:p>
+    <w:p>
+      <w:pPr>
+        <w:pStyle w:val="ListBullet"/>
+      </w:pPr>
+      <w:r>
+        <w:t>Provider account terms and language support are external and must be rechecked for each release.</w:t>
+      </w:r>
+    </w:p>
+    <w:p>
+      <w:pPr>
+        <w:pStyle w:val="Heading1"/>
+      </w:pPr>
+      <w:bookmarkStart w:id="29" w:name="_Toc237016636"/>
+      <w:r>
+        <w:t>19. Documentation Generation</w:t>
+      </w:r>
+      <w:bookmarkEnd w:id="29"/>
+    </w:p>
+    <w:p>
+      <w:r>
+        <w:t>The editable guides are generated from actual source and engineering notes with python-docx. Each DOCX contains a Word TOC field, a dedicated TOC section, and a new-page content section. Microsoft Word COM updates the TOC and fields, repaginates, saves the DOCX, and exports the companion PDF through ExportAsFixedFormat. PDFs are rendered to page images and inspected before release.</w:t>
+      </w:r>
+    </w:p>
+    <w:p>
+      <w:pPr>
+        <w:pStyle w:val="Heading1"/>
+      </w:pPr>
+      <w:bookmarkStart w:id="30" w:name="_Toc237016637"/>
+      <w:r>
+        <w:t>20. Source References</w:t>
+      </w:r>
+      <w:bookmarkEnd w:id="30"/>
+    </w:p>
+    <w:p>
+      <w:pPr>
+        <w:pStyle w:val="ListBullet"/>
+      </w:pPr>
+      <w:r>
+        <w:t>Repository source, forms, project metadata, schemas, and smoke tests as of August 7, 2026.</w:t>
+      </w:r>
+    </w:p>
+    <w:p>
+      <w:pPr>
+        <w:pStyle w:val="ListBullet"/>
+      </w:pPr>
+      <w:r>
+        <w:t>Microsoft credential handling: https://learn.microsoft.com/en-us/windows/win32/secbp/handling-passwords</w:t>
+      </w:r>
+    </w:p>
+    <w:p>
+      <w:pPr>
+        <w:pStyle w:val="ListBullet"/>
+      </w:pPr>
       <w:r>
         <w:lastRenderedPageBreak/>
-        <w:t>18. Known Boundaries and Future-Compatible Design</w:t>
-      </w:r>
-      <w:bookmarkEnd w:id="28"/>
+        <w:t>Windows CREDENTIAL structure: https://learn.microsoft.com/en-us/windows/win32/api/wincred/ns-wincred-credentialw</w:t>
+      </w:r>
     </w:p>
     <w:p>
       <w:pPr>
         <w:pStyle w:val="ListBullet"/>
       </w:pPr>
       <w:r>
-        <w:t>Only Windows Win32/Win64 Delphi applications are supported.</w:t>
+        <w:t>DeepL developer documentation: https://developers.deepl.com/docs/getting-started/auth</w:t>
       </w:r>
     </w:p>
     <w:p>
@@ -5386,7 +5546,7 @@
         <w:pStyle w:val="ListBullet"/>
       </w:pPr>
       <w:r>
-        <w:t>Google Advanced v3, OAuth/service-account workflows, and other providers are not implemented.</w:t>
+        <w:t>Google Cloud Translation documentation: https://docs.cloud.google.com/translate/docs/authentication</w:t>
       </w:r>
     </w:p>
     <w:p>
@@ -5394,7 +5554,7 @@
         <w:pStyle w:val="ListBullet"/>
       </w:pPr>
       <w:r>
-        <w:t>Provider operations are optional explicit Studio actions; target runtime remains offline.</w:t>
+        <w:t>Google API-key guidance: https://docs.cloud.google.com/docs/authentication/api-keys-best-practices</w:t>
       </w:r>
     </w:p>
     <w:p>
@@ -5402,7 +5562,7 @@
         <w:pStyle w:val="ListBullet"/>
       </w:pPr>
       <w:r>
-        <w:t>The Studio prepares and monitors the workspace but does not launch or authenticate Codex or Claude; the developer starts the chosen agent with the generated contract.</w:t>
+        <w:t>OpenAI Codex CLI reference: https://developers.openai.com/codex/cli/reference/</w:t>
       </w:r>
     </w:p>
     <w:p>
@@ -5410,104 +5570,7 @@
         <w:pStyle w:val="ListBullet"/>
       </w:pPr>
       <w:r>
-        <w:t>No automatic control resizing/reflow is performed.</w:t>
-      </w:r>
-    </w:p>
-    <w:p>
-      <w:pPr>
-        <w:pStyle w:val="ListBullet"/>
-      </w:pPr>
-      <w:r>
-        <w:t>Binary DFM conversion is outside the scanner.</w:t>
-      </w:r>
-    </w:p>
-    <w:p>
-      <w:pPr>
-        <w:pStyle w:val="ListBullet"/>
-      </w:pPr>
-      <w:r>
-        <w:t>The generated menu selection persists the locale; restarting is the conservative way to ensure every form and application-specific string is refreshed.</w:t>
-      </w:r>
-    </w:p>
-    <w:p>
-      <w:pPr>
-        <w:pStyle w:val="ListBullet"/>
-      </w:pPr>
-      <w:r>
-        <w:t>Provider account terms and language support are external and must be rechecked for each release.</w:t>
-      </w:r>
-    </w:p>
-    <w:p>
-      <w:pPr>
-        <w:pStyle w:val="Heading1"/>
-      </w:pPr>
-      <w:bookmarkStart w:id="29" w:name="_Toc237009646"/>
-      <w:r>
-        <w:t>19. Documentation Generation</w:t>
-      </w:r>
-      <w:bookmarkEnd w:id="29"/>
-    </w:p>
-    <w:p>
-      <w:r>
-        <w:t>The editable guides are generated from actual source and engineering notes with python-docx. Each DOCX contains a Word TOC field, a dedicated TOC section, and a new-page content section. Microsoft Word COM updates the TOC and fields, repaginates, saves the DOCX, and exports the companion PDF through ExportAsFixedFormat. PDFs are rendered to page images and inspected before release.</w:t>
-      </w:r>
-    </w:p>
-    <w:p>
-      <w:pPr>
-        <w:pStyle w:val="Heading1"/>
-      </w:pPr>
-      <w:bookmarkStart w:id="30" w:name="_Toc237009647"/>
-      <w:r>
-        <w:t>20. Source References</w:t>
-      </w:r>
-      <w:bookmarkEnd w:id="30"/>
-    </w:p>
-    <w:p>
-      <w:pPr>
-        <w:pStyle w:val="ListBullet"/>
-      </w:pPr>
-      <w:r>
-        <w:t>Repository source, forms, project metadata, schemas, and smoke tests as of August 7, 2026.</w:t>
-      </w:r>
-    </w:p>
-    <w:p>
-      <w:pPr>
-        <w:pStyle w:val="ListBullet"/>
-      </w:pPr>
-      <w:r>
-        <w:t>Microsoft credential handling: https://learn.microsoft.com/en-us/windows/win32/secbp/handling-passwords</w:t>
-      </w:r>
-    </w:p>
-    <w:p>
-      <w:pPr>
-        <w:pStyle w:val="ListBullet"/>
-      </w:pPr>
-      <w:r>
-        <w:t>Windows CREDENTIAL structure: https://learn.microsoft.com/en-us/windows/win32/api/wincred/ns-wincred-credentialw</w:t>
-      </w:r>
-    </w:p>
-    <w:p>
-      <w:pPr>
-        <w:pStyle w:val="ListBullet"/>
-      </w:pPr>
-      <w:r>
-        <w:t>DeepL developer documentation: https://developers.deepl.com/docs/getting-started/auth</w:t>
-      </w:r>
-    </w:p>
-    <w:p>
-      <w:pPr>
-        <w:pStyle w:val="ListBullet"/>
-      </w:pPr>
-      <w:r>
-        <w:t>Google Cloud Translation documentation: https://docs.cloud.google.com/translate/docs/authentication</w:t>
-      </w:r>
-    </w:p>
-    <w:p>
-      <w:pPr>
-        <w:pStyle w:val="ListBullet"/>
-      </w:pPr>
-      <w:r>
-        <w:t>Google API-key guidance: https://docs.cloud.google.com/docs/authentication/api-keys-best-practices</w:t>
+        <w:t>Anthropic Claude Code CLI reference: https://docs.anthropic.com/en/docs/claude-code/cli-usage</w:t>
       </w:r>
     </w:p>
     <w:sectPr>
@@ -5924,40 +5987,40 @@
       </w:rPr>
     </w:lvl>
   </w:abstractNum>
-  <w:num w:numId="1" w16cid:durableId="1820229188">
+  <w:num w:numId="1" w16cid:durableId="1763990333">
     <w:abstractNumId w:val="8"/>
   </w:num>
-  <w:num w:numId="2" w16cid:durableId="299773959">
+  <w:num w:numId="2" w16cid:durableId="325405617">
     <w:abstractNumId w:val="6"/>
   </w:num>
-  <w:num w:numId="3" w16cid:durableId="1819300345">
+  <w:num w:numId="3" w16cid:durableId="1085540017">
     <w:abstractNumId w:val="5"/>
   </w:num>
-  <w:num w:numId="4" w16cid:durableId="859046140">
+  <w:num w:numId="4" w16cid:durableId="221671506">
     <w:abstractNumId w:val="4"/>
   </w:num>
-  <w:num w:numId="5" w16cid:durableId="554656325">
+  <w:num w:numId="5" w16cid:durableId="1098872337">
     <w:abstractNumId w:val="7"/>
   </w:num>
-  <w:num w:numId="6" w16cid:durableId="1593274723">
+  <w:num w:numId="6" w16cid:durableId="1590310043">
     <w:abstractNumId w:val="3"/>
   </w:num>
-  <w:num w:numId="7" w16cid:durableId="801582366">
+  <w:num w:numId="7" w16cid:durableId="1404595818">
     <w:abstractNumId w:val="2"/>
   </w:num>
-  <w:num w:numId="8" w16cid:durableId="1844591158">
+  <w:num w:numId="8" w16cid:durableId="2111274056">
     <w:abstractNumId w:val="1"/>
   </w:num>
-  <w:num w:numId="9" w16cid:durableId="1556965801">
+  <w:num w:numId="9" w16cid:durableId="1526746018">
     <w:abstractNumId w:val="0"/>
   </w:num>
-  <w:num w:numId="10" w16cid:durableId="828785202">
+  <w:num w:numId="10" w16cid:durableId="473571845">
     <w:abstractNumId w:val="7"/>
     <w:lvlOverride w:ilvl="0">
       <w:startOverride w:val="1"/>
     </w:lvlOverride>
   </w:num>
-  <w:num w:numId="11" w16cid:durableId="214123379">
+  <w:num w:numId="11" w16cid:durableId="405033856">
     <w:abstractNumId w:val="7"/>
     <w:lvlOverride w:ilvl="0">
       <w:startOverride w:val="1"/>
@@ -17384,7 +17447,7 @@
     <w:autoRedefine/>
     <w:uiPriority w:val="39"/>
     <w:unhideWhenUsed/>
-    <w:rsid w:val="00FE2E4D"/>
+    <w:rsid w:val="004628AE"/>
     <w:pPr>
       <w:spacing w:after="100"/>
     </w:pPr>
@@ -17396,7 +17459,7 @@
     <w:autoRedefine/>
     <w:uiPriority w:val="39"/>
     <w:unhideWhenUsed/>
-    <w:rsid w:val="00FE2E4D"/>
+    <w:rsid w:val="004628AE"/>
     <w:pPr>
       <w:spacing w:after="100"/>
       <w:ind w:left="220"/>
@@ -17407,7 +17470,7 @@
     <w:basedOn w:val="DefaultParagraphFont"/>
     <w:uiPriority w:val="99"/>
     <w:unhideWhenUsed/>
-    <w:rsid w:val="00FE2E4D"/>
+    <w:rsid w:val="004628AE"/>
     <w:rPr>
       <w:color w:val="0000FF" w:themeColor="hyperlink"/>
       <w:u w:val="single"/>

</xml_diff>

<commit_message>
Replace CLI agents with provider-only translation
</commit_message>
<xml_diff>
--- a/docs/guides/Delphi App Translation Studio Engineering Guide.docx
+++ b/docs/guides/Delphi App Translation Studio Engineering Guide.docx
@@ -13,7 +13,7 @@
           <w:noProof/>
         </w:rPr>
         <w:drawing>
-          <wp:inline distT="0" distB="0" distL="0" distR="0" wp14:anchorId="5BD57C41" wp14:editId="280CABC5">
+          <wp:inline distT="0" distB="0" distL="0" distR="0" wp14:anchorId="7D743104" wp14:editId="6D8967DA">
             <wp:extent cx="1371600" cy="1371600"/>
             <wp:effectExtent l="0" t="0" r="0" b="0"/>
             <wp:docPr id="1" name="Picture 1"/>
@@ -149,7 +149,7 @@
       <w:pPr>
         <w:pStyle w:val="Heading1"/>
       </w:pPr>
-      <w:bookmarkStart w:id="0" w:name="_Toc237016607"/>
+      <w:bookmarkStart w:id="0" w:name="_Toc237020187"/>
       <w:r>
         <w:lastRenderedPageBreak/>
         <w:t>Table of Contents</w:t>
@@ -175,7 +175,7 @@
       <w:r>
         <w:fldChar w:fldCharType="separate"/>
       </w:r>
-      <w:hyperlink w:anchor="_Toc237016607" w:history="1">
+      <w:hyperlink w:anchor="_Toc237020187" w:history="1">
         <w:r>
           <w:rPr>
             <w:rStyle w:val="Hyperlink"/>
@@ -202,7 +202,7 @@
             <w:noProof/>
             <w:webHidden/>
           </w:rPr>
-          <w:instrText xml:space="preserve"> PAGEREF _Toc237016607 \h </w:instrText>
+          <w:instrText xml:space="preserve"> PAGEREF _Toc237020187 \h </w:instrText>
         </w:r>
         <w:r>
           <w:rPr>
@@ -243,7 +243,7 @@
           <w:noProof/>
         </w:rPr>
       </w:pPr>
-      <w:hyperlink w:anchor="_Toc237016608" w:history="1">
+      <w:hyperlink w:anchor="_Toc237020188" w:history="1">
         <w:r>
           <w:rPr>
             <w:rStyle w:val="Hyperlink"/>
@@ -270,7 +270,7 @@
             <w:noProof/>
             <w:webHidden/>
           </w:rPr>
-          <w:instrText xml:space="preserve"> PAGEREF _Toc237016608 \h </w:instrText>
+          <w:instrText xml:space="preserve"> PAGEREF _Toc237020188 \h </w:instrText>
         </w:r>
         <w:r>
           <w:rPr>
@@ -311,7 +311,7 @@
           <w:noProof/>
         </w:rPr>
       </w:pPr>
-      <w:hyperlink w:anchor="_Toc237016609" w:history="1">
+      <w:hyperlink w:anchor="_Toc237020189" w:history="1">
         <w:r>
           <w:rPr>
             <w:rStyle w:val="Hyperlink"/>
@@ -338,7 +338,7 @@
             <w:noProof/>
             <w:webHidden/>
           </w:rPr>
-          <w:instrText xml:space="preserve"> PAGEREF _Toc237016609 \h </w:instrText>
+          <w:instrText xml:space="preserve"> PAGEREF _Toc237020189 \h </w:instrText>
         </w:r>
         <w:r>
           <w:rPr>
@@ -379,7 +379,7 @@
           <w:noProof/>
         </w:rPr>
       </w:pPr>
-      <w:hyperlink w:anchor="_Toc237016610" w:history="1">
+      <w:hyperlink w:anchor="_Toc237020190" w:history="1">
         <w:r>
           <w:rPr>
             <w:rStyle w:val="Hyperlink"/>
@@ -406,7 +406,7 @@
             <w:noProof/>
             <w:webHidden/>
           </w:rPr>
-          <w:instrText xml:space="preserve"> PAGEREF _Toc237016610 \h </w:instrText>
+          <w:instrText xml:space="preserve"> PAGEREF _Toc237020190 \h </w:instrText>
         </w:r>
         <w:r>
           <w:rPr>
@@ -447,7 +447,7 @@
           <w:noProof/>
         </w:rPr>
       </w:pPr>
-      <w:hyperlink w:anchor="_Toc237016611" w:history="1">
+      <w:hyperlink w:anchor="_Toc237020191" w:history="1">
         <w:r>
           <w:rPr>
             <w:rStyle w:val="Hyperlink"/>
@@ -474,7 +474,7 @@
             <w:noProof/>
             <w:webHidden/>
           </w:rPr>
-          <w:instrText xml:space="preserve"> PAGEREF _Toc237016611 \h </w:instrText>
+          <w:instrText xml:space="preserve"> PAGEREF _Toc237020191 \h </w:instrText>
         </w:r>
         <w:r>
           <w:rPr>
@@ -515,7 +515,7 @@
           <w:noProof/>
         </w:rPr>
       </w:pPr>
-      <w:hyperlink w:anchor="_Toc237016612" w:history="1">
+      <w:hyperlink w:anchor="_Toc237020192" w:history="1">
         <w:r>
           <w:rPr>
             <w:rStyle w:val="Hyperlink"/>
@@ -542,7 +542,7 @@
             <w:noProof/>
             <w:webHidden/>
           </w:rPr>
-          <w:instrText xml:space="preserve"> PAGEREF _Toc237016612 \h </w:instrText>
+          <w:instrText xml:space="preserve"> PAGEREF _Toc237020192 \h </w:instrText>
         </w:r>
         <w:r>
           <w:rPr>
@@ -583,7 +583,7 @@
           <w:noProof/>
         </w:rPr>
       </w:pPr>
-      <w:hyperlink w:anchor="_Toc237016613" w:history="1">
+      <w:hyperlink w:anchor="_Toc237020193" w:history="1">
         <w:r>
           <w:rPr>
             <w:rStyle w:val="Hyperlink"/>
@@ -610,7 +610,7 @@
             <w:noProof/>
             <w:webHidden/>
           </w:rPr>
-          <w:instrText xml:space="preserve"> PAGEREF _Toc237016613 \h </w:instrText>
+          <w:instrText xml:space="preserve"> PAGEREF _Toc237020193 \h </w:instrText>
         </w:r>
         <w:r>
           <w:rPr>
@@ -651,7 +651,7 @@
           <w:noProof/>
         </w:rPr>
       </w:pPr>
-      <w:hyperlink w:anchor="_Toc237016614" w:history="1">
+      <w:hyperlink w:anchor="_Toc237020194" w:history="1">
         <w:r>
           <w:rPr>
             <w:rStyle w:val="Hyperlink"/>
@@ -678,7 +678,7 @@
             <w:noProof/>
             <w:webHidden/>
           </w:rPr>
-          <w:instrText xml:space="preserve"> PAGEREF _Toc237016614 \h </w:instrText>
+          <w:instrText xml:space="preserve"> PAGEREF _Toc237020194 \h </w:instrText>
         </w:r>
         <w:r>
           <w:rPr>
@@ -719,7 +719,7 @@
           <w:noProof/>
         </w:rPr>
       </w:pPr>
-      <w:hyperlink w:anchor="_Toc237016615" w:history="1">
+      <w:hyperlink w:anchor="_Toc237020195" w:history="1">
         <w:r>
           <w:rPr>
             <w:rStyle w:val="Hyperlink"/>
@@ -746,7 +746,7 @@
             <w:noProof/>
             <w:webHidden/>
           </w:rPr>
-          <w:instrText xml:space="preserve"> PAGEREF _Toc237016615 \h </w:instrText>
+          <w:instrText xml:space="preserve"> PAGEREF _Toc237020195 \h </w:instrText>
         </w:r>
         <w:r>
           <w:rPr>
@@ -787,7 +787,7 @@
           <w:noProof/>
         </w:rPr>
       </w:pPr>
-      <w:hyperlink w:anchor="_Toc237016616" w:history="1">
+      <w:hyperlink w:anchor="_Toc237020196" w:history="1">
         <w:r>
           <w:rPr>
             <w:rStyle w:val="Hyperlink"/>
@@ -814,7 +814,7 @@
             <w:noProof/>
             <w:webHidden/>
           </w:rPr>
-          <w:instrText xml:space="preserve"> PAGEREF _Toc237016616 \h </w:instrText>
+          <w:instrText xml:space="preserve"> PAGEREF _Toc237020196 \h </w:instrText>
         </w:r>
         <w:r>
           <w:rPr>
@@ -855,7 +855,7 @@
           <w:noProof/>
         </w:rPr>
       </w:pPr>
-      <w:hyperlink w:anchor="_Toc237016617" w:history="1">
+      <w:hyperlink w:anchor="_Toc237020197" w:history="1">
         <w:r>
           <w:rPr>
             <w:rStyle w:val="Hyperlink"/>
@@ -882,7 +882,7 @@
             <w:noProof/>
             <w:webHidden/>
           </w:rPr>
-          <w:instrText xml:space="preserve"> PAGEREF _Toc237016617 \h </w:instrText>
+          <w:instrText xml:space="preserve"> PAGEREF _Toc237020197 \h </w:instrText>
         </w:r>
         <w:r>
           <w:rPr>
@@ -923,7 +923,7 @@
           <w:noProof/>
         </w:rPr>
       </w:pPr>
-      <w:hyperlink w:anchor="_Toc237016618" w:history="1">
+      <w:hyperlink w:anchor="_Toc237020198" w:history="1">
         <w:r>
           <w:rPr>
             <w:rStyle w:val="Hyperlink"/>
@@ -950,7 +950,7 @@
             <w:noProof/>
             <w:webHidden/>
           </w:rPr>
-          <w:instrText xml:space="preserve"> PAGEREF _Toc237016618 \h </w:instrText>
+          <w:instrText xml:space="preserve"> PAGEREF _Toc237020198 \h </w:instrText>
         </w:r>
         <w:r>
           <w:rPr>
@@ -991,13 +991,13 @@
           <w:noProof/>
         </w:rPr>
       </w:pPr>
-      <w:hyperlink w:anchor="_Toc237016619" w:history="1">
+      <w:hyperlink w:anchor="_Toc237020199" w:history="1">
         <w:r>
           <w:rPr>
             <w:rStyle w:val="Hyperlink"/>
             <w:noProof/>
           </w:rPr>
-          <w:t>7. Agent Execution, Provider Settings, and Secret Storage</w:t>
+          <w:t>7. Provider Settings and Secret Storage</w:t>
         </w:r>
         <w:r>
           <w:rPr>
@@ -1018,7 +1018,7 @@
             <w:noProof/>
             <w:webHidden/>
           </w:rPr>
-          <w:instrText xml:space="preserve"> PAGEREF _Toc237016619 \h </w:instrText>
+          <w:instrText xml:space="preserve"> PAGEREF _Toc237020199 \h </w:instrText>
         </w:r>
         <w:r>
           <w:rPr>
@@ -1059,7 +1059,7 @@
           <w:noProof/>
         </w:rPr>
       </w:pPr>
-      <w:hyperlink w:anchor="_Toc237016620" w:history="1">
+      <w:hyperlink w:anchor="_Toc237020200" w:history="1">
         <w:r>
           <w:rPr>
             <w:rStyle w:val="Hyperlink"/>
@@ -1086,7 +1086,7 @@
             <w:noProof/>
             <w:webHidden/>
           </w:rPr>
-          <w:instrText xml:space="preserve"> PAGEREF _Toc237016620 \h </w:instrText>
+          <w:instrText xml:space="preserve"> PAGEREF _Toc237020200 \h </w:instrText>
         </w:r>
         <w:r>
           <w:rPr>
@@ -1106,7 +1106,7 @@
             <w:noProof/>
             <w:webHidden/>
           </w:rPr>
-          <w:t>6</w:t>
+          <w:t>5</w:t>
         </w:r>
         <w:r>
           <w:rPr>
@@ -1127,7 +1127,7 @@
           <w:noProof/>
         </w:rPr>
       </w:pPr>
-      <w:hyperlink w:anchor="_Toc237016621" w:history="1">
+      <w:hyperlink w:anchor="_Toc237020201" w:history="1">
         <w:r>
           <w:rPr>
             <w:rStyle w:val="Hyperlink"/>
@@ -1154,7 +1154,7 @@
             <w:noProof/>
             <w:webHidden/>
           </w:rPr>
-          <w:instrText xml:space="preserve"> PAGEREF _Toc237016621 \h </w:instrText>
+          <w:instrText xml:space="preserve"> PAGEREF _Toc237020201 \h </w:instrText>
         </w:r>
         <w:r>
           <w:rPr>
@@ -1195,7 +1195,7 @@
           <w:noProof/>
         </w:rPr>
       </w:pPr>
-      <w:hyperlink w:anchor="_Toc237016622" w:history="1">
+      <w:hyperlink w:anchor="_Toc237020202" w:history="1">
         <w:r>
           <w:rPr>
             <w:rStyle w:val="Hyperlink"/>
@@ -1222,7 +1222,7 @@
             <w:noProof/>
             <w:webHidden/>
           </w:rPr>
-          <w:instrText xml:space="preserve"> PAGEREF _Toc237016622 \h </w:instrText>
+          <w:instrText xml:space="preserve"> PAGEREF _Toc237020202 \h </w:instrText>
         </w:r>
         <w:r>
           <w:rPr>
@@ -1263,13 +1263,13 @@
           <w:noProof/>
         </w:rPr>
       </w:pPr>
-      <w:hyperlink w:anchor="_Toc237016623" w:history="1">
+      <w:hyperlink w:anchor="_Toc237020203" w:history="1">
         <w:r>
           <w:rPr>
             <w:rStyle w:val="Hyperlink"/>
             <w:noProof/>
           </w:rPr>
-          <w:t>9. In-Place AI Translation and Alternatives</w:t>
+          <w:t>9. Automatic Provider Translation and Review</w:t>
         </w:r>
         <w:r>
           <w:rPr>
@@ -1290,7 +1290,7 @@
             <w:noProof/>
             <w:webHidden/>
           </w:rPr>
-          <w:instrText xml:space="preserve"> PAGEREF _Toc237016623 \h </w:instrText>
+          <w:instrText xml:space="preserve"> PAGEREF _Toc237020203 \h </w:instrText>
         </w:r>
         <w:r>
           <w:rPr>
@@ -1310,7 +1310,7 @@
             <w:noProof/>
             <w:webHidden/>
           </w:rPr>
-          <w:t>7</w:t>
+          <w:t>6</w:t>
         </w:r>
         <w:r>
           <w:rPr>
@@ -1331,7 +1331,7 @@
           <w:noProof/>
         </w:rPr>
       </w:pPr>
-      <w:hyperlink w:anchor="_Toc237016624" w:history="1">
+      <w:hyperlink w:anchor="_Toc237020204" w:history="1">
         <w:r>
           <w:rPr>
             <w:rStyle w:val="Hyperlink"/>
@@ -1358,7 +1358,7 @@
             <w:noProof/>
             <w:webHidden/>
           </w:rPr>
-          <w:instrText xml:space="preserve"> PAGEREF _Toc237016624 \h </w:instrText>
+          <w:instrText xml:space="preserve"> PAGEREF _Toc237020204 \h </w:instrText>
         </w:r>
         <w:r>
           <w:rPr>
@@ -1378,7 +1378,7 @@
             <w:noProof/>
             <w:webHidden/>
           </w:rPr>
-          <w:t>8</w:t>
+          <w:t>7</w:t>
         </w:r>
         <w:r>
           <w:rPr>
@@ -1399,7 +1399,7 @@
           <w:noProof/>
         </w:rPr>
       </w:pPr>
-      <w:hyperlink w:anchor="_Toc237016625" w:history="1">
+      <w:hyperlink w:anchor="_Toc237020205" w:history="1">
         <w:r>
           <w:rPr>
             <w:rStyle w:val="Hyperlink"/>
@@ -1426,7 +1426,7 @@
             <w:noProof/>
             <w:webHidden/>
           </w:rPr>
-          <w:instrText xml:space="preserve"> PAGEREF _Toc237016625 \h </w:instrText>
+          <w:instrText xml:space="preserve"> PAGEREF _Toc237020205 \h </w:instrText>
         </w:r>
         <w:r>
           <w:rPr>
@@ -1446,7 +1446,7 @@
             <w:noProof/>
             <w:webHidden/>
           </w:rPr>
-          <w:t>8</w:t>
+          <w:t>7</w:t>
         </w:r>
         <w:r>
           <w:rPr>
@@ -1467,7 +1467,7 @@
           <w:noProof/>
         </w:rPr>
       </w:pPr>
-      <w:hyperlink w:anchor="_Toc237016626" w:history="1">
+      <w:hyperlink w:anchor="_Toc237020206" w:history="1">
         <w:r>
           <w:rPr>
             <w:rStyle w:val="Hyperlink"/>
@@ -1494,7 +1494,7 @@
             <w:noProof/>
             <w:webHidden/>
           </w:rPr>
-          <w:instrText xml:space="preserve"> PAGEREF _Toc237016626 \h </w:instrText>
+          <w:instrText xml:space="preserve"> PAGEREF _Toc237020206 \h </w:instrText>
         </w:r>
         <w:r>
           <w:rPr>
@@ -1535,7 +1535,7 @@
           <w:noProof/>
         </w:rPr>
       </w:pPr>
-      <w:hyperlink w:anchor="_Toc237016627" w:history="1">
+      <w:hyperlink w:anchor="_Toc237020207" w:history="1">
         <w:r>
           <w:rPr>
             <w:rStyle w:val="Hyperlink"/>
@@ -1562,7 +1562,7 @@
             <w:noProof/>
             <w:webHidden/>
           </w:rPr>
-          <w:instrText xml:space="preserve"> PAGEREF _Toc237016627 \h </w:instrText>
+          <w:instrText xml:space="preserve"> PAGEREF _Toc237020207 \h </w:instrText>
         </w:r>
         <w:r>
           <w:rPr>
@@ -1603,7 +1603,7 @@
           <w:noProof/>
         </w:rPr>
       </w:pPr>
-      <w:hyperlink w:anchor="_Toc237016628" w:history="1">
+      <w:hyperlink w:anchor="_Toc237020208" w:history="1">
         <w:r>
           <w:rPr>
             <w:rStyle w:val="Hyperlink"/>
@@ -1630,7 +1630,7 @@
             <w:noProof/>
             <w:webHidden/>
           </w:rPr>
-          <w:instrText xml:space="preserve"> PAGEREF _Toc237016628 \h </w:instrText>
+          <w:instrText xml:space="preserve"> PAGEREF _Toc237020208 \h </w:instrText>
         </w:r>
         <w:r>
           <w:rPr>
@@ -1650,7 +1650,7 @@
             <w:noProof/>
             <w:webHidden/>
           </w:rPr>
-          <w:t>9</w:t>
+          <w:t>8</w:t>
         </w:r>
         <w:r>
           <w:rPr>
@@ -1671,7 +1671,7 @@
           <w:noProof/>
         </w:rPr>
       </w:pPr>
-      <w:hyperlink w:anchor="_Toc237016629" w:history="1">
+      <w:hyperlink w:anchor="_Toc237020209" w:history="1">
         <w:r>
           <w:rPr>
             <w:rStyle w:val="Hyperlink"/>
@@ -1698,7 +1698,7 @@
             <w:noProof/>
             <w:webHidden/>
           </w:rPr>
-          <w:instrText xml:space="preserve"> PAGEREF _Toc237016629 \h </w:instrText>
+          <w:instrText xml:space="preserve"> PAGEREF _Toc237020209 \h </w:instrText>
         </w:r>
         <w:r>
           <w:rPr>
@@ -1739,7 +1739,7 @@
           <w:noProof/>
         </w:rPr>
       </w:pPr>
-      <w:hyperlink w:anchor="_Toc237016630" w:history="1">
+      <w:hyperlink w:anchor="_Toc237020210" w:history="1">
         <w:r>
           <w:rPr>
             <w:rStyle w:val="Hyperlink"/>
@@ -1766,7 +1766,7 @@
             <w:noProof/>
             <w:webHidden/>
           </w:rPr>
-          <w:instrText xml:space="preserve"> PAGEREF _Toc237016630 \h </w:instrText>
+          <w:instrText xml:space="preserve"> PAGEREF _Toc237020210 \h </w:instrText>
         </w:r>
         <w:r>
           <w:rPr>
@@ -1807,7 +1807,7 @@
           <w:noProof/>
         </w:rPr>
       </w:pPr>
-      <w:hyperlink w:anchor="_Toc237016631" w:history="1">
+      <w:hyperlink w:anchor="_Toc237020211" w:history="1">
         <w:r>
           <w:rPr>
             <w:rStyle w:val="Hyperlink"/>
@@ -1834,7 +1834,7 @@
             <w:noProof/>
             <w:webHidden/>
           </w:rPr>
-          <w:instrText xml:space="preserve"> PAGEREF _Toc237016631 \h </w:instrText>
+          <w:instrText xml:space="preserve"> PAGEREF _Toc237020211 \h </w:instrText>
         </w:r>
         <w:r>
           <w:rPr>
@@ -1854,7 +1854,7 @@
             <w:noProof/>
             <w:webHidden/>
           </w:rPr>
-          <w:t>10</w:t>
+          <w:t>9</w:t>
         </w:r>
         <w:r>
           <w:rPr>
@@ -1875,7 +1875,7 @@
           <w:noProof/>
         </w:rPr>
       </w:pPr>
-      <w:hyperlink w:anchor="_Toc237016632" w:history="1">
+      <w:hyperlink w:anchor="_Toc237020212" w:history="1">
         <w:r>
           <w:rPr>
             <w:rStyle w:val="Hyperlink"/>
@@ -1902,7 +1902,7 @@
             <w:noProof/>
             <w:webHidden/>
           </w:rPr>
-          <w:instrText xml:space="preserve"> PAGEREF _Toc237016632 \h </w:instrText>
+          <w:instrText xml:space="preserve"> PAGEREF _Toc237020212 \h </w:instrText>
         </w:r>
         <w:r>
           <w:rPr>
@@ -1943,7 +1943,7 @@
           <w:noProof/>
         </w:rPr>
       </w:pPr>
-      <w:hyperlink w:anchor="_Toc237016633" w:history="1">
+      <w:hyperlink w:anchor="_Toc237020213" w:history="1">
         <w:r>
           <w:rPr>
             <w:rStyle w:val="Hyperlink"/>
@@ -1970,7 +1970,7 @@
             <w:noProof/>
             <w:webHidden/>
           </w:rPr>
-          <w:instrText xml:space="preserve"> PAGEREF _Toc237016633 \h </w:instrText>
+          <w:instrText xml:space="preserve"> PAGEREF _Toc237020213 \h </w:instrText>
         </w:r>
         <w:r>
           <w:rPr>
@@ -1990,7 +1990,7 @@
             <w:noProof/>
             <w:webHidden/>
           </w:rPr>
-          <w:t>11</w:t>
+          <w:t>10</w:t>
         </w:r>
         <w:r>
           <w:rPr>
@@ -2011,7 +2011,7 @@
           <w:noProof/>
         </w:rPr>
       </w:pPr>
-      <w:hyperlink w:anchor="_Toc237016634" w:history="1">
+      <w:hyperlink w:anchor="_Toc237020214" w:history="1">
         <w:r>
           <w:rPr>
             <w:rStyle w:val="Hyperlink"/>
@@ -2038,7 +2038,7 @@
             <w:noProof/>
             <w:webHidden/>
           </w:rPr>
-          <w:instrText xml:space="preserve"> PAGEREF _Toc237016634 \h </w:instrText>
+          <w:instrText xml:space="preserve"> PAGEREF _Toc237020214 \h </w:instrText>
         </w:r>
         <w:r>
           <w:rPr>
@@ -2079,7 +2079,7 @@
           <w:noProof/>
         </w:rPr>
       </w:pPr>
-      <w:hyperlink w:anchor="_Toc237016635" w:history="1">
+      <w:hyperlink w:anchor="_Toc237020215" w:history="1">
         <w:r>
           <w:rPr>
             <w:rStyle w:val="Hyperlink"/>
@@ -2106,7 +2106,7 @@
             <w:noProof/>
             <w:webHidden/>
           </w:rPr>
-          <w:instrText xml:space="preserve"> PAGEREF _Toc237016635 \h </w:instrText>
+          <w:instrText xml:space="preserve"> PAGEREF _Toc237020215 \h </w:instrText>
         </w:r>
         <w:r>
           <w:rPr>
@@ -2126,7 +2126,7 @@
             <w:noProof/>
             <w:webHidden/>
           </w:rPr>
-          <w:t>12</w:t>
+          <w:t>11</w:t>
         </w:r>
         <w:r>
           <w:rPr>
@@ -2147,7 +2147,7 @@
           <w:noProof/>
         </w:rPr>
       </w:pPr>
-      <w:hyperlink w:anchor="_Toc237016636" w:history="1">
+      <w:hyperlink w:anchor="_Toc237020216" w:history="1">
         <w:r>
           <w:rPr>
             <w:rStyle w:val="Hyperlink"/>
@@ -2174,7 +2174,7 @@
             <w:noProof/>
             <w:webHidden/>
           </w:rPr>
-          <w:instrText xml:space="preserve"> PAGEREF _Toc237016636 \h </w:instrText>
+          <w:instrText xml:space="preserve"> PAGEREF _Toc237020216 \h </w:instrText>
         </w:r>
         <w:r>
           <w:rPr>
@@ -2215,7 +2215,7 @@
           <w:noProof/>
         </w:rPr>
       </w:pPr>
-      <w:hyperlink w:anchor="_Toc237016637" w:history="1">
+      <w:hyperlink w:anchor="_Toc237020217" w:history="1">
         <w:r>
           <w:rPr>
             <w:rStyle w:val="Hyperlink"/>
@@ -2242,7 +2242,7 @@
             <w:noProof/>
             <w:webHidden/>
           </w:rPr>
-          <w:instrText xml:space="preserve"> PAGEREF _Toc237016637 \h </w:instrText>
+          <w:instrText xml:space="preserve"> PAGEREF _Toc237020217 \h </w:instrText>
         </w:r>
         <w:r>
           <w:rPr>
@@ -2295,7 +2295,7 @@
       <w:pPr>
         <w:pStyle w:val="Heading1"/>
       </w:pPr>
-      <w:bookmarkStart w:id="1" w:name="_Toc237016608"/>
+      <w:bookmarkStart w:id="1" w:name="_Toc237020188"/>
       <w:r>
         <w:lastRenderedPageBreak/>
         <w:t>1. Product Scope and Invariants</w:t>
@@ -2364,7 +2364,7 @@
       <w:pPr>
         <w:pStyle w:val="Heading1"/>
       </w:pPr>
-      <w:bookmarkStart w:id="2" w:name="_Toc237016609"/>
+      <w:bookmarkStart w:id="2" w:name="_Toc237020189"/>
       <w:r>
         <w:t>2. Repository and Build Layout</w:t>
       </w:r>
@@ -2473,7 +2473,7 @@
           </w:tcPr>
           <w:p>
             <w:r>
-              <w:t>source\agent</w:t>
+              <w:t>source\scan</w:t>
             </w:r>
           </w:p>
         </w:tc>
@@ -2487,7 +2487,7 @@
               <w:cnfStyle w:val="000000000000" w:firstRow="0" w:lastRow="0" w:firstColumn="0" w:lastColumn="0" w:oddVBand="0" w:evenVBand="0" w:oddHBand="0" w:evenHBand="0" w:firstRowFirstColumn="0" w:firstRowLastColumn="0" w:lastRowFirstColumn="0" w:lastRowLastColumn="0"/>
             </w:pPr>
             <w:r>
-              <w:t>Installed Codex/Claude command settings, detection, process execution, logging, and cancellation.</w:t>
+              <w:t>VCL/FMX form text, Pascal resourcestrings, extraction rules, diagnostics, incremental merge.</w:t>
             </w:r>
           </w:p>
         </w:tc>
@@ -2495,38 +2495,6 @@
       <w:tr>
         <w:trPr>
           <w:cnfStyle w:val="000000100000" w:firstRow="0" w:lastRow="0" w:firstColumn="0" w:lastColumn="0" w:oddVBand="0" w:evenVBand="0" w:oddHBand="1" w:evenHBand="0" w:firstRowFirstColumn="0" w:firstRowLastColumn="0" w:lastRowFirstColumn="0" w:lastRowLastColumn="0"/>
-          <w:cantSplit/>
-          <w:jc w:val="center"/>
-        </w:trPr>
-        <w:tc>
-          <w:tcPr>
-            <w:cnfStyle w:val="001000000000" w:firstRow="0" w:lastRow="0" w:firstColumn="1" w:lastColumn="0" w:oddVBand="0" w:evenVBand="0" w:oddHBand="0" w:evenHBand="0" w:firstRowFirstColumn="0" w:firstRowLastColumn="0" w:lastRowFirstColumn="0" w:lastRowLastColumn="0"/>
-            <w:tcW w:w="2700" w:type="dxa"/>
-            <w:vAlign w:val="center"/>
-          </w:tcPr>
-          <w:p>
-            <w:r>
-              <w:t>source\scan</w:t>
-            </w:r>
-          </w:p>
-        </w:tc>
-        <w:tc>
-          <w:tcPr>
-            <w:tcW w:w="6660" w:type="dxa"/>
-            <w:vAlign w:val="center"/>
-          </w:tcPr>
-          <w:p>
-            <w:pPr>
-              <w:cnfStyle w:val="000000100000" w:firstRow="0" w:lastRow="0" w:firstColumn="0" w:lastColumn="0" w:oddVBand="0" w:evenVBand="0" w:oddHBand="1" w:evenHBand="0" w:firstRowFirstColumn="0" w:firstRowLastColumn="0" w:lastRowFirstColumn="0" w:lastRowLastColumn="0"/>
-            </w:pPr>
-            <w:r>
-              <w:t>VCL/FMX form text, Pascal resourcestrings, extraction rules, diagnostics, incremental merge.</w:t>
-            </w:r>
-          </w:p>
-        </w:tc>
-      </w:tr>
-      <w:tr>
-        <w:trPr>
           <w:cantSplit/>
           <w:jc w:val="center"/>
         </w:trPr>
@@ -2549,7 +2517,7 @@
           </w:tcPr>
           <w:p>
             <w:pPr>
-              <w:cnfStyle w:val="000000000000" w:firstRow="0" w:lastRow="0" w:firstColumn="0" w:lastColumn="0" w:oddVBand="0" w:evenVBand="0" w:oddHBand="0" w:evenHBand="0" w:firstRowFirstColumn="0" w:firstRowLastColumn="0" w:lastRowFirstColumn="0" w:lastRowLastColumn="0"/>
+              <w:cnfStyle w:val="000000100000" w:firstRow="0" w:lastRow="0" w:firstColumn="0" w:lastColumn="0" w:oddVBand="0" w:evenVBand="0" w:oddHBand="1" w:evenHBand="0" w:firstRowFirstColumn="0" w:firstRowLastColumn="0" w:lastRowFirstColumn="0" w:lastRowLastColumn="0"/>
             </w:pPr>
             <w:r>
               <w:t>Catalog safety and completeness checks.</w:t>
@@ -2559,7 +2527,6 @@
       </w:tr>
       <w:tr>
         <w:trPr>
-          <w:cnfStyle w:val="000000100000" w:firstRow="0" w:lastRow="0" w:firstColumn="0" w:lastColumn="0" w:oddVBand="0" w:evenVBand="0" w:oddHBand="1" w:evenHBand="0" w:firstRowFirstColumn="0" w:firstRowLastColumn="0" w:lastRowFirstColumn="0" w:lastRowLastColumn="0"/>
           <w:cantSplit/>
           <w:jc w:val="center"/>
         </w:trPr>
@@ -2582,7 +2549,7 @@
           </w:tcPr>
           <w:p>
             <w:pPr>
-              <w:cnfStyle w:val="000000100000" w:firstRow="0" w:lastRow="0" w:firstColumn="0" w:lastColumn="0" w:oddVBand="0" w:evenVBand="0" w:oddHBand="1" w:evenHBand="0" w:firstRowFirstColumn="0" w:firstRowLastColumn="0" w:lastRowFirstColumn="0" w:lastRowLastColumn="0"/>
+              <w:cnfStyle w:val="000000000000" w:firstRow="0" w:lastRow="0" w:firstColumn="0" w:lastColumn="0" w:oddVBand="0" w:evenVBand="0" w:oddHBand="0" w:evenHBand="0" w:firstRowFirstColumn="0" w:firstRowLastColumn="0" w:lastRowFirstColumn="0" w:lastRowLastColumn="0"/>
             </w:pPr>
             <w:r>
               <w:t>Provider types/settings, Credential Manager, DeepL/Google HTTPS client.</w:t>
@@ -2592,6 +2559,7 @@
       </w:tr>
       <w:tr>
         <w:trPr>
+          <w:cnfStyle w:val="000000100000" w:firstRow="0" w:lastRow="0" w:firstColumn="0" w:lastColumn="0" w:oddVBand="0" w:evenVBand="0" w:oddHBand="1" w:evenHBand="0" w:firstRowFirstColumn="0" w:firstRowLastColumn="0" w:lastRowFirstColumn="0" w:lastRowLastColumn="0"/>
           <w:cantSplit/>
           <w:jc w:val="center"/>
         </w:trPr>
@@ -2614,7 +2582,7 @@
           </w:tcPr>
           <w:p>
             <w:pPr>
-              <w:cnfStyle w:val="000000000000" w:firstRow="0" w:lastRow="0" w:firstColumn="0" w:lastColumn="0" w:oddVBand="0" w:evenVBand="0" w:oddHBand="0" w:evenHBand="0" w:firstRowFirstColumn="0" w:firstRowLastColumn="0" w:lastRowFirstColumn="0" w:lastRowLastColumn="0"/>
+              <w:cnfStyle w:val="000000100000" w:firstRow="0" w:lastRow="0" w:firstColumn="0" w:lastColumn="0" w:oddVBand="0" w:evenVBand="0" w:oddHBand="1" w:evenHBand="0" w:firstRowFirstColumn="0" w:firstRowLastColumn="0" w:lastRowFirstColumn="0" w:lastRowLastColumn="0"/>
             </w:pPr>
             <w:r>
               <w:t>Pack discovery/loading, preference, manager, VCL and FMX applicators.</w:t>
@@ -2624,7 +2592,6 @@
       </w:tr>
       <w:tr>
         <w:trPr>
-          <w:cnfStyle w:val="000000100000" w:firstRow="0" w:lastRow="0" w:firstColumn="0" w:lastColumn="0" w:oddVBand="0" w:evenVBand="0" w:oddHBand="1" w:evenHBand="0" w:firstRowFirstColumn="0" w:firstRowLastColumn="0" w:lastRowFirstColumn="0" w:lastRowLastColumn="0"/>
           <w:cantSplit/>
           <w:jc w:val="center"/>
         </w:trPr>
@@ -2636,7 +2603,6 @@
           </w:tcPr>
           <w:p>
             <w:r>
-              <w:lastRenderedPageBreak/>
               <w:t>source\integration</w:t>
             </w:r>
           </w:p>
@@ -2648,7 +2614,7 @@
           </w:tcPr>
           <w:p>
             <w:pPr>
-              <w:cnfStyle w:val="000000100000" w:firstRow="0" w:lastRow="0" w:firstColumn="0" w:lastColumn="0" w:oddVBand="0" w:evenVBand="0" w:oddHBand="1" w:evenHBand="0" w:firstRowFirstColumn="0" w:firstRowLastColumn="0" w:lastRowFirstColumn="0" w:lastRowLastColumn="0"/>
+              <w:cnfStyle w:val="000000000000" w:firstRow="0" w:lastRow="0" w:firstColumn="0" w:lastColumn="0" w:oddVBand="0" w:evenVBand="0" w:oddHBand="0" w:evenHBand="0" w:firstRowFirstColumn="0" w:firstRowLastColumn="0" w:lastRowFirstColumn="0" w:lastRowLastColumn="0"/>
             </w:pPr>
             <w:r>
               <w:t>Plan, resource/source rewriting, change sets, transaction, package generation.</w:t>
@@ -2658,6 +2624,7 @@
       </w:tr>
       <w:tr>
         <w:trPr>
+          <w:cnfStyle w:val="000000100000" w:firstRow="0" w:lastRow="0" w:firstColumn="0" w:lastColumn="0" w:oddVBand="0" w:evenVBand="0" w:oddHBand="1" w:evenHBand="0" w:firstRowFirstColumn="0" w:firstRowLastColumn="0" w:lastRowFirstColumn="0" w:lastRowLastColumn="0"/>
           <w:cantSplit/>
           <w:jc w:val="center"/>
         </w:trPr>
@@ -2680,7 +2647,7 @@
           </w:tcPr>
           <w:p>
             <w:pPr>
-              <w:cnfStyle w:val="000000000000" w:firstRow="0" w:lastRow="0" w:firstColumn="0" w:lastColumn="0" w:oddVBand="0" w:evenVBand="0" w:oddHBand="0" w:evenHBand="0" w:firstRowFirstColumn="0" w:firstRowLastColumn="0" w:lastRowFirstColumn="0" w:lastRowLastColumn="0"/>
+              <w:cnfStyle w:val="000000100000" w:firstRow="0" w:lastRow="0" w:firstColumn="0" w:lastColumn="0" w:oddVBand="0" w:evenVBand="0" w:oddHBand="1" w:evenHBand="0" w:firstRowFirstColumn="0" w:firstRowLastColumn="0" w:lastRowFirstColumn="0" w:lastRowLastColumn="0"/>
             </w:pPr>
             <w:r>
               <w:t>Designer-authored FMX UI and Studio self-localization.</w:t>
@@ -2690,7 +2657,6 @@
       </w:tr>
       <w:tr>
         <w:trPr>
-          <w:cnfStyle w:val="000000100000" w:firstRow="0" w:lastRow="0" w:firstColumn="0" w:lastColumn="0" w:oddVBand="0" w:evenVBand="0" w:oddHBand="1" w:evenHBand="0" w:firstRowFirstColumn="0" w:firstRowLastColumn="0" w:lastRowFirstColumn="0" w:lastRowLastColumn="0"/>
           <w:cantSplit/>
           <w:jc w:val="center"/>
         </w:trPr>
@@ -2702,6 +2668,7 @@
           </w:tcPr>
           <w:p>
             <w:r>
+              <w:lastRenderedPageBreak/>
               <w:t>source\schemas</w:t>
             </w:r>
           </w:p>
@@ -2713,7 +2680,7 @@
           </w:tcPr>
           <w:p>
             <w:pPr>
-              <w:cnfStyle w:val="000000100000" w:firstRow="0" w:lastRow="0" w:firstColumn="0" w:lastColumn="0" w:oddVBand="0" w:evenVBand="0" w:oddHBand="1" w:evenHBand="0" w:firstRowFirstColumn="0" w:firstRowLastColumn="0" w:lastRowFirstColumn="0" w:lastRowLastColumn="0"/>
+              <w:cnfStyle w:val="000000000000" w:firstRow="0" w:lastRow="0" w:firstColumn="0" w:lastColumn="0" w:oddVBand="0" w:evenVBand="0" w:oddHBand="0" w:evenHBand="0" w:firstRowFirstColumn="0" w:firstRowLastColumn="0" w:lastRowFirstColumn="0" w:lastRowLastColumn="0"/>
             </w:pPr>
             <w:r>
               <w:t>Development and runtime JSON Schemas.</w:t>
@@ -2723,6 +2690,7 @@
       </w:tr>
       <w:tr>
         <w:trPr>
+          <w:cnfStyle w:val="000000100000" w:firstRow="0" w:lastRow="0" w:firstColumn="0" w:lastColumn="0" w:oddVBand="0" w:evenVBand="0" w:oddHBand="1" w:evenHBand="0" w:firstRowFirstColumn="0" w:firstRowLastColumn="0" w:lastRowFirstColumn="0" w:lastRowLastColumn="0"/>
           <w:cantSplit/>
           <w:jc w:val="center"/>
         </w:trPr>
@@ -2745,7 +2713,7 @@
           </w:tcPr>
           <w:p>
             <w:pPr>
-              <w:cnfStyle w:val="000000000000" w:firstRow="0" w:lastRow="0" w:firstColumn="0" w:lastColumn="0" w:oddVBand="0" w:evenVBand="0" w:oddHBand="0" w:evenHBand="0" w:firstRowFirstColumn="0" w:firstRowLastColumn="0" w:lastRowFirstColumn="0" w:lastRowLastColumn="0"/>
+              <w:cnfStyle w:val="000000100000" w:firstRow="0" w:lastRow="0" w:firstColumn="0" w:lastColumn="0" w:oddVBand="0" w:evenVBand="0" w:oddHBand="1" w:evenHBand="0" w:firstRowFirstColumn="0" w:firstRowLastColumn="0" w:lastRowFirstColumn="0" w:lastRowLastColumn="0"/>
             </w:pPr>
             <w:r>
               <w:t>Foundation, runtime, integration, form-streaming, launch, and self-localization smoke tests.</w:t>
@@ -2755,7 +2723,6 @@
       </w:tr>
       <w:tr>
         <w:trPr>
-          <w:cnfStyle w:val="000000100000" w:firstRow="0" w:lastRow="0" w:firstColumn="0" w:lastColumn="0" w:oddVBand="0" w:evenVBand="0" w:oddHBand="1" w:evenHBand="0" w:firstRowFirstColumn="0" w:firstRowLastColumn="0" w:lastRowFirstColumn="0" w:lastRowLastColumn="0"/>
           <w:cantSplit/>
           <w:jc w:val="center"/>
         </w:trPr>
@@ -2778,7 +2745,7 @@
           </w:tcPr>
           <w:p>
             <w:pPr>
-              <w:cnfStyle w:val="000000100000" w:firstRow="0" w:lastRow="0" w:firstColumn="0" w:lastColumn="0" w:oddVBand="0" w:evenVBand="0" w:oddHBand="1" w:evenHBand="0" w:firstRowFirstColumn="0" w:firstRowLastColumn="0" w:lastRowFirstColumn="0" w:lastRowLastColumn="0"/>
+              <w:cnfStyle w:val="000000000000" w:firstRow="0" w:lastRow="0" w:firstColumn="0" w:lastColumn="0" w:oddVBand="0" w:evenVBand="0" w:oddHBand="0" w:evenHBand="0" w:firstRowFirstColumn="0" w:firstRowLastColumn="0" w:lastRowFirstColumn="0" w:lastRowLastColumn="0"/>
             </w:pPr>
             <w:r>
               <w:t>Product documentation, help source, and safe fixtures.</w:t>
@@ -2791,7 +2758,7 @@
       <w:pPr>
         <w:pStyle w:val="Heading2"/>
       </w:pPr>
-      <w:bookmarkStart w:id="3" w:name="_Toc237016610"/>
+      <w:bookmarkStart w:id="3" w:name="_Toc237020190"/>
       <w:r>
         <w:t>2.1 Toolchain</w:t>
       </w:r>
@@ -2825,7 +2792,7 @@
       <w:pPr>
         <w:pStyle w:val="Heading1"/>
       </w:pPr>
-      <w:bookmarkStart w:id="4" w:name="_Toc237016611"/>
+      <w:bookmarkStart w:id="4" w:name="_Toc237020191"/>
       <w:r>
         <w:t>3. System Architecture</w:t>
       </w:r>
@@ -3152,7 +3119,6 @@
           </w:tcPr>
           <w:p>
             <w:r>
-              <w:lastRenderedPageBreak/>
               <w:t>Integration</w:t>
             </w:r>
           </w:p>
@@ -3200,6 +3166,7 @@
           </w:tcPr>
           <w:p>
             <w:r>
+              <w:lastRenderedPageBreak/>
               <w:t>Runtime</w:t>
             </w:r>
           </w:p>
@@ -3238,7 +3205,7 @@
       <w:pPr>
         <w:pStyle w:val="Heading1"/>
       </w:pPr>
-      <w:bookmarkStart w:id="5" w:name="_Toc237016612"/>
+      <w:bookmarkStart w:id="5" w:name="_Toc237020192"/>
       <w:r>
         <w:t>4. Core Data Model and JSON</w:t>
       </w:r>
@@ -3253,7 +3220,7 @@
       <w:pPr>
         <w:pStyle w:val="Heading2"/>
       </w:pPr>
-      <w:bookmarkStart w:id="6" w:name="_Toc237016613"/>
+      <w:bookmarkStart w:id="6" w:name="_Toc237020193"/>
       <w:r>
         <w:t>4.1 Stable keys</w:t>
       </w:r>
@@ -3295,7 +3262,7 @@
       <w:pPr>
         <w:pStyle w:val="Heading2"/>
       </w:pPr>
-      <w:bookmarkStart w:id="7" w:name="_Toc237016614"/>
+      <w:bookmarkStart w:id="7" w:name="_Toc237020194"/>
       <w:r>
         <w:t>4.2 Development catalog</w:t>
       </w:r>
@@ -3333,20 +3300,16 @@
       </w:r>
       <w:r>
         <w:br/>
-        <w:t xml:space="preserve">               "translatedText": "Salva", "status": "aiDraft",</w:t>
+        <w:t xml:space="preserve">               "translatedText": "Salva", "status": "machineTranslated",</w:t>
       </w:r>
       <w:r>
         <w:br/>
-        <w:t xml:space="preserve">               "translationOrigin": "codex",</w:t>
+        <w:t xml:space="preserve">               "translationOrigin": "google",</w:t>
       </w:r>
       <w:r>
         <w:br/>
       </w:r>
       <w:r>
-        <w:t xml:space="preserve">               "translationConfidence": "high",</w:t>
-      </w:r>
-      <w:r>
-        <w:br/>
         <w:t xml:space="preserve">               "runtimeApplication": "automatic"}]</w:t>
       </w:r>
       <w:r>
@@ -3358,7 +3321,7 @@
       <w:pPr>
         <w:pStyle w:val="Heading2"/>
       </w:pPr>
-      <w:bookmarkStart w:id="8" w:name="_Toc237016615"/>
+      <w:bookmarkStart w:id="8" w:name="_Toc237020195"/>
       <w:r>
         <w:t>4.3 Runtime pack</w:t>
       </w:r>
@@ -3405,7 +3368,6 @@
     </w:p>
     <w:p>
       <w:r>
-        <w:lastRenderedPageBreak/>
         <w:t>The schema files are source\schemas\development-project.schema.json and runtime-language-pack.schema.json. Changes require schema-version handling, round-trip fixtures, and compatibility notes.</w:t>
       </w:r>
     </w:p>
@@ -3413,8 +3375,9 @@
       <w:pPr>
         <w:pStyle w:val="Heading1"/>
       </w:pPr>
-      <w:bookmarkStart w:id="9" w:name="_Toc237016616"/>
+      <w:bookmarkStart w:id="9" w:name="_Toc237020196"/>
       <w:r>
+        <w:lastRenderedPageBreak/>
         <w:t>5. Project Detection and Scanning</w:t>
       </w:r>
       <w:bookmarkEnd w:id="9"/>
@@ -3433,7 +3396,7 @@
       <w:pPr>
         <w:pStyle w:val="Heading2"/>
       </w:pPr>
-      <w:bookmarkStart w:id="10" w:name="_Toc237016617"/>
+      <w:bookmarkStart w:id="10" w:name="_Toc237020197"/>
       <w:r>
         <w:t>5.1 Incremental merge</w:t>
       </w:r>
@@ -3515,7 +3478,7 @@
       <w:pPr>
         <w:pStyle w:val="Heading1"/>
       </w:pPr>
-      <w:bookmarkStart w:id="11" w:name="_Toc237016618"/>
+      <w:bookmarkStart w:id="11" w:name="_Toc237020198"/>
       <w:r>
         <w:t>6. Studio UI and Workflow State</w:t>
       </w:r>
@@ -3523,10 +3486,10 @@
     </w:p>
     <w:p>
       <w:r>
-        <w:t xml:space="preserve">DAT.Studio.MainForm.fmx contains the complete orange-and-blue interface. The form persists WindowState=wsMaximized, uses client-aligned workflow cards, anchors resizable work areas to every relevant edge, and keeps the status card at the bottom. The workflow selection rectangle moves among Project, Scan, Translate, Validation, Export, Integration, and Engine Settings. Language and engine choices are designer-owned combo boxes. Translate Automatically, Cancel Translation, Prompt, Reload, agent configuration </w:t>
+        <w:t>DAT.Studio.MainForm.fmx contains the complete orange-and-blue interface. The form persists WindowState=wsMaximized, uses client-aligned workflow cards, anchors resizable work areas to every relevant edge, and keeps the status card at the bottom. The workflow selection rectangle moves among Project, Scan, Translate, Validation, Export, Integration, and Provider Settings. Language and provider choices, Translate Automatically, key-management actions, and all other controls are persisted designer objects. DAT.</w:t>
       </w:r>
       <w:r>
-        <w:t>controls, and the monitor timer are persisted designer objects. DAT.Studio.MainForm.pas contains event and state logic only; it does not construct controls.</w:t>
+        <w:t>Studio.MainForm.pas contains event and state logic only; it does not construct controls.</w:t>
       </w:r>
     </w:p>
     <w:p>
@@ -3568,13 +3531,15 @@
           <w:p>
             <w:pPr>
               <w:pStyle w:val="Callout"/>
+              <w:rPr>
+                <w:rFonts w:hint="eastAsia"/>
+              </w:rPr>
             </w:pPr>
             <w:r>
               <w:rPr>
                 <w:b/>
                 <w:color w:val="234C80"/>
               </w:rPr>
-              <w:lastRenderedPageBreak/>
               <w:t xml:space="preserve">FMX validation requirement. </w:t>
             </w:r>
             <w:r>
@@ -3588,19 +3553,12 @@
       <w:pPr>
         <w:pStyle w:val="Heading1"/>
       </w:pPr>
-      <w:bookmarkStart w:id="12" w:name="_Toc237016619"/>
+      <w:bookmarkStart w:id="12" w:name="_Toc237020199"/>
       <w:r>
-        <w:t>7. Agent Execution, Provider Settings, and Secret Storage</w:t>
+        <w:lastRenderedPageBreak/>
+        <w:t>7. Provider Settings and Secret Storage</w:t>
       </w:r>
       <w:bookmarkEnd w:id="12"/>
-    </w:p>
-    <w:p>
-      <w:r>
-        <w:t>DAT.Agent.Execution persists only the selected command-line engine, executable path, and model choice. It detects supported installations, starts the agent without a console window, passes the translation contract through inherited standard input, redirects stdout/stderr to a project-local diagnostic log, polls the process from the designer-owned timer, and supports controlled cancellation. Codex runs non-interactively with workspace-write sandboxing in the target project; Claude runs in print mode with str</w:t>
-      </w:r>
-      <w:r>
-        <w:t>eamed JSON and accepted workspace edits. Authentication remains owned by the installed vendor CLI.</w:t>
-      </w:r>
     </w:p>
     <w:p>
       <w:r>
@@ -3864,9 +3822,8 @@
       <w:pPr>
         <w:pStyle w:val="Heading1"/>
       </w:pPr>
-      <w:bookmarkStart w:id="13" w:name="_Toc237016620"/>
+      <w:bookmarkStart w:id="13" w:name="_Toc237020200"/>
       <w:r>
-        <w:lastRenderedPageBreak/>
         <w:t>8. Provider HTTP Clients</w:t>
       </w:r>
       <w:bookmarkEnd w:id="13"/>
@@ -4043,6 +4000,7 @@
           </w:tcPr>
           <w:p>
             <w:r>
+              <w:lastRenderedPageBreak/>
               <w:t>DeepL API Pro</w:t>
             </w:r>
           </w:p>
@@ -4156,7 +4114,7 @@
       <w:pPr>
         <w:pStyle w:val="Heading2"/>
       </w:pPr>
-      <w:bookmarkStart w:id="14" w:name="_Toc237016621"/>
+      <w:bookmarkStart w:id="14" w:name="_Toc237020201"/>
       <w:r>
         <w:t>8.1 Reliability and cancellation</w:t>
       </w:r>
@@ -4214,7 +4172,7 @@
       <w:pPr>
         <w:pStyle w:val="Heading2"/>
       </w:pPr>
-      <w:bookmarkStart w:id="15" w:name="_Toc237016622"/>
+      <w:bookmarkStart w:id="15" w:name="_Toc237020202"/>
       <w:r>
         <w:t>8.2 Official protocol references</w:t>
       </w:r>
@@ -4257,7 +4215,6 @@
         <w:pStyle w:val="ListBullet"/>
       </w:pPr>
       <w:r>
-        <w:lastRenderedPageBreak/>
         <w:t>Google API-key best practices: https://docs.cloud.google.com/docs/authentication/api-keys-best-practices</w:t>
       </w:r>
     </w:p>
@@ -4265,35 +4222,34 @@
       <w:pPr>
         <w:pStyle w:val="Heading1"/>
       </w:pPr>
-      <w:bookmarkStart w:id="16" w:name="_Toc237016623"/>
+      <w:bookmarkStart w:id="16" w:name="_Toc237020203"/>
       <w:r>
-        <w:t>9. In-Place AI Translation and Alternatives</w:t>
+        <w:t>9. Automatic Provider Translation and Review</w:t>
       </w:r>
       <w:bookmarkEnd w:id="16"/>
     </w:p>
     <w:p>
       <w:r>
-        <w:t>The canonical workflow combines DAT.Core.AITranslation with DAT.Agent.Execution. Translate Automatically saves an exact recovery snapshot, ensures the terminology profile, writes the agent contract, records the file SHA-256, locks Studio editing, launches the selected signed-in command-line agent, supplies the complete task through standard input, and monitors both the child process and catalog from a designer-owned timer.</w:t>
+        <w:t>Translate Automatically is the canonical machine-translation path. It validates the selected catalog language, loads the selected provider settings and effective key, counts eligible unresolved entries, and shows the provider and count before any network request.</w:t>
       </w:r>
     </w:p>
     <w:p>
       <w:r>
-        <w:t>A zero process exit triggers protected reload and automatic save. A nonzero exit or developer cancellation restores the snapshot. Prompt and Reload remain explicit recovery controls for diagnosis or manually continued work; they are not required during the normal one-button path.</w:t>
+        <w:t xml:space="preserve">Eligible source strings are copied into ordered arrays and sent through DAT.Provider.Client in bounded batches. Reviewed, Approved, Excluded, and Obsolete entries are not overwritten. Provider results are </w:t>
       </w:r>
-    </w:p>
-    <w:p>
       <w:r>
-        <w:t>Reload parses the external file and compares application, framework, language, locale formats, entry count/order, keys, source/checksums, context, developer notes, runtime classification, and wiring confirmation with the pre-session snapshot. Only Needs Translation, Source Changed, Error, and existing AI Draft entries are eligible. Machine-translated, Imported, Edited, Reviewed, Approved, Excluded, and Obsolete entries are protected. Any protected mutation rejects the reload.</w:t>
+        <w:lastRenderedPageBreak/>
+        <w:t>mapped back by index, marked Machine translated, tagged with Google or DeepL provenance, and saved to the canonical development catalog automatically.</w:t>
       </w:r>
     </w:p>
     <w:p>
       <w:r>
-        <w:t>Allowed changes are normalized to AI Draft while Codex/Claude origin, high/medium/low confidence, and review notes are retained. A metadata-only confirmation is retained when an existing translation remains correct after a source change.</w:t>
+        <w:t>If no key is available, the workflow opens Provider Settings and gives a specific corrective message. HTTP or parsing failures leave the catalog entries unchanged for the failed operation and report a redacted summary in the status card.</w:t>
       </w:r>
     </w:p>
     <w:p>
       <w:r>
-        <w:t>CSV/JSON interchange, manual editing, and direct Google/DeepL translation remain alternatives. Provider output receives Machine translated status with its provider origin.</w:t>
+        <w:t>CSV interchange and manual editing remain optional alternatives for translation-company collaboration or specialized review, not prerequisites for automatic translation.</w:t>
       </w:r>
     </w:p>
     <w:p>
@@ -4330,7 +4286,7 @@
         <w:pStyle w:val="ListBullet"/>
       </w:pPr>
       <w:r>
-        <w:t>Low confidence, explicit AI notes, inconsistent repeated terms, and structural defects form the focused exception queue; a valid AI draft is not itself an exception.</w:t>
+        <w:t>Inconsistent repeated terms and structural defects form the focused exception queue; a valid machine-translated draft is not itself an error.</w:t>
       </w:r>
     </w:p>
     <w:p>
@@ -4353,16 +4309,15 @@
       <w:pPr>
         <w:pStyle w:val="Heading1"/>
       </w:pPr>
-      <w:bookmarkStart w:id="17" w:name="_Toc237016624"/>
+      <w:bookmarkStart w:id="17" w:name="_Toc237020204"/>
       <w:r>
-        <w:lastRenderedPageBreak/>
         <w:t>10. Validation and Runtime Pack Export</w:t>
       </w:r>
       <w:bookmarkEnd w:id="17"/>
     </w:p>
     <w:p>
       <w:r>
-        <w:t>DAT.Validation.Catalog validates metadata, missing target text, duplicates, changed source, Delphi indexed and sequential Format arguments, accelerators, low AI confidence, explicit AI review notes, inconsistent repeated-source terminology, and status conditions. Export is blocked by errors. Manual resourcestring wiring is reported separately from structural errors. DAT.Core.RuntimePack serializes only runtime-required metadata and strings and records a source-catalog checksum.</w:t>
+        <w:t>DAT.Validation.Catalog validates metadata, missing target text, duplicates, changed source, Delphi indexed and sequential Format arguments, accelerators, inconsistent repeated-source terminology, and status conditions. Export is blocked by errors. Manual resourcestring wiring is reported separately from structural errors. DAT.Core.RuntimePack serializes only runtime-required metadata and strings and records a source-catalog checksum.</w:t>
       </w:r>
     </w:p>
     <w:p>
@@ -4374,7 +4329,7 @@
       <w:pPr>
         <w:pStyle w:val="Heading1"/>
       </w:pPr>
-      <w:bookmarkStart w:id="18" w:name="_Toc237016625"/>
+      <w:bookmarkStart w:id="18" w:name="_Toc237020205"/>
       <w:r>
         <w:t>11. Runtime Engine</w:t>
       </w:r>
@@ -4387,6 +4342,7 @@
     </w:p>
     <w:p>
       <w:r>
+        <w:lastRenderedPageBreak/>
         <w:t>DAT.Runtime.VCL and DAT.Runtime.FMX traverse existing component trees and supported collection properties. They apply values by stable key to already designer-created controls. Missing keys retain source text. The adapters do not create controls or rearrange layouts.</w:t>
       </w:r>
     </w:p>
@@ -4394,7 +4350,7 @@
       <w:pPr>
         <w:pStyle w:val="Heading2"/>
       </w:pPr>
-      <w:bookmarkStart w:id="19" w:name="_Toc237016626"/>
+      <w:bookmarkStart w:id="19" w:name="_Toc237020206"/>
       <w:r>
         <w:t>11.1 Deployment paths</w:t>
       </w:r>
@@ -4436,7 +4392,7 @@
       <w:pPr>
         <w:pStyle w:val="Heading1"/>
       </w:pPr>
-      <w:bookmarkStart w:id="20" w:name="_Toc237016627"/>
+      <w:bookmarkStart w:id="20" w:name="_Toc237020207"/>
       <w:r>
         <w:t>12. Integration Planning and Transactions</w:t>
       </w:r>
@@ -4454,7 +4410,6 @@
     </w:p>
     <w:p>
       <w:r>
-        <w:lastRenderedPageBreak/>
         <w:t>DAT.Integration.MenuResource modifies text DFM/FMX menus idempotently and preserves designer editability. DAT.Integration.DelphiSource applies narrowly scoped DPR, PAS, and DPROJ wiring. For FMX, it preserves an existing root OnCreate handler or persists datTranslationFormCreate in the FMX and adds ApplyTranslation(Self) to its Pascal method. This respects the FMX form streaming lifecycle and avoids translating the first form from the DPR immediately after CreateForm.</w:t>
       </w:r>
     </w:p>
@@ -4462,7 +4417,7 @@
       <w:pPr>
         <w:pStyle w:val="Heading2"/>
       </w:pPr>
-      <w:bookmarkStart w:id="21" w:name="_Toc237016628"/>
+      <w:bookmarkStart w:id="21" w:name="_Toc237020208"/>
       <w:r>
         <w:t>12.1 Generated startup contract</w:t>
       </w:r>
@@ -4545,6 +4500,9 @@
           <w:p>
             <w:pPr>
               <w:pStyle w:val="Callout"/>
+              <w:rPr>
+                <w:rFonts w:hint="eastAsia"/>
+              </w:rPr>
             </w:pPr>
             <w:r>
               <w:rPr>
@@ -4554,7 +4512,11 @@
               <w:t xml:space="preserve">Original code preservation. </w:t>
             </w:r>
             <w:r>
-              <w:t>Integration adds narrowly scoped calls and units but does not replace original captions or rewrite every control. The original DFM/FMX values continue to be the source-language fallback.</w:t>
+              <w:t xml:space="preserve">Integration adds narrowly scoped calls and units but does not replace original </w:t>
+            </w:r>
+            <w:r>
+              <w:lastRenderedPageBreak/>
+              <w:t>captions or rewrite every control. The original DFM/FMX values continue to be the source-language fallback.</w:t>
             </w:r>
           </w:p>
         </w:tc>
@@ -4564,8 +4526,9 @@
       <w:pPr>
         <w:pStyle w:val="Heading1"/>
       </w:pPr>
-      <w:bookmarkStart w:id="22" w:name="_Toc237016629"/>
+      <w:bookmarkStart w:id="22" w:name="_Toc237020209"/>
       <w:r>
+        <w:lastRenderedPageBreak/>
         <w:t>13. Self-Localization</w:t>
       </w:r>
       <w:bookmarkEnd w:id="22"/>
@@ -4579,7 +4542,7 @@
       <w:pPr>
         <w:pStyle w:val="Heading1"/>
       </w:pPr>
-      <w:bookmarkStart w:id="23" w:name="_Toc237016630"/>
+      <w:bookmarkStart w:id="23" w:name="_Toc237020210"/>
       <w:r>
         <w:t>14. Error Handling and Diagnostics</w:t>
       </w:r>
@@ -4637,9 +4600,8 @@
       <w:pPr>
         <w:pStyle w:val="Heading1"/>
       </w:pPr>
-      <w:bookmarkStart w:id="24" w:name="_Toc237016631"/>
+      <w:bookmarkStart w:id="24" w:name="_Toc237020211"/>
       <w:r>
-        <w:lastRenderedPageBreak/>
         <w:t>15. Test Strategy and Verified Matrix</w:t>
       </w:r>
       <w:bookmarkEnd w:id="24"/>
@@ -4729,7 +4691,7 @@
               <w:cnfStyle w:val="000000100000" w:firstRow="0" w:lastRow="0" w:firstColumn="0" w:lastColumn="0" w:oddVBand="0" w:evenVBand="0" w:oddHBand="1" w:evenHBand="0" w:firstRowFirstColumn="0" w:firstRowLastColumn="0" w:lastRowFirstColumn="0" w:lastRowLastColumn="0"/>
             </w:pPr>
             <w:r>
-              <w:t>Detection, scan-to-catalog, protected in-place AI session/reload, schema/provenance round-trip, independent CSV fallback, review/approval, validation, runtime pack, preference, exact diff, integration, self change set.</w:t>
+              <w:t>Detection, scan-to-catalog, schema/provenance round-trip, provider client contracts, CSV interchange, review/approval, validation, runtime pack, preference, exact diff, integration, and self change set.</w:t>
             </w:r>
           </w:p>
         </w:tc>
@@ -4826,7 +4788,7 @@
               <w:cnfStyle w:val="000000000000" w:firstRow="0" w:lastRow="0" w:firstColumn="0" w:lastColumn="0" w:oddVBand="0" w:evenVBand="0" w:oddHBand="0" w:evenHBand="0" w:firstRowFirstColumn="0" w:firstRowLastColumn="0" w:lastRowFirstColumn="0" w:lastRowLastColumn="0"/>
             </w:pPr>
             <w:r>
-              <w:t>Direct FMX stream/create, maximized client-aligned pages, designer-owned agent controls/timer, exact-review controls, linguistic action wiring, and provider alternative activation.</w:t>
+              <w:t>Direct FMX stream/create, maximized client-aligned pages, provider-only automatic-translation controls, exact-review controls, linguistic action wiring, and Provider Settings activation.</w:t>
             </w:r>
           </w:p>
         </w:tc>
@@ -4845,6 +4807,7 @@
           </w:tcPr>
           <w:p>
             <w:r>
+              <w:lastRenderedPageBreak/>
               <w:t>RunRuntimeSmokeTests.ps1</w:t>
             </w:r>
           </w:p>
@@ -4859,7 +4822,7 @@
               <w:cnfStyle w:val="000000100000" w:firstRow="0" w:lastRow="0" w:firstColumn="0" w:lastColumn="0" w:oddVBand="0" w:evenVBand="0" w:oddHBand="1" w:evenHBand="0" w:firstRowFirstColumn="0" w:firstRowLastColumn="0" w:lastRowFirstColumn="0" w:lastRowLastColumn="0"/>
             </w:pPr>
             <w:r>
-              <w:t>Both compilers, protected in-place AI pilot pipeline, disposable integrated VCL/FMX builds, deployed Italian pack, and required Italian launch title.</w:t>
+              <w:t>Both compilers, scanner/catalog/provider contracts, disposable integrated VCL/FMX builds, deployed Italian pack, and required Italian launch title.</w:t>
             </w:r>
           </w:p>
         </w:tc>
@@ -4932,17 +4895,14 @@
     </w:tbl>
     <w:p>
       <w:r>
-        <w:t>On August 7, 2026, the release gate passed with real compilable VCL and FMX samples under both Win32 and Win64. Each sample was scanned, translated by a deterministic Codex-style direct edit of its canonical JSON, protected-field reviewed, reloaded as AI Draft with provenance, reviewed, approved, validated, exported, integrated, built, deployed, and launched with the required Italian title. Snapshot creation and protected mutation rejection passed. The Studio also built with zero warnings and errors in Debu</w:t>
+        <w:t>On August 7, 2026, the deterministic release gate passed with real compilable VCL and FMX samples under Win32 and Win64. Scanner, catalog, provider request/response contracts, review, validation, export, integration, deployed packs, and required Italian launch titles passed without embedding a live credential. The Studio built in Debug and Release for both architectures, streamed its FMX form directly, launched normally, and self-localized to Italian in all four configurations.</w:t>
       </w:r>
-      <w:r>
-        <w:t>g and Release for both architectures, streamed its FMX form directly, launched normally, and self-localized to Italian in all four configurations.</w:t>
-      </w:r>
     </w:p>
     <w:p>
       <w:pPr>
         <w:pStyle w:val="Heading2"/>
       </w:pPr>
-      <w:bookmarkStart w:id="25" w:name="_Toc237016632"/>
+      <w:bookmarkStart w:id="25" w:name="_Toc237020212"/>
       <w:r>
         <w:t>15.1 Optional live provider testing</w:t>
       </w:r>
@@ -4950,18 +4910,14 @@
     </w:p>
     <w:p>
       <w:r>
-        <w:t xml:space="preserve">Automated fixtures must not contain live keys. Optional provider acceptance uses an owner-supplied restricted key through Engine Settings, confirms Test Connection, translates a small disposable catalog, </w:t>
+        <w:t>Automated fixtures must not contain live keys. Live provider acceptance uses an owner-supplied restricted key through Provider Settings, confirms Test Connection, translates a small disposable catalog, checks Machine translated status and provider provenance, then removes or rotates the test key. Provider availability is external state and cannot be made deterministic, but live provider acceptance is required before a public release that claims current Google or DeepL compatibility.</w:t>
       </w:r>
-      <w:r>
-        <w:lastRenderedPageBreak/>
-        <w:t>checks Machine translated status and provider provenance, then removes or rotates the test key. Provider availability is external state and is not a release blocker for the primary Codex/Claude workflow or offline runtime.</w:t>
-      </w:r>
     </w:p>
     <w:p>
       <w:pPr>
         <w:pStyle w:val="Heading1"/>
       </w:pPr>
-      <w:bookmarkStart w:id="26" w:name="_Toc237016633"/>
+      <w:bookmarkStart w:id="26" w:name="_Toc237020213"/>
       <w:r>
         <w:t>16. Security Review</w:t>
       </w:r>
@@ -5135,6 +5091,7 @@
           </w:tcPr>
           <w:p>
             <w:r>
+              <w:lastRenderedPageBreak/>
               <w:t>Unrecoverable source mutation</w:t>
             </w:r>
           </w:p>
@@ -5233,7 +5190,7 @@
           </w:tcPr>
           <w:p>
             <w:r>
-              <w:t>Agent corrupts catalog structure</w:t>
+              <w:t>Pack for wrong application</w:t>
             </w:r>
           </w:p>
         </w:tc>
@@ -5247,38 +5204,6 @@
               <w:cnfStyle w:val="000000100000" w:firstRow="0" w:lastRow="0" w:firstColumn="0" w:lastColumn="0" w:oddVBand="0" w:evenVBand="0" w:oddHBand="1" w:evenHBand="0" w:firstRowFirstColumn="0" w:firstRowLastColumn="0" w:lastRowFirstColumn="0" w:lastRowLastColumn="0"/>
             </w:pPr>
             <w:r>
-              <w:t>Exact pre-session snapshot, protected-field comparison, all-or-nothing reload, and explicit recovery.</w:t>
-            </w:r>
-          </w:p>
-        </w:tc>
-      </w:tr>
-      <w:tr>
-        <w:trPr>
-          <w:cantSplit/>
-          <w:jc w:val="center"/>
-        </w:trPr>
-        <w:tc>
-          <w:tcPr>
-            <w:cnfStyle w:val="001000000000" w:firstRow="0" w:lastRow="0" w:firstColumn="1" w:lastColumn="0" w:oddVBand="0" w:evenVBand="0" w:oddHBand="0" w:evenHBand="0" w:firstRowFirstColumn="0" w:firstRowLastColumn="0" w:lastRowFirstColumn="0" w:lastRowLastColumn="0"/>
-            <w:tcW w:w="2700" w:type="dxa"/>
-            <w:vAlign w:val="center"/>
-          </w:tcPr>
-          <w:p>
-            <w:r>
-              <w:t>Pack for wrong application</w:t>
-            </w:r>
-          </w:p>
-        </w:tc>
-        <w:tc>
-          <w:tcPr>
-            <w:tcW w:w="6660" w:type="dxa"/>
-            <w:vAlign w:val="center"/>
-          </w:tcPr>
-          <w:p>
-            <w:pPr>
-              <w:cnfStyle w:val="000000000000" w:firstRow="0" w:lastRow="0" w:firstColumn="0" w:lastColumn="0" w:oddVBand="0" w:evenVBand="0" w:oddHBand="0" w:evenHBand="0" w:firstRowFirstColumn="0" w:firstRowLastColumn="0" w:lastRowFirstColumn="0" w:lastRowLastColumn="0"/>
-            </w:pPr>
-            <w:r>
               <w:t>applicationId validation in pack discovery/loading.</w:t>
             </w:r>
           </w:p>
@@ -5294,7 +5219,7 @@
       <w:pPr>
         <w:pStyle w:val="Heading1"/>
       </w:pPr>
-      <w:bookmarkStart w:id="27" w:name="_Toc237016634"/>
+      <w:bookmarkStart w:id="27" w:name="_Toc237020214"/>
       <w:r>
         <w:t>17. Release and Contribution Workflow</w:t>
       </w:r>
@@ -5333,7 +5258,6 @@
         </w:numPr>
       </w:pPr>
       <w:r>
-        <w:lastRenderedPageBreak/>
         <w:t>Keep UI edits in the FMX designer resource and source event logic separate.</w:t>
       </w:r>
     </w:p>
@@ -5413,7 +5337,7 @@
       <w:pPr>
         <w:pStyle w:val="Heading1"/>
       </w:pPr>
-      <w:bookmarkStart w:id="28" w:name="_Toc237016635"/>
+      <w:bookmarkStart w:id="28" w:name="_Toc237020215"/>
       <w:r>
         <w:t>18. Known Boundaries and Future-Compatible Design</w:t>
       </w:r>
@@ -5440,15 +5364,7 @@
         <w:pStyle w:val="ListBullet"/>
       </w:pPr>
       <w:r>
-        <w:t>Provider operations are optional explicit Studio actions; target runtime remains offline.</w:t>
-      </w:r>
-    </w:p>
-    <w:p>
-      <w:pPr>
-        <w:pStyle w:val="ListBullet"/>
-      </w:pPr>
-      <w:r>
-        <w:t>The Studio launches a separately installed Codex CLI or Claude Code command but never impersonates, embeds, or authenticates that service. The developer installs and signs in to the selected CLI using vendor-supported instructions; the Studio stores only non-secret command settings.</w:t>
+        <w:t>Provider operations are explicit Studio actions; target runtime remains offline.</w:t>
       </w:r>
     </w:p>
     <w:p>
@@ -5472,6 +5388,7 @@
         <w:pStyle w:val="ListBullet"/>
       </w:pPr>
       <w:r>
+        <w:lastRenderedPageBreak/>
         <w:t>The generated menu selection persists the locale; restarting is the conservative way to ensure every form and application-specific string is refreshed.</w:t>
       </w:r>
     </w:p>
@@ -5487,7 +5404,7 @@
       <w:pPr>
         <w:pStyle w:val="Heading1"/>
       </w:pPr>
-      <w:bookmarkStart w:id="29" w:name="_Toc237016636"/>
+      <w:bookmarkStart w:id="29" w:name="_Toc237020216"/>
       <w:r>
         <w:t>19. Documentation Generation</w:t>
       </w:r>
@@ -5495,14 +5412,14 @@
     </w:p>
     <w:p>
       <w:r>
-        <w:t>The editable guides are generated from actual source and engineering notes with python-docx. Each DOCX contains a Word TOC field, a dedicated TOC section, and a new-page content section. Microsoft Word COM updates the TOC and fields, repaginates, saves the DOCX, and exports the companion PDF through ExportAsFixedFormat. PDFs are rendered to page images and inspected before release.</w:t>
+        <w:t>The editable guides are generated from actual source and engineering notes with python-docx. Each DOCX contains a Word TOC field, a dedicated TOC section, and a new-page content section. Microsoft Word COM updates the TOC and fields, repaginates, and saves the DOCX. Word ExportAsFixedFormat is the preferred companion-PDF path; when that host export is unavailable, the documented fallback is styled HTML/CSS printed through Playwright. Final PDFs are rendered to page images and inspected before release.</w:t>
       </w:r>
     </w:p>
     <w:p>
       <w:pPr>
         <w:pStyle w:val="Heading1"/>
       </w:pPr>
-      <w:bookmarkStart w:id="30" w:name="_Toc237016637"/>
+      <w:bookmarkStart w:id="30" w:name="_Toc237020217"/>
       <w:r>
         <w:t>20. Source References</w:t>
       </w:r>
@@ -5529,7 +5446,6 @@
         <w:pStyle w:val="ListBullet"/>
       </w:pPr>
       <w:r>
-        <w:lastRenderedPageBreak/>
         <w:t>Windows CREDENTIAL structure: https://learn.microsoft.com/en-us/windows/win32/api/wincred/ns-wincred-credentialw</w:t>
       </w:r>
     </w:p>
@@ -5555,22 +5471,6 @@
       </w:pPr>
       <w:r>
         <w:t>Google API-key guidance: https://docs.cloud.google.com/docs/authentication/api-keys-best-practices</w:t>
-      </w:r>
-    </w:p>
-    <w:p>
-      <w:pPr>
-        <w:pStyle w:val="ListBullet"/>
-      </w:pPr>
-      <w:r>
-        <w:t>OpenAI Codex CLI reference: https://developers.openai.com/codex/cli/reference/</w:t>
-      </w:r>
-    </w:p>
-    <w:p>
-      <w:pPr>
-        <w:pStyle w:val="ListBullet"/>
-      </w:pPr>
-      <w:r>
-        <w:t>Anthropic Claude Code CLI reference: https://docs.anthropic.com/en/docs/claude-code/cli-usage</w:t>
       </w:r>
     </w:p>
     <w:sectPr>
@@ -5987,40 +5887,40 @@
       </w:rPr>
     </w:lvl>
   </w:abstractNum>
-  <w:num w:numId="1" w16cid:durableId="1763990333">
+  <w:num w:numId="1" w16cid:durableId="700664511">
     <w:abstractNumId w:val="8"/>
   </w:num>
-  <w:num w:numId="2" w16cid:durableId="325405617">
+  <w:num w:numId="2" w16cid:durableId="1176463352">
     <w:abstractNumId w:val="6"/>
   </w:num>
-  <w:num w:numId="3" w16cid:durableId="1085540017">
+  <w:num w:numId="3" w16cid:durableId="1103263399">
     <w:abstractNumId w:val="5"/>
   </w:num>
-  <w:num w:numId="4" w16cid:durableId="221671506">
+  <w:num w:numId="4" w16cid:durableId="567572763">
     <w:abstractNumId w:val="4"/>
   </w:num>
-  <w:num w:numId="5" w16cid:durableId="1098872337">
+  <w:num w:numId="5" w16cid:durableId="344406531">
     <w:abstractNumId w:val="7"/>
   </w:num>
-  <w:num w:numId="6" w16cid:durableId="1590310043">
+  <w:num w:numId="6" w16cid:durableId="1039629798">
     <w:abstractNumId w:val="3"/>
   </w:num>
-  <w:num w:numId="7" w16cid:durableId="1404595818">
+  <w:num w:numId="7" w16cid:durableId="1869561761">
     <w:abstractNumId w:val="2"/>
   </w:num>
-  <w:num w:numId="8" w16cid:durableId="2111274056">
+  <w:num w:numId="8" w16cid:durableId="728842087">
     <w:abstractNumId w:val="1"/>
   </w:num>
-  <w:num w:numId="9" w16cid:durableId="1526746018">
+  <w:num w:numId="9" w16cid:durableId="244002587">
     <w:abstractNumId w:val="0"/>
   </w:num>
-  <w:num w:numId="10" w16cid:durableId="473571845">
+  <w:num w:numId="10" w16cid:durableId="535198557">
     <w:abstractNumId w:val="7"/>
     <w:lvlOverride w:ilvl="0">
       <w:startOverride w:val="1"/>
     </w:lvlOverride>
   </w:num>
-  <w:num w:numId="11" w16cid:durableId="405033856">
+  <w:num w:numId="11" w16cid:durableId="771318464">
     <w:abstractNumId w:val="7"/>
     <w:lvlOverride w:ilvl="0">
       <w:startOverride w:val="1"/>
@@ -17447,7 +17347,7 @@
     <w:autoRedefine/>
     <w:uiPriority w:val="39"/>
     <w:unhideWhenUsed/>
-    <w:rsid w:val="004628AE"/>
+    <w:rsid w:val="00E23D88"/>
     <w:pPr>
       <w:spacing w:after="100"/>
     </w:pPr>
@@ -17459,7 +17359,7 @@
     <w:autoRedefine/>
     <w:uiPriority w:val="39"/>
     <w:unhideWhenUsed/>
-    <w:rsid w:val="004628AE"/>
+    <w:rsid w:val="00E23D88"/>
     <w:pPr>
       <w:spacing w:after="100"/>
       <w:ind w:left="220"/>
@@ -17470,7 +17370,7 @@
     <w:basedOn w:val="DefaultParagraphFont"/>
     <w:uiPriority w:val="99"/>
     <w:unhideWhenUsed/>
-    <w:rsid w:val="004628AE"/>
+    <w:rsid w:val="00E23D88"/>
     <w:rPr>
       <w:color w:val="0000FF" w:themeColor="hyperlink"/>
       <w:u w:val="single"/>

</xml_diff>

<commit_message>
Complete instant localization and streamlined integration
</commit_message>
<xml_diff>
--- a/docs/guides/Delphi App Translation Studio Engineering Guide.docx
+++ b/docs/guides/Delphi App Translation Studio Engineering Guide.docx
@@ -13,7 +13,7 @@
           <w:noProof/>
         </w:rPr>
         <w:drawing>
-          <wp:inline distT="0" distB="0" distL="0" distR="0" wp14:anchorId="7D743104" wp14:editId="6D8967DA">
+          <wp:inline distT="0" distB="0" distL="0" distR="0" wp14:anchorId="28C01E99" wp14:editId="6D62943E">
             <wp:extent cx="1371600" cy="1371600"/>
             <wp:effectExtent l="0" t="0" r="0" b="0"/>
             <wp:docPr id="1" name="Picture 1"/>
@@ -149,7 +149,7 @@
       <w:pPr>
         <w:pStyle w:val="Heading1"/>
       </w:pPr>
-      <w:bookmarkStart w:id="0" w:name="_Toc237020187"/>
+      <w:bookmarkStart w:id="0" w:name="_Toc237032156"/>
       <w:r>
         <w:lastRenderedPageBreak/>
         <w:t>Table of Contents</w:t>
@@ -175,7 +175,7 @@
       <w:r>
         <w:fldChar w:fldCharType="separate"/>
       </w:r>
-      <w:hyperlink w:anchor="_Toc237020187" w:history="1">
+      <w:hyperlink w:anchor="_Toc237032156" w:history="1">
         <w:r>
           <w:rPr>
             <w:rStyle w:val="Hyperlink"/>
@@ -202,7 +202,7 @@
             <w:noProof/>
             <w:webHidden/>
           </w:rPr>
-          <w:instrText xml:space="preserve"> PAGEREF _Toc237020187 \h </w:instrText>
+          <w:instrText xml:space="preserve"> PAGEREF _Toc237032156 \h </w:instrText>
         </w:r>
         <w:r>
           <w:rPr>
@@ -243,7 +243,7 @@
           <w:noProof/>
         </w:rPr>
       </w:pPr>
-      <w:hyperlink w:anchor="_Toc237020188" w:history="1">
+      <w:hyperlink w:anchor="_Toc237032157" w:history="1">
         <w:r>
           <w:rPr>
             <w:rStyle w:val="Hyperlink"/>
@@ -270,7 +270,7 @@
             <w:noProof/>
             <w:webHidden/>
           </w:rPr>
-          <w:instrText xml:space="preserve"> PAGEREF _Toc237020188 \h </w:instrText>
+          <w:instrText xml:space="preserve"> PAGEREF _Toc237032157 \h </w:instrText>
         </w:r>
         <w:r>
           <w:rPr>
@@ -311,7 +311,7 @@
           <w:noProof/>
         </w:rPr>
       </w:pPr>
-      <w:hyperlink w:anchor="_Toc237020189" w:history="1">
+      <w:hyperlink w:anchor="_Toc237032158" w:history="1">
         <w:r>
           <w:rPr>
             <w:rStyle w:val="Hyperlink"/>
@@ -338,7 +338,7 @@
             <w:noProof/>
             <w:webHidden/>
           </w:rPr>
-          <w:instrText xml:space="preserve"> PAGEREF _Toc237020189 \h </w:instrText>
+          <w:instrText xml:space="preserve"> PAGEREF _Toc237032158 \h </w:instrText>
         </w:r>
         <w:r>
           <w:rPr>
@@ -379,7 +379,7 @@
           <w:noProof/>
         </w:rPr>
       </w:pPr>
-      <w:hyperlink w:anchor="_Toc237020190" w:history="1">
+      <w:hyperlink w:anchor="_Toc237032159" w:history="1">
         <w:r>
           <w:rPr>
             <w:rStyle w:val="Hyperlink"/>
@@ -406,7 +406,7 @@
             <w:noProof/>
             <w:webHidden/>
           </w:rPr>
-          <w:instrText xml:space="preserve"> PAGEREF _Toc237020190 \h </w:instrText>
+          <w:instrText xml:space="preserve"> PAGEREF _Toc237032159 \h </w:instrText>
         </w:r>
         <w:r>
           <w:rPr>
@@ -447,7 +447,7 @@
           <w:noProof/>
         </w:rPr>
       </w:pPr>
-      <w:hyperlink w:anchor="_Toc237020191" w:history="1">
+      <w:hyperlink w:anchor="_Toc237032160" w:history="1">
         <w:r>
           <w:rPr>
             <w:rStyle w:val="Hyperlink"/>
@@ -474,7 +474,7 @@
             <w:noProof/>
             <w:webHidden/>
           </w:rPr>
-          <w:instrText xml:space="preserve"> PAGEREF _Toc237020191 \h </w:instrText>
+          <w:instrText xml:space="preserve"> PAGEREF _Toc237032160 \h </w:instrText>
         </w:r>
         <w:r>
           <w:rPr>
@@ -515,7 +515,7 @@
           <w:noProof/>
         </w:rPr>
       </w:pPr>
-      <w:hyperlink w:anchor="_Toc237020192" w:history="1">
+      <w:hyperlink w:anchor="_Toc237032161" w:history="1">
         <w:r>
           <w:rPr>
             <w:rStyle w:val="Hyperlink"/>
@@ -542,7 +542,7 @@
             <w:noProof/>
             <w:webHidden/>
           </w:rPr>
-          <w:instrText xml:space="preserve"> PAGEREF _Toc237020192 \h </w:instrText>
+          <w:instrText xml:space="preserve"> PAGEREF _Toc237032161 \h </w:instrText>
         </w:r>
         <w:r>
           <w:rPr>
@@ -583,7 +583,7 @@
           <w:noProof/>
         </w:rPr>
       </w:pPr>
-      <w:hyperlink w:anchor="_Toc237020193" w:history="1">
+      <w:hyperlink w:anchor="_Toc237032162" w:history="1">
         <w:r>
           <w:rPr>
             <w:rStyle w:val="Hyperlink"/>
@@ -610,7 +610,7 @@
             <w:noProof/>
             <w:webHidden/>
           </w:rPr>
-          <w:instrText xml:space="preserve"> PAGEREF _Toc237020193 \h </w:instrText>
+          <w:instrText xml:space="preserve"> PAGEREF _Toc237032162 \h </w:instrText>
         </w:r>
         <w:r>
           <w:rPr>
@@ -651,7 +651,7 @@
           <w:noProof/>
         </w:rPr>
       </w:pPr>
-      <w:hyperlink w:anchor="_Toc237020194" w:history="1">
+      <w:hyperlink w:anchor="_Toc237032163" w:history="1">
         <w:r>
           <w:rPr>
             <w:rStyle w:val="Hyperlink"/>
@@ -678,7 +678,7 @@
             <w:noProof/>
             <w:webHidden/>
           </w:rPr>
-          <w:instrText xml:space="preserve"> PAGEREF _Toc237020194 \h </w:instrText>
+          <w:instrText xml:space="preserve"> PAGEREF _Toc237032163 \h </w:instrText>
         </w:r>
         <w:r>
           <w:rPr>
@@ -719,7 +719,7 @@
           <w:noProof/>
         </w:rPr>
       </w:pPr>
-      <w:hyperlink w:anchor="_Toc237020195" w:history="1">
+      <w:hyperlink w:anchor="_Toc237032164" w:history="1">
         <w:r>
           <w:rPr>
             <w:rStyle w:val="Hyperlink"/>
@@ -746,7 +746,7 @@
             <w:noProof/>
             <w:webHidden/>
           </w:rPr>
-          <w:instrText xml:space="preserve"> PAGEREF _Toc237020195 \h </w:instrText>
+          <w:instrText xml:space="preserve"> PAGEREF _Toc237032164 \h </w:instrText>
         </w:r>
         <w:r>
           <w:rPr>
@@ -787,7 +787,7 @@
           <w:noProof/>
         </w:rPr>
       </w:pPr>
-      <w:hyperlink w:anchor="_Toc237020196" w:history="1">
+      <w:hyperlink w:anchor="_Toc237032165" w:history="1">
         <w:r>
           <w:rPr>
             <w:rStyle w:val="Hyperlink"/>
@@ -814,7 +814,7 @@
             <w:noProof/>
             <w:webHidden/>
           </w:rPr>
-          <w:instrText xml:space="preserve"> PAGEREF _Toc237020196 \h </w:instrText>
+          <w:instrText xml:space="preserve"> PAGEREF _Toc237032165 \h </w:instrText>
         </w:r>
         <w:r>
           <w:rPr>
@@ -855,7 +855,7 @@
           <w:noProof/>
         </w:rPr>
       </w:pPr>
-      <w:hyperlink w:anchor="_Toc237020197" w:history="1">
+      <w:hyperlink w:anchor="_Toc237032166" w:history="1">
         <w:r>
           <w:rPr>
             <w:rStyle w:val="Hyperlink"/>
@@ -882,7 +882,7 @@
             <w:noProof/>
             <w:webHidden/>
           </w:rPr>
-          <w:instrText xml:space="preserve"> PAGEREF _Toc237020197 \h </w:instrText>
+          <w:instrText xml:space="preserve"> PAGEREF _Toc237032166 \h </w:instrText>
         </w:r>
         <w:r>
           <w:rPr>
@@ -923,7 +923,7 @@
           <w:noProof/>
         </w:rPr>
       </w:pPr>
-      <w:hyperlink w:anchor="_Toc237020198" w:history="1">
+      <w:hyperlink w:anchor="_Toc237032167" w:history="1">
         <w:r>
           <w:rPr>
             <w:rStyle w:val="Hyperlink"/>
@@ -950,7 +950,7 @@
             <w:noProof/>
             <w:webHidden/>
           </w:rPr>
-          <w:instrText xml:space="preserve"> PAGEREF _Toc237020198 \h </w:instrText>
+          <w:instrText xml:space="preserve"> PAGEREF _Toc237032167 \h </w:instrText>
         </w:r>
         <w:r>
           <w:rPr>
@@ -991,7 +991,7 @@
           <w:noProof/>
         </w:rPr>
       </w:pPr>
-      <w:hyperlink w:anchor="_Toc237020199" w:history="1">
+      <w:hyperlink w:anchor="_Toc237032168" w:history="1">
         <w:r>
           <w:rPr>
             <w:rStyle w:val="Hyperlink"/>
@@ -1018,7 +1018,7 @@
             <w:noProof/>
             <w:webHidden/>
           </w:rPr>
-          <w:instrText xml:space="preserve"> PAGEREF _Toc237020199 \h </w:instrText>
+          <w:instrText xml:space="preserve"> PAGEREF _Toc237032168 \h </w:instrText>
         </w:r>
         <w:r>
           <w:rPr>
@@ -1059,7 +1059,7 @@
           <w:noProof/>
         </w:rPr>
       </w:pPr>
-      <w:hyperlink w:anchor="_Toc237020200" w:history="1">
+      <w:hyperlink w:anchor="_Toc237032169" w:history="1">
         <w:r>
           <w:rPr>
             <w:rStyle w:val="Hyperlink"/>
@@ -1086,7 +1086,7 @@
             <w:noProof/>
             <w:webHidden/>
           </w:rPr>
-          <w:instrText xml:space="preserve"> PAGEREF _Toc237020200 \h </w:instrText>
+          <w:instrText xml:space="preserve"> PAGEREF _Toc237032169 \h </w:instrText>
         </w:r>
         <w:r>
           <w:rPr>
@@ -1127,7 +1127,7 @@
           <w:noProof/>
         </w:rPr>
       </w:pPr>
-      <w:hyperlink w:anchor="_Toc237020201" w:history="1">
+      <w:hyperlink w:anchor="_Toc237032170" w:history="1">
         <w:r>
           <w:rPr>
             <w:rStyle w:val="Hyperlink"/>
@@ -1154,7 +1154,7 @@
             <w:noProof/>
             <w:webHidden/>
           </w:rPr>
-          <w:instrText xml:space="preserve"> PAGEREF _Toc237020201 \h </w:instrText>
+          <w:instrText xml:space="preserve"> PAGEREF _Toc237032170 \h </w:instrText>
         </w:r>
         <w:r>
           <w:rPr>
@@ -1195,7 +1195,7 @@
           <w:noProof/>
         </w:rPr>
       </w:pPr>
-      <w:hyperlink w:anchor="_Toc237020202" w:history="1">
+      <w:hyperlink w:anchor="_Toc237032171" w:history="1">
         <w:r>
           <w:rPr>
             <w:rStyle w:val="Hyperlink"/>
@@ -1222,7 +1222,7 @@
             <w:noProof/>
             <w:webHidden/>
           </w:rPr>
-          <w:instrText xml:space="preserve"> PAGEREF _Toc237020202 \h </w:instrText>
+          <w:instrText xml:space="preserve"> PAGEREF _Toc237032171 \h </w:instrText>
         </w:r>
         <w:r>
           <w:rPr>
@@ -1263,7 +1263,7 @@
           <w:noProof/>
         </w:rPr>
       </w:pPr>
-      <w:hyperlink w:anchor="_Toc237020203" w:history="1">
+      <w:hyperlink w:anchor="_Toc237032172" w:history="1">
         <w:r>
           <w:rPr>
             <w:rStyle w:val="Hyperlink"/>
@@ -1290,7 +1290,7 @@
             <w:noProof/>
             <w:webHidden/>
           </w:rPr>
-          <w:instrText xml:space="preserve"> PAGEREF _Toc237020203 \h </w:instrText>
+          <w:instrText xml:space="preserve"> PAGEREF _Toc237032172 \h </w:instrText>
         </w:r>
         <w:r>
           <w:rPr>
@@ -1331,7 +1331,7 @@
           <w:noProof/>
         </w:rPr>
       </w:pPr>
-      <w:hyperlink w:anchor="_Toc237020204" w:history="1">
+      <w:hyperlink w:anchor="_Toc237032173" w:history="1">
         <w:r>
           <w:rPr>
             <w:rStyle w:val="Hyperlink"/>
@@ -1358,7 +1358,7 @@
             <w:noProof/>
             <w:webHidden/>
           </w:rPr>
-          <w:instrText xml:space="preserve"> PAGEREF _Toc237020204 \h </w:instrText>
+          <w:instrText xml:space="preserve"> PAGEREF _Toc237032173 \h </w:instrText>
         </w:r>
         <w:r>
           <w:rPr>
@@ -1399,7 +1399,7 @@
           <w:noProof/>
         </w:rPr>
       </w:pPr>
-      <w:hyperlink w:anchor="_Toc237020205" w:history="1">
+      <w:hyperlink w:anchor="_Toc237032174" w:history="1">
         <w:r>
           <w:rPr>
             <w:rStyle w:val="Hyperlink"/>
@@ -1426,7 +1426,7 @@
             <w:noProof/>
             <w:webHidden/>
           </w:rPr>
-          <w:instrText xml:space="preserve"> PAGEREF _Toc237020205 \h </w:instrText>
+          <w:instrText xml:space="preserve"> PAGEREF _Toc237032174 \h </w:instrText>
         </w:r>
         <w:r>
           <w:rPr>
@@ -1467,7 +1467,7 @@
           <w:noProof/>
         </w:rPr>
       </w:pPr>
-      <w:hyperlink w:anchor="_Toc237020206" w:history="1">
+      <w:hyperlink w:anchor="_Toc237032175" w:history="1">
         <w:r>
           <w:rPr>
             <w:rStyle w:val="Hyperlink"/>
@@ -1494,7 +1494,7 @@
             <w:noProof/>
             <w:webHidden/>
           </w:rPr>
-          <w:instrText xml:space="preserve"> PAGEREF _Toc237020206 \h </w:instrText>
+          <w:instrText xml:space="preserve"> PAGEREF _Toc237032175 \h </w:instrText>
         </w:r>
         <w:r>
           <w:rPr>
@@ -1535,7 +1535,7 @@
           <w:noProof/>
         </w:rPr>
       </w:pPr>
-      <w:hyperlink w:anchor="_Toc237020207" w:history="1">
+      <w:hyperlink w:anchor="_Toc237032176" w:history="1">
         <w:r>
           <w:rPr>
             <w:rStyle w:val="Hyperlink"/>
@@ -1562,7 +1562,7 @@
             <w:noProof/>
             <w:webHidden/>
           </w:rPr>
-          <w:instrText xml:space="preserve"> PAGEREF _Toc237020207 \h </w:instrText>
+          <w:instrText xml:space="preserve"> PAGEREF _Toc237032176 \h </w:instrText>
         </w:r>
         <w:r>
           <w:rPr>
@@ -1603,7 +1603,7 @@
           <w:noProof/>
         </w:rPr>
       </w:pPr>
-      <w:hyperlink w:anchor="_Toc237020208" w:history="1">
+      <w:hyperlink w:anchor="_Toc237032177" w:history="1">
         <w:r>
           <w:rPr>
             <w:rStyle w:val="Hyperlink"/>
@@ -1630,7 +1630,7 @@
             <w:noProof/>
             <w:webHidden/>
           </w:rPr>
-          <w:instrText xml:space="preserve"> PAGEREF _Toc237020208 \h </w:instrText>
+          <w:instrText xml:space="preserve"> PAGEREF _Toc237032177 \h </w:instrText>
         </w:r>
         <w:r>
           <w:rPr>
@@ -1671,7 +1671,7 @@
           <w:noProof/>
         </w:rPr>
       </w:pPr>
-      <w:hyperlink w:anchor="_Toc237020209" w:history="1">
+      <w:hyperlink w:anchor="_Toc237032178" w:history="1">
         <w:r>
           <w:rPr>
             <w:rStyle w:val="Hyperlink"/>
@@ -1698,7 +1698,7 @@
             <w:noProof/>
             <w:webHidden/>
           </w:rPr>
-          <w:instrText xml:space="preserve"> PAGEREF _Toc237020209 \h </w:instrText>
+          <w:instrText xml:space="preserve"> PAGEREF _Toc237032178 \h </w:instrText>
         </w:r>
         <w:r>
           <w:rPr>
@@ -1739,7 +1739,7 @@
           <w:noProof/>
         </w:rPr>
       </w:pPr>
-      <w:hyperlink w:anchor="_Toc237020210" w:history="1">
+      <w:hyperlink w:anchor="_Toc237032179" w:history="1">
         <w:r>
           <w:rPr>
             <w:rStyle w:val="Hyperlink"/>
@@ -1766,7 +1766,7 @@
             <w:noProof/>
             <w:webHidden/>
           </w:rPr>
-          <w:instrText xml:space="preserve"> PAGEREF _Toc237020210 \h </w:instrText>
+          <w:instrText xml:space="preserve"> PAGEREF _Toc237032179 \h </w:instrText>
         </w:r>
         <w:r>
           <w:rPr>
@@ -1807,7 +1807,7 @@
           <w:noProof/>
         </w:rPr>
       </w:pPr>
-      <w:hyperlink w:anchor="_Toc237020211" w:history="1">
+      <w:hyperlink w:anchor="_Toc237032180" w:history="1">
         <w:r>
           <w:rPr>
             <w:rStyle w:val="Hyperlink"/>
@@ -1834,7 +1834,7 @@
             <w:noProof/>
             <w:webHidden/>
           </w:rPr>
-          <w:instrText xml:space="preserve"> PAGEREF _Toc237020211 \h </w:instrText>
+          <w:instrText xml:space="preserve"> PAGEREF _Toc237032180 \h </w:instrText>
         </w:r>
         <w:r>
           <w:rPr>
@@ -1875,7 +1875,7 @@
           <w:noProof/>
         </w:rPr>
       </w:pPr>
-      <w:hyperlink w:anchor="_Toc237020212" w:history="1">
+      <w:hyperlink w:anchor="_Toc237032181" w:history="1">
         <w:r>
           <w:rPr>
             <w:rStyle w:val="Hyperlink"/>
@@ -1902,7 +1902,7 @@
             <w:noProof/>
             <w:webHidden/>
           </w:rPr>
-          <w:instrText xml:space="preserve"> PAGEREF _Toc237020212 \h </w:instrText>
+          <w:instrText xml:space="preserve"> PAGEREF _Toc237032181 \h </w:instrText>
         </w:r>
         <w:r>
           <w:rPr>
@@ -1943,7 +1943,7 @@
           <w:noProof/>
         </w:rPr>
       </w:pPr>
-      <w:hyperlink w:anchor="_Toc237020213" w:history="1">
+      <w:hyperlink w:anchor="_Toc237032182" w:history="1">
         <w:r>
           <w:rPr>
             <w:rStyle w:val="Hyperlink"/>
@@ -1970,7 +1970,7 @@
             <w:noProof/>
             <w:webHidden/>
           </w:rPr>
-          <w:instrText xml:space="preserve"> PAGEREF _Toc237020213 \h </w:instrText>
+          <w:instrText xml:space="preserve"> PAGEREF _Toc237032182 \h </w:instrText>
         </w:r>
         <w:r>
           <w:rPr>
@@ -2011,7 +2011,7 @@
           <w:noProof/>
         </w:rPr>
       </w:pPr>
-      <w:hyperlink w:anchor="_Toc237020214" w:history="1">
+      <w:hyperlink w:anchor="_Toc237032183" w:history="1">
         <w:r>
           <w:rPr>
             <w:rStyle w:val="Hyperlink"/>
@@ -2038,7 +2038,7 @@
             <w:noProof/>
             <w:webHidden/>
           </w:rPr>
-          <w:instrText xml:space="preserve"> PAGEREF _Toc237020214 \h </w:instrText>
+          <w:instrText xml:space="preserve"> PAGEREF _Toc237032183 \h </w:instrText>
         </w:r>
         <w:r>
           <w:rPr>
@@ -2079,7 +2079,7 @@
           <w:noProof/>
         </w:rPr>
       </w:pPr>
-      <w:hyperlink w:anchor="_Toc237020215" w:history="1">
+      <w:hyperlink w:anchor="_Toc237032184" w:history="1">
         <w:r>
           <w:rPr>
             <w:rStyle w:val="Hyperlink"/>
@@ -2106,7 +2106,7 @@
             <w:noProof/>
             <w:webHidden/>
           </w:rPr>
-          <w:instrText xml:space="preserve"> PAGEREF _Toc237020215 \h </w:instrText>
+          <w:instrText xml:space="preserve"> PAGEREF _Toc237032184 \h </w:instrText>
         </w:r>
         <w:r>
           <w:rPr>
@@ -2147,7 +2147,7 @@
           <w:noProof/>
         </w:rPr>
       </w:pPr>
-      <w:hyperlink w:anchor="_Toc237020216" w:history="1">
+      <w:hyperlink w:anchor="_Toc237032185" w:history="1">
         <w:r>
           <w:rPr>
             <w:rStyle w:val="Hyperlink"/>
@@ -2174,7 +2174,7 @@
             <w:noProof/>
             <w:webHidden/>
           </w:rPr>
-          <w:instrText xml:space="preserve"> PAGEREF _Toc237020216 \h </w:instrText>
+          <w:instrText xml:space="preserve"> PAGEREF _Toc237032185 \h </w:instrText>
         </w:r>
         <w:r>
           <w:rPr>
@@ -2215,7 +2215,7 @@
           <w:noProof/>
         </w:rPr>
       </w:pPr>
-      <w:hyperlink w:anchor="_Toc237020217" w:history="1">
+      <w:hyperlink w:anchor="_Toc237032186" w:history="1">
         <w:r>
           <w:rPr>
             <w:rStyle w:val="Hyperlink"/>
@@ -2242,7 +2242,7 @@
             <w:noProof/>
             <w:webHidden/>
           </w:rPr>
-          <w:instrText xml:space="preserve"> PAGEREF _Toc237020217 \h </w:instrText>
+          <w:instrText xml:space="preserve"> PAGEREF _Toc237032186 \h </w:instrText>
         </w:r>
         <w:r>
           <w:rPr>
@@ -2295,7 +2295,7 @@
       <w:pPr>
         <w:pStyle w:val="Heading1"/>
       </w:pPr>
-      <w:bookmarkStart w:id="1" w:name="_Toc237020188"/>
+      <w:bookmarkStart w:id="1" w:name="_Toc237032157"/>
       <w:r>
         <w:lastRenderedPageBreak/>
         <w:t>1. Product Scope and Invariants</w:t>
@@ -2364,7 +2364,7 @@
       <w:pPr>
         <w:pStyle w:val="Heading1"/>
       </w:pPr>
-      <w:bookmarkStart w:id="2" w:name="_Toc237020189"/>
+      <w:bookmarkStart w:id="2" w:name="_Toc237032158"/>
       <w:r>
         <w:t>2. Repository and Build Layout</w:t>
       </w:r>
@@ -2758,7 +2758,7 @@
       <w:pPr>
         <w:pStyle w:val="Heading2"/>
       </w:pPr>
-      <w:bookmarkStart w:id="3" w:name="_Toc237020190"/>
+      <w:bookmarkStart w:id="3" w:name="_Toc237032159"/>
       <w:r>
         <w:t>2.1 Toolchain</w:t>
       </w:r>
@@ -2792,7 +2792,7 @@
       <w:pPr>
         <w:pStyle w:val="Heading1"/>
       </w:pPr>
-      <w:bookmarkStart w:id="4" w:name="_Toc237020191"/>
+      <w:bookmarkStart w:id="4" w:name="_Toc237032160"/>
       <w:r>
         <w:t>3. System Architecture</w:t>
       </w:r>
@@ -3205,7 +3205,7 @@
       <w:pPr>
         <w:pStyle w:val="Heading1"/>
       </w:pPr>
-      <w:bookmarkStart w:id="5" w:name="_Toc237020192"/>
+      <w:bookmarkStart w:id="5" w:name="_Toc237032161"/>
       <w:r>
         <w:t>4. Core Data Model and JSON</w:t>
       </w:r>
@@ -3220,7 +3220,7 @@
       <w:pPr>
         <w:pStyle w:val="Heading2"/>
       </w:pPr>
-      <w:bookmarkStart w:id="6" w:name="_Toc237020193"/>
+      <w:bookmarkStart w:id="6" w:name="_Toc237032162"/>
       <w:r>
         <w:t>4.1 Stable keys</w:t>
       </w:r>
@@ -3262,7 +3262,7 @@
       <w:pPr>
         <w:pStyle w:val="Heading2"/>
       </w:pPr>
-      <w:bookmarkStart w:id="7" w:name="_Toc237020194"/>
+      <w:bookmarkStart w:id="7" w:name="_Toc237032163"/>
       <w:r>
         <w:t>4.2 Development catalog</w:t>
       </w:r>
@@ -3321,7 +3321,7 @@
       <w:pPr>
         <w:pStyle w:val="Heading2"/>
       </w:pPr>
-      <w:bookmarkStart w:id="8" w:name="_Toc237020195"/>
+      <w:bookmarkStart w:id="8" w:name="_Toc237032164"/>
       <w:r>
         <w:t>4.3 Runtime pack</w:t>
       </w:r>
@@ -3375,7 +3375,7 @@
       <w:pPr>
         <w:pStyle w:val="Heading1"/>
       </w:pPr>
-      <w:bookmarkStart w:id="9" w:name="_Toc237020196"/>
+      <w:bookmarkStart w:id="9" w:name="_Toc237032165"/>
       <w:r>
         <w:lastRenderedPageBreak/>
         <w:t>5. Project Detection and Scanning</w:t>
@@ -3396,7 +3396,7 @@
       <w:pPr>
         <w:pStyle w:val="Heading2"/>
       </w:pPr>
-      <w:bookmarkStart w:id="10" w:name="_Toc237020197"/>
+      <w:bookmarkStart w:id="10" w:name="_Toc237032166"/>
       <w:r>
         <w:t>5.1 Incremental merge</w:t>
       </w:r>
@@ -3478,7 +3478,7 @@
       <w:pPr>
         <w:pStyle w:val="Heading1"/>
       </w:pPr>
-      <w:bookmarkStart w:id="11" w:name="_Toc237020198"/>
+      <w:bookmarkStart w:id="11" w:name="_Toc237032167"/>
       <w:r>
         <w:t>6. Studio UI and Workflow State</w:t>
       </w:r>
@@ -3553,7 +3553,7 @@
       <w:pPr>
         <w:pStyle w:val="Heading1"/>
       </w:pPr>
-      <w:bookmarkStart w:id="12" w:name="_Toc237020199"/>
+      <w:bookmarkStart w:id="12" w:name="_Toc237032168"/>
       <w:r>
         <w:lastRenderedPageBreak/>
         <w:t>7. Provider Settings and Secret Storage</w:t>
@@ -3822,7 +3822,7 @@
       <w:pPr>
         <w:pStyle w:val="Heading1"/>
       </w:pPr>
-      <w:bookmarkStart w:id="13" w:name="_Toc237020200"/>
+      <w:bookmarkStart w:id="13" w:name="_Toc237032169"/>
       <w:r>
         <w:t>8. Provider HTTP Clients</w:t>
       </w:r>
@@ -4114,7 +4114,7 @@
       <w:pPr>
         <w:pStyle w:val="Heading2"/>
       </w:pPr>
-      <w:bookmarkStart w:id="14" w:name="_Toc237020201"/>
+      <w:bookmarkStart w:id="14" w:name="_Toc237032170"/>
       <w:r>
         <w:t>8.1 Reliability and cancellation</w:t>
       </w:r>
@@ -4172,7 +4172,7 @@
       <w:pPr>
         <w:pStyle w:val="Heading2"/>
       </w:pPr>
-      <w:bookmarkStart w:id="15" w:name="_Toc237020202"/>
+      <w:bookmarkStart w:id="15" w:name="_Toc237032171"/>
       <w:r>
         <w:t>8.2 Official protocol references</w:t>
       </w:r>
@@ -4222,7 +4222,7 @@
       <w:pPr>
         <w:pStyle w:val="Heading1"/>
       </w:pPr>
-      <w:bookmarkStart w:id="16" w:name="_Toc237020203"/>
+      <w:bookmarkStart w:id="16" w:name="_Toc237032172"/>
       <w:r>
         <w:t>9. Automatic Provider Translation and Review</w:t>
       </w:r>
@@ -4309,7 +4309,7 @@
       <w:pPr>
         <w:pStyle w:val="Heading1"/>
       </w:pPr>
-      <w:bookmarkStart w:id="17" w:name="_Toc237020204"/>
+      <w:bookmarkStart w:id="17" w:name="_Toc237032173"/>
       <w:r>
         <w:t>10. Validation and Runtime Pack Export</w:t>
       </w:r>
@@ -4329,7 +4329,7 @@
       <w:pPr>
         <w:pStyle w:val="Heading1"/>
       </w:pPr>
-      <w:bookmarkStart w:id="18" w:name="_Toc237020205"/>
+      <w:bookmarkStart w:id="18" w:name="_Toc237032174"/>
       <w:r>
         <w:t>11. Runtime Engine</w:t>
       </w:r>
@@ -4337,12 +4337,15 @@
     </w:p>
     <w:p>
       <w:r>
-        <w:t>DAT.Runtime.LanguagePack loads and discovers JSON packs, checks application identity, and provides fallback lookup. DAT.Runtime.Preference reads/writes the selected locale. DAT.Runtime.Manager owns the active pack, discovery, preference, translation lookup, and locale format settings.</w:t>
+        <w:t xml:space="preserve">DAT.Runtime.LanguagePack loads and discovers JSON packs, checks application identity, rejects empty/invalid packs, canonicalizes native language names, de-duplicates exact locale codes, and suppresses a generic locale when a regional variant exists. DAT.Runtime.Preference reads/writes the selected locale. DAT.Runtime.Manager owns the active pack, discovery, preference, translation lookup, </w:t>
       </w:r>
-    </w:p>
-    <w:p>
       <w:r>
         <w:lastRenderedPageBreak/>
+        <w:t>and locale format settings. The source language loads its generated JSON pack when present and falls back to designer text only for older deployments without that pack.</w:t>
+      </w:r>
+    </w:p>
+    <w:p>
+      <w:r>
         <w:t>DAT.Runtime.VCL and DAT.Runtime.FMX traverse existing component trees and supported collection properties. They apply values by stable key to already designer-created controls. Missing keys retain source text. The adapters do not create controls or rearrange layouts.</w:t>
       </w:r>
     </w:p>
@@ -4350,7 +4353,7 @@
       <w:pPr>
         <w:pStyle w:val="Heading2"/>
       </w:pPr>
-      <w:bookmarkStart w:id="19" w:name="_Toc237020206"/>
+      <w:bookmarkStart w:id="19" w:name="_Toc237032175"/>
       <w:r>
         <w:t>11.1 Deployment paths</w:t>
       </w:r>
@@ -4392,7 +4395,7 @@
       <w:pPr>
         <w:pStyle w:val="Heading1"/>
       </w:pPr>
-      <w:bookmarkStart w:id="20" w:name="_Toc237020207"/>
+      <w:bookmarkStart w:id="20" w:name="_Toc237032176"/>
       <w:r>
         <w:t>12. Integration Planning and Transactions</w:t>
       </w:r>
@@ -4400,24 +4403,27 @@
     </w:p>
     <w:p>
       <w:r>
-        <w:t>DAT.Integration.Plan builds a human-readable plan. DAT.Integration.Package creates the generated application unit, framework adapter, shared runtime units, JSON packs, language-menu manifest, and deployment script. DAT.Integration.Engine builds every proposed file change in memory. TIntegrationFileChange.ExactReviewText produces a complete line-numbered original/proposed LCS diff; generated files are shown in full.</w:t>
+        <w:t>DAT.Integration.Plan builds a human-readable plan. DAT.Integration.Package creates the generated application unit, framework adapter, shared runtime units, normalized JSON packs, automatic English source pack, language-menu manifest, and deployment script. DAT.Integration.Engine builds every proposed file change in memory, including language-pack installation. TIntegrationFileChange.ExactReviewText provides an optional complete line-numbered original/proposed LCS diff; generated files are shown in full.</w:t>
       </w:r>
     </w:p>
     <w:p>
       <w:r>
-        <w:t>The Studio records each selected preview file as viewed. The final review checkbox remains disabled until every file has been viewed, and Apply remains disabled until the checkbox is explicitly checked. DAT.Integration.Transaction then checks source state, creates a verified pre-change backup, writes files atomically, rolls back failures, and records a manifest for restore.</w:t>
+        <w:t>One explicit authorization enables Apply; opening every diff is not required. DAT.Integration.Transaction checks source state, creates a verified pre-change backup, writes files atomically, rolls back failures, and records a manifest for restore. DAT.Integration.BuildDeploy can then invoke the Delphi 37 build elevated and deploy the package packs to the standardized executable output without launching it.</w:t>
       </w:r>
     </w:p>
     <w:p>
       <w:r>
-        <w:t>DAT.Integration.MenuResource modifies text DFM/FMX menus idempotently and preserves designer editability. DAT.Integration.DelphiSource applies narrowly scoped DPR, PAS, and DPROJ wiring. For FMX, it preserves an existing root OnCreate handler or persists datTranslationFormCreate in the FMX and adds ApplyTranslation(Self) to its Pascal method. This respects the FMX form streaming lifecycle and avoids translating the first form from the DPR immediately after CreateForm.</w:t>
+        <w:t>DAT.Integration.MenuResource modifies text DFM/FMX menus idempotently and preserves designer editability. It locates the first DPR-created form when a menu must be added, reuses an existing TMenuBar/TMainMenu when available, or persists a new framework-appropriate container and menu. DAT.Integration.DelphiSource adds matching component fields and applies narrowly scoped DPR, PAS, and DPROJ wiring. For FMX, it preserves an existing root OnCreate handler or persists datTranslationFormCreate in the FMX and add</w:t>
       </w:r>
+      <w:r>
+        <w:t>s ApplyTranslation(Self) to its Pascal method. This respects the FMX form streaming lifecycle and avoids translating the first form from the DPR immediately after CreateForm.</w:t>
+      </w:r>
     </w:p>
     <w:p>
       <w:pPr>
         <w:pStyle w:val="Heading2"/>
       </w:pPr>
-      <w:bookmarkStart w:id="21" w:name="_Toc237020208"/>
+      <w:bookmarkStart w:id="21" w:name="_Toc237032177"/>
       <w:r>
         <w:t>12.1 Generated startup contract</w:t>
       </w:r>
@@ -4444,6 +4450,7 @@
         <w:pStyle w:val="ListBullet"/>
       </w:pPr>
       <w:r>
+        <w:lastRenderedPageBreak/>
         <w:t>FMX applies each form in its designer-persisted OnCreate handler after streaming is complete.</w:t>
       </w:r>
     </w:p>
@@ -4453,6 +4460,22 @@
       </w:pPr>
       <w:r>
         <w:t>SelectLanguageMenuItem derives a locale from datLanguage_&lt;locale&gt; component names.</w:t>
+      </w:r>
+    </w:p>
+    <w:p>
+      <w:pPr>
+        <w:pStyle w:val="ListBullet"/>
+      </w:pPr>
+      <w:r>
+        <w:t>SelectLanguage applies the chosen pack to every currently open form immediately.</w:t>
+      </w:r>
+    </w:p>
+    <w:p>
+      <w:pPr>
+        <w:pStyle w:val="ListBullet"/>
+      </w:pPr>
+      <w:r>
+        <w:t>The generated en-US pack makes switching back to source text deterministic.</w:t>
       </w:r>
     </w:p>
     <w:p>
@@ -4512,11 +4535,7 @@
               <w:t xml:space="preserve">Original code preservation. </w:t>
             </w:r>
             <w:r>
-              <w:t xml:space="preserve">Integration adds narrowly scoped calls and units but does not replace original </w:t>
-            </w:r>
-            <w:r>
-              <w:lastRenderedPageBreak/>
-              <w:t>captions or rewrite every control. The original DFM/FMX values continue to be the source-language fallback.</w:t>
+              <w:t>Integration adds narrowly scoped calls and units but does not replace original captions or rewrite every control. The original DFM/FMX values continue to be the source-language fallback.</w:t>
             </w:r>
           </w:p>
         </w:tc>
@@ -4526,9 +4545,8 @@
       <w:pPr>
         <w:pStyle w:val="Heading1"/>
       </w:pPr>
-      <w:bookmarkStart w:id="22" w:name="_Toc237020209"/>
+      <w:bookmarkStart w:id="22" w:name="_Toc237032178"/>
       <w:r>
-        <w:lastRenderedPageBreak/>
         <w:t>13. Self-Localization</w:t>
       </w:r>
       <w:bookmarkEnd w:id="22"/>
@@ -4542,7 +4560,7 @@
       <w:pPr>
         <w:pStyle w:val="Heading1"/>
       </w:pPr>
-      <w:bookmarkStart w:id="23" w:name="_Toc237020210"/>
+      <w:bookmarkStart w:id="23" w:name="_Toc237032179"/>
       <w:r>
         <w:t>14. Error Handling and Diagnostics</w:t>
       </w:r>
@@ -4600,7 +4618,7 @@
       <w:pPr>
         <w:pStyle w:val="Heading1"/>
       </w:pPr>
-      <w:bookmarkStart w:id="24" w:name="_Toc237020211"/>
+      <w:bookmarkStart w:id="24" w:name="_Toc237032180"/>
       <w:r>
         <w:t>15. Test Strategy and Verified Matrix</w:t>
       </w:r>
@@ -4742,6 +4760,7 @@
           </w:tcPr>
           <w:p>
             <w:r>
+              <w:lastRenderedPageBreak/>
               <w:t>FMXRuntimeSmokeTests</w:t>
             </w:r>
           </w:p>
@@ -4807,7 +4826,6 @@
           </w:tcPr>
           <w:p>
             <w:r>
-              <w:lastRenderedPageBreak/>
               <w:t>RunRuntimeSmokeTests.ps1</w:t>
             </w:r>
           </w:p>
@@ -4902,7 +4920,7 @@
       <w:pPr>
         <w:pStyle w:val="Heading2"/>
       </w:pPr>
-      <w:bookmarkStart w:id="25" w:name="_Toc237020212"/>
+      <w:bookmarkStart w:id="25" w:name="_Toc237032181"/>
       <w:r>
         <w:t>15.1 Optional live provider testing</w:t>
       </w:r>
@@ -4917,7 +4935,7 @@
       <w:pPr>
         <w:pStyle w:val="Heading1"/>
       </w:pPr>
-      <w:bookmarkStart w:id="26" w:name="_Toc237020213"/>
+      <w:bookmarkStart w:id="26" w:name="_Toc237032182"/>
       <w:r>
         <w:t>16. Security Review</w:t>
       </w:r>
@@ -5026,6 +5044,7 @@
           </w:tcPr>
           <w:p>
             <w:r>
+              <w:lastRenderedPageBreak/>
               <w:t>Key leaked through URL/log</w:t>
             </w:r>
           </w:p>
@@ -5091,7 +5110,6 @@
           </w:tcPr>
           <w:p>
             <w:r>
-              <w:lastRenderedPageBreak/>
               <w:t>Unrecoverable source mutation</w:t>
             </w:r>
           </w:p>
@@ -5219,7 +5237,7 @@
       <w:pPr>
         <w:pStyle w:val="Heading1"/>
       </w:pPr>
-      <w:bookmarkStart w:id="27" w:name="_Toc237020214"/>
+      <w:bookmarkStart w:id="27" w:name="_Toc237032183"/>
       <w:r>
         <w:t>17. Release and Contribution Workflow</w:t>
       </w:r>
@@ -5337,7 +5355,7 @@
       <w:pPr>
         <w:pStyle w:val="Heading1"/>
       </w:pPr>
-      <w:bookmarkStart w:id="28" w:name="_Toc237020215"/>
+      <w:bookmarkStart w:id="28" w:name="_Toc237032184"/>
       <w:r>
         <w:t>18. Known Boundaries and Future-Compatible Design</w:t>
       </w:r>
@@ -5356,6 +5374,7 @@
         <w:pStyle w:val="ListBullet"/>
       </w:pPr>
       <w:r>
+        <w:lastRenderedPageBreak/>
         <w:t>Google Advanced v3, OAuth/service-account workflows, and other providers are not implemented.</w:t>
       </w:r>
     </w:p>
@@ -5388,8 +5407,7 @@
         <w:pStyle w:val="ListBullet"/>
       </w:pPr>
       <w:r>
-        <w:lastRenderedPageBreak/>
-        <w:t>The generated menu selection persists the locale; restarting is the conservative way to ensure every form and application-specific string is refreshed.</w:t>
+        <w:t>Automatic runtime application covers scanned designer properties. Application-specific strings still require the documented TranslateText wiring.</w:t>
       </w:r>
     </w:p>
     <w:p>
@@ -5404,7 +5422,7 @@
       <w:pPr>
         <w:pStyle w:val="Heading1"/>
       </w:pPr>
-      <w:bookmarkStart w:id="29" w:name="_Toc237020216"/>
+      <w:bookmarkStart w:id="29" w:name="_Toc237032185"/>
       <w:r>
         <w:t>19. Documentation Generation</w:t>
       </w:r>
@@ -5419,7 +5437,7 @@
       <w:pPr>
         <w:pStyle w:val="Heading1"/>
       </w:pPr>
-      <w:bookmarkStart w:id="30" w:name="_Toc237020217"/>
+      <w:bookmarkStart w:id="30" w:name="_Toc237032186"/>
       <w:r>
         <w:t>20. Source References</w:t>
       </w:r>
@@ -5887,40 +5905,40 @@
       </w:rPr>
     </w:lvl>
   </w:abstractNum>
-  <w:num w:numId="1" w16cid:durableId="700664511">
+  <w:num w:numId="1" w16cid:durableId="7682366">
     <w:abstractNumId w:val="8"/>
   </w:num>
-  <w:num w:numId="2" w16cid:durableId="1176463352">
+  <w:num w:numId="2" w16cid:durableId="59519788">
     <w:abstractNumId w:val="6"/>
   </w:num>
-  <w:num w:numId="3" w16cid:durableId="1103263399">
+  <w:num w:numId="3" w16cid:durableId="731733184">
     <w:abstractNumId w:val="5"/>
   </w:num>
-  <w:num w:numId="4" w16cid:durableId="567572763">
+  <w:num w:numId="4" w16cid:durableId="978076263">
     <w:abstractNumId w:val="4"/>
   </w:num>
-  <w:num w:numId="5" w16cid:durableId="344406531">
+  <w:num w:numId="5" w16cid:durableId="841509379">
     <w:abstractNumId w:val="7"/>
   </w:num>
-  <w:num w:numId="6" w16cid:durableId="1039629798">
+  <w:num w:numId="6" w16cid:durableId="1721594691">
     <w:abstractNumId w:val="3"/>
   </w:num>
-  <w:num w:numId="7" w16cid:durableId="1869561761">
+  <w:num w:numId="7" w16cid:durableId="1127893741">
     <w:abstractNumId w:val="2"/>
   </w:num>
-  <w:num w:numId="8" w16cid:durableId="728842087">
+  <w:num w:numId="8" w16cid:durableId="581647136">
     <w:abstractNumId w:val="1"/>
   </w:num>
-  <w:num w:numId="9" w16cid:durableId="244002587">
+  <w:num w:numId="9" w16cid:durableId="34936894">
     <w:abstractNumId w:val="0"/>
   </w:num>
-  <w:num w:numId="10" w16cid:durableId="535198557">
+  <w:num w:numId="10" w16cid:durableId="755172528">
     <w:abstractNumId w:val="7"/>
     <w:lvlOverride w:ilvl="0">
       <w:startOverride w:val="1"/>
     </w:lvlOverride>
   </w:num>
-  <w:num w:numId="11" w16cid:durableId="771318464">
+  <w:num w:numId="11" w16cid:durableId="2134135562">
     <w:abstractNumId w:val="7"/>
     <w:lvlOverride w:ilvl="0">
       <w:startOverride w:val="1"/>
@@ -17347,7 +17365,7 @@
     <w:autoRedefine/>
     <w:uiPriority w:val="39"/>
     <w:unhideWhenUsed/>
-    <w:rsid w:val="00E23D88"/>
+    <w:rsid w:val="00C260D9"/>
     <w:pPr>
       <w:spacing w:after="100"/>
     </w:pPr>
@@ -17359,7 +17377,7 @@
     <w:autoRedefine/>
     <w:uiPriority w:val="39"/>
     <w:unhideWhenUsed/>
-    <w:rsid w:val="00E23D88"/>
+    <w:rsid w:val="00C260D9"/>
     <w:pPr>
       <w:spacing w:after="100"/>
       <w:ind w:left="220"/>
@@ -17370,7 +17388,7 @@
     <w:basedOn w:val="DefaultParagraphFont"/>
     <w:uiPriority w:val="99"/>
     <w:unhideWhenUsed/>
-    <w:rsid w:val="00E23D88"/>
+    <w:rsid w:val="00C260D9"/>
     <w:rPr>
       <w:color w:val="0000FF" w:themeColor="hyperlink"/>
       <w:u w:val="single"/>

</xml_diff>

<commit_message>
docs: complete language manager release validation
</commit_message>
<xml_diff>
--- a/docs/guides/Delphi App Translation Studio Engineering Guide.docx
+++ b/docs/guides/Delphi App Translation Studio Engineering Guide.docx
@@ -13,7 +13,7 @@
           <w:noProof/>
         </w:rPr>
         <w:drawing>
-          <wp:inline distT="0" distB="0" distL="0" distR="0" wp14:anchorId="28C01E99" wp14:editId="6D62943E">
+          <wp:inline distT="0" distB="0" distL="0" distR="0" wp14:anchorId="0EE58753" wp14:editId="1685281D">
             <wp:extent cx="1371600" cy="1371600"/>
             <wp:effectExtent l="0" t="0" r="0" b="0"/>
             <wp:docPr id="1" name="Picture 1"/>
@@ -122,7 +122,7 @@
           <w:color w:val="5D7693"/>
         </w:rPr>
         <w:br/>
-        <w:t>Last changed: August 7, 2026</w:t>
+        <w:t>Last changed: August 8, 2026</w:t>
       </w:r>
       <w:r>
         <w:rPr>
@@ -147,14 +147,12 @@
     </w:p>
     <w:p>
       <w:pPr>
-        <w:pStyle w:val="Heading1"/>
-      </w:pPr>
-      <w:bookmarkStart w:id="0" w:name="_Toc237032156"/>
+        <w:pStyle w:val="TOCHeading"/>
+      </w:pPr>
       <w:r>
         <w:lastRenderedPageBreak/>
         <w:t>Table of Contents</w:t>
       </w:r>
-      <w:bookmarkEnd w:id="0"/>
     </w:p>
     <w:p>
       <w:pPr>
@@ -175,13 +173,13 @@
       <w:r>
         <w:fldChar w:fldCharType="separate"/>
       </w:r>
-      <w:hyperlink w:anchor="_Toc237032156" w:history="1">
+      <w:hyperlink w:anchor="_Toc237099570" w:history="1">
         <w:r>
           <w:rPr>
             <w:rStyle w:val="Hyperlink"/>
             <w:noProof/>
           </w:rPr>
-          <w:t>Table of Contents</w:t>
+          <w:t>1. Product Scope and Invariants</w:t>
         </w:r>
         <w:r>
           <w:rPr>
@@ -202,7 +200,7 @@
             <w:noProof/>
             <w:webHidden/>
           </w:rPr>
-          <w:instrText xml:space="preserve"> PAGEREF _Toc237032156 \h </w:instrText>
+          <w:instrText xml:space="preserve"> PAGEREF _Toc237099570 \h </w:instrText>
         </w:r>
         <w:r>
           <w:rPr>
@@ -222,7 +220,7 @@
             <w:noProof/>
             <w:webHidden/>
           </w:rPr>
-          <w:t>i</w:t>
+          <w:t>1</w:t>
         </w:r>
         <w:r>
           <w:rPr>
@@ -243,13 +241,13 @@
           <w:noProof/>
         </w:rPr>
       </w:pPr>
-      <w:hyperlink w:anchor="_Toc237032157" w:history="1">
+      <w:hyperlink w:anchor="_Toc237099571" w:history="1">
         <w:r>
           <w:rPr>
             <w:rStyle w:val="Hyperlink"/>
             <w:noProof/>
           </w:rPr>
-          <w:t>1. Product Scope and Invariants</w:t>
+          <w:t>2. Repository and Build Layout</w:t>
         </w:r>
         <w:r>
           <w:rPr>
@@ -270,7 +268,7 @@
             <w:noProof/>
             <w:webHidden/>
           </w:rPr>
-          <w:instrText xml:space="preserve"> PAGEREF _Toc237032157 \h </w:instrText>
+          <w:instrText xml:space="preserve"> PAGEREF _Toc237099571 \h </w:instrText>
         </w:r>
         <w:r>
           <w:rPr>
@@ -291,6 +289,74 @@
             <w:webHidden/>
           </w:rPr>
           <w:t>1</w:t>
+        </w:r>
+        <w:r>
+          <w:rPr>
+            <w:noProof/>
+            <w:webHidden/>
+          </w:rPr>
+          <w:fldChar w:fldCharType="end"/>
+        </w:r>
+      </w:hyperlink>
+    </w:p>
+    <w:p>
+      <w:pPr>
+        <w:pStyle w:val="TOC2"/>
+        <w:tabs>
+          <w:tab w:val="right" w:leader="dot" w:pos="9350"/>
+        </w:tabs>
+        <w:rPr>
+          <w:noProof/>
+        </w:rPr>
+      </w:pPr>
+      <w:hyperlink w:anchor="_Toc237099572" w:history="1">
+        <w:r>
+          <w:rPr>
+            <w:rStyle w:val="Hyperlink"/>
+            <w:noProof/>
+          </w:rPr>
+          <w:t>2.1 Toolchain</w:t>
+        </w:r>
+        <w:r>
+          <w:rPr>
+            <w:noProof/>
+            <w:webHidden/>
+          </w:rPr>
+          <w:tab/>
+        </w:r>
+        <w:r>
+          <w:rPr>
+            <w:noProof/>
+            <w:webHidden/>
+          </w:rPr>
+          <w:fldChar w:fldCharType="begin"/>
+        </w:r>
+        <w:r>
+          <w:rPr>
+            <w:noProof/>
+            <w:webHidden/>
+          </w:rPr>
+          <w:instrText xml:space="preserve"> PAGEREF _Toc237099572 \h </w:instrText>
+        </w:r>
+        <w:r>
+          <w:rPr>
+            <w:noProof/>
+            <w:webHidden/>
+          </w:rPr>
+        </w:r>
+        <w:r>
+          <w:rPr>
+            <w:noProof/>
+            <w:webHidden/>
+          </w:rPr>
+          <w:fldChar w:fldCharType="separate"/>
+        </w:r>
+        <w:r>
+          <w:rPr>
+            <w:noProof/>
+            <w:webHidden/>
+          </w:rPr>
+          <w:t>2</w:t>
         </w:r>
         <w:r>
           <w:rPr>
@@ -311,13 +377,13 @@
           <w:noProof/>
         </w:rPr>
       </w:pPr>
-      <w:hyperlink w:anchor="_Toc237032158" w:history="1">
+      <w:hyperlink w:anchor="_Toc237099573" w:history="1">
         <w:r>
           <w:rPr>
             <w:rStyle w:val="Hyperlink"/>
             <w:noProof/>
           </w:rPr>
-          <w:t>2. Repository and Build Layout</w:t>
+          <w:t>3. System Architecture</w:t>
         </w:r>
         <w:r>
           <w:rPr>
@@ -338,7 +404,7 @@
             <w:noProof/>
             <w:webHidden/>
           </w:rPr>
-          <w:instrText xml:space="preserve"> PAGEREF _Toc237032158 \h </w:instrText>
+          <w:instrText xml:space="preserve"> PAGEREF _Toc237099573 \h </w:instrText>
         </w:r>
         <w:r>
           <w:rPr>
@@ -358,7 +424,75 @@
             <w:noProof/>
             <w:webHidden/>
           </w:rPr>
-          <w:t>1</w:t>
+          <w:t>2</w:t>
+        </w:r>
+        <w:r>
+          <w:rPr>
+            <w:noProof/>
+            <w:webHidden/>
+          </w:rPr>
+          <w:fldChar w:fldCharType="end"/>
+        </w:r>
+      </w:hyperlink>
+    </w:p>
+    <w:p>
+      <w:pPr>
+        <w:pStyle w:val="TOC1"/>
+        <w:tabs>
+          <w:tab w:val="right" w:leader="dot" w:pos="9350"/>
+        </w:tabs>
+        <w:rPr>
+          <w:noProof/>
+        </w:rPr>
+      </w:pPr>
+      <w:hyperlink w:anchor="_Toc237099574" w:history="1">
+        <w:r>
+          <w:rPr>
+            <w:rStyle w:val="Hyperlink"/>
+            <w:noProof/>
+          </w:rPr>
+          <w:t>4. Core Data Model and JSON</w:t>
+        </w:r>
+        <w:r>
+          <w:rPr>
+            <w:noProof/>
+            <w:webHidden/>
+          </w:rPr>
+          <w:tab/>
+        </w:r>
+        <w:r>
+          <w:rPr>
+            <w:noProof/>
+            <w:webHidden/>
+          </w:rPr>
+          <w:fldChar w:fldCharType="begin"/>
+        </w:r>
+        <w:r>
+          <w:rPr>
+            <w:noProof/>
+            <w:webHidden/>
+          </w:rPr>
+          <w:instrText xml:space="preserve"> PAGEREF _Toc237099574 \h </w:instrText>
+        </w:r>
+        <w:r>
+          <w:rPr>
+            <w:noProof/>
+            <w:webHidden/>
+          </w:rPr>
+        </w:r>
+        <w:r>
+          <w:rPr>
+            <w:noProof/>
+            <w:webHidden/>
+          </w:rPr>
+          <w:fldChar w:fldCharType="separate"/>
+        </w:r>
+        <w:r>
+          <w:rPr>
+            <w:noProof/>
+            <w:webHidden/>
+          </w:rPr>
+          <w:t>3</w:t>
         </w:r>
         <w:r>
           <w:rPr>
@@ -379,13 +513,13 @@
           <w:noProof/>
         </w:rPr>
       </w:pPr>
-      <w:hyperlink w:anchor="_Toc237032159" w:history="1">
+      <w:hyperlink w:anchor="_Toc237099575" w:history="1">
         <w:r>
           <w:rPr>
             <w:rStyle w:val="Hyperlink"/>
             <w:noProof/>
           </w:rPr>
-          <w:t>2.1 Toolchain</w:t>
+          <w:t>4.1 Stable keys</w:t>
         </w:r>
         <w:r>
           <w:rPr>
@@ -406,7 +540,7 @@
             <w:noProof/>
             <w:webHidden/>
           </w:rPr>
-          <w:instrText xml:space="preserve"> PAGEREF _Toc237032159 \h </w:instrText>
+          <w:instrText xml:space="preserve"> PAGEREF _Toc237099575 \h </w:instrText>
         </w:r>
         <w:r>
           <w:rPr>
@@ -426,7 +560,143 @@
             <w:noProof/>
             <w:webHidden/>
           </w:rPr>
-          <w:t>2</w:t>
+          <w:t>3</w:t>
+        </w:r>
+        <w:r>
+          <w:rPr>
+            <w:noProof/>
+            <w:webHidden/>
+          </w:rPr>
+          <w:fldChar w:fldCharType="end"/>
+        </w:r>
+      </w:hyperlink>
+    </w:p>
+    <w:p>
+      <w:pPr>
+        <w:pStyle w:val="TOC2"/>
+        <w:tabs>
+          <w:tab w:val="right" w:leader="dot" w:pos="9350"/>
+        </w:tabs>
+        <w:rPr>
+          <w:noProof/>
+        </w:rPr>
+      </w:pPr>
+      <w:hyperlink w:anchor="_Toc237099576" w:history="1">
+        <w:r>
+          <w:rPr>
+            <w:rStyle w:val="Hyperlink"/>
+            <w:noProof/>
+          </w:rPr>
+          <w:t>4.2 Development catalog</w:t>
+        </w:r>
+        <w:r>
+          <w:rPr>
+            <w:noProof/>
+            <w:webHidden/>
+          </w:rPr>
+          <w:tab/>
+        </w:r>
+        <w:r>
+          <w:rPr>
+            <w:noProof/>
+            <w:webHidden/>
+          </w:rPr>
+          <w:fldChar w:fldCharType="begin"/>
+        </w:r>
+        <w:r>
+          <w:rPr>
+            <w:noProof/>
+            <w:webHidden/>
+          </w:rPr>
+          <w:instrText xml:space="preserve"> PAGEREF _Toc237099576 \h </w:instrText>
+        </w:r>
+        <w:r>
+          <w:rPr>
+            <w:noProof/>
+            <w:webHidden/>
+          </w:rPr>
+        </w:r>
+        <w:r>
+          <w:rPr>
+            <w:noProof/>
+            <w:webHidden/>
+          </w:rPr>
+          <w:fldChar w:fldCharType="separate"/>
+        </w:r>
+        <w:r>
+          <w:rPr>
+            <w:noProof/>
+            <w:webHidden/>
+          </w:rPr>
+          <w:t>3</w:t>
+        </w:r>
+        <w:r>
+          <w:rPr>
+            <w:noProof/>
+            <w:webHidden/>
+          </w:rPr>
+          <w:fldChar w:fldCharType="end"/>
+        </w:r>
+      </w:hyperlink>
+    </w:p>
+    <w:p>
+      <w:pPr>
+        <w:pStyle w:val="TOC2"/>
+        <w:tabs>
+          <w:tab w:val="right" w:leader="dot" w:pos="9350"/>
+        </w:tabs>
+        <w:rPr>
+          <w:noProof/>
+        </w:rPr>
+      </w:pPr>
+      <w:hyperlink w:anchor="_Toc237099577" w:history="1">
+        <w:r>
+          <w:rPr>
+            <w:rStyle w:val="Hyperlink"/>
+            <w:noProof/>
+          </w:rPr>
+          <w:t>4.3 Runtime pack</w:t>
+        </w:r>
+        <w:r>
+          <w:rPr>
+            <w:noProof/>
+            <w:webHidden/>
+          </w:rPr>
+          <w:tab/>
+        </w:r>
+        <w:r>
+          <w:rPr>
+            <w:noProof/>
+            <w:webHidden/>
+          </w:rPr>
+          <w:fldChar w:fldCharType="begin"/>
+        </w:r>
+        <w:r>
+          <w:rPr>
+            <w:noProof/>
+            <w:webHidden/>
+          </w:rPr>
+          <w:instrText xml:space="preserve"> PAGEREF _Toc237099577 \h </w:instrText>
+        </w:r>
+        <w:r>
+          <w:rPr>
+            <w:noProof/>
+            <w:webHidden/>
+          </w:rPr>
+        </w:r>
+        <w:r>
+          <w:rPr>
+            <w:noProof/>
+            <w:webHidden/>
+          </w:rPr>
+          <w:fldChar w:fldCharType="separate"/>
+        </w:r>
+        <w:r>
+          <w:rPr>
+            <w:noProof/>
+            <w:webHidden/>
+          </w:rPr>
+          <w:t>4</w:t>
         </w:r>
         <w:r>
           <w:rPr>
@@ -447,13 +717,13 @@
           <w:noProof/>
         </w:rPr>
       </w:pPr>
-      <w:hyperlink w:anchor="_Toc237032160" w:history="1">
+      <w:hyperlink w:anchor="_Toc237099578" w:history="1">
         <w:r>
           <w:rPr>
             <w:rStyle w:val="Hyperlink"/>
             <w:noProof/>
           </w:rPr>
-          <w:t>3. System Architecture</w:t>
+          <w:t>5. Project Detection and Scanning</w:t>
         </w:r>
         <w:r>
           <w:rPr>
@@ -474,7 +744,7 @@
             <w:noProof/>
             <w:webHidden/>
           </w:rPr>
-          <w:instrText xml:space="preserve"> PAGEREF _Toc237032160 \h </w:instrText>
+          <w:instrText xml:space="preserve"> PAGEREF _Toc237099578 \h </w:instrText>
         </w:r>
         <w:r>
           <w:rPr>
@@ -494,7 +764,75 @@
             <w:noProof/>
             <w:webHidden/>
           </w:rPr>
-          <w:t>2</w:t>
+          <w:t>4</w:t>
+        </w:r>
+        <w:r>
+          <w:rPr>
+            <w:noProof/>
+            <w:webHidden/>
+          </w:rPr>
+          <w:fldChar w:fldCharType="end"/>
+        </w:r>
+      </w:hyperlink>
+    </w:p>
+    <w:p>
+      <w:pPr>
+        <w:pStyle w:val="TOC2"/>
+        <w:tabs>
+          <w:tab w:val="right" w:leader="dot" w:pos="9350"/>
+        </w:tabs>
+        <w:rPr>
+          <w:noProof/>
+        </w:rPr>
+      </w:pPr>
+      <w:hyperlink w:anchor="_Toc237099579" w:history="1">
+        <w:r>
+          <w:rPr>
+            <w:rStyle w:val="Hyperlink"/>
+            <w:noProof/>
+          </w:rPr>
+          <w:t>5.1 Incremental merge</w:t>
+        </w:r>
+        <w:r>
+          <w:rPr>
+            <w:noProof/>
+            <w:webHidden/>
+          </w:rPr>
+          <w:tab/>
+        </w:r>
+        <w:r>
+          <w:rPr>
+            <w:noProof/>
+            <w:webHidden/>
+          </w:rPr>
+          <w:fldChar w:fldCharType="begin"/>
+        </w:r>
+        <w:r>
+          <w:rPr>
+            <w:noProof/>
+            <w:webHidden/>
+          </w:rPr>
+          <w:instrText xml:space="preserve"> PAGEREF _Toc237099579 \h </w:instrText>
+        </w:r>
+        <w:r>
+          <w:rPr>
+            <w:noProof/>
+            <w:webHidden/>
+          </w:rPr>
+        </w:r>
+        <w:r>
+          <w:rPr>
+            <w:noProof/>
+            <w:webHidden/>
+          </w:rPr>
+          <w:fldChar w:fldCharType="separate"/>
+        </w:r>
+        <w:r>
+          <w:rPr>
+            <w:noProof/>
+            <w:webHidden/>
+          </w:rPr>
+          <w:t>4</w:t>
         </w:r>
         <w:r>
           <w:rPr>
@@ -515,13 +853,13 @@
           <w:noProof/>
         </w:rPr>
       </w:pPr>
-      <w:hyperlink w:anchor="_Toc237032161" w:history="1">
+      <w:hyperlink w:anchor="_Toc237099580" w:history="1">
         <w:r>
           <w:rPr>
             <w:rStyle w:val="Hyperlink"/>
             <w:noProof/>
           </w:rPr>
-          <w:t>4. Core Data Model and JSON</w:t>
+          <w:t>6. Studio UI and Workflow State</w:t>
         </w:r>
         <w:r>
           <w:rPr>
@@ -542,7 +880,7 @@
             <w:noProof/>
             <w:webHidden/>
           </w:rPr>
-          <w:instrText xml:space="preserve"> PAGEREF _Toc237032161 \h </w:instrText>
+          <w:instrText xml:space="preserve"> PAGEREF _Toc237099580 \h </w:instrText>
         </w:r>
         <w:r>
           <w:rPr>
@@ -562,7 +900,143 @@
             <w:noProof/>
             <w:webHidden/>
           </w:rPr>
-          <w:t>3</w:t>
+          <w:t>4</w:t>
+        </w:r>
+        <w:r>
+          <w:rPr>
+            <w:noProof/>
+            <w:webHidden/>
+          </w:rPr>
+          <w:fldChar w:fldCharType="end"/>
+        </w:r>
+      </w:hyperlink>
+    </w:p>
+    <w:p>
+      <w:pPr>
+        <w:pStyle w:val="TOC1"/>
+        <w:tabs>
+          <w:tab w:val="right" w:leader="dot" w:pos="9350"/>
+        </w:tabs>
+        <w:rPr>
+          <w:noProof/>
+        </w:rPr>
+      </w:pPr>
+      <w:hyperlink w:anchor="_Toc237099581" w:history="1">
+        <w:r>
+          <w:rPr>
+            <w:rStyle w:val="Hyperlink"/>
+            <w:noProof/>
+          </w:rPr>
+          <w:t>7. Provider Settings and Secret Storage</w:t>
+        </w:r>
+        <w:r>
+          <w:rPr>
+            <w:noProof/>
+            <w:webHidden/>
+          </w:rPr>
+          <w:tab/>
+        </w:r>
+        <w:r>
+          <w:rPr>
+            <w:noProof/>
+            <w:webHidden/>
+          </w:rPr>
+          <w:fldChar w:fldCharType="begin"/>
+        </w:r>
+        <w:r>
+          <w:rPr>
+            <w:noProof/>
+            <w:webHidden/>
+          </w:rPr>
+          <w:instrText xml:space="preserve"> PAGEREF _Toc237099581 \h </w:instrText>
+        </w:r>
+        <w:r>
+          <w:rPr>
+            <w:noProof/>
+            <w:webHidden/>
+          </w:rPr>
+        </w:r>
+        <w:r>
+          <w:rPr>
+            <w:noProof/>
+            <w:webHidden/>
+          </w:rPr>
+          <w:fldChar w:fldCharType="separate"/>
+        </w:r>
+        <w:r>
+          <w:rPr>
+            <w:noProof/>
+            <w:webHidden/>
+          </w:rPr>
+          <w:t>5</w:t>
+        </w:r>
+        <w:r>
+          <w:rPr>
+            <w:noProof/>
+            <w:webHidden/>
+          </w:rPr>
+          <w:fldChar w:fldCharType="end"/>
+        </w:r>
+      </w:hyperlink>
+    </w:p>
+    <w:p>
+      <w:pPr>
+        <w:pStyle w:val="TOC1"/>
+        <w:tabs>
+          <w:tab w:val="right" w:leader="dot" w:pos="9350"/>
+        </w:tabs>
+        <w:rPr>
+          <w:noProof/>
+        </w:rPr>
+      </w:pPr>
+      <w:hyperlink w:anchor="_Toc237099582" w:history="1">
+        <w:r>
+          <w:rPr>
+            <w:rStyle w:val="Hyperlink"/>
+            <w:noProof/>
+          </w:rPr>
+          <w:t>8. Provider HTTP Clients</w:t>
+        </w:r>
+        <w:r>
+          <w:rPr>
+            <w:noProof/>
+            <w:webHidden/>
+          </w:rPr>
+          <w:tab/>
+        </w:r>
+        <w:r>
+          <w:rPr>
+            <w:noProof/>
+            <w:webHidden/>
+          </w:rPr>
+          <w:fldChar w:fldCharType="begin"/>
+        </w:r>
+        <w:r>
+          <w:rPr>
+            <w:noProof/>
+            <w:webHidden/>
+          </w:rPr>
+          <w:instrText xml:space="preserve"> PAGEREF _Toc237099582 \h </w:instrText>
+        </w:r>
+        <w:r>
+          <w:rPr>
+            <w:noProof/>
+            <w:webHidden/>
+          </w:rPr>
+        </w:r>
+        <w:r>
+          <w:rPr>
+            <w:noProof/>
+            <w:webHidden/>
+          </w:rPr>
+          <w:fldChar w:fldCharType="separate"/>
+        </w:r>
+        <w:r>
+          <w:rPr>
+            <w:noProof/>
+            <w:webHidden/>
+          </w:rPr>
+          <w:t>6</w:t>
         </w:r>
         <w:r>
           <w:rPr>
@@ -583,13 +1057,13 @@
           <w:noProof/>
         </w:rPr>
       </w:pPr>
-      <w:hyperlink w:anchor="_Toc237032162" w:history="1">
+      <w:hyperlink w:anchor="_Toc237099583" w:history="1">
         <w:r>
           <w:rPr>
             <w:rStyle w:val="Hyperlink"/>
             <w:noProof/>
           </w:rPr>
-          <w:t>4.1 Stable keys</w:t>
+          <w:t>8.1 Reliability and cancellation</w:t>
         </w:r>
         <w:r>
           <w:rPr>
@@ -610,7 +1084,7 @@
             <w:noProof/>
             <w:webHidden/>
           </w:rPr>
-          <w:instrText xml:space="preserve"> PAGEREF _Toc237032162 \h </w:instrText>
+          <w:instrText xml:space="preserve"> PAGEREF _Toc237099583 \h </w:instrText>
         </w:r>
         <w:r>
           <w:rPr>
@@ -630,7 +1104,7 @@
             <w:noProof/>
             <w:webHidden/>
           </w:rPr>
-          <w:t>3</w:t>
+          <w:t>6</w:t>
         </w:r>
         <w:r>
           <w:rPr>
@@ -651,13 +1125,13 @@
           <w:noProof/>
         </w:rPr>
       </w:pPr>
-      <w:hyperlink w:anchor="_Toc237032163" w:history="1">
+      <w:hyperlink w:anchor="_Toc237099584" w:history="1">
         <w:r>
           <w:rPr>
             <w:rStyle w:val="Hyperlink"/>
             <w:noProof/>
           </w:rPr>
-          <w:t>4.2 Development catalog</w:t>
+          <w:t>8.2 Official protocol references</w:t>
         </w:r>
         <w:r>
           <w:rPr>
@@ -678,7 +1152,7 @@
             <w:noProof/>
             <w:webHidden/>
           </w:rPr>
-          <w:instrText xml:space="preserve"> PAGEREF _Toc237032163 \h </w:instrText>
+          <w:instrText xml:space="preserve"> PAGEREF _Toc237099584 \h </w:instrText>
         </w:r>
         <w:r>
           <w:rPr>
@@ -698,7 +1172,211 @@
             <w:noProof/>
             <w:webHidden/>
           </w:rPr>
-          <w:t>3</w:t>
+          <w:t>6</w:t>
+        </w:r>
+        <w:r>
+          <w:rPr>
+            <w:noProof/>
+            <w:webHidden/>
+          </w:rPr>
+          <w:fldChar w:fldCharType="end"/>
+        </w:r>
+      </w:hyperlink>
+    </w:p>
+    <w:p>
+      <w:pPr>
+        <w:pStyle w:val="TOC1"/>
+        <w:tabs>
+          <w:tab w:val="right" w:leader="dot" w:pos="9350"/>
+        </w:tabs>
+        <w:rPr>
+          <w:noProof/>
+        </w:rPr>
+      </w:pPr>
+      <w:hyperlink w:anchor="_Toc237099585" w:history="1">
+        <w:r>
+          <w:rPr>
+            <w:rStyle w:val="Hyperlink"/>
+            <w:noProof/>
+          </w:rPr>
+          <w:t>9. Automatic Provider Translation and Review</w:t>
+        </w:r>
+        <w:r>
+          <w:rPr>
+            <w:noProof/>
+            <w:webHidden/>
+          </w:rPr>
+          <w:tab/>
+        </w:r>
+        <w:r>
+          <w:rPr>
+            <w:noProof/>
+            <w:webHidden/>
+          </w:rPr>
+          <w:fldChar w:fldCharType="begin"/>
+        </w:r>
+        <w:r>
+          <w:rPr>
+            <w:noProof/>
+            <w:webHidden/>
+          </w:rPr>
+          <w:instrText xml:space="preserve"> PAGEREF _Toc237099585 \h </w:instrText>
+        </w:r>
+        <w:r>
+          <w:rPr>
+            <w:noProof/>
+            <w:webHidden/>
+          </w:rPr>
+        </w:r>
+        <w:r>
+          <w:rPr>
+            <w:noProof/>
+            <w:webHidden/>
+          </w:rPr>
+          <w:fldChar w:fldCharType="separate"/>
+        </w:r>
+        <w:r>
+          <w:rPr>
+            <w:noProof/>
+            <w:webHidden/>
+          </w:rPr>
+          <w:t>7</w:t>
+        </w:r>
+        <w:r>
+          <w:rPr>
+            <w:noProof/>
+            <w:webHidden/>
+          </w:rPr>
+          <w:fldChar w:fldCharType="end"/>
+        </w:r>
+      </w:hyperlink>
+    </w:p>
+    <w:p>
+      <w:pPr>
+        <w:pStyle w:val="TOC1"/>
+        <w:tabs>
+          <w:tab w:val="right" w:leader="dot" w:pos="9350"/>
+        </w:tabs>
+        <w:rPr>
+          <w:noProof/>
+        </w:rPr>
+      </w:pPr>
+      <w:hyperlink w:anchor="_Toc237099586" w:history="1">
+        <w:r>
+          <w:rPr>
+            <w:rStyle w:val="Hyperlink"/>
+            <w:noProof/>
+          </w:rPr>
+          <w:t>10. Validation and Runtime Pack Export</w:t>
+        </w:r>
+        <w:r>
+          <w:rPr>
+            <w:noProof/>
+            <w:webHidden/>
+          </w:rPr>
+          <w:tab/>
+        </w:r>
+        <w:r>
+          <w:rPr>
+            <w:noProof/>
+            <w:webHidden/>
+          </w:rPr>
+          <w:fldChar w:fldCharType="begin"/>
+        </w:r>
+        <w:r>
+          <w:rPr>
+            <w:noProof/>
+            <w:webHidden/>
+          </w:rPr>
+          <w:instrText xml:space="preserve"> PAGEREF _Toc237099586 \h </w:instrText>
+        </w:r>
+        <w:r>
+          <w:rPr>
+            <w:noProof/>
+            <w:webHidden/>
+          </w:rPr>
+        </w:r>
+        <w:r>
+          <w:rPr>
+            <w:noProof/>
+            <w:webHidden/>
+          </w:rPr>
+          <w:fldChar w:fldCharType="separate"/>
+        </w:r>
+        <w:r>
+          <w:rPr>
+            <w:noProof/>
+            <w:webHidden/>
+          </w:rPr>
+          <w:t>7</w:t>
+        </w:r>
+        <w:r>
+          <w:rPr>
+            <w:noProof/>
+            <w:webHidden/>
+          </w:rPr>
+          <w:fldChar w:fldCharType="end"/>
+        </w:r>
+      </w:hyperlink>
+    </w:p>
+    <w:p>
+      <w:pPr>
+        <w:pStyle w:val="TOC1"/>
+        <w:tabs>
+          <w:tab w:val="right" w:leader="dot" w:pos="9350"/>
+        </w:tabs>
+        <w:rPr>
+          <w:noProof/>
+        </w:rPr>
+      </w:pPr>
+      <w:hyperlink w:anchor="_Toc237099587" w:history="1">
+        <w:r>
+          <w:rPr>
+            <w:rStyle w:val="Hyperlink"/>
+            <w:noProof/>
+          </w:rPr>
+          <w:t>11. Runtime Engine</w:t>
+        </w:r>
+        <w:r>
+          <w:rPr>
+            <w:noProof/>
+            <w:webHidden/>
+          </w:rPr>
+          <w:tab/>
+        </w:r>
+        <w:r>
+          <w:rPr>
+            <w:noProof/>
+            <w:webHidden/>
+          </w:rPr>
+          <w:fldChar w:fldCharType="begin"/>
+        </w:r>
+        <w:r>
+          <w:rPr>
+            <w:noProof/>
+            <w:webHidden/>
+          </w:rPr>
+          <w:instrText xml:space="preserve"> PAGEREF _Toc237099587 \h </w:instrText>
+        </w:r>
+        <w:r>
+          <w:rPr>
+            <w:noProof/>
+            <w:webHidden/>
+          </w:rPr>
+        </w:r>
+        <w:r>
+          <w:rPr>
+            <w:noProof/>
+            <w:webHidden/>
+          </w:rPr>
+          <w:fldChar w:fldCharType="separate"/>
+        </w:r>
+        <w:r>
+          <w:rPr>
+            <w:noProof/>
+            <w:webHidden/>
+          </w:rPr>
+          <w:t>8</w:t>
         </w:r>
         <w:r>
           <w:rPr>
@@ -719,13 +1397,13 @@
           <w:noProof/>
         </w:rPr>
       </w:pPr>
-      <w:hyperlink w:anchor="_Toc237032164" w:history="1">
+      <w:hyperlink w:anchor="_Toc237099588" w:history="1">
         <w:r>
           <w:rPr>
             <w:rStyle w:val="Hyperlink"/>
             <w:noProof/>
           </w:rPr>
-          <w:t>4.3 Runtime pack</w:t>
+          <w:t>11.1 Component manager core</w:t>
         </w:r>
         <w:r>
           <w:rPr>
@@ -746,7 +1424,7 @@
             <w:noProof/>
             <w:webHidden/>
           </w:rPr>
-          <w:instrText xml:space="preserve"> PAGEREF _Toc237032164 \h </w:instrText>
+          <w:instrText xml:space="preserve"> PAGEREF _Toc237099588 \h </w:instrText>
         </w:r>
         <w:r>
           <w:rPr>
@@ -766,7 +1444,143 @@
             <w:noProof/>
             <w:webHidden/>
           </w:rPr>
-          <w:t>3</w:t>
+          <w:t>8</w:t>
+        </w:r>
+        <w:r>
+          <w:rPr>
+            <w:noProof/>
+            <w:webHidden/>
+          </w:rPr>
+          <w:fldChar w:fldCharType="end"/>
+        </w:r>
+      </w:hyperlink>
+    </w:p>
+    <w:p>
+      <w:pPr>
+        <w:pStyle w:val="TOC2"/>
+        <w:tabs>
+          <w:tab w:val="right" w:leader="dot" w:pos="9350"/>
+        </w:tabs>
+        <w:rPr>
+          <w:noProof/>
+        </w:rPr>
+      </w:pPr>
+      <w:hyperlink w:anchor="_Toc237099589" w:history="1">
+        <w:r>
+          <w:rPr>
+            <w:rStyle w:val="Hyperlink"/>
+            <w:noProof/>
+          </w:rPr>
+          <w:t>11.2 Optional selectors</w:t>
+        </w:r>
+        <w:r>
+          <w:rPr>
+            <w:noProof/>
+            <w:webHidden/>
+          </w:rPr>
+          <w:tab/>
+        </w:r>
+        <w:r>
+          <w:rPr>
+            <w:noProof/>
+            <w:webHidden/>
+          </w:rPr>
+          <w:fldChar w:fldCharType="begin"/>
+        </w:r>
+        <w:r>
+          <w:rPr>
+            <w:noProof/>
+            <w:webHidden/>
+          </w:rPr>
+          <w:instrText xml:space="preserve"> PAGEREF _Toc237099589 \h </w:instrText>
+        </w:r>
+        <w:r>
+          <w:rPr>
+            <w:noProof/>
+            <w:webHidden/>
+          </w:rPr>
+        </w:r>
+        <w:r>
+          <w:rPr>
+            <w:noProof/>
+            <w:webHidden/>
+          </w:rPr>
+          <w:fldChar w:fldCharType="separate"/>
+        </w:r>
+        <w:r>
+          <w:rPr>
+            <w:noProof/>
+            <w:webHidden/>
+          </w:rPr>
+          <w:t>8</w:t>
+        </w:r>
+        <w:r>
+          <w:rPr>
+            <w:noProof/>
+            <w:webHidden/>
+          </w:rPr>
+          <w:fldChar w:fldCharType="end"/>
+        </w:r>
+      </w:hyperlink>
+    </w:p>
+    <w:p>
+      <w:pPr>
+        <w:pStyle w:val="TOC2"/>
+        <w:tabs>
+          <w:tab w:val="right" w:leader="dot" w:pos="9350"/>
+        </w:tabs>
+        <w:rPr>
+          <w:noProof/>
+        </w:rPr>
+      </w:pPr>
+      <w:hyperlink w:anchor="_Toc237099590" w:history="1">
+        <w:r>
+          <w:rPr>
+            <w:rStyle w:val="Hyperlink"/>
+            <w:noProof/>
+          </w:rPr>
+          <w:t>11.3 Deployment paths</w:t>
+        </w:r>
+        <w:r>
+          <w:rPr>
+            <w:noProof/>
+            <w:webHidden/>
+          </w:rPr>
+          <w:tab/>
+        </w:r>
+        <w:r>
+          <w:rPr>
+            <w:noProof/>
+            <w:webHidden/>
+          </w:rPr>
+          <w:fldChar w:fldCharType="begin"/>
+        </w:r>
+        <w:r>
+          <w:rPr>
+            <w:noProof/>
+            <w:webHidden/>
+          </w:rPr>
+          <w:instrText xml:space="preserve"> PAGEREF _Toc237099590 \h </w:instrText>
+        </w:r>
+        <w:r>
+          <w:rPr>
+            <w:noProof/>
+            <w:webHidden/>
+          </w:rPr>
+        </w:r>
+        <w:r>
+          <w:rPr>
+            <w:noProof/>
+            <w:webHidden/>
+          </w:rPr>
+          <w:fldChar w:fldCharType="separate"/>
+        </w:r>
+        <w:r>
+          <w:rPr>
+            <w:noProof/>
+            <w:webHidden/>
+          </w:rPr>
+          <w:t>9</w:t>
         </w:r>
         <w:r>
           <w:rPr>
@@ -787,13 +1601,13 @@
           <w:noProof/>
         </w:rPr>
       </w:pPr>
-      <w:hyperlink w:anchor="_Toc237032165" w:history="1">
+      <w:hyperlink w:anchor="_Toc237099591" w:history="1">
         <w:r>
           <w:rPr>
             <w:rStyle w:val="Hyperlink"/>
             <w:noProof/>
           </w:rPr>
-          <w:t>5. Project Detection and Scanning</w:t>
+          <w:t>12. Component Packages and Integration Modes</w:t>
         </w:r>
         <w:r>
           <w:rPr>
@@ -814,7 +1628,7 @@
             <w:noProof/>
             <w:webHidden/>
           </w:rPr>
-          <w:instrText xml:space="preserve"> PAGEREF _Toc237032165 \h </w:instrText>
+          <w:instrText xml:space="preserve"> PAGEREF _Toc237099591 \h </w:instrText>
         </w:r>
         <w:r>
           <w:rPr>
@@ -834,7 +1648,7 @@
             <w:noProof/>
             <w:webHidden/>
           </w:rPr>
-          <w:t>4</w:t>
+          <w:t>9</w:t>
         </w:r>
         <w:r>
           <w:rPr>
@@ -855,13 +1669,13 @@
           <w:noProof/>
         </w:rPr>
       </w:pPr>
-      <w:hyperlink w:anchor="_Toc237032166" w:history="1">
+      <w:hyperlink w:anchor="_Toc237099592" w:history="1">
         <w:r>
           <w:rPr>
             <w:rStyle w:val="Hyperlink"/>
             <w:noProof/>
           </w:rPr>
-          <w:t>5.1 Incremental merge</w:t>
+          <w:t>12.1 Component startup contract</w:t>
         </w:r>
         <w:r>
           <w:rPr>
@@ -882,7 +1696,7 @@
             <w:noProof/>
             <w:webHidden/>
           </w:rPr>
-          <w:instrText xml:space="preserve"> PAGEREF _Toc237032166 \h </w:instrText>
+          <w:instrText xml:space="preserve"> PAGEREF _Toc237099592 \h </w:instrText>
         </w:r>
         <w:r>
           <w:rPr>
@@ -902,7 +1716,7 @@
             <w:noProof/>
             <w:webHidden/>
           </w:rPr>
-          <w:t>4</w:t>
+          <w:t>9</w:t>
         </w:r>
         <w:r>
           <w:rPr>
@@ -923,13 +1737,13 @@
           <w:noProof/>
         </w:rPr>
       </w:pPr>
-      <w:hyperlink w:anchor="_Toc237032167" w:history="1">
+      <w:hyperlink w:anchor="_Toc237099593" w:history="1">
         <w:r>
           <w:rPr>
             <w:rStyle w:val="Hyperlink"/>
             <w:noProof/>
           </w:rPr>
-          <w:t>6. Studio UI and Workflow State</w:t>
+          <w:t>13. Self-Localization</w:t>
         </w:r>
         <w:r>
           <w:rPr>
@@ -950,7 +1764,7 @@
             <w:noProof/>
             <w:webHidden/>
           </w:rPr>
-          <w:instrText xml:space="preserve"> PAGEREF _Toc237032167 \h </w:instrText>
+          <w:instrText xml:space="preserve"> PAGEREF _Toc237099593 \h </w:instrText>
         </w:r>
         <w:r>
           <w:rPr>
@@ -970,7 +1784,7 @@
             <w:noProof/>
             <w:webHidden/>
           </w:rPr>
-          <w:t>4</w:t>
+          <w:t>10</w:t>
         </w:r>
         <w:r>
           <w:rPr>
@@ -991,13 +1805,13 @@
           <w:noProof/>
         </w:rPr>
       </w:pPr>
-      <w:hyperlink w:anchor="_Toc237032168" w:history="1">
+      <w:hyperlink w:anchor="_Toc237099594" w:history="1">
         <w:r>
           <w:rPr>
             <w:rStyle w:val="Hyperlink"/>
             <w:noProof/>
           </w:rPr>
-          <w:t>7. Provider Settings and Secret Storage</w:t>
+          <w:t>14. Error Handling and Diagnostics</w:t>
         </w:r>
         <w:r>
           <w:rPr>
@@ -1018,7 +1832,7 @@
             <w:noProof/>
             <w:webHidden/>
           </w:rPr>
-          <w:instrText xml:space="preserve"> PAGEREF _Toc237032168 \h </w:instrText>
+          <w:instrText xml:space="preserve"> PAGEREF _Toc237099594 \h </w:instrText>
         </w:r>
         <w:r>
           <w:rPr>
@@ -1038,7 +1852,7 @@
             <w:noProof/>
             <w:webHidden/>
           </w:rPr>
-          <w:t>5</w:t>
+          <w:t>10</w:t>
         </w:r>
         <w:r>
           <w:rPr>
@@ -1059,13 +1873,13 @@
           <w:noProof/>
         </w:rPr>
       </w:pPr>
-      <w:hyperlink w:anchor="_Toc237032169" w:history="1">
+      <w:hyperlink w:anchor="_Toc237099595" w:history="1">
         <w:r>
           <w:rPr>
             <w:rStyle w:val="Hyperlink"/>
             <w:noProof/>
           </w:rPr>
-          <w:t>8. Provider HTTP Clients</w:t>
+          <w:t>15. Test Strategy and Verified Matrix</w:t>
         </w:r>
         <w:r>
           <w:rPr>
@@ -1086,7 +1900,7 @@
             <w:noProof/>
             <w:webHidden/>
           </w:rPr>
-          <w:instrText xml:space="preserve"> PAGEREF _Toc237032169 \h </w:instrText>
+          <w:instrText xml:space="preserve"> PAGEREF _Toc237099595 \h </w:instrText>
         </w:r>
         <w:r>
           <w:rPr>
@@ -1106,7 +1920,7 @@
             <w:noProof/>
             <w:webHidden/>
           </w:rPr>
-          <w:t>5</w:t>
+          <w:t>10</w:t>
         </w:r>
         <w:r>
           <w:rPr>
@@ -1127,13 +1941,13 @@
           <w:noProof/>
         </w:rPr>
       </w:pPr>
-      <w:hyperlink w:anchor="_Toc237032170" w:history="1">
+      <w:hyperlink w:anchor="_Toc237099596" w:history="1">
         <w:r>
           <w:rPr>
             <w:rStyle w:val="Hyperlink"/>
             <w:noProof/>
           </w:rPr>
-          <w:t>8.1 Reliability and cancellation</w:t>
+          <w:t>15.1 Optional live provider testing</w:t>
         </w:r>
         <w:r>
           <w:rPr>
@@ -1154,7 +1968,7 @@
             <w:noProof/>
             <w:webHidden/>
           </w:rPr>
-          <w:instrText xml:space="preserve"> PAGEREF _Toc237032170 \h </w:instrText>
+          <w:instrText xml:space="preserve"> PAGEREF _Toc237099596 \h </w:instrText>
         </w:r>
         <w:r>
           <w:rPr>
@@ -1174,75 +1988,7 @@
             <w:noProof/>
             <w:webHidden/>
           </w:rPr>
-          <w:t>6</w:t>
-        </w:r>
-        <w:r>
-          <w:rPr>
-            <w:noProof/>
-            <w:webHidden/>
-          </w:rPr>
-          <w:fldChar w:fldCharType="end"/>
-        </w:r>
-      </w:hyperlink>
-    </w:p>
-    <w:p>
-      <w:pPr>
-        <w:pStyle w:val="TOC2"/>
-        <w:tabs>
-          <w:tab w:val="right" w:leader="dot" w:pos="9350"/>
-        </w:tabs>
-        <w:rPr>
-          <w:noProof/>
-        </w:rPr>
-      </w:pPr>
-      <w:hyperlink w:anchor="_Toc237032171" w:history="1">
-        <w:r>
-          <w:rPr>
-            <w:rStyle w:val="Hyperlink"/>
-            <w:noProof/>
-          </w:rPr>
-          <w:t>8.2 Official protocol references</w:t>
-        </w:r>
-        <w:r>
-          <w:rPr>
-            <w:noProof/>
-            <w:webHidden/>
-          </w:rPr>
-          <w:tab/>
-        </w:r>
-        <w:r>
-          <w:rPr>
-            <w:noProof/>
-            <w:webHidden/>
-          </w:rPr>
-          <w:fldChar w:fldCharType="begin"/>
-        </w:r>
-        <w:r>
-          <w:rPr>
-            <w:noProof/>
-            <w:webHidden/>
-          </w:rPr>
-          <w:instrText xml:space="preserve"> PAGEREF _Toc237032171 \h </w:instrText>
-        </w:r>
-        <w:r>
-          <w:rPr>
-            <w:noProof/>
-            <w:webHidden/>
-          </w:rPr>
-        </w:r>
-        <w:r>
-          <w:rPr>
-            <w:noProof/>
-            <w:webHidden/>
-          </w:rPr>
-          <w:fldChar w:fldCharType="separate"/>
-        </w:r>
-        <w:r>
-          <w:rPr>
-            <w:noProof/>
-            <w:webHidden/>
-          </w:rPr>
-          <w:t>6</w:t>
+          <w:t>11</w:t>
         </w:r>
         <w:r>
           <w:rPr>
@@ -1263,13 +2009,13 @@
           <w:noProof/>
         </w:rPr>
       </w:pPr>
-      <w:hyperlink w:anchor="_Toc237032172" w:history="1">
+      <w:hyperlink w:anchor="_Toc237099597" w:history="1">
         <w:r>
           <w:rPr>
             <w:rStyle w:val="Hyperlink"/>
             <w:noProof/>
           </w:rPr>
-          <w:t>9. Automatic Provider Translation and Review</w:t>
+          <w:t>16. Security Review</w:t>
         </w:r>
         <w:r>
           <w:rPr>
@@ -1290,7 +2036,7 @@
             <w:noProof/>
             <w:webHidden/>
           </w:rPr>
-          <w:instrText xml:space="preserve"> PAGEREF _Toc237032172 \h </w:instrText>
+          <w:instrText xml:space="preserve"> PAGEREF _Toc237099597 \h </w:instrText>
         </w:r>
         <w:r>
           <w:rPr>
@@ -1310,7 +2056,7 @@
             <w:noProof/>
             <w:webHidden/>
           </w:rPr>
-          <w:t>6</w:t>
+          <w:t>12</w:t>
         </w:r>
         <w:r>
           <w:rPr>
@@ -1331,13 +2077,13 @@
           <w:noProof/>
         </w:rPr>
       </w:pPr>
-      <w:hyperlink w:anchor="_Toc237032173" w:history="1">
+      <w:hyperlink w:anchor="_Toc237099598" w:history="1">
         <w:r>
           <w:rPr>
             <w:rStyle w:val="Hyperlink"/>
             <w:noProof/>
           </w:rPr>
-          <w:t>10. Validation and Runtime Pack Export</w:t>
+          <w:t>17. Release and Contribution Workflow</w:t>
         </w:r>
         <w:r>
           <w:rPr>
@@ -1358,7 +2104,7 @@
             <w:noProof/>
             <w:webHidden/>
           </w:rPr>
-          <w:instrText xml:space="preserve"> PAGEREF _Toc237032173 \h </w:instrText>
+          <w:instrText xml:space="preserve"> PAGEREF _Toc237099598 \h </w:instrText>
         </w:r>
         <w:r>
           <w:rPr>
@@ -1378,7 +2124,7 @@
             <w:noProof/>
             <w:webHidden/>
           </w:rPr>
-          <w:t>7</w:t>
+          <w:t>12</w:t>
         </w:r>
         <w:r>
           <w:rPr>
@@ -1399,13 +2145,13 @@
           <w:noProof/>
         </w:rPr>
       </w:pPr>
-      <w:hyperlink w:anchor="_Toc237032174" w:history="1">
+      <w:hyperlink w:anchor="_Toc237099599" w:history="1">
         <w:r>
           <w:rPr>
             <w:rStyle w:val="Hyperlink"/>
             <w:noProof/>
           </w:rPr>
-          <w:t>11. Runtime Engine</w:t>
+          <w:t>18. Known Boundaries and Future-Compatible Design</w:t>
         </w:r>
         <w:r>
           <w:rPr>
@@ -1426,7 +2172,7 @@
             <w:noProof/>
             <w:webHidden/>
           </w:rPr>
-          <w:instrText xml:space="preserve"> PAGEREF _Toc237032174 \h </w:instrText>
+          <w:instrText xml:space="preserve"> PAGEREF _Toc237099599 \h </w:instrText>
         </w:r>
         <w:r>
           <w:rPr>
@@ -1446,75 +2192,7 @@
             <w:noProof/>
             <w:webHidden/>
           </w:rPr>
-          <w:t>7</w:t>
-        </w:r>
-        <w:r>
-          <w:rPr>
-            <w:noProof/>
-            <w:webHidden/>
-          </w:rPr>
-          <w:fldChar w:fldCharType="end"/>
-        </w:r>
-      </w:hyperlink>
-    </w:p>
-    <w:p>
-      <w:pPr>
-        <w:pStyle w:val="TOC2"/>
-        <w:tabs>
-          <w:tab w:val="right" w:leader="dot" w:pos="9350"/>
-        </w:tabs>
-        <w:rPr>
-          <w:noProof/>
-        </w:rPr>
-      </w:pPr>
-      <w:hyperlink w:anchor="_Toc237032175" w:history="1">
-        <w:r>
-          <w:rPr>
-            <w:rStyle w:val="Hyperlink"/>
-            <w:noProof/>
-          </w:rPr>
-          <w:t>11.1 Deployment paths</w:t>
-        </w:r>
-        <w:r>
-          <w:rPr>
-            <w:noProof/>
-            <w:webHidden/>
-          </w:rPr>
-          <w:tab/>
-        </w:r>
-        <w:r>
-          <w:rPr>
-            <w:noProof/>
-            <w:webHidden/>
-          </w:rPr>
-          <w:fldChar w:fldCharType="begin"/>
-        </w:r>
-        <w:r>
-          <w:rPr>
-            <w:noProof/>
-            <w:webHidden/>
-          </w:rPr>
-          <w:instrText xml:space="preserve"> PAGEREF _Toc237032175 \h </w:instrText>
-        </w:r>
-        <w:r>
-          <w:rPr>
-            <w:noProof/>
-            <w:webHidden/>
-          </w:rPr>
-        </w:r>
-        <w:r>
-          <w:rPr>
-            <w:noProof/>
-            <w:webHidden/>
-          </w:rPr>
-          <w:fldChar w:fldCharType="separate"/>
-        </w:r>
-        <w:r>
-          <w:rPr>
-            <w:noProof/>
-            <w:webHidden/>
-          </w:rPr>
-          <w:t>8</w:t>
+          <w:t>13</w:t>
         </w:r>
         <w:r>
           <w:rPr>
@@ -1535,13 +2213,13 @@
           <w:noProof/>
         </w:rPr>
       </w:pPr>
-      <w:hyperlink w:anchor="_Toc237032176" w:history="1">
+      <w:hyperlink w:anchor="_Toc237099600" w:history="1">
         <w:r>
           <w:rPr>
             <w:rStyle w:val="Hyperlink"/>
             <w:noProof/>
           </w:rPr>
-          <w:t>12. Integration Planning and Transactions</w:t>
+          <w:t>19. Documentation Generation</w:t>
         </w:r>
         <w:r>
           <w:rPr>
@@ -1562,7 +2240,7 @@
             <w:noProof/>
             <w:webHidden/>
           </w:rPr>
-          <w:instrText xml:space="preserve"> PAGEREF _Toc237032176 \h </w:instrText>
+          <w:instrText xml:space="preserve"> PAGEREF _Toc237099600 \h </w:instrText>
         </w:r>
         <w:r>
           <w:rPr>
@@ -1582,75 +2260,7 @@
             <w:noProof/>
             <w:webHidden/>
           </w:rPr>
-          <w:t>8</w:t>
-        </w:r>
-        <w:r>
-          <w:rPr>
-            <w:noProof/>
-            <w:webHidden/>
-          </w:rPr>
-          <w:fldChar w:fldCharType="end"/>
-        </w:r>
-      </w:hyperlink>
-    </w:p>
-    <w:p>
-      <w:pPr>
-        <w:pStyle w:val="TOC2"/>
-        <w:tabs>
-          <w:tab w:val="right" w:leader="dot" w:pos="9350"/>
-        </w:tabs>
-        <w:rPr>
-          <w:noProof/>
-        </w:rPr>
-      </w:pPr>
-      <w:hyperlink w:anchor="_Toc237032177" w:history="1">
-        <w:r>
-          <w:rPr>
-            <w:rStyle w:val="Hyperlink"/>
-            <w:noProof/>
-          </w:rPr>
-          <w:t>12.1 Generated startup contract</w:t>
-        </w:r>
-        <w:r>
-          <w:rPr>
-            <w:noProof/>
-            <w:webHidden/>
-          </w:rPr>
-          <w:tab/>
-        </w:r>
-        <w:r>
-          <w:rPr>
-            <w:noProof/>
-            <w:webHidden/>
-          </w:rPr>
-          <w:fldChar w:fldCharType="begin"/>
-        </w:r>
-        <w:r>
-          <w:rPr>
-            <w:noProof/>
-            <w:webHidden/>
-          </w:rPr>
-          <w:instrText xml:space="preserve"> PAGEREF _Toc237032177 \h </w:instrText>
-        </w:r>
-        <w:r>
-          <w:rPr>
-            <w:noProof/>
-            <w:webHidden/>
-          </w:rPr>
-        </w:r>
-        <w:r>
-          <w:rPr>
-            <w:noProof/>
-            <w:webHidden/>
-          </w:rPr>
-          <w:fldChar w:fldCharType="separate"/>
-        </w:r>
-        <w:r>
-          <w:rPr>
-            <w:noProof/>
-            <w:webHidden/>
-          </w:rPr>
-          <w:t>8</w:t>
+          <w:t>13</w:t>
         </w:r>
         <w:r>
           <w:rPr>
@@ -1671,13 +2281,13 @@
           <w:noProof/>
         </w:rPr>
       </w:pPr>
-      <w:hyperlink w:anchor="_Toc237032178" w:history="1">
+      <w:hyperlink w:anchor="_Toc237099601" w:history="1">
         <w:r>
           <w:rPr>
             <w:rStyle w:val="Hyperlink"/>
             <w:noProof/>
           </w:rPr>
-          <w:t>13. Self-Localization</w:t>
+          <w:t>20. Source References</w:t>
         </w:r>
         <w:r>
           <w:rPr>
@@ -1698,7 +2308,7 @@
             <w:noProof/>
             <w:webHidden/>
           </w:rPr>
-          <w:instrText xml:space="preserve"> PAGEREF _Toc237032178 \h </w:instrText>
+          <w:instrText xml:space="preserve"> PAGEREF _Toc237099601 \h </w:instrText>
         </w:r>
         <w:r>
           <w:rPr>
@@ -1718,551 +2328,7 @@
             <w:noProof/>
             <w:webHidden/>
           </w:rPr>
-          <w:t>9</w:t>
-        </w:r>
-        <w:r>
-          <w:rPr>
-            <w:noProof/>
-            <w:webHidden/>
-          </w:rPr>
-          <w:fldChar w:fldCharType="end"/>
-        </w:r>
-      </w:hyperlink>
-    </w:p>
-    <w:p>
-      <w:pPr>
-        <w:pStyle w:val="TOC1"/>
-        <w:tabs>
-          <w:tab w:val="right" w:leader="dot" w:pos="9350"/>
-        </w:tabs>
-        <w:rPr>
-          <w:noProof/>
-        </w:rPr>
-      </w:pPr>
-      <w:hyperlink w:anchor="_Toc237032179" w:history="1">
-        <w:r>
-          <w:rPr>
-            <w:rStyle w:val="Hyperlink"/>
-            <w:noProof/>
-          </w:rPr>
-          <w:t>14. Error Handling and Diagnostics</w:t>
-        </w:r>
-        <w:r>
-          <w:rPr>
-            <w:noProof/>
-            <w:webHidden/>
-          </w:rPr>
-          <w:tab/>
-        </w:r>
-        <w:r>
-          <w:rPr>
-            <w:noProof/>
-            <w:webHidden/>
-          </w:rPr>
-          <w:fldChar w:fldCharType="begin"/>
-        </w:r>
-        <w:r>
-          <w:rPr>
-            <w:noProof/>
-            <w:webHidden/>
-          </w:rPr>
-          <w:instrText xml:space="preserve"> PAGEREF _Toc237032179 \h </w:instrText>
-        </w:r>
-        <w:r>
-          <w:rPr>
-            <w:noProof/>
-            <w:webHidden/>
-          </w:rPr>
-        </w:r>
-        <w:r>
-          <w:rPr>
-            <w:noProof/>
-            <w:webHidden/>
-          </w:rPr>
-          <w:fldChar w:fldCharType="separate"/>
-        </w:r>
-        <w:r>
-          <w:rPr>
-            <w:noProof/>
-            <w:webHidden/>
-          </w:rPr>
-          <w:t>9</w:t>
-        </w:r>
-        <w:r>
-          <w:rPr>
-            <w:noProof/>
-            <w:webHidden/>
-          </w:rPr>
-          <w:fldChar w:fldCharType="end"/>
-        </w:r>
-      </w:hyperlink>
-    </w:p>
-    <w:p>
-      <w:pPr>
-        <w:pStyle w:val="TOC1"/>
-        <w:tabs>
-          <w:tab w:val="right" w:leader="dot" w:pos="9350"/>
-        </w:tabs>
-        <w:rPr>
-          <w:noProof/>
-        </w:rPr>
-      </w:pPr>
-      <w:hyperlink w:anchor="_Toc237032180" w:history="1">
-        <w:r>
-          <w:rPr>
-            <w:rStyle w:val="Hyperlink"/>
-            <w:noProof/>
-          </w:rPr>
-          <w:t>15. Test Strategy and Verified Matrix</w:t>
-        </w:r>
-        <w:r>
-          <w:rPr>
-            <w:noProof/>
-            <w:webHidden/>
-          </w:rPr>
-          <w:tab/>
-        </w:r>
-        <w:r>
-          <w:rPr>
-            <w:noProof/>
-            <w:webHidden/>
-          </w:rPr>
-          <w:fldChar w:fldCharType="begin"/>
-        </w:r>
-        <w:r>
-          <w:rPr>
-            <w:noProof/>
-            <w:webHidden/>
-          </w:rPr>
-          <w:instrText xml:space="preserve"> PAGEREF _Toc237032180 \h </w:instrText>
-        </w:r>
-        <w:r>
-          <w:rPr>
-            <w:noProof/>
-            <w:webHidden/>
-          </w:rPr>
-        </w:r>
-        <w:r>
-          <w:rPr>
-            <w:noProof/>
-            <w:webHidden/>
-          </w:rPr>
-          <w:fldChar w:fldCharType="separate"/>
-        </w:r>
-        <w:r>
-          <w:rPr>
-            <w:noProof/>
-            <w:webHidden/>
-          </w:rPr>
-          <w:t>9</w:t>
-        </w:r>
-        <w:r>
-          <w:rPr>
-            <w:noProof/>
-            <w:webHidden/>
-          </w:rPr>
-          <w:fldChar w:fldCharType="end"/>
-        </w:r>
-      </w:hyperlink>
-    </w:p>
-    <w:p>
-      <w:pPr>
-        <w:pStyle w:val="TOC2"/>
-        <w:tabs>
-          <w:tab w:val="right" w:leader="dot" w:pos="9350"/>
-        </w:tabs>
-        <w:rPr>
-          <w:noProof/>
-        </w:rPr>
-      </w:pPr>
-      <w:hyperlink w:anchor="_Toc237032181" w:history="1">
-        <w:r>
-          <w:rPr>
-            <w:rStyle w:val="Hyperlink"/>
-            <w:noProof/>
-          </w:rPr>
-          <w:t>15.1 Optional live provider testing</w:t>
-        </w:r>
-        <w:r>
-          <w:rPr>
-            <w:noProof/>
-            <w:webHidden/>
-          </w:rPr>
-          <w:tab/>
-        </w:r>
-        <w:r>
-          <w:rPr>
-            <w:noProof/>
-            <w:webHidden/>
-          </w:rPr>
-          <w:fldChar w:fldCharType="begin"/>
-        </w:r>
-        <w:r>
-          <w:rPr>
-            <w:noProof/>
-            <w:webHidden/>
-          </w:rPr>
-          <w:instrText xml:space="preserve"> PAGEREF _Toc237032181 \h </w:instrText>
-        </w:r>
-        <w:r>
-          <w:rPr>
-            <w:noProof/>
-            <w:webHidden/>
-          </w:rPr>
-        </w:r>
-        <w:r>
-          <w:rPr>
-            <w:noProof/>
-            <w:webHidden/>
-          </w:rPr>
-          <w:fldChar w:fldCharType="separate"/>
-        </w:r>
-        <w:r>
-          <w:rPr>
-            <w:noProof/>
-            <w:webHidden/>
-          </w:rPr>
-          <w:t>10</w:t>
-        </w:r>
-        <w:r>
-          <w:rPr>
-            <w:noProof/>
-            <w:webHidden/>
-          </w:rPr>
-          <w:fldChar w:fldCharType="end"/>
-        </w:r>
-      </w:hyperlink>
-    </w:p>
-    <w:p>
-      <w:pPr>
-        <w:pStyle w:val="TOC1"/>
-        <w:tabs>
-          <w:tab w:val="right" w:leader="dot" w:pos="9350"/>
-        </w:tabs>
-        <w:rPr>
-          <w:noProof/>
-        </w:rPr>
-      </w:pPr>
-      <w:hyperlink w:anchor="_Toc237032182" w:history="1">
-        <w:r>
-          <w:rPr>
-            <w:rStyle w:val="Hyperlink"/>
-            <w:noProof/>
-          </w:rPr>
-          <w:t>16. Security Review</w:t>
-        </w:r>
-        <w:r>
-          <w:rPr>
-            <w:noProof/>
-            <w:webHidden/>
-          </w:rPr>
-          <w:tab/>
-        </w:r>
-        <w:r>
-          <w:rPr>
-            <w:noProof/>
-            <w:webHidden/>
-          </w:rPr>
-          <w:fldChar w:fldCharType="begin"/>
-        </w:r>
-        <w:r>
-          <w:rPr>
-            <w:noProof/>
-            <w:webHidden/>
-          </w:rPr>
-          <w:instrText xml:space="preserve"> PAGEREF _Toc237032182 \h </w:instrText>
-        </w:r>
-        <w:r>
-          <w:rPr>
-            <w:noProof/>
-            <w:webHidden/>
-          </w:rPr>
-        </w:r>
-        <w:r>
-          <w:rPr>
-            <w:noProof/>
-            <w:webHidden/>
-          </w:rPr>
-          <w:fldChar w:fldCharType="separate"/>
-        </w:r>
-        <w:r>
-          <w:rPr>
-            <w:noProof/>
-            <w:webHidden/>
-          </w:rPr>
-          <w:t>10</w:t>
-        </w:r>
-        <w:r>
-          <w:rPr>
-            <w:noProof/>
-            <w:webHidden/>
-          </w:rPr>
-          <w:fldChar w:fldCharType="end"/>
-        </w:r>
-      </w:hyperlink>
-    </w:p>
-    <w:p>
-      <w:pPr>
-        <w:pStyle w:val="TOC1"/>
-        <w:tabs>
-          <w:tab w:val="right" w:leader="dot" w:pos="9350"/>
-        </w:tabs>
-        <w:rPr>
-          <w:noProof/>
-        </w:rPr>
-      </w:pPr>
-      <w:hyperlink w:anchor="_Toc237032183" w:history="1">
-        <w:r>
-          <w:rPr>
-            <w:rStyle w:val="Hyperlink"/>
-            <w:noProof/>
-          </w:rPr>
-          <w:t>17. Release and Contribution Workflow</w:t>
-        </w:r>
-        <w:r>
-          <w:rPr>
-            <w:noProof/>
-            <w:webHidden/>
-          </w:rPr>
-          <w:tab/>
-        </w:r>
-        <w:r>
-          <w:rPr>
-            <w:noProof/>
-            <w:webHidden/>
-          </w:rPr>
-          <w:fldChar w:fldCharType="begin"/>
-        </w:r>
-        <w:r>
-          <w:rPr>
-            <w:noProof/>
-            <w:webHidden/>
-          </w:rPr>
-          <w:instrText xml:space="preserve"> PAGEREF _Toc237032183 \h </w:instrText>
-        </w:r>
-        <w:r>
-          <w:rPr>
-            <w:noProof/>
-            <w:webHidden/>
-          </w:rPr>
-        </w:r>
-        <w:r>
-          <w:rPr>
-            <w:noProof/>
-            <w:webHidden/>
-          </w:rPr>
-          <w:fldChar w:fldCharType="separate"/>
-        </w:r>
-        <w:r>
-          <w:rPr>
-            <w:noProof/>
-            <w:webHidden/>
-          </w:rPr>
-          <w:t>11</w:t>
-        </w:r>
-        <w:r>
-          <w:rPr>
-            <w:noProof/>
-            <w:webHidden/>
-          </w:rPr>
-          <w:fldChar w:fldCharType="end"/>
-        </w:r>
-      </w:hyperlink>
-    </w:p>
-    <w:p>
-      <w:pPr>
-        <w:pStyle w:val="TOC1"/>
-        <w:tabs>
-          <w:tab w:val="right" w:leader="dot" w:pos="9350"/>
-        </w:tabs>
-        <w:rPr>
-          <w:noProof/>
-        </w:rPr>
-      </w:pPr>
-      <w:hyperlink w:anchor="_Toc237032184" w:history="1">
-        <w:r>
-          <w:rPr>
-            <w:rStyle w:val="Hyperlink"/>
-            <w:noProof/>
-          </w:rPr>
-          <w:t>18. Known Boundaries and Future-Compatible Design</w:t>
-        </w:r>
-        <w:r>
-          <w:rPr>
-            <w:noProof/>
-            <w:webHidden/>
-          </w:rPr>
-          <w:tab/>
-        </w:r>
-        <w:r>
-          <w:rPr>
-            <w:noProof/>
-            <w:webHidden/>
-          </w:rPr>
-          <w:fldChar w:fldCharType="begin"/>
-        </w:r>
-        <w:r>
-          <w:rPr>
-            <w:noProof/>
-            <w:webHidden/>
-          </w:rPr>
-          <w:instrText xml:space="preserve"> PAGEREF _Toc237032184 \h </w:instrText>
-        </w:r>
-        <w:r>
-          <w:rPr>
-            <w:noProof/>
-            <w:webHidden/>
-          </w:rPr>
-        </w:r>
-        <w:r>
-          <w:rPr>
-            <w:noProof/>
-            <w:webHidden/>
-          </w:rPr>
-          <w:fldChar w:fldCharType="separate"/>
-        </w:r>
-        <w:r>
-          <w:rPr>
-            <w:noProof/>
-            <w:webHidden/>
-          </w:rPr>
-          <w:t>11</w:t>
-        </w:r>
-        <w:r>
-          <w:rPr>
-            <w:noProof/>
-            <w:webHidden/>
-          </w:rPr>
-          <w:fldChar w:fldCharType="end"/>
-        </w:r>
-      </w:hyperlink>
-    </w:p>
-    <w:p>
-      <w:pPr>
-        <w:pStyle w:val="TOC1"/>
-        <w:tabs>
-          <w:tab w:val="right" w:leader="dot" w:pos="9350"/>
-        </w:tabs>
-        <w:rPr>
-          <w:noProof/>
-        </w:rPr>
-      </w:pPr>
-      <w:hyperlink w:anchor="_Toc237032185" w:history="1">
-        <w:r>
-          <w:rPr>
-            <w:rStyle w:val="Hyperlink"/>
-            <w:noProof/>
-          </w:rPr>
-          <w:t>19. Documentation Generation</w:t>
-        </w:r>
-        <w:r>
-          <w:rPr>
-            <w:noProof/>
-            <w:webHidden/>
-          </w:rPr>
-          <w:tab/>
-        </w:r>
-        <w:r>
-          <w:rPr>
-            <w:noProof/>
-            <w:webHidden/>
-          </w:rPr>
-          <w:fldChar w:fldCharType="begin"/>
-        </w:r>
-        <w:r>
-          <w:rPr>
-            <w:noProof/>
-            <w:webHidden/>
-          </w:rPr>
-          <w:instrText xml:space="preserve"> PAGEREF _Toc237032185 \h </w:instrText>
-        </w:r>
-        <w:r>
-          <w:rPr>
-            <w:noProof/>
-            <w:webHidden/>
-          </w:rPr>
-        </w:r>
-        <w:r>
-          <w:rPr>
-            <w:noProof/>
-            <w:webHidden/>
-          </w:rPr>
-          <w:fldChar w:fldCharType="separate"/>
-        </w:r>
-        <w:r>
-          <w:rPr>
-            <w:noProof/>
-            <w:webHidden/>
-          </w:rPr>
-          <w:t>12</w:t>
-        </w:r>
-        <w:r>
-          <w:rPr>
-            <w:noProof/>
-            <w:webHidden/>
-          </w:rPr>
-          <w:fldChar w:fldCharType="end"/>
-        </w:r>
-      </w:hyperlink>
-    </w:p>
-    <w:p>
-      <w:pPr>
-        <w:pStyle w:val="TOC1"/>
-        <w:tabs>
-          <w:tab w:val="right" w:leader="dot" w:pos="9350"/>
-        </w:tabs>
-        <w:rPr>
-          <w:noProof/>
-        </w:rPr>
-      </w:pPr>
-      <w:hyperlink w:anchor="_Toc237032186" w:history="1">
-        <w:r>
-          <w:rPr>
-            <w:rStyle w:val="Hyperlink"/>
-            <w:noProof/>
-          </w:rPr>
-          <w:t>20. Source References</w:t>
-        </w:r>
-        <w:r>
-          <w:rPr>
-            <w:noProof/>
-            <w:webHidden/>
-          </w:rPr>
-          <w:tab/>
-        </w:r>
-        <w:r>
-          <w:rPr>
-            <w:noProof/>
-            <w:webHidden/>
-          </w:rPr>
-          <w:fldChar w:fldCharType="begin"/>
-        </w:r>
-        <w:r>
-          <w:rPr>
-            <w:noProof/>
-            <w:webHidden/>
-          </w:rPr>
-          <w:instrText xml:space="preserve"> PAGEREF _Toc237032186 \h </w:instrText>
-        </w:r>
-        <w:r>
-          <w:rPr>
-            <w:noProof/>
-            <w:webHidden/>
-          </w:rPr>
-        </w:r>
-        <w:r>
-          <w:rPr>
-            <w:noProof/>
-            <w:webHidden/>
-          </w:rPr>
-          <w:fldChar w:fldCharType="separate"/>
-        </w:r>
-        <w:r>
-          <w:rPr>
-            <w:noProof/>
-            <w:webHidden/>
-          </w:rPr>
-          <w:t>12</w:t>
+          <w:t>13</w:t>
         </w:r>
         <w:r>
           <w:rPr>
@@ -2295,80 +2361,80 @@
       <w:pPr>
         <w:pStyle w:val="Heading1"/>
       </w:pPr>
-      <w:bookmarkStart w:id="1" w:name="_Toc237032157"/>
+      <w:bookmarkStart w:id="0" w:name="_Toc237099570"/>
       <w:r>
         <w:lastRenderedPageBreak/>
         <w:t>1. Product Scope and Invariants</w:t>
       </w:r>
+      <w:bookmarkEnd w:id="0"/>
+    </w:p>
+    <w:p>
+      <w:r>
+        <w:t>Delphi App Translation Studio is a Windows-only, open-source localization workspace written in Delphi FireMonkey. It targets Delphi VCL and FMX applications compiled for Win32 and Win64. It is not a runtime translation service and does not require target machines to have Internet access.</w:t>
+      </w:r>
+    </w:p>
+    <w:p>
+      <w:r>
+        <w:t>The central invariant is separation: scan and catalog operations do not modify target source; provider access exists only in the Studio; recommended Component Integration writes only to the Studio export tree; advanced automatic integration remains explicit, previewed, transactional, backed up, and reversible; target applications consume compact offline JSON only.</w:t>
+      </w:r>
+    </w:p>
+    <w:p>
+      <w:pPr>
+        <w:pStyle w:val="ListBullet"/>
+      </w:pPr>
+      <w:r>
+        <w:t>All user interface controls are persisted in DAT.Studio.MainForm.fmx and remain editable in the RAD Studio designer.</w:t>
+      </w:r>
+    </w:p>
+    <w:p>
+      <w:pPr>
+        <w:pStyle w:val="ListBullet"/>
+      </w:pPr>
+      <w:r>
+        <w:t>No UI is constructed at runtime.</w:t>
+      </w:r>
+    </w:p>
+    <w:p>
+      <w:pPr>
+        <w:pStyle w:val="ListBullet"/>
+      </w:pPr>
+      <w:r>
+        <w:t>Stable keys, not source text alone, identify translated properties.</w:t>
+      </w:r>
+    </w:p>
+    <w:p>
+      <w:pPr>
+        <w:pStyle w:val="ListBullet"/>
+      </w:pPr>
+      <w:r>
+        <w:t>Original designer text remains the runtime fallback.</w:t>
+      </w:r>
+    </w:p>
+    <w:p>
+      <w:pPr>
+        <w:pStyle w:val="ListBullet"/>
+      </w:pPr>
+      <w:r>
+        <w:t>API keys never enter project artifacts.</w:t>
+      </w:r>
+    </w:p>
+    <w:p>
+      <w:pPr>
+        <w:pStyle w:val="ListBullet"/>
+      </w:pPr>
+      <w:r>
+        <w:t>One designer-persisted manager supervises the application; ordinary forms require no component.</w:t>
+      </w:r>
+    </w:p>
+    <w:p>
+      <w:pPr>
+        <w:pStyle w:val="Heading1"/>
+      </w:pPr>
+      <w:bookmarkStart w:id="1" w:name="_Toc237099571"/>
+      <w:r>
+        <w:t>2. Repository and Build Layout</w:t>
+      </w:r>
       <w:bookmarkEnd w:id="1"/>
-    </w:p>
-    <w:p>
-      <w:r>
-        <w:t>Delphi App Translation Studio is a Windows-only, open-source localization workspace written in Delphi FireMonkey. It targets Delphi VCL and FMX applications compiled for Win32 and Win64. It is not a runtime translation service and does not require target machines to have Internet access.</w:t>
-      </w:r>
-    </w:p>
-    <w:p>
-      <w:r>
-        <w:t>The central invariant is separation: scan and catalog operations do not modify target source; provider access exists only in the Studio; integration is explicit, previewed, transactional, backed up, and reversible; target applications consume compact offline JSON only.</w:t>
-      </w:r>
-    </w:p>
-    <w:p>
-      <w:pPr>
-        <w:pStyle w:val="ListBullet"/>
-      </w:pPr>
-      <w:r>
-        <w:t>All user interface controls are persisted in DAT.Studio.MainForm.fmx and remain editable in the RAD Studio designer.</w:t>
-      </w:r>
-    </w:p>
-    <w:p>
-      <w:pPr>
-        <w:pStyle w:val="ListBullet"/>
-      </w:pPr>
-      <w:r>
-        <w:t>No UI is constructed at runtime.</w:t>
-      </w:r>
-    </w:p>
-    <w:p>
-      <w:pPr>
-        <w:pStyle w:val="ListBullet"/>
-      </w:pPr>
-      <w:r>
-        <w:t>Stable keys, not source text alone, identify translated properties.</w:t>
-      </w:r>
-    </w:p>
-    <w:p>
-      <w:pPr>
-        <w:pStyle w:val="ListBullet"/>
-      </w:pPr>
-      <w:r>
-        <w:t>Original designer text remains the runtime fallback.</w:t>
-      </w:r>
-    </w:p>
-    <w:p>
-      <w:pPr>
-        <w:pStyle w:val="ListBullet"/>
-      </w:pPr>
-      <w:r>
-        <w:t>API keys never enter project artifacts.</w:t>
-      </w:r>
-    </w:p>
-    <w:p>
-      <w:pPr>
-        <w:pStyle w:val="ListBullet"/>
-      </w:pPr>
-      <w:r>
-        <w:t>Language menu items remain designer-persisted in DFM/FMX resources.</w:t>
-      </w:r>
-    </w:p>
-    <w:p>
-      <w:pPr>
-        <w:pStyle w:val="Heading1"/>
-      </w:pPr>
-      <w:bookmarkStart w:id="2" w:name="_Toc237032158"/>
-      <w:r>
-        <w:t>2. Repository and Build Layout</w:t>
-      </w:r>
-      <w:bookmarkEnd w:id="2"/>
     </w:p>
     <w:tbl>
       <w:tblPr>
@@ -2603,7 +2669,7 @@
           </w:tcPr>
           <w:p>
             <w:r>
-              <w:t>source\integration</w:t>
+              <w:t>source\components</w:t>
             </w:r>
           </w:p>
         </w:tc>
@@ -2617,7 +2683,7 @@
               <w:cnfStyle w:val="000000000000" w:firstRow="0" w:lastRow="0" w:firstColumn="0" w:lastColumn="0" w:oddVBand="0" w:evenVBand="0" w:oddHBand="0" w:evenHBand="0" w:firstRowFirstColumn="0" w:firstRowLastColumn="0" w:lastRowFirstColumn="0" w:lastRowLastColumn="0"/>
             </w:pPr>
             <w:r>
-              <w:t>Plan, resource/source rewriting, change sets, transaction, package generation.</w:t>
+              <w:t>Framework-neutral manager core, VCL/FMX lifecycle adapters, and optional language selectors.</w:t>
             </w:r>
           </w:p>
         </w:tc>
@@ -2625,6 +2691,103 @@
       <w:tr>
         <w:trPr>
           <w:cnfStyle w:val="000000100000" w:firstRow="0" w:lastRow="0" w:firstColumn="0" w:lastColumn="0" w:oddVBand="0" w:evenVBand="0" w:oddHBand="1" w:evenHBand="0" w:firstRowFirstColumn="0" w:firstRowLastColumn="0" w:lastRowFirstColumn="0" w:lastRowLastColumn="0"/>
+          <w:cantSplit/>
+          <w:jc w:val="center"/>
+        </w:trPr>
+        <w:tc>
+          <w:tcPr>
+            <w:cnfStyle w:val="001000000000" w:firstRow="0" w:lastRow="0" w:firstColumn="1" w:lastColumn="0" w:oddVBand="0" w:evenVBand="0" w:oddHBand="0" w:evenHBand="0" w:firstRowFirstColumn="0" w:firstRowLastColumn="0" w:lastRowFirstColumn="0" w:lastRowLastColumn="0"/>
+            <w:tcW w:w="2700" w:type="dxa"/>
+            <w:vAlign w:val="center"/>
+          </w:tcPr>
+          <w:p>
+            <w:r>
+              <w:t>source\design</w:t>
+            </w:r>
+          </w:p>
+        </w:tc>
+        <w:tc>
+          <w:tcPr>
+            <w:tcW w:w="6660" w:type="dxa"/>
+            <w:vAlign w:val="center"/>
+          </w:tcPr>
+          <w:p>
+            <w:pPr>
+              <w:cnfStyle w:val="000000100000" w:firstRow="0" w:lastRow="0" w:firstColumn="0" w:lastColumn="0" w:oddVBand="0" w:evenVBand="0" w:oddHBand="1" w:evenHBand="0" w:firstRowFirstColumn="0" w:firstRowLastColumn="0" w:lastRowFirstColumn="0" w:lastRowLastColumn="0"/>
+            </w:pPr>
+            <w:r>
+              <w:t>VCL and FMX Tool Palette registration units.</w:t>
+            </w:r>
+          </w:p>
+        </w:tc>
+      </w:tr>
+      <w:tr>
+        <w:trPr>
+          <w:cantSplit/>
+          <w:jc w:val="center"/>
+        </w:trPr>
+        <w:tc>
+          <w:tcPr>
+            <w:cnfStyle w:val="001000000000" w:firstRow="0" w:lastRow="0" w:firstColumn="1" w:lastColumn="0" w:oddVBand="0" w:evenVBand="0" w:oddHBand="0" w:evenHBand="0" w:firstRowFirstColumn="0" w:firstRowLastColumn="0" w:lastRowFirstColumn="0" w:lastRowLastColumn="0"/>
+            <w:tcW w:w="2700" w:type="dxa"/>
+            <w:vAlign w:val="center"/>
+          </w:tcPr>
+          <w:p>
+            <w:r>
+              <w:t>packages\runtime / packages\design</w:t>
+            </w:r>
+          </w:p>
+        </w:tc>
+        <w:tc>
+          <w:tcPr>
+            <w:tcW w:w="6660" w:type="dxa"/>
+            <w:vAlign w:val="center"/>
+          </w:tcPr>
+          <w:p>
+            <w:pPr>
+              <w:cnfStyle w:val="000000000000" w:firstRow="0" w:lastRow="0" w:firstColumn="0" w:lastColumn="0" w:oddVBand="0" w:evenVBand="0" w:oddHBand="0" w:evenHBand="0" w:firstRowFirstColumn="0" w:firstRowLastColumn="0" w:lastRowFirstColumn="0" w:lastRowLastColumn="0"/>
+            </w:pPr>
+            <w:r>
+              <w:t>Core and framework runtime BPLs plus Win32 IDE design packages.</w:t>
+            </w:r>
+          </w:p>
+        </w:tc>
+      </w:tr>
+      <w:tr>
+        <w:trPr>
+          <w:cnfStyle w:val="000000100000" w:firstRow="0" w:lastRow="0" w:firstColumn="0" w:lastColumn="0" w:oddVBand="0" w:evenVBand="0" w:oddHBand="1" w:evenHBand="0" w:firstRowFirstColumn="0" w:firstRowLastColumn="0" w:lastRowFirstColumn="0" w:lastRowLastColumn="0"/>
+          <w:cantSplit/>
+          <w:jc w:val="center"/>
+        </w:trPr>
+        <w:tc>
+          <w:tcPr>
+            <w:cnfStyle w:val="001000000000" w:firstRow="0" w:lastRow="0" w:firstColumn="1" w:lastColumn="0" w:oddVBand="0" w:evenVBand="0" w:oddHBand="0" w:evenHBand="0" w:firstRowFirstColumn="0" w:firstRowLastColumn="0" w:lastRowFirstColumn="0" w:lastRowLastColumn="0"/>
+            <w:tcW w:w="2700" w:type="dxa"/>
+            <w:vAlign w:val="center"/>
+          </w:tcPr>
+          <w:p>
+            <w:r>
+              <w:t>source\integration</w:t>
+            </w:r>
+          </w:p>
+        </w:tc>
+        <w:tc>
+          <w:tcPr>
+            <w:tcW w:w="6660" w:type="dxa"/>
+            <w:vAlign w:val="center"/>
+          </w:tcPr>
+          <w:p>
+            <w:pPr>
+              <w:cnfStyle w:val="000000100000" w:firstRow="0" w:lastRow="0" w:firstColumn="0" w:lastColumn="0" w:oddVBand="0" w:evenVBand="0" w:oddHBand="1" w:evenHBand="0" w:firstRowFirstColumn="0" w:firstRowLastColumn="0" w:lastRowFirstColumn="0" w:lastRowLastColumn="0"/>
+            </w:pPr>
+            <w:r>
+              <w:t>Non-mutating component kits plus advanced planning, resource/source changes, transactions, and reset.</w:t>
+            </w:r>
+          </w:p>
+        </w:tc>
+      </w:tr>
+      <w:tr>
+        <w:trPr>
           <w:cantSplit/>
           <w:jc w:val="center"/>
         </w:trPr>
@@ -2647,7 +2810,7 @@
           </w:tcPr>
           <w:p>
             <w:pPr>
-              <w:cnfStyle w:val="000000100000" w:firstRow="0" w:lastRow="0" w:firstColumn="0" w:lastColumn="0" w:oddVBand="0" w:evenVBand="0" w:oddHBand="1" w:evenHBand="0" w:firstRowFirstColumn="0" w:firstRowLastColumn="0" w:lastRowFirstColumn="0" w:lastRowLastColumn="0"/>
+              <w:cnfStyle w:val="000000000000" w:firstRow="0" w:lastRow="0" w:firstColumn="0" w:lastColumn="0" w:oddVBand="0" w:evenVBand="0" w:oddHBand="0" w:evenHBand="0" w:firstRowFirstColumn="0" w:firstRowLastColumn="0" w:lastRowFirstColumn="0" w:lastRowLastColumn="0"/>
             </w:pPr>
             <w:r>
               <w:t>Designer-authored FMX UI and Studio self-localization.</w:t>
@@ -2657,6 +2820,7 @@
       </w:tr>
       <w:tr>
         <w:trPr>
+          <w:cnfStyle w:val="000000100000" w:firstRow="0" w:lastRow="0" w:firstColumn="0" w:lastColumn="0" w:oddVBand="0" w:evenVBand="0" w:oddHBand="1" w:evenHBand="0" w:firstRowFirstColumn="0" w:firstRowLastColumn="0" w:lastRowFirstColumn="0" w:lastRowLastColumn="0"/>
           <w:cantSplit/>
           <w:jc w:val="center"/>
         </w:trPr>
@@ -2668,7 +2832,6 @@
           </w:tcPr>
           <w:p>
             <w:r>
-              <w:lastRenderedPageBreak/>
               <w:t>source\schemas</w:t>
             </w:r>
           </w:p>
@@ -2680,7 +2843,7 @@
           </w:tcPr>
           <w:p>
             <w:pPr>
-              <w:cnfStyle w:val="000000000000" w:firstRow="0" w:lastRow="0" w:firstColumn="0" w:lastColumn="0" w:oddVBand="0" w:evenVBand="0" w:oddHBand="0" w:evenHBand="0" w:firstRowFirstColumn="0" w:firstRowLastColumn="0" w:lastRowFirstColumn="0" w:lastRowLastColumn="0"/>
+              <w:cnfStyle w:val="000000100000" w:firstRow="0" w:lastRow="0" w:firstColumn="0" w:lastColumn="0" w:oddVBand="0" w:evenVBand="0" w:oddHBand="1" w:evenHBand="0" w:firstRowFirstColumn="0" w:firstRowLastColumn="0" w:lastRowFirstColumn="0" w:lastRowLastColumn="0"/>
             </w:pPr>
             <w:r>
               <w:t>Development and runtime JSON Schemas.</w:t>
@@ -2690,7 +2853,6 @@
       </w:tr>
       <w:tr>
         <w:trPr>
-          <w:cnfStyle w:val="000000100000" w:firstRow="0" w:lastRow="0" w:firstColumn="0" w:lastColumn="0" w:oddVBand="0" w:evenVBand="0" w:oddHBand="1" w:evenHBand="0" w:firstRowFirstColumn="0" w:firstRowLastColumn="0" w:lastRowFirstColumn="0" w:lastRowLastColumn="0"/>
           <w:cantSplit/>
           <w:jc w:val="center"/>
         </w:trPr>
@@ -2713,7 +2875,7 @@
           </w:tcPr>
           <w:p>
             <w:pPr>
-              <w:cnfStyle w:val="000000100000" w:firstRow="0" w:lastRow="0" w:firstColumn="0" w:lastColumn="0" w:oddVBand="0" w:evenVBand="0" w:oddHBand="1" w:evenHBand="0" w:firstRowFirstColumn="0" w:firstRowLastColumn="0" w:lastRowFirstColumn="0" w:lastRowLastColumn="0"/>
+              <w:cnfStyle w:val="000000000000" w:firstRow="0" w:lastRow="0" w:firstColumn="0" w:lastColumn="0" w:oddVBand="0" w:evenVBand="0" w:oddHBand="0" w:evenHBand="0" w:firstRowFirstColumn="0" w:firstRowLastColumn="0" w:lastRowFirstColumn="0" w:lastRowLastColumn="0"/>
             </w:pPr>
             <w:r>
               <w:t>Foundation, runtime, integration, form-streaming, launch, and self-localization smoke tests.</w:t>
@@ -2723,6 +2885,7 @@
       </w:tr>
       <w:tr>
         <w:trPr>
+          <w:cnfStyle w:val="000000100000" w:firstRow="0" w:lastRow="0" w:firstColumn="0" w:lastColumn="0" w:oddVBand="0" w:evenVBand="0" w:oddHBand="1" w:evenHBand="0" w:firstRowFirstColumn="0" w:firstRowLastColumn="0" w:lastRowFirstColumn="0" w:lastRowLastColumn="0"/>
           <w:cantSplit/>
           <w:jc w:val="center"/>
         </w:trPr>
@@ -2745,7 +2908,7 @@
           </w:tcPr>
           <w:p>
             <w:pPr>
-              <w:cnfStyle w:val="000000000000" w:firstRow="0" w:lastRow="0" w:firstColumn="0" w:lastColumn="0" w:oddVBand="0" w:evenVBand="0" w:oddHBand="0" w:evenHBand="0" w:firstRowFirstColumn="0" w:firstRowLastColumn="0" w:lastRowFirstColumn="0" w:lastRowLastColumn="0"/>
+              <w:cnfStyle w:val="000000100000" w:firstRow="0" w:lastRow="0" w:firstColumn="0" w:lastColumn="0" w:oddVBand="0" w:evenVBand="0" w:oddHBand="1" w:evenHBand="0" w:firstRowFirstColumn="0" w:firstRowLastColumn="0" w:lastRowFirstColumn="0" w:lastRowLastColumn="0"/>
             </w:pPr>
             <w:r>
               <w:t>Product documentation, help source, and safe fixtures.</w:t>
@@ -2758,11 +2921,11 @@
       <w:pPr>
         <w:pStyle w:val="Heading2"/>
       </w:pPr>
-      <w:bookmarkStart w:id="3" w:name="_Toc237032159"/>
+      <w:bookmarkStart w:id="2" w:name="_Toc237099572"/>
       <w:r>
         <w:t>2.1 Toolchain</w:t>
       </w:r>
-      <w:bookmarkEnd w:id="3"/>
+      <w:bookmarkEnd w:id="2"/>
     </w:p>
     <w:p>
       <w:pPr>
@@ -2792,11 +2955,11 @@
       <w:pPr>
         <w:pStyle w:val="Heading1"/>
       </w:pPr>
-      <w:bookmarkStart w:id="4" w:name="_Toc237032160"/>
+      <w:bookmarkStart w:id="3" w:name="_Toc237099573"/>
       <w:r>
         <w:t>3. System Architecture</w:t>
       </w:r>
-      <w:bookmarkEnd w:id="4"/>
+      <w:bookmarkEnd w:id="3"/>
     </w:p>
     <w:tbl>
       <w:tblPr>
@@ -3119,7 +3282,7 @@
           </w:tcPr>
           <w:p>
             <w:r>
-              <w:t>Integration</w:t>
+              <w:t>Component integration</w:t>
             </w:r>
           </w:p>
         </w:tc>
@@ -3133,7 +3296,7 @@
               <w:cnfStyle w:val="000000000000" w:firstRow="0" w:lastRow="0" w:firstColumn="0" w:lastColumn="0" w:oddVBand="0" w:evenVBand="0" w:oddHBand="0" w:evenHBand="0" w:firstRowFirstColumn="0" w:firstRowLastColumn="0" w:lastRowFirstColumn="0" w:lastRowLastColumn="0"/>
             </w:pPr>
             <w:r>
-              <w:t>Project profile, packs, designated menu</w:t>
+              <w:t>Project profile, scanner roots, packs</w:t>
             </w:r>
           </w:p>
         </w:tc>
@@ -3147,7 +3310,7 @@
               <w:cnfStyle w:val="000000000000" w:firstRow="0" w:lastRow="0" w:firstColumn="0" w:lastColumn="0" w:oddVBand="0" w:evenVBand="0" w:oddHBand="0" w:evenHBand="0" w:firstRowFirstColumn="0" w:firstRowLastColumn="0" w:lastRowFirstColumn="0" w:lastRowLastColumn="0"/>
             </w:pPr>
             <w:r>
-              <w:t>Preview package and transactional change set</w:t>
+              <w:t>Non-mutating component kit under Studio export</w:t>
             </w:r>
           </w:p>
         </w:tc>
@@ -3166,8 +3329,7 @@
           </w:tcPr>
           <w:p>
             <w:r>
-              <w:lastRenderedPageBreak/>
-              <w:t>Runtime</w:t>
+              <w:t>Advanced integration</w:t>
             </w:r>
           </w:p>
         </w:tc>
@@ -3181,7 +3343,7 @@
               <w:cnfStyle w:val="000000100000" w:firstRow="0" w:lastRow="0" w:firstColumn="0" w:lastColumn="0" w:oddVBand="0" w:evenVBand="0" w:oddHBand="1" w:evenHBand="0" w:firstRowFirstColumn="0" w:firstRowLastColumn="0" w:lastRowFirstColumn="0" w:lastRowLastColumn="0"/>
             </w:pPr>
             <w:r>
-              <w:t>Local JSON and per-user preference</w:t>
+              <w:t>Project profile, packs, designated menu</w:t>
             </w:r>
           </w:p>
         </w:tc>
@@ -3195,6 +3357,52 @@
               <w:cnfStyle w:val="000000100000" w:firstRow="0" w:lastRow="0" w:firstColumn="0" w:lastColumn="0" w:oddVBand="0" w:evenVBand="0" w:oddHBand="1" w:evenHBand="0" w:firstRowFirstColumn="0" w:firstRowLastColumn="0" w:lastRowFirstColumn="0" w:lastRowLastColumn="0"/>
             </w:pPr>
             <w:r>
+              <w:t>Preview package and transactional change set</w:t>
+            </w:r>
+          </w:p>
+        </w:tc>
+      </w:tr>
+      <w:tr>
+        <w:trPr>
+          <w:cantSplit/>
+          <w:jc w:val="center"/>
+        </w:trPr>
+        <w:tc>
+          <w:tcPr>
+            <w:cnfStyle w:val="001000000000" w:firstRow="0" w:lastRow="0" w:firstColumn="1" w:lastColumn="0" w:oddVBand="0" w:evenVBand="0" w:oddHBand="0" w:evenHBand="0" w:firstRowFirstColumn="0" w:firstRowLastColumn="0" w:lastRowFirstColumn="0" w:lastRowLastColumn="0"/>
+            <w:tcW w:w="1800" w:type="dxa"/>
+            <w:vAlign w:val="center"/>
+          </w:tcPr>
+          <w:p>
+            <w:r>
+              <w:t>Runtime</w:t>
+            </w:r>
+          </w:p>
+        </w:tc>
+        <w:tc>
+          <w:tcPr>
+            <w:tcW w:w="3900" w:type="dxa"/>
+            <w:vAlign w:val="center"/>
+          </w:tcPr>
+          <w:p>
+            <w:pPr>
+              <w:cnfStyle w:val="000000000000" w:firstRow="0" w:lastRow="0" w:firstColumn="0" w:lastColumn="0" w:oddVBand="0" w:evenVBand="0" w:oddHBand="0" w:evenHBand="0" w:firstRowFirstColumn="0" w:firstRowLastColumn="0" w:lastRowFirstColumn="0" w:lastRowLastColumn="0"/>
+            </w:pPr>
+            <w:r>
+              <w:t>Local JSON and per-user preference</w:t>
+            </w:r>
+          </w:p>
+        </w:tc>
+        <w:tc>
+          <w:tcPr>
+            <w:tcW w:w="3660" w:type="dxa"/>
+            <w:vAlign w:val="center"/>
+          </w:tcPr>
+          <w:p>
+            <w:pPr>
+              <w:cnfStyle w:val="000000000000" w:firstRow="0" w:lastRow="0" w:firstColumn="0" w:lastColumn="0" w:oddVBand="0" w:evenVBand="0" w:oddHBand="0" w:evenHBand="0" w:firstRowFirstColumn="0" w:firstRowLastColumn="0" w:lastRowFirstColumn="0" w:lastRowLastColumn="0"/>
+            </w:pPr>
+            <w:r>
               <w:t>Translated existing controls and locale settings</w:t>
             </w:r>
           </w:p>
@@ -3205,68 +3413,68 @@
       <w:pPr>
         <w:pStyle w:val="Heading1"/>
       </w:pPr>
-      <w:bookmarkStart w:id="5" w:name="_Toc237032161"/>
+      <w:bookmarkStart w:id="4" w:name="_Toc237099574"/>
       <w:r>
         <w:t>4. Core Data Model and JSON</w:t>
       </w:r>
+      <w:bookmarkEnd w:id="4"/>
+    </w:p>
+    <w:p>
+      <w:r>
+        <w:t>DAT.Core.Types defines target framework/platform flags, locale metadata, translation status, catalog entries, and catalog ownership. Development JSON retains source text, translation, stable key, checksum, status, source location, component/property metadata, and locale data. Runtime JSON deliberately omits development-only detail.</w:t>
+      </w:r>
+    </w:p>
+    <w:p>
+      <w:pPr>
+        <w:pStyle w:val="Heading2"/>
+      </w:pPr>
+      <w:bookmarkStart w:id="5" w:name="_Toc237099575"/>
+      <w:r>
+        <w:t>4.1 Stable keys</w:t>
+      </w:r>
       <w:bookmarkEnd w:id="5"/>
     </w:p>
     <w:p>
-      <w:r>
-        <w:t>DAT.Core.Types defines target framework/platform flags, locale metadata, translation status, catalog entries, and catalog ownership. Development JSON retains source text, translation, stable key, checksum, status, source location, component/property metadata, and locale data. Runtime JSON deliberately omits development-only detail.</w:t>
+      <w:pPr>
+        <w:pStyle w:val="ListBullet"/>
+      </w:pPr>
+      <w:r>
+        <w:t>Form properties use form.component.property, for example frmMain.btnSave.Text.</w:t>
+      </w:r>
+    </w:p>
+    <w:p>
+      <w:pPr>
+        <w:pStyle w:val="ListBullet"/>
+      </w:pPr>
+      <w:r>
+        <w:t>resourcestring entries use the Pascal unit and symbol.</w:t>
+      </w:r>
+    </w:p>
+    <w:p>
+      <w:pPr>
+        <w:pStyle w:val="ListBullet"/>
+      </w:pPr>
+      <w:r>
+        <w:t>Keys remain stable when wording changes, allowing source-changed detection.</w:t>
+      </w:r>
+    </w:p>
+    <w:p>
+      <w:pPr>
+        <w:pStyle w:val="ListBullet"/>
+      </w:pPr>
+      <w:r>
+        <w:t>Fallback source text remains in the compiled DFM/FMX or code.</w:t>
       </w:r>
     </w:p>
     <w:p>
       <w:pPr>
         <w:pStyle w:val="Heading2"/>
       </w:pPr>
-      <w:bookmarkStart w:id="6" w:name="_Toc237032162"/>
-      <w:r>
-        <w:t>4.1 Stable keys</w:t>
+      <w:bookmarkStart w:id="6" w:name="_Toc237099576"/>
+      <w:r>
+        <w:t>4.2 Development catalog</w:t>
       </w:r>
       <w:bookmarkEnd w:id="6"/>
-    </w:p>
-    <w:p>
-      <w:pPr>
-        <w:pStyle w:val="ListBullet"/>
-      </w:pPr>
-      <w:r>
-        <w:t>Form properties use form.component.property, for example frmMain.btnSave.Text.</w:t>
-      </w:r>
-    </w:p>
-    <w:p>
-      <w:pPr>
-        <w:pStyle w:val="ListBullet"/>
-      </w:pPr>
-      <w:r>
-        <w:t>resourcestring entries use the Pascal unit and symbol.</w:t>
-      </w:r>
-    </w:p>
-    <w:p>
-      <w:pPr>
-        <w:pStyle w:val="ListBullet"/>
-      </w:pPr>
-      <w:r>
-        <w:t>Keys remain stable when wording changes, allowing source-changed detection.</w:t>
-      </w:r>
-    </w:p>
-    <w:p>
-      <w:pPr>
-        <w:pStyle w:val="ListBullet"/>
-      </w:pPr>
-      <w:r>
-        <w:t>Fallback source text remains in the compiled DFM/FMX or code.</w:t>
-      </w:r>
-    </w:p>
-    <w:p>
-      <w:pPr>
-        <w:pStyle w:val="Heading2"/>
-      </w:pPr>
-      <w:bookmarkStart w:id="7" w:name="_Toc237032163"/>
-      <w:r>
-        <w:t>4.2 Development catalog</w:t>
-      </w:r>
-      <w:bookmarkEnd w:id="7"/>
     </w:p>
     <w:p>
       <w:pPr>
@@ -3321,11 +3529,11 @@
       <w:pPr>
         <w:pStyle w:val="Heading2"/>
       </w:pPr>
-      <w:bookmarkStart w:id="8" w:name="_Toc237032164"/>
+      <w:bookmarkStart w:id="7" w:name="_Toc237099577"/>
       <w:r>
         <w:t>4.3 Runtime pack</w:t>
       </w:r>
-      <w:bookmarkEnd w:id="8"/>
+      <w:bookmarkEnd w:id="7"/>
     </w:p>
     <w:p>
       <w:pPr>
@@ -3375,32 +3583,31 @@
       <w:pPr>
         <w:pStyle w:val="Heading1"/>
       </w:pPr>
-      <w:bookmarkStart w:id="9" w:name="_Toc237032165"/>
-      <w:r>
-        <w:lastRenderedPageBreak/>
+      <w:bookmarkStart w:id="8" w:name="_Toc237099578"/>
+      <w:r>
         <w:t>5. Project Detection and Scanning</w:t>
       </w:r>
+      <w:bookmarkEnd w:id="8"/>
+    </w:p>
+    <w:p>
+      <w:r>
+        <w:t>DAT.Core.ProjectDetection reads project metadata, resolves the DPR, detects VCL or FMX through project/form evidence, records Win32/Win64 support, and enumerates forms and Pascal sources. DAT.Scan.Project coordinates form and resourcestring scanners while measuring elapsed milliseconds.</w:t>
+      </w:r>
+    </w:p>
+    <w:p>
+      <w:r>
+        <w:t>DAT.Scan.FormText parses text DFM/FMX without instantiating target forms. DAT.Scan.PascalResources extracts resourcestring declarations. DAT.Scan.TextCodec preserves Delphi text encodings and escaped string syntax. DAT.Scan.Rules centralizes designated property decisions.</w:t>
+      </w:r>
+    </w:p>
+    <w:p>
+      <w:pPr>
+        <w:pStyle w:val="Heading2"/>
+      </w:pPr>
+      <w:bookmarkStart w:id="9" w:name="_Toc237099579"/>
+      <w:r>
+        <w:t>5.1 Incremental merge</w:t>
+      </w:r>
       <w:bookmarkEnd w:id="9"/>
-    </w:p>
-    <w:p>
-      <w:r>
-        <w:t>DAT.Core.ProjectDetection reads project metadata, resolves the DPR, detects VCL or FMX through project/form evidence, records Win32/Win64 support, and enumerates forms and Pascal sources. DAT.Scan.Project coordinates form and resourcestring scanners while measuring elapsed milliseconds.</w:t>
-      </w:r>
-    </w:p>
-    <w:p>
-      <w:r>
-        <w:t>DAT.Scan.FormText parses text DFM/FMX without instantiating target forms. DAT.Scan.PascalResources extracts resourcestring declarations. DAT.Scan.TextCodec preserves Delphi text encodings and escaped string syntax. DAT.Scan.Rules centralizes designated property decisions.</w:t>
-      </w:r>
-    </w:p>
-    <w:p>
-      <w:pPr>
-        <w:pStyle w:val="Heading2"/>
-      </w:pPr>
-      <w:bookmarkStart w:id="10" w:name="_Toc237032166"/>
-      <w:r>
-        <w:t>5.1 Incremental merge</w:t>
-      </w:r>
-      <w:bookmarkEnd w:id="10"/>
     </w:p>
     <w:p>
       <w:pPr>
@@ -3478,11 +3685,11 @@
       <w:pPr>
         <w:pStyle w:val="Heading1"/>
       </w:pPr>
-      <w:bookmarkStart w:id="11" w:name="_Toc237032167"/>
+      <w:bookmarkStart w:id="10" w:name="_Toc237099580"/>
       <w:r>
         <w:t>6. Studio UI and Workflow State</w:t>
       </w:r>
-      <w:bookmarkEnd w:id="11"/>
+      <w:bookmarkEnd w:id="10"/>
     </w:p>
     <w:p>
       <w:r>
@@ -3499,7 +3706,7 @@
     </w:p>
     <w:p>
       <w:r>
-        <w:t>The form owns the project profile, scan result, catalog, validation result, integration change set, provider settings, and per-provider session-key strings. Destructors release owned objects. Catalog updates invalidate validation and export state.</w:t>
+        <w:t>The form owns the project profile, scan result, catalog, validation result, integration change set, provider settings, and per-provider session-key strings. Destructors release owned objects. Catalog updates invalidate validation and export state. The designer-authored Integration method combo defaults to Component Integration; mutation controls are hidden in that mode and restored only for the explicitly selected advanced mode.</w:t>
       </w:r>
     </w:p>
     <w:tbl>
@@ -3553,12 +3760,11 @@
       <w:pPr>
         <w:pStyle w:val="Heading1"/>
       </w:pPr>
-      <w:bookmarkStart w:id="12" w:name="_Toc237032168"/>
-      <w:r>
-        <w:lastRenderedPageBreak/>
+      <w:bookmarkStart w:id="11" w:name="_Toc237099581"/>
+      <w:r>
         <w:t>7. Provider Settings and Secret Storage</w:t>
       </w:r>
-      <w:bookmarkEnd w:id="12"/>
+      <w:bookmarkEnd w:id="11"/>
     </w:p>
     <w:p>
       <w:r>
@@ -3822,11 +4028,11 @@
       <w:pPr>
         <w:pStyle w:val="Heading1"/>
       </w:pPr>
-      <w:bookmarkStart w:id="13" w:name="_Toc237032169"/>
+      <w:bookmarkStart w:id="12" w:name="_Toc237099582"/>
       <w:r>
         <w:t>8. Provider HTTP Clients</w:t>
       </w:r>
-      <w:bookmarkEnd w:id="13"/>
+      <w:bookmarkEnd w:id="12"/>
     </w:p>
     <w:p>
       <w:r>
@@ -4000,7 +4206,6 @@
           </w:tcPr>
           <w:p>
             <w:r>
-              <w:lastRenderedPageBreak/>
               <w:t>DeepL API Pro</w:t>
             </w:r>
           </w:p>
@@ -4114,10 +4319,68 @@
       <w:pPr>
         <w:pStyle w:val="Heading2"/>
       </w:pPr>
-      <w:bookmarkStart w:id="14" w:name="_Toc237032170"/>
+      <w:bookmarkStart w:id="13" w:name="_Toc237099583"/>
       <w:r>
         <w:t>8.1 Reliability and cancellation</w:t>
       </w:r>
+      <w:bookmarkEnd w:id="13"/>
+    </w:p>
+    <w:p>
+      <w:pPr>
+        <w:pStyle w:val="ListBullet"/>
+      </w:pPr>
+      <w:r>
+        <w:t>Batch size is capped at 50 and Google language tags are reduced to base language where appropriate.</w:t>
+      </w:r>
+    </w:p>
+    <w:p>
+      <w:pPr>
+        <w:pStyle w:val="ListBullet"/>
+      </w:pPr>
+      <w:r>
+        <w:t>DeepL source codes are normalized to two-letter uppercase; targets retain supported regional forms.</w:t>
+      </w:r>
+    </w:p>
+    <w:p>
+      <w:pPr>
+        <w:pStyle w:val="ListBullet"/>
+      </w:pPr>
+      <w:r>
+        <w:t>HTTP 429 and 5xx responses receive three bounded attempts with short backoff.</w:t>
+      </w:r>
+    </w:p>
+    <w:p>
+      <w:pPr>
+        <w:pStyle w:val="ListBullet"/>
+      </w:pPr>
+      <w:r>
+        <w:t>Other non-2xx statuses fail immediately with provider, status, and corrective categories.</w:t>
+      </w:r>
+    </w:p>
+    <w:p>
+      <w:pPr>
+        <w:pStyle w:val="ListBullet"/>
+      </w:pPr>
+      <w:r>
+        <w:t>A cancellation callback is checked between batches.</w:t>
+      </w:r>
+    </w:p>
+    <w:p>
+      <w:pPr>
+        <w:pStyle w:val="ListBullet"/>
+      </w:pPr>
+      <w:r>
+        <w:t>Test Connection translates one harmless English phrase to Italian.</w:t>
+      </w:r>
+    </w:p>
+    <w:p>
+      <w:pPr>
+        <w:pStyle w:val="Heading2"/>
+      </w:pPr>
+      <w:bookmarkStart w:id="14" w:name="_Toc237099584"/>
+      <w:r>
+        <w:t>8.2 Official protocol references</w:t>
+      </w:r>
       <w:bookmarkEnd w:id="14"/>
     </w:p>
     <w:p>
@@ -4125,7 +4388,7 @@
         <w:pStyle w:val="ListBullet"/>
       </w:pPr>
       <w:r>
-        <w:t>Batch size is capped at 50 and Google language tags are reduced to base language where appropriate.</w:t>
+        <w:t>DeepL authentication: https://developers.deepl.com/docs/getting-started/auth</w:t>
       </w:r>
     </w:p>
     <w:p>
@@ -4133,7 +4396,7 @@
         <w:pStyle w:val="ListBullet"/>
       </w:pPr>
       <w:r>
-        <w:t>DeepL source codes are normalized to two-letter uppercase; targets retain supported regional forms.</w:t>
+        <w:t>DeepL quickstart: https://developers.deepl.com/docs/getting-started/quickstart</w:t>
       </w:r>
     </w:p>
     <w:p>
@@ -4141,7 +4404,7 @@
         <w:pStyle w:val="ListBullet"/>
       </w:pPr>
       <w:r>
-        <w:t>HTTP 429 and 5xx responses receive three bounded attempts with short backoff.</w:t>
+        <w:t>Google Basic translate method: https://docs.cloud.google.com/translate/docs/reference/rest/v2/translate</w:t>
       </w:r>
     </w:p>
     <w:p>
@@ -4149,7 +4412,7 @@
         <w:pStyle w:val="ListBullet"/>
       </w:pPr>
       <w:r>
-        <w:t>Other non-2xx statuses fail immediately with provider, status, and corrective categories.</w:t>
+        <w:t>Google Cloud Translation authentication: https://docs.cloud.google.com/translate/docs/authentication</w:t>
       </w:r>
     </w:p>
     <w:p>
@@ -4157,7 +4420,42 @@
         <w:pStyle w:val="ListBullet"/>
       </w:pPr>
       <w:r>
-        <w:t>A cancellation callback is checked between batches.</w:t>
+        <w:t>Google API-key best practices: https://docs.cloud.google.com/docs/authentication/api-keys-best-practices</w:t>
+      </w:r>
+    </w:p>
+    <w:p>
+      <w:pPr>
+        <w:pStyle w:val="Heading1"/>
+      </w:pPr>
+      <w:bookmarkStart w:id="15" w:name="_Toc237099585"/>
+      <w:r>
+        <w:t>9. Automatic Provider Translation and Review</w:t>
+      </w:r>
+      <w:bookmarkEnd w:id="15"/>
+    </w:p>
+    <w:p>
+      <w:r>
+        <w:t>Translate Automatically is the canonical machine-translation path. It validates the selected catalog language, loads the selected provider settings and effective key, counts eligible unresolved entries, and shows the provider and count before any network request.</w:t>
+      </w:r>
+    </w:p>
+    <w:p>
+      <w:r>
+        <w:t>Eligible source strings are copied into ordered arrays and sent through DAT.Provider.Client in bounded batches. Reviewed, Approved, Excluded, and Obsolete entries are not overwritten. Provider results are mapped back by index, marked Machine translated, tagged with Google or DeepL provenance, and saved to the canonical development catalog automatically.</w:t>
+      </w:r>
+    </w:p>
+    <w:p>
+      <w:r>
+        <w:t>If no key is available, the workflow opens Provider Settings and gives a specific corrective message. HTTP or parsing failures leave the catalog entries unchanged for the failed operation and report a redacted summary in the status card.</w:t>
+      </w:r>
+    </w:p>
+    <w:p>
+      <w:r>
+        <w:t>CSV interchange and manual editing remain optional alternatives for translation-company collaboration or specialized review, not prerequisites for automatic translation.</w:t>
+      </w:r>
+    </w:p>
+    <w:p>
+      <w:r>
+        <w:t>The Studio never copies a translation from one stable key to another automatically. Exact-source matches are suggestions only. Explicit acceptance creates an Edited result and does not inherit Reviewed or Approved status.</w:t>
       </w:r>
     </w:p>
     <w:p>
@@ -4165,25 +4463,151 @@
         <w:pStyle w:val="ListBullet"/>
       </w:pPr>
       <w:r>
-        <w:t>Test Connection translates one harmless English phrase to Italian.</w:t>
+        <w:t>Mark Reviewed requires nonblank translated text.</w:t>
+      </w:r>
+    </w:p>
+    <w:p>
+      <w:pPr>
+        <w:pStyle w:val="ListBullet"/>
+      </w:pPr>
+      <w:r>
+        <w:t>Approve requires the entry to have reached Reviewed first.</w:t>
+      </w:r>
+    </w:p>
+    <w:p>
+      <w:pPr>
+        <w:pStyle w:val="ListBullet"/>
+      </w:pPr>
+      <w:r>
+        <w:t>Translation origin is independent of linguistic status.</w:t>
+      </w:r>
+    </w:p>
+    <w:p>
+      <w:pPr>
+        <w:pStyle w:val="ListBullet"/>
+      </w:pPr>
+      <w:r>
+        <w:t>Inconsistent repeated terms and structural defects form the focused exception queue; a valid machine-translated draft is not itself an error.</w:t>
+      </w:r>
+    </w:p>
+    <w:p>
+      <w:pPr>
+        <w:pStyle w:val="ListBullet"/>
+      </w:pPr>
+      <w:r>
+        <w:t>Structural validity, linguistic status, automatic runtime coverage, and manual wiring readiness are separate measures.</w:t>
+      </w:r>
+    </w:p>
+    <w:p>
+      <w:pPr>
+        <w:pStyle w:val="ListBullet"/>
+      </w:pPr>
+      <w:r>
+        <w:t>A Pascal resourcestring remains manual wiring until the developer confirms the generated TranslateText call site.</w:t>
+      </w:r>
+    </w:p>
+    <w:p>
+      <w:pPr>
+        <w:pStyle w:val="Heading1"/>
+      </w:pPr>
+      <w:bookmarkStart w:id="16" w:name="_Toc237099586"/>
+      <w:r>
+        <w:t>10. Validation and Runtime Pack Export</w:t>
+      </w:r>
+      <w:bookmarkEnd w:id="16"/>
+    </w:p>
+    <w:p>
+      <w:r>
+        <w:t>DAT.Validation.Catalog validates metadata, missing target text, duplicates, changed source, Delphi indexed and sequential Format arguments, accelerators, inconsistent repeated-source terminology, and status conditions. Export is blocked by errors. Manual resourcestring wiring is reported separately from structural errors. DAT.Core.RuntimePack serializes only runtime-required metadata and strings and records a source-catalog checksum.</w:t>
+      </w:r>
+    </w:p>
+    <w:p>
+      <w:r>
+        <w:t>Locale data is retained in the runtime pack so DAT.Runtime.Manager can expose a pack-specific TFormatSettings without globally mutating the developer's source code.</w:t>
+      </w:r>
+    </w:p>
+    <w:p>
+      <w:pPr>
+        <w:pStyle w:val="Heading1"/>
+      </w:pPr>
+      <w:bookmarkStart w:id="17" w:name="_Toc237099587"/>
+      <w:r>
+        <w:t>11. Runtime Engine</w:t>
+      </w:r>
+      <w:bookmarkEnd w:id="17"/>
+    </w:p>
+    <w:p>
+      <w:r>
+        <w:t>DAT.Runtime.LanguagePack loads and discovers JSON packs, checks application identity, rejects empty/invalid packs, canonicalizes native language names, de-duplicates exact locale codes, and suppresses a generic locale when a regional variant exists. DAT.Runtime.Preference reads/writes the selected locale. DAT.Runtime.Manager owns the active pack, discovery, preference, translation lookup, and locale format settings. The source language loads its generated JSON pack when present and falls back to designer te</w:t>
+      </w:r>
+      <w:r>
+        <w:t>xt only for older deployments without that pack.</w:t>
+      </w:r>
+    </w:p>
+    <w:p>
+      <w:r>
+        <w:t>DAT.Runtime.VCL and DAT.Runtime.FMX traverse existing component trees and supported collection properties. They apply values by stable key to already designer-created controls. Missing keys retain source text. The adapters do not create controls or rearrange layouts.</w:t>
       </w:r>
     </w:p>
     <w:p>
       <w:pPr>
         <w:pStyle w:val="Heading2"/>
       </w:pPr>
-      <w:bookmarkStart w:id="15" w:name="_Toc237032171"/>
-      <w:r>
-        <w:t>8.2 Official protocol references</w:t>
-      </w:r>
-      <w:bookmarkEnd w:id="15"/>
+      <w:bookmarkStart w:id="18" w:name="_Toc237099588"/>
+      <w:r>
+        <w:t>11.1 Component manager core</w:t>
+      </w:r>
+      <w:bookmarkEnd w:id="18"/>
+    </w:p>
+    <w:p>
+      <w:r>
+        <w:t>TDATCustomLanguageManager owns TTranslationRuntime, immutable post-initialization configuration, stable form-identity mappings, generation tracking, deterministic removal, main-thread and reentrancy guards, exclusion policy, diagnostics, and lifecycle events. SelectLanguage advances the generation, applies the active pack to open forms, saves the preference, and raises additive notifications.</w:t>
+      </w:r>
+    </w:p>
+    <w:p>
+      <w:r>
+        <w:t>TDATFMXLanguageManager subscribes additively to TFormBeforeShownMessage and TFormReleasedMessage. It translates after streaming but before OnShow/first paint and never replaces a global handler. TDATVCLLanguageManager owns a private TApplicationEvents, discovers visible forms on throttled idle, and inspects modal forms before display. VCL has no public additive before-show notification for every dynamic modeless form; such a form can paint once in the source language unless the application calls ApplyToForm</w:t>
+      </w:r>
+      <w:r>
+        <w:t xml:space="preserve"> before Show.</w:t>
+      </w:r>
+    </w:p>
+    <w:p>
+      <w:r>
+        <w:t>PreserveControlState protects writable edit/memo data, focus, selection ranges, and list/combo ItemIndex. Collection replacement temporarily suppresses and then restores OnChange. Read-only instructional memo content remains translatable.</w:t>
+      </w:r>
+    </w:p>
+    <w:p>
+      <w:pPr>
+        <w:pStyle w:val="Heading2"/>
+      </w:pPr>
+      <w:bookmarkStart w:id="19" w:name="_Toc237099589"/>
+      <w:r>
+        <w:t>11.2 Optional selectors</w:t>
+      </w:r>
+      <w:bookmarkEnd w:id="19"/>
+    </w:p>
+    <w:p>
+      <w:r>
+        <w:t>TDATVCLLanguageComboBox and TDATFMXLanguageComboBox are normal designer-owned controls. Their typed LanguageManager property streams in DFM/FMX resources. At runtime AutoPopulate obtains validated descriptors, ShowLanguageCode controls display formatting, and selection calls the manager while preserving the inherited OnChange notification. RefreshLanguages supports packs deployed after startup.</w:t>
+      </w:r>
+    </w:p>
+    <w:p>
+      <w:pPr>
+        <w:pStyle w:val="Heading2"/>
+      </w:pPr>
+      <w:bookmarkStart w:id="20" w:name="_Toc237099590"/>
+      <w:r>
+        <w:t>11.3 Deployment paths</w:t>
+      </w:r>
+      <w:bookmarkEnd w:id="20"/>
     </w:p>
     <w:p>
       <w:pPr>
         <w:pStyle w:val="ListBullet"/>
       </w:pPr>
       <w:r>
-        <w:t>DeepL authentication: https://developers.deepl.com/docs/getting-started/auth</w:t>
+        <w:t>Packs: &lt;ExecutableDirectory&gt;\Localization\Languages\&lt;locale&gt;.json.</w:t>
       </w:r>
     </w:p>
     <w:p>
@@ -4191,7 +4615,7 @@
         <w:pStyle w:val="ListBullet"/>
       </w:pPr>
       <w:r>
-        <w:t>DeepL quickstart: https://developers.deepl.com/docs/getting-started/quickstart</w:t>
+        <w:t>Preference: %LOCALAPPDATA%\&lt;ApplicationId&gt;\language.ini.</w:t>
       </w:r>
     </w:p>
     <w:p>
@@ -4199,7 +4623,7 @@
         <w:pStyle w:val="ListBullet"/>
       </w:pPr>
       <w:r>
-        <w:t>Google Basic translate method: https://docs.cloud.google.com/translate/docs/reference/rest/v2/translate</w:t>
+        <w:t>Studio preference: %LOCALAPPDATA%\DelphiAppTranslationStudio\language.ini.</w:t>
       </w:r>
     </w:p>
     <w:p>
@@ -4207,54 +4631,50 @@
         <w:pStyle w:val="ListBullet"/>
       </w:pPr>
       <w:r>
-        <w:t>Google Cloud Translation authentication: https://docs.cloud.google.com/translate/docs/authentication</w:t>
-      </w:r>
+        <w:t>Developer catalogs remain in the target source tree under Localization\Development.</w:t>
+      </w:r>
+    </w:p>
+    <w:p>
+      <w:pPr>
+        <w:pStyle w:val="Heading1"/>
+      </w:pPr>
+      <w:bookmarkStart w:id="21" w:name="_Toc237099591"/>
+      <w:r>
+        <w:t>12. Component Packages and Integration Modes</w:t>
+      </w:r>
+      <w:bookmarkEnd w:id="21"/>
+    </w:p>
+    <w:p>
+      <w:r>
+        <w:t>The package graph contains DATLanguageManagerCoreRuntime, framework-specific VCL/FMX runtime packages, and separate VCL/FMX design packages. Design packages register only their applicable manager and selector on DAT Localization. Runtime packages build for Win32 and Win64; the installed RAD Studio IDE consumes Win32 design BPLs. Tests build but never silently install packages.</w:t>
+      </w:r>
+    </w:p>
+    <w:p>
+      <w:r>
+        <w:t>DAT.Integration.ComponentPackage implements the recommended non-mutating mode. It emits applicable runtime/component units, validated translated packs, an English source pack, component-integration.json, scanner form roots, README instructions, and a deployment script exclusively below export\component-integration. SHA-256 fixture tests prove target DPROJ and DFM/FMX hashes remain unchanged.</w:t>
+      </w:r>
+    </w:p>
+    <w:p>
+      <w:r>
+        <w:t>The advanced fallback retains DAT.Integration.Plan, DAT.Integration.Package, DAT.Integration.Engine, MenuResource, DelphiSource, Transaction, BuildDeploy, and Reset. It generates the application unit and exact changes in memory, requires explicit authorization, verifies a pre-change backup, writes atomically, rolls back failures, and supports restore/complete reset.</w:t>
+      </w:r>
+    </w:p>
+    <w:p>
+      <w:pPr>
+        <w:pStyle w:val="Heading2"/>
+      </w:pPr>
+      <w:bookmarkStart w:id="22" w:name="_Toc237099592"/>
+      <w:r>
+        <w:t>12.1 Component startup contract</w:t>
+      </w:r>
+      <w:bookmarkEnd w:id="22"/>
     </w:p>
     <w:p>
       <w:pPr>
         <w:pStyle w:val="ListBullet"/>
       </w:pPr>
       <w:r>
-        <w:t>Google API-key best practices: https://docs.cloud.google.com/docs/authentication/api-keys-best-practices</w:t>
-      </w:r>
-    </w:p>
-    <w:p>
-      <w:pPr>
-        <w:pStyle w:val="Heading1"/>
-      </w:pPr>
-      <w:bookmarkStart w:id="16" w:name="_Toc237032172"/>
-      <w:r>
-        <w:t>9. Automatic Provider Translation and Review</w:t>
-      </w:r>
-      <w:bookmarkEnd w:id="16"/>
-    </w:p>
-    <w:p>
-      <w:r>
-        <w:t>Translate Automatically is the canonical machine-translation path. It validates the selected catalog language, loads the selected provider settings and effective key, counts eligible unresolved entries, and shows the provider and count before any network request.</w:t>
-      </w:r>
-    </w:p>
-    <w:p>
-      <w:r>
-        <w:t xml:space="preserve">Eligible source strings are copied into ordered arrays and sent through DAT.Provider.Client in bounded batches. Reviewed, Approved, Excluded, and Obsolete entries are not overwritten. Provider results are </w:t>
-      </w:r>
-      <w:r>
-        <w:lastRenderedPageBreak/>
-        <w:t>mapped back by index, marked Machine translated, tagged with Google or DeepL provenance, and saved to the canonical development catalog automatically.</w:t>
-      </w:r>
-    </w:p>
-    <w:p>
-      <w:r>
-        <w:t>If no key is available, the workflow opens Provider Settings and gives a specific corrective message. HTTP or parsing failures leave the catalog entries unchanged for the failed operation and report a redacted summary in the status card.</w:t>
-      </w:r>
-    </w:p>
-    <w:p>
-      <w:r>
-        <w:t>CSV interchange and manual editing remain optional alternatives for translation-company collaboration or specialized review, not prerequisites for automatic translation.</w:t>
-      </w:r>
-    </w:p>
-    <w:p>
-      <w:r>
-        <w:t>The Studio never copies a translation from one stable key to another automatically. Exact-source matches are suggestions only. Explicit acceptance creates an Edited result and does not inherit Reviewed or Approved status.</w:t>
+        <w:t>The primary form streams one manager through ordinary Delphi designer mechanics.</w:t>
       </w:r>
     </w:p>
     <w:p>
@@ -4262,7 +4682,7 @@
         <w:pStyle w:val="ListBullet"/>
       </w:pPr>
       <w:r>
-        <w:t>Mark Reviewed requires nonblank translated text.</w:t>
+        <w:t>Loaded initializes the runtime, loads the preferred/source language, and applies the owner.</w:t>
       </w:r>
     </w:p>
     <w:p>
@@ -4270,7 +4690,7 @@
         <w:pStyle w:val="ListBullet"/>
       </w:pPr>
       <w:r>
-        <w:t>Approve requires the entry to have reached Reviewed first.</w:t>
+        <w:t>FMX before-show messages cover later normal, inherited, and popup forms.</w:t>
       </w:r>
     </w:p>
     <w:p>
@@ -4278,7 +4698,7 @@
         <w:pStyle w:val="ListBullet"/>
       </w:pPr>
       <w:r>
-        <w:t>Translation origin is independent of linguistic status.</w:t>
+        <w:t>VCL idle/modal discovery covers ordinary forms; strict modeless pre-display callers use ApplyToForm.</w:t>
       </w:r>
     </w:p>
     <w:p>
@@ -4286,7 +4706,7 @@
         <w:pStyle w:val="ListBullet"/>
       </w:pPr>
       <w:r>
-        <w:t>Inconsistent repeated terms and structural defects form the focused exception queue; a valid machine-translated draft is not itself an error.</w:t>
+        <w:t>SelectLanguage applies the pack to currently open forms immediately and persists the locale.</w:t>
       </w:r>
     </w:p>
     <w:p>
@@ -4294,7 +4714,7 @@
         <w:pStyle w:val="ListBullet"/>
       </w:pPr>
       <w:r>
-        <w:t>Structural validity, linguistic status, automatic runtime coverage, and manual wiring readiness are separate measures.</w:t>
+        <w:t>The generated en-US pack makes switching back to source text deterministic.</w:t>
       </w:r>
     </w:p>
     <w:p>
@@ -4302,196 +4722,7 @@
         <w:pStyle w:val="ListBullet"/>
       </w:pPr>
       <w:r>
-        <w:t>A Pascal resourcestring remains manual wiring until the developer confirms the generated TranslateText call site.</w:t>
-      </w:r>
-    </w:p>
-    <w:p>
-      <w:pPr>
-        <w:pStyle w:val="Heading1"/>
-      </w:pPr>
-      <w:bookmarkStart w:id="17" w:name="_Toc237032173"/>
-      <w:r>
-        <w:t>10. Validation and Runtime Pack Export</w:t>
-      </w:r>
-      <w:bookmarkEnd w:id="17"/>
-    </w:p>
-    <w:p>
-      <w:r>
-        <w:t>DAT.Validation.Catalog validates metadata, missing target text, duplicates, changed source, Delphi indexed and sequential Format arguments, accelerators, inconsistent repeated-source terminology, and status conditions. Export is blocked by errors. Manual resourcestring wiring is reported separately from structural errors. DAT.Core.RuntimePack serializes only runtime-required metadata and strings and records a source-catalog checksum.</w:t>
-      </w:r>
-    </w:p>
-    <w:p>
-      <w:r>
-        <w:t>Locale data is retained in the runtime pack so DAT.Runtime.Manager can expose a pack-specific TFormatSettings without globally mutating the developer's source code.</w:t>
-      </w:r>
-    </w:p>
-    <w:p>
-      <w:pPr>
-        <w:pStyle w:val="Heading1"/>
-      </w:pPr>
-      <w:bookmarkStart w:id="18" w:name="_Toc237032174"/>
-      <w:r>
-        <w:t>11. Runtime Engine</w:t>
-      </w:r>
-      <w:bookmarkEnd w:id="18"/>
-    </w:p>
-    <w:p>
-      <w:r>
-        <w:t xml:space="preserve">DAT.Runtime.LanguagePack loads and discovers JSON packs, checks application identity, rejects empty/invalid packs, canonicalizes native language names, de-duplicates exact locale codes, and suppresses a generic locale when a regional variant exists. DAT.Runtime.Preference reads/writes the selected locale. DAT.Runtime.Manager owns the active pack, discovery, preference, translation lookup, </w:t>
-      </w:r>
-      <w:r>
-        <w:lastRenderedPageBreak/>
-        <w:t>and locale format settings. The source language loads its generated JSON pack when present and falls back to designer text only for older deployments without that pack.</w:t>
-      </w:r>
-    </w:p>
-    <w:p>
-      <w:r>
-        <w:t>DAT.Runtime.VCL and DAT.Runtime.FMX traverse existing component trees and supported collection properties. They apply values by stable key to already designer-created controls. Missing keys retain source text. The adapters do not create controls or rearrange layouts.</w:t>
-      </w:r>
-    </w:p>
-    <w:p>
-      <w:pPr>
-        <w:pStyle w:val="Heading2"/>
-      </w:pPr>
-      <w:bookmarkStart w:id="19" w:name="_Toc237032175"/>
-      <w:r>
-        <w:t>11.1 Deployment paths</w:t>
-      </w:r>
-      <w:bookmarkEnd w:id="19"/>
-    </w:p>
-    <w:p>
-      <w:pPr>
-        <w:pStyle w:val="ListBullet"/>
-      </w:pPr>
-      <w:r>
-        <w:t>Packs: &lt;ExecutableDirectory&gt;\Localization\Languages\&lt;locale&gt;.json.</w:t>
-      </w:r>
-    </w:p>
-    <w:p>
-      <w:pPr>
-        <w:pStyle w:val="ListBullet"/>
-      </w:pPr>
-      <w:r>
-        <w:t>Preference: %LOCALAPPDATA%\&lt;ApplicationId&gt;\language.ini.</w:t>
-      </w:r>
-    </w:p>
-    <w:p>
-      <w:pPr>
-        <w:pStyle w:val="ListBullet"/>
-      </w:pPr>
-      <w:r>
-        <w:t>Studio preference: %LOCALAPPDATA%\DelphiAppTranslationStudio\language.ini.</w:t>
-      </w:r>
-    </w:p>
-    <w:p>
-      <w:pPr>
-        <w:pStyle w:val="ListBullet"/>
-      </w:pPr>
-      <w:r>
-        <w:t>Developer catalogs remain in the target source tree under Localization\Development.</w:t>
-      </w:r>
-    </w:p>
-    <w:p>
-      <w:pPr>
-        <w:pStyle w:val="Heading1"/>
-      </w:pPr>
-      <w:bookmarkStart w:id="20" w:name="_Toc237032176"/>
-      <w:r>
-        <w:t>12. Integration Planning and Transactions</w:t>
-      </w:r>
-      <w:bookmarkEnd w:id="20"/>
-    </w:p>
-    <w:p>
-      <w:r>
-        <w:t>DAT.Integration.Plan builds a human-readable plan. DAT.Integration.Package creates the generated application unit, framework adapter, shared runtime units, normalized JSON packs, automatic English source pack, language-menu manifest, and deployment script. DAT.Integration.Engine builds every proposed file change in memory, including language-pack installation. TIntegrationFileChange.ExactReviewText provides an optional complete line-numbered original/proposed LCS diff; generated files are shown in full.</w:t>
-      </w:r>
-    </w:p>
-    <w:p>
-      <w:r>
-        <w:t>One explicit authorization enables Apply; opening every diff is not required. DAT.Integration.Transaction checks source state, creates a verified pre-change backup, writes files atomically, rolls back failures, and records a manifest for restore. DAT.Integration.BuildDeploy can then invoke the Delphi 37 build elevated and deploy the package packs to the standardized executable output without launching it.</w:t>
-      </w:r>
-    </w:p>
-    <w:p>
-      <w:r>
-        <w:t>DAT.Integration.MenuResource modifies text DFM/FMX menus idempotently and preserves designer editability. It locates the first DPR-created form when a menu must be added, reuses an existing TMenuBar/TMainMenu when available, or persists a new framework-appropriate container and menu. DAT.Integration.DelphiSource adds matching component fields and applies narrowly scoped DPR, PAS, and DPROJ wiring. For FMX, it preserves an existing root OnCreate handler or persists datTranslationFormCreate in the FMX and add</w:t>
-      </w:r>
-      <w:r>
-        <w:t>s ApplyTranslation(Self) to its Pascal method. This respects the FMX form streaming lifecycle and avoids translating the first form from the DPR immediately after CreateForm.</w:t>
-      </w:r>
-    </w:p>
-    <w:p>
-      <w:pPr>
-        <w:pStyle w:val="Heading2"/>
-      </w:pPr>
-      <w:bookmarkStart w:id="21" w:name="_Toc237032177"/>
-      <w:r>
-        <w:t>12.1 Generated startup contract</w:t>
-      </w:r>
-      <w:bookmarkEnd w:id="21"/>
-    </w:p>
-    <w:p>
-      <w:pPr>
-        <w:pStyle w:val="ListBullet"/>
-      </w:pPr>
-      <w:r>
-        <w:t>InitializeTranslation runs before form creation.</w:t>
-      </w:r>
-    </w:p>
-    <w:p>
-      <w:pPr>
-        <w:pStyle w:val="ListBullet"/>
-      </w:pPr>
-      <w:r>
-        <w:t>VCL applies the first created form through the DPR startup wiring.</w:t>
-      </w:r>
-    </w:p>
-    <w:p>
-      <w:pPr>
-        <w:pStyle w:val="ListBullet"/>
-      </w:pPr>
-      <w:r>
-        <w:lastRenderedPageBreak/>
-        <w:t>FMX applies each form in its designer-persisted OnCreate handler after streaming is complete.</w:t>
-      </w:r>
-    </w:p>
-    <w:p>
-      <w:pPr>
-        <w:pStyle w:val="ListBullet"/>
-      </w:pPr>
-      <w:r>
-        <w:t>SelectLanguageMenuItem derives a locale from datLanguage_&lt;locale&gt; component names.</w:t>
-      </w:r>
-    </w:p>
-    <w:p>
-      <w:pPr>
-        <w:pStyle w:val="ListBullet"/>
-      </w:pPr>
-      <w:r>
-        <w:t>SelectLanguage applies the chosen pack to every currently open form immediately.</w:t>
-      </w:r>
-    </w:p>
-    <w:p>
-      <w:pPr>
-        <w:pStyle w:val="ListBullet"/>
-      </w:pPr>
-      <w:r>
-        <w:t>The generated en-US pack makes switching back to source text deterministic.</w:t>
-      </w:r>
-    </w:p>
-    <w:p>
-      <w:pPr>
-        <w:pStyle w:val="ListBullet"/>
-      </w:pPr>
-      <w:r>
-        <w:t>TranslateText provides resourcestring/code fallback access.</w:t>
-      </w:r>
-    </w:p>
-    <w:p>
-      <w:pPr>
-        <w:pStyle w:val="ListBullet"/>
-      </w:pPr>
-      <w:r>
-        <w:t>Runtime ownership is finalized safely.</w:t>
+        <w:t>Manager and lifecycle subscriptions are released deterministically.</w:t>
       </w:r>
     </w:p>
     <w:tbl>
@@ -4535,7 +4766,7 @@
               <w:t xml:space="preserve">Original code preservation. </w:t>
             </w:r>
             <w:r>
-              <w:t>Integration adds narrowly scoped calls and units but does not replace original captions or rewrite every control. The original DFM/FMX values continue to be the source-language fallback.</w:t>
+              <w:t>Recommended Component Integration performs zero automatic writes to the target. The developer's normal act of placing the manager causes Delphi to persist one component field/resource and applicable uses unit. Original DFM/FMX text remains the source-language fallback.</w:t>
             </w:r>
           </w:p>
         </w:tc>
@@ -4545,26 +4776,26 @@
       <w:pPr>
         <w:pStyle w:val="Heading1"/>
       </w:pPr>
-      <w:bookmarkStart w:id="22" w:name="_Toc237032178"/>
+      <w:bookmarkStart w:id="23" w:name="_Toc237099593"/>
       <w:r>
         <w:t>13. Self-Localization</w:t>
       </w:r>
-      <w:bookmarkEnd w:id="22"/>
-    </w:p>
-    <w:p>
-      <w:r>
-        <w:t>DAT.Studio.Translation resolves the project/deployed pack directory, initializes a Studio runtime before form creation, applies the active pack in FormCreate, and maps persisted language-menu names to locale codes. Self-integration recognizes the existing runtime and plans only the menu-resource change, preventing duplicate startup wiring.</w:t>
+      <w:bookmarkEnd w:id="23"/>
+    </w:p>
+    <w:p>
+      <w:r>
+        <w:t>DAT.Studio.Translation resolves the project/deployed pack directory, initializes a Studio runtime before form creation, applies the active pack in FormCreate, and maps persisted language-menu names to locale codes. Package streaming fixtures run in isolated bin\tests\packages directories so their local JSON cannot shadow the Studio's project/deployed packs.</w:t>
       </w:r>
     </w:p>
     <w:p>
       <w:pPr>
         <w:pStyle w:val="Heading1"/>
       </w:pPr>
-      <w:bookmarkStart w:id="23" w:name="_Toc237032179"/>
+      <w:bookmarkStart w:id="24" w:name="_Toc237099594"/>
       <w:r>
         <w:t>14. Error Handling and Diagnostics</w:t>
       </w:r>
-      <w:bookmarkEnd w:id="23"/>
+      <w:bookmarkEnd w:id="24"/>
     </w:p>
     <w:p>
       <w:pPr>
@@ -4618,11 +4849,11 @@
       <w:pPr>
         <w:pStyle w:val="Heading1"/>
       </w:pPr>
-      <w:bookmarkStart w:id="24" w:name="_Toc237032180"/>
+      <w:bookmarkStart w:id="25" w:name="_Toc237099595"/>
       <w:r>
         <w:t>15. Test Strategy and Verified Matrix</w:t>
       </w:r>
-      <w:bookmarkEnd w:id="24"/>
+      <w:bookmarkEnd w:id="25"/>
     </w:p>
     <w:tbl>
       <w:tblPr>
@@ -4709,7 +4940,72 @@
               <w:cnfStyle w:val="000000100000" w:firstRow="0" w:lastRow="0" w:firstColumn="0" w:lastColumn="0" w:oddVBand="0" w:evenVBand="0" w:oddHBand="1" w:evenHBand="0" w:firstRowFirstColumn="0" w:firstRowLastColumn="0" w:lastRowFirstColumn="0" w:lastRowLastColumn="0"/>
             </w:pPr>
             <w:r>
-              <w:t>Detection, scan-to-catalog, schema/provenance round-trip, provider client contracts, CSV interchange, review/approval, validation, runtime pack, preference, exact diff, integration, and self change set.</w:t>
+              <w:t>Detection, scan-to-catalog, schema/provenance round-trip, provider contracts, review/approval, validation, runtime pack, preference, advanced integration, component-kit contents, and SHA-256 non-mutation proof.</w:t>
+            </w:r>
+          </w:p>
+        </w:tc>
+      </w:tr>
+      <w:tr>
+        <w:trPr>
+          <w:cantSplit/>
+          <w:jc w:val="center"/>
+        </w:trPr>
+        <w:tc>
+          <w:tcPr>
+            <w:cnfStyle w:val="001000000000" w:firstRow="0" w:lastRow="0" w:firstColumn="1" w:lastColumn="0" w:oddVBand="0" w:evenVBand="0" w:oddHBand="0" w:evenHBand="0" w:firstRowFirstColumn="0" w:firstRowLastColumn="0" w:lastRowFirstColumn="0" w:lastRowLastColumn="0"/>
+            <w:tcW w:w="2700" w:type="dxa"/>
+            <w:vAlign w:val="center"/>
+          </w:tcPr>
+          <w:p>
+            <w:r>
+              <w:t>Language manager suites</w:t>
+            </w:r>
+          </w:p>
+        </w:tc>
+        <w:tc>
+          <w:tcPr>
+            <w:tcW w:w="6660" w:type="dxa"/>
+            <w:vAlign w:val="center"/>
+          </w:tcPr>
+          <w:p>
+            <w:pPr>
+              <w:cnfStyle w:val="000000000000" w:firstRow="0" w:lastRow="0" w:firstColumn="0" w:lastColumn="0" w:oddVBand="0" w:evenVBand="0" w:oddHBand="0" w:evenHBand="0" w:firstRowFirstColumn="0" w:firstRowLastColumn="0" w:lastRowFirstColumn="0" w:lastRowLastColumn="0"/>
+            </w:pPr>
+            <w:r>
+              <w:t>Core guards/generations, FMX before-show lifecycle, VCL discovery/modal boundary, stable identities, instant switching, state preservation, and deterministic cleanup on Win32/Win64.</w:t>
+            </w:r>
+          </w:p>
+        </w:tc>
+      </w:tr>
+      <w:tr>
+        <w:trPr>
+          <w:cnfStyle w:val="000000100000" w:firstRow="0" w:lastRow="0" w:firstColumn="0" w:lastColumn="0" w:oddVBand="0" w:evenVBand="0" w:oddHBand="1" w:evenHBand="0" w:firstRowFirstColumn="0" w:firstRowLastColumn="0" w:lastRowFirstColumn="0" w:lastRowLastColumn="0"/>
+          <w:cantSplit/>
+          <w:jc w:val="center"/>
+        </w:trPr>
+        <w:tc>
+          <w:tcPr>
+            <w:cnfStyle w:val="001000000000" w:firstRow="0" w:lastRow="0" w:firstColumn="1" w:lastColumn="0" w:oddVBand="0" w:evenVBand="0" w:oddHBand="0" w:evenHBand="0" w:firstRowFirstColumn="0" w:firstRowLastColumn="0" w:lastRowFirstColumn="0" w:lastRowLastColumn="0"/>
+            <w:tcW w:w="2700" w:type="dxa"/>
+            <w:vAlign w:val="center"/>
+          </w:tcPr>
+          <w:p>
+            <w:r>
+              <w:t>Package/selector suites</w:t>
+            </w:r>
+          </w:p>
+        </w:tc>
+        <w:tc>
+          <w:tcPr>
+            <w:tcW w:w="6660" w:type="dxa"/>
+            <w:vAlign w:val="center"/>
+          </w:tcPr>
+          <w:p>
+            <w:pPr>
+              <w:cnfStyle w:val="000000100000" w:firstRow="0" w:lastRow="0" w:firstColumn="0" w:lastColumn="0" w:oddVBand="0" w:evenVBand="0" w:oddHBand="1" w:evenHBand="0" w:firstRowFirstColumn="0" w:firstRowLastColumn="0" w:lastRowFirstColumn="0" w:lastRowLastColumn="0"/>
+            </w:pPr>
+            <w:r>
+              <w:t>Debug and Release runtime/design packages, DFM/FMX streaming, typed manager references, pack discovery, and selector language propagation on Win32/Win64.</w:t>
             </w:r>
           </w:p>
         </w:tc>
@@ -4760,7 +5056,6 @@
           </w:tcPr>
           <w:p>
             <w:r>
-              <w:lastRenderedPageBreak/>
               <w:t>FMXRuntimeSmokeTests</w:t>
             </w:r>
           </w:p>
@@ -4913,18 +5208,21 @@
     </w:tbl>
     <w:p>
       <w:r>
-        <w:t>On August 7, 2026, the deterministic release gate passed with real compilable VCL and FMX samples under Win32 and Win64. Scanner, catalog, provider request/response contracts, review, validation, export, integration, deployed packs, and required Italian launch titles passed without embedding a live credential. The Studio built in Debug and Release for both architectures, streamed its FMX form directly, launched normally, and self-localized to Italian in all four configurations.</w:t>
+        <w:t>On August 8, 2026, the complete release harness passed uninterrupted. Debug and Release component packages, Win32/Win64 manager suites, scanner/catalog/provider contracts, component non-mutation, runtime and advanced integration all passed. The Studio built in Debug and Release for both architectures, streamed its FMX form directly, launched normally, and self-localized to Italian in all four configurations. Disposable real-application pilots also built and opened translated first forms on Win32/Win64 for W</w:t>
+      </w:r>
+      <w:r>
+        <w:t>ebsite Analytics (FMX) and Courier Herald Reader (VCL).</w:t>
       </w:r>
     </w:p>
     <w:p>
       <w:pPr>
         <w:pStyle w:val="Heading2"/>
       </w:pPr>
-      <w:bookmarkStart w:id="25" w:name="_Toc237032181"/>
+      <w:bookmarkStart w:id="26" w:name="_Toc237099596"/>
       <w:r>
         <w:t>15.1 Optional live provider testing</w:t>
       </w:r>
-      <w:bookmarkEnd w:id="25"/>
+      <w:bookmarkEnd w:id="26"/>
     </w:p>
     <w:p>
       <w:r>
@@ -4935,11 +5233,11 @@
       <w:pPr>
         <w:pStyle w:val="Heading1"/>
       </w:pPr>
-      <w:bookmarkStart w:id="26" w:name="_Toc237032182"/>
+      <w:bookmarkStart w:id="27" w:name="_Toc237099597"/>
       <w:r>
         <w:t>16. Security Review</w:t>
       </w:r>
-      <w:bookmarkEnd w:id="26"/>
+      <w:bookmarkEnd w:id="27"/>
     </w:p>
     <w:tbl>
       <w:tblPr>
@@ -5044,7 +5342,6 @@
           </w:tcPr>
           <w:p>
             <w:r>
-              <w:lastRenderedPageBreak/>
               <w:t>Key leaked through URL/log</w:t>
             </w:r>
           </w:p>
@@ -5092,7 +5389,7 @@
               <w:cnfStyle w:val="000000100000" w:firstRow="0" w:lastRow="0" w:firstColumn="0" w:lastColumn="0" w:oddVBand="0" w:evenVBand="0" w:oddHBand="1" w:evenHBand="0" w:firstRowFirstColumn="0" w:firstRowLastColumn="0" w:lastRowFirstColumn="0" w:lastRowLastColumn="0"/>
             </w:pPr>
             <w:r>
-              <w:t>Profile display, previewed file change set, explicit Apply.</w:t>
+              <w:t>Recommended component kit has no target-write path; advanced mode uses profile display, preview, and explicit Apply.</w:t>
             </w:r>
           </w:p>
         </w:tc>
@@ -5237,11 +5534,11 @@
       <w:pPr>
         <w:pStyle w:val="Heading1"/>
       </w:pPr>
-      <w:bookmarkStart w:id="27" w:name="_Toc237032183"/>
+      <w:bookmarkStart w:id="28" w:name="_Toc237099598"/>
       <w:r>
         <w:t>17. Release and Contribution Workflow</w:t>
       </w:r>
-      <w:bookmarkEnd w:id="27"/>
+      <w:bookmarkEnd w:id="28"/>
     </w:p>
     <w:p>
       <w:pPr>
@@ -5355,11 +5652,11 @@
       <w:pPr>
         <w:pStyle w:val="Heading1"/>
       </w:pPr>
-      <w:bookmarkStart w:id="28" w:name="_Toc237032184"/>
+      <w:bookmarkStart w:id="29" w:name="_Toc237099599"/>
       <w:r>
         <w:t>18. Known Boundaries and Future-Compatible Design</w:t>
       </w:r>
-      <w:bookmarkEnd w:id="28"/>
+      <w:bookmarkEnd w:id="29"/>
     </w:p>
     <w:p>
       <w:pPr>
@@ -5374,7 +5671,6 @@
         <w:pStyle w:val="ListBullet"/>
       </w:pPr>
       <w:r>
-        <w:lastRenderedPageBreak/>
         <w:t>Google Advanced v3, OAuth/service-account workflows, and other providers are not implemented.</w:t>
       </w:r>
     </w:p>
@@ -5415,6 +5711,14 @@
         <w:pStyle w:val="ListBullet"/>
       </w:pPr>
       <w:r>
+        <w:t>VCL dynamic modeless forms may paint once in source language before idle discovery; call ApplyToForm before Show when a no-flicker first display is mandatory.</w:t>
+      </w:r>
+    </w:p>
+    <w:p>
+      <w:pPr>
+        <w:pStyle w:val="ListBullet"/>
+      </w:pPr>
+      <w:r>
         <w:t>Provider account terms and language support are external and must be rechecked for each release.</w:t>
       </w:r>
     </w:p>
@@ -5422,33 +5726,33 @@
       <w:pPr>
         <w:pStyle w:val="Heading1"/>
       </w:pPr>
-      <w:bookmarkStart w:id="29" w:name="_Toc237032185"/>
+      <w:bookmarkStart w:id="30" w:name="_Toc237099600"/>
       <w:r>
         <w:t>19. Documentation Generation</w:t>
       </w:r>
-      <w:bookmarkEnd w:id="29"/>
-    </w:p>
-    <w:p>
-      <w:r>
-        <w:t>The editable guides are generated from actual source and engineering notes with python-docx. Each DOCX contains a Word TOC field, a dedicated TOC section, and a new-page content section. Microsoft Word COM updates the TOC and fields, repaginates, and saves the DOCX. Word ExportAsFixedFormat is the preferred companion-PDF path; when that host export is unavailable, the documented fallback is styled HTML/CSS printed through Playwright. Final PDFs are rendered to page images and inspected before release.</w:t>
+      <w:bookmarkEnd w:id="30"/>
+    </w:p>
+    <w:p>
+      <w:r>
+        <w:t>The editable guides are generated from actual source and engineering notes with python-docx. Each DOCX contains a real Word TOC field, a dedicated TOC section, and a new-page content section. Microsoft Word COM updates every field and TOC, repaginates, saves the DOCX, and creates the companion PDF with ExportAsFixedFormat. PDF pages are rendered to images and inspected before release. LibreOffice is not used for this project.</w:t>
       </w:r>
     </w:p>
     <w:p>
       <w:pPr>
         <w:pStyle w:val="Heading1"/>
       </w:pPr>
-      <w:bookmarkStart w:id="30" w:name="_Toc237032186"/>
+      <w:bookmarkStart w:id="31" w:name="_Toc237099601"/>
       <w:r>
         <w:t>20. Source References</w:t>
       </w:r>
-      <w:bookmarkEnd w:id="30"/>
+      <w:bookmarkEnd w:id="31"/>
     </w:p>
     <w:p>
       <w:pPr>
         <w:pStyle w:val="ListBullet"/>
       </w:pPr>
       <w:r>
-        <w:t>Repository source, forms, project metadata, schemas, and smoke tests as of August 7, 2026.</w:t>
+        <w:t>Repository source, forms, project metadata, schemas, and smoke tests as of August 8, 2026.</w:t>
       </w:r>
     </w:p>
     <w:p>
@@ -5707,7 +6011,7 @@
         <w:color w:val="5D7693"/>
         <w:sz w:val="16"/>
       </w:rPr>
-      <w:t>Delphi App Translation Studio — Engineering Guide</w:t>
+      <w:t>Delphi App Translation Studio - Engineering Guide</w:t>
     </w:r>
   </w:p>
 </w:hdr>
@@ -5726,7 +6030,7 @@
         <w:color w:val="5D7693"/>
         <w:sz w:val="16"/>
       </w:rPr>
-      <w:t>Delphi App Translation Studio — Engineering Guide</w:t>
+      <w:t>Delphi App Translation Studio - Engineering Guide</w:t>
     </w:r>
   </w:p>
 </w:hdr>
@@ -5905,40 +6209,40 @@
       </w:rPr>
     </w:lvl>
   </w:abstractNum>
-  <w:num w:numId="1" w16cid:durableId="7682366">
+  <w:num w:numId="1" w16cid:durableId="95828009">
     <w:abstractNumId w:val="8"/>
   </w:num>
-  <w:num w:numId="2" w16cid:durableId="59519788">
+  <w:num w:numId="2" w16cid:durableId="852301574">
     <w:abstractNumId w:val="6"/>
   </w:num>
-  <w:num w:numId="3" w16cid:durableId="731733184">
+  <w:num w:numId="3" w16cid:durableId="1901868361">
     <w:abstractNumId w:val="5"/>
   </w:num>
-  <w:num w:numId="4" w16cid:durableId="978076263">
+  <w:num w:numId="4" w16cid:durableId="1575430744">
     <w:abstractNumId w:val="4"/>
   </w:num>
-  <w:num w:numId="5" w16cid:durableId="841509379">
+  <w:num w:numId="5" w16cid:durableId="890581061">
     <w:abstractNumId w:val="7"/>
   </w:num>
-  <w:num w:numId="6" w16cid:durableId="1721594691">
+  <w:num w:numId="6" w16cid:durableId="276915753">
     <w:abstractNumId w:val="3"/>
   </w:num>
-  <w:num w:numId="7" w16cid:durableId="1127893741">
+  <w:num w:numId="7" w16cid:durableId="1692143596">
     <w:abstractNumId w:val="2"/>
   </w:num>
-  <w:num w:numId="8" w16cid:durableId="581647136">
+  <w:num w:numId="8" w16cid:durableId="611784032">
     <w:abstractNumId w:val="1"/>
   </w:num>
-  <w:num w:numId="9" w16cid:durableId="34936894">
+  <w:num w:numId="9" w16cid:durableId="848059222">
     <w:abstractNumId w:val="0"/>
   </w:num>
-  <w:num w:numId="10" w16cid:durableId="755172528">
+  <w:num w:numId="10" w16cid:durableId="1107575922">
     <w:abstractNumId w:val="7"/>
     <w:lvlOverride w:ilvl="0">
       <w:startOverride w:val="1"/>
     </w:lvlOverride>
   </w:num>
-  <w:num w:numId="11" w16cid:durableId="2134135562">
+  <w:num w:numId="11" w16cid:durableId="1040588261">
     <w:abstractNumId w:val="7"/>
     <w:lvlOverride w:ilvl="0">
       <w:startOverride w:val="1"/>
@@ -7279,6 +7583,9 @@
     <w:pPr>
       <w:outlineLvl w:val="9"/>
     </w:pPr>
+    <w:rPr>
+      <w:rFonts w:ascii="Calibri" w:hAnsi="Calibri"/>
+    </w:rPr>
   </w:style>
   <w:style w:type="table" w:styleId="TableGrid">
     <w:name w:val="Table Grid"/>
@@ -17365,7 +17672,7 @@
     <w:autoRedefine/>
     <w:uiPriority w:val="39"/>
     <w:unhideWhenUsed/>
-    <w:rsid w:val="00C260D9"/>
+    <w:rsid w:val="00AF76B2"/>
     <w:pPr>
       <w:spacing w:after="100"/>
     </w:pPr>
@@ -17377,7 +17684,7 @@
     <w:autoRedefine/>
     <w:uiPriority w:val="39"/>
     <w:unhideWhenUsed/>
-    <w:rsid w:val="00C260D9"/>
+    <w:rsid w:val="00AF76B2"/>
     <w:pPr>
       <w:spacing w:after="100"/>
       <w:ind w:left="220"/>
@@ -17388,7 +17695,7 @@
     <w:basedOn w:val="DefaultParagraphFont"/>
     <w:uiPriority w:val="99"/>
     <w:unhideWhenUsed/>
-    <w:rsid w:val="00C260D9"/>
+    <w:rsid w:val="00AF76B2"/>
     <w:rPr>
       <w:color w:val="0000FF" w:themeColor="hyperlink"/>
       <w:u w:val="single"/>

</xml_diff>

<commit_message>
Add guided translation setup wizard
</commit_message>
<xml_diff>
--- a/docs/guides/Delphi App Translation Studio Engineering Guide.docx
+++ b/docs/guides/Delphi App Translation Studio Engineering Guide.docx
@@ -122,7 +122,13 @@
           <w:color w:val="5D7693"/>
         </w:rPr>
         <w:br/>
-        <w:t>Last changed: August 9, 2026</w:t>
+      </w:r>
+      <w:r>
+        <w:rPr>
+          <w:rFonts w:ascii="Aptos" w:hAnsi="Aptos"/>
+          <w:color w:val="5D7693"/>
+        </w:rPr>
+        <w:t>Last changed: August 10, 2026</w:t>
       </w:r>
       <w:r>
         <w:rPr>
@@ -2363,7 +2369,6 @@
       </w:pPr>
       <w:bookmarkStart w:id="0" w:name="_Toc237169179"/>
       <w:r>
-        <w:lastRenderedPageBreak/>
         <w:t>1. Product Scope and Invariants</w:t>
       </w:r>
       <w:bookmarkEnd w:id="0"/>
@@ -2669,7 +2674,6 @@
           </w:tcPr>
           <w:p>
             <w:r>
-              <w:lastRenderedPageBreak/>
               <w:t>source\components</w:t>
             </w:r>
           </w:p>
@@ -2931,9 +2935,6 @@
     <w:p>
       <w:pPr>
         <w:pStyle w:val="CodeBlock"/>
-        <w:rPr>
-          <w:rFonts w:hint="eastAsia"/>
-        </w:rPr>
       </w:pPr>
       <w:r>
         <w:t>call "C:\Program Files (x86)\Embarcadero\Studio\37.0\bin\rsvars.bat"</w:t>
@@ -3097,7 +3098,6 @@
           </w:tcPr>
           <w:p>
             <w:r>
-              <w:lastRenderedPageBreak/>
               <w:t>Catalog</w:t>
             </w:r>
           </w:p>
@@ -3481,9 +3481,6 @@
     <w:p>
       <w:pPr>
         <w:pStyle w:val="CodeBlock"/>
-        <w:rPr>
-          <w:rFonts w:hint="eastAsia"/>
-        </w:rPr>
       </w:pPr>
       <w:r>
         <w:t>{</w:t>
@@ -3502,9 +3499,6 @@
       </w:r>
       <w:r>
         <w:br/>
-      </w:r>
-      <w:r>
-        <w:lastRenderedPageBreak/>
         <w:t xml:space="preserve">  "locale": {"languageCode": "it-IT", "nativeLanguageName": "Italiano"},</w:t>
       </w:r>
       <w:r>
@@ -3521,8 +3515,6 @@
       </w:r>
       <w:r>
         <w:br/>
-      </w:r>
-      <w:r>
         <w:t xml:space="preserve">               "runtimeApplication": "automatic"}]</w:t>
       </w:r>
       <w:r>
@@ -3543,9 +3535,6 @@
     <w:p>
       <w:pPr>
         <w:pStyle w:val="CodeBlock"/>
-        <w:rPr>
-          <w:rFonts w:hint="eastAsia"/>
-        </w:rPr>
       </w:pPr>
       <w:r>
         <w:t>{</w:t>
@@ -3698,11 +3687,7 @@
     </w:p>
     <w:p>
       <w:r>
-        <w:t xml:space="preserve">DAT.Studio.MainForm.fmx contains the complete orange-and-blue interface. The form persists WindowState=wsMaximized, uses client-aligned workflow cards, anchors resizable work areas to every relevant edge, and keeps the status card at the bottom. The workflow selection rectangle moves among </w:t>
-      </w:r>
-      <w:r>
-        <w:lastRenderedPageBreak/>
-        <w:t>Project, Scan, Translate, Validation, Export, Integration, and Provider Settings. Language and provider choices, Translate Automatically, key-management actions, and all other controls are persisted designer objects. DAT.Studio.MainForm.pas contains event and state logic only; it does not construct controls.</w:t>
+        <w:t>DAT.Studio.MainForm.fmx contains the complete orange-and-blue interface. The form persists WindowState=wsMaximized, uses client-aligned workflow cards, anchors resizable work areas to every relevant edge, and keeps the status card at the bottom. The workflow selection rectangle moves among Project, Scan, Translate, Validation, Export, Integration, and Provider Settings. Language and provider choices, Translate Automatically, key-management actions, and all other controls are persisted designer objects. DAT.Studio.MainForm.pas contains event and state logic only; it does not construct controls.</w:t>
       </w:r>
     </w:p>
     <w:p>
@@ -3744,9 +3729,6 @@
           <w:p>
             <w:pPr>
               <w:pStyle w:val="Callout"/>
-              <w:rPr>
-                <w:rFonts w:hint="eastAsia"/>
-              </w:rPr>
             </w:pPr>
             <w:r>
               <w:rPr>
@@ -4019,7 +4001,6 @@
         <w:pStyle w:val="ListBullet"/>
       </w:pPr>
       <w:r>
-        <w:lastRenderedPageBreak/>
         <w:t>No error message contains the key, request headers, or provider response body.</w:t>
       </w:r>
     </w:p>
@@ -4419,7 +4400,6 @@
         <w:pStyle w:val="ListBullet"/>
       </w:pPr>
       <w:r>
-        <w:lastRenderedPageBreak/>
         <w:t>Google Cloud Translation authentication: https://docs.cloud.google.com/translate/docs/authentication</w:t>
       </w:r>
     </w:p>
@@ -4528,17 +4508,13 @@
       </w:pPr>
       <w:bookmarkStart w:id="16" w:name="_Toc237169195"/>
       <w:r>
-        <w:lastRenderedPageBreak/>
         <w:t>10. Validation and Runtime Pack Export</w:t>
       </w:r>
       <w:bookmarkEnd w:id="16"/>
     </w:p>
     <w:p>
       <w:r>
-        <w:t>DAT.Validation.Catalog validates metadata, missing target text, duplicates, changed source, Delphi indexed and sequential Format arguments, accelerators, inconsistent repeated-source terminology, and status conditions. Export is blocked by errors. Common runtime placeholders such as -- are informational when intentionally unchanged. The UI explains severity and maps a double-clicked entry issue back to the Translate list. Manual resourcestring wiring is reported separately from structural errors. DAT.Core.R</w:t>
-      </w:r>
-      <w:r>
-        <w:t>untimePack serializes only runtime-required metadata and strings and records a source-catalog checksum.</w:t>
+        <w:t>DAT.Validation.Catalog validates metadata, missing target text, duplicates, changed source, Delphi indexed and sequential Format arguments, accelerators, inconsistent repeated-source terminology, and status conditions. Export is blocked by errors. Common runtime placeholders such as -- are informational when intentionally unchanged. The UI explains severity and maps a double-clicked entry issue back to the Translate list. Manual resourcestring wiring is reported separately from structural errors. DAT.Core.RuntimePack serializes only runtime-required metadata and strings and records a source-catalog checksum.</w:t>
       </w:r>
     </w:p>
     <w:p>
@@ -4558,10 +4534,7 @@
     </w:p>
     <w:p>
       <w:r>
-        <w:t>DAT.Runtime.LanguagePack loads and discovers JSON packs, checks application identity, rejects empty/invalid packs, canonicalizes native language names, de-duplicates exact locale codes, and suppresses a generic locale when a regional variant exists. DAT.Runtime.Preference reads/writes the selected locale. DAT.Runtime.Manager owns the active pack, discovery, preference, translation lookup, and locale format settings. The source language loads its generated JSON pack when present and falls back to designer te</w:t>
-      </w:r>
-      <w:r>
-        <w:t>xt only for older deployments without that pack.</w:t>
+        <w:t>DAT.Runtime.LanguagePack loads and discovers JSON packs, checks application identity, rejects empty/invalid packs, canonicalizes native language names, de-duplicates exact locale codes, and suppresses a generic locale when a regional variant exists. DAT.Runtime.Preference reads/writes the selected locale. DAT.Runtime.Manager owns the active pack, discovery, preference, translation lookup, and locale format settings. The source language loads its generated JSON pack when present and falls back to designer text only for older deployments without that pack.</w:t>
       </w:r>
     </w:p>
     <w:p>
@@ -4586,15 +4559,11 @@
     </w:p>
     <w:p>
       <w:r>
-        <w:t>TDATFMXLanguageManager subscribes additively to TFormBeforeShownMessage and TFormReleasedMessage. It translates after streaming but before OnShow/first paint and never replaces a global handler. TDATVCLLanguageManager owns a private TApplicationEvents, discovers visible forms on throttled idle, and inspects modal forms before display. VCL has no public additive before-show notification for every dynamic modeless form; such a form can paint once in the source language unless the application calls ApplyToForm</w:t>
-      </w:r>
-      <w:r>
-        <w:t xml:space="preserve"> before Show.</w:t>
-      </w:r>
-    </w:p>
-    <w:p>
-      <w:r>
-        <w:lastRenderedPageBreak/>
+        <w:t>TDATFMXLanguageManager subscribes additively to TFormBeforeShownMessage and TFormReleasedMessage. It translates after streaming but before OnShow/first paint and never replaces a global handler. TDATVCLLanguageManager owns a private TApplicationEvents, discovers visible forms on throttled idle, and inspects modal forms before display. VCL has no public additive before-show notification for every dynamic modeless form; such a form can paint once in the source language unless the application calls ApplyToForm before Show.</w:t>
+      </w:r>
+    </w:p>
+    <w:p>
+      <w:r>
         <w:t>PreserveControlState protects writable edit/memo data, focus, selection ranges, and list/combo ItemIndex. Collection replacement temporarily suppresses and then restores OnChange. Read-only instructional memo content remains translatable.</w:t>
       </w:r>
     </w:p>
@@ -4672,19 +4641,12 @@
     </w:p>
     <w:p>
       <w:r>
-        <w:t xml:space="preserve">The Studio's Show Design BPL action selects the matching, verified, self-contained package under bin\packages\Win32\Release. The developer installs that stable file with RAD Studio's Component &gt; Install Packages &gt; Add command. The Studio does not copy BPLs to public Delphi folders, write Known Packages registry values, close/restart RAD Studio, or expose automatic package installation. Delphi therefore remains the sole owner of design-package registration. Generated per-project kits contain no BPLs and are </w:t>
-      </w:r>
-      <w:r>
-        <w:t>regenerated from a clean output directory, so they can be replaced without invalidating Delphi's registered package path.</w:t>
-      </w:r>
-    </w:p>
-    <w:p>
-      <w:r>
-        <w:t xml:space="preserve">DAT.Integration.ComponentPackage implements the recommended non-mutating mode. It emits applicable runtime/component units, validated translated packs, an English source pack, component-integration.json, scanner form roots, README instructions, and a deployment script exclusively below </w:t>
-      </w:r>
-      <w:r>
-        <w:lastRenderedPageBreak/>
-        <w:t>export\component-integration. SHA-256 fixture tests prove target DPROJ and DFM/FMX hashes remain unchanged.</w:t>
+        <w:t>The Studio's Show Design BPL action selects the matching, verified, self-contained package under bin\packages\Win32\Release. The developer installs that stable file with RAD Studio's Component &gt; Install Packages &gt; Add command. The Studio does not copy BPLs to public Delphi folders, write Known Packages registry values, close/restart RAD Studio, or expose automatic package installation. Delphi therefore remains the sole owner of design-package registration. Generated per-project kits contain no BPLs and are regenerated from a clean output directory, so they can be replaced without invalidating Delphi's registered package path.</w:t>
+      </w:r>
+    </w:p>
+    <w:p>
+      <w:r>
+        <w:t>DAT.Integration.ComponentPackage implements the recommended non-mutating mode. It emits applicable runtime/component units, validated translated packs, an English source pack, component-integration.json, scanner form roots, README instructions, and a deployment script exclusively below export\component-integration. SHA-256 fixture tests prove target DPROJ and DFM/FMX hashes remain unchanged.</w:t>
       </w:r>
     </w:p>
     <w:p>
@@ -4787,9 +4749,6 @@
           <w:p>
             <w:pPr>
               <w:pStyle w:val="Callout"/>
-              <w:rPr>
-                <w:rFonts w:hint="eastAsia"/>
-              </w:rPr>
             </w:pPr>
             <w:r>
               <w:rPr>
@@ -4875,7 +4834,6 @@
         <w:pStyle w:val="ListBullet"/>
       </w:pPr>
       <w:r>
-        <w:lastRenderedPageBreak/>
         <w:t>Provider keys must never be added to troubleshooting logs.</w:t>
       </w:r>
     </w:p>
@@ -5242,11 +5200,7 @@
     </w:tbl>
     <w:p>
       <w:r>
-        <w:t xml:space="preserve">On August 9, 2026, the complete release harness passed uninterrupted. Debug and Release component packages, Win32/Win64 manager suites, scanner/catalog/provider contracts, component non-mutation, </w:t>
-      </w:r>
-      <w:r>
-        <w:lastRenderedPageBreak/>
-        <w:t>runtime and advanced integration all passed. The Studio built in Debug and Release for both architectures, streamed its FMX form directly, launched normally, and self-localized to Italian in all four configurations. Disposable real-application pilots also built and opened translated first forms on Win32/Win64 for Website Analytics (FMX) and Courier Herald Reader (VCL).</w:t>
+        <w:t>On August 9, 2026, the complete release harness passed uninterrupted. Debug and Release component packages, Win32/Win64 manager suites, scanner/catalog/provider contracts, component non-mutation, runtime and advanced integration all passed. The Studio built in Debug and Release for both architectures, streamed its FMX form directly, launched normally, and self-localized to Italian in all four configurations. Disposable real-application pilots also built and opened translated first forms on Win32/Win64 for Website Analytics (FMX) and Courier Herald Reader (VCL).</w:t>
       </w:r>
     </w:p>
     <w:p>
@@ -5562,11 +5516,7 @@
     </w:tbl>
     <w:p>
       <w:r>
-        <w:t xml:space="preserve">Windows Credential Manager follows Microsoft guidance for application credentials (CredWrite/CredRead). It protects persistence under the signed-in Windows context; it does not make a </w:t>
-      </w:r>
-      <w:r>
-        <w:lastRenderedPageBreak/>
-        <w:t>key safe from malware running as that user. Provider-side restrictions, quotas, rotation, and least privilege remain necessary.</w:t>
+        <w:t>Windows Credential Manager follows Microsoft guidance for application credentials (CredWrite/CredRead). It protects persistence under the signed-in Windows context; it does not make a key safe from malware running as that user. Provider-side restrictions, quotas, rotation, and least privilege remain necessary.</w:t>
       </w:r>
     </w:p>
     <w:p>
@@ -5782,7 +5732,6 @@
       </w:pPr>
       <w:bookmarkStart w:id="31" w:name="_Toc237169210"/>
       <w:r>
-        <w:lastRenderedPageBreak/>
         <w:t>20. Source References</w:t>
       </w:r>
       <w:bookmarkEnd w:id="31"/>
@@ -5835,6 +5784,153 @@
         <w:t>Google API-key guidance: https://docs.cloud.google.com/docs/authentication/api-keys-best-practices</w:t>
       </w:r>
     </w:p>
+    <w:p>
+      <w:pPr>
+        <w:spacing w:after="200" w:line="276" w:lineRule="auto"/>
+      </w:pPr>
+      <w:r>
+        <w:br w:type="page"/>
+      </w:r>
+    </w:p>
+    <w:p>
+      <w:pPr>
+        <w:pStyle w:val="Heading1"/>
+      </w:pPr>
+      <w:r>
+        <w:t>Guided Setup Wizard Architecture</w:t>
+      </w:r>
+    </w:p>
+    <w:p>
+      <w:r>
+        <w:t>DAT.Studio.SetupWizard is a designer-authored FMX modal form. It is intentionally borderless, fixed-size, centered, and has no menu or system controls. All controls and layout parameters remain editable in the FMX designer. The main Studio launches it from Start Guided Setup while retaining the existing workflow as the advanced fallback.</w:t>
+      </w:r>
+    </w:p>
+    <w:p>
+      <w:pPr>
+        <w:pStyle w:val="ListNumber"/>
+        <w:numPr>
+          <w:ilvl w:val="0"/>
+          <w:numId w:val="16"/>
+        </w:numPr>
+      </w:pPr>
+      <w:r>
+        <w:t>The wizard owns isolated project-profile, scan-result, catalog, provider-key, backup, and component-kit state. No target source integration engine is invoked.</w:t>
+      </w:r>
+    </w:p>
+    <w:p>
+      <w:pPr>
+        <w:pStyle w:val="ListNumber"/>
+        <w:numPr>
+          <w:ilvl w:val="0"/>
+          <w:numId w:val="16"/>
+        </w:numPr>
+      </w:pPr>
+      <w:r>
+        <w:t>The left rail permits navigation only to steps already reached. A changed project or target language invalidates downstream scan/catalog state.</w:t>
+      </w:r>
+    </w:p>
+    <w:p>
+      <w:pPr>
+        <w:pStyle w:val="ListNumber"/>
+        <w:numPr>
+          <w:ilvl w:val="0"/>
+          <w:numId w:val="16"/>
+        </w:numPr>
+      </w:pPr>
+      <w:r>
+        <w:t>Pre-final activities are read-only with respect to the target except an explicitly saved provider credential, which is stored through Windows Credential Manager.</w:t>
+      </w:r>
+    </w:p>
+    <w:p>
+      <w:pPr>
+        <w:pStyle w:val="ListNumber"/>
+        <w:numPr>
+          <w:ilvl w:val="0"/>
+          <w:numId w:val="16"/>
+        </w:numPr>
+      </w:pPr>
+      <w:r>
+        <w:t>Final processing optionally creates a timestamped ZIP in Documents\Delphi App Translation Backups, translates only unresolved eligible entries, saves the development catalog, validates, exports the runtime JSON pack, and generates the component kit.</w:t>
+      </w:r>
+    </w:p>
+    <w:p>
+      <w:pPr>
+        <w:pStyle w:val="ListNumber"/>
+        <w:numPr>
+          <w:ilvl w:val="0"/>
+          <w:numId w:val="16"/>
+        </w:numPr>
+      </w:pPr>
+      <w:r>
+        <w:t>Blocking validation errors stop final processing before component-kit completion. Reviewed and approved translations are never resent automatically.</w:t>
+      </w:r>
+    </w:p>
+    <w:p>
+      <w:pPr>
+        <w:pStyle w:val="ListNumber"/>
+        <w:numPr>
+          <w:ilvl w:val="0"/>
+          <w:numId w:val="16"/>
+        </w:numPr>
+      </w:pPr>
+      <w:r>
+        <w:t>During final processing, Back, Cancel, the rail, and close-query approval are disabled. On failure, control is restored and the progress log identifies the stopping point.</w:t>
+      </w:r>
+    </w:p>
+    <w:p>
+      <w:pPr>
+        <w:pStyle w:val="ListNumber"/>
+        <w:numPr>
+          <w:ilvl w:val="0"/>
+          <w:numId w:val="16"/>
+        </w:numPr>
+      </w:pPr>
+      <w:r>
+        <w:t>The wizard generates four exact deployment commands for Win32 and Win64 Debug and Release. Every command launches the system Windows PowerShell executable with -NoProfile -ExecutionPolicy Bypass.</w:t>
+      </w:r>
+    </w:p>
+    <w:p>
+      <w:pPr>
+        <w:pStyle w:val="ListNumber"/>
+        <w:numPr>
+          <w:ilvl w:val="0"/>
+          <w:numId w:val="16"/>
+        </w:numPr>
+      </w:pPr>
+      <w:r>
+        <w:t>Run Pack Deployment executes the same generated script only for target output folders that exist. Missing output folders are skipped.</w:t>
+      </w:r>
+    </w:p>
+    <w:p>
+      <w:pPr>
+        <w:pStyle w:val="ListNumber"/>
+        <w:numPr>
+          <w:ilvl w:val="0"/>
+          <w:numId w:val="16"/>
+        </w:numPr>
+      </w:pPr>
+      <w:r>
+        <w:t>The component package remains a manual RAD Studio operation through Component &gt; Install Packages &gt; Add. The wizard never writes the IDE package registry and never uses the Install Component wizard.</w:t>
+      </w:r>
+    </w:p>
+    <w:p>
+      <w:pPr>
+        <w:pStyle w:val="ListNumber"/>
+        <w:numPr>
+          <w:ilvl w:val="0"/>
+          <w:numId w:val="16"/>
+        </w:numPr>
+      </w:pPr>
+      <w:r>
+        <w:t>Wizard-Completion-Report.txt is written into the generated kit and records the project, language, catalog, runtime pack, backup, manual step, and deployment commands.</w:t>
+      </w:r>
+    </w:p>
+    <w:p>
+      <w:r>
+        <w:t>The form source is source\studio\DAT.Studio.SetupWizard.pas and its editable designer resource is source\studio\DAT.Studio.SetupWizard.fmx. The unit is registered in the DPR and DPROJ. Release validation must compile Win32 and Win64 Debug and Release and instantiate the wizard form to verify FMX streaming.</w:t>
+      </w:r>
+    </w:p>
+    <w:p/>
     <w:sectPr>
       <w:headerReference w:type="default" r:id="rId13"/>
       <w:footerReference w:type="default" r:id="rId14"/>
@@ -6247,6 +6343,134 @@
       <w:rPr>
         <w:rFonts w:ascii="Symbol" w:hAnsi="Symbol" w:hint="default"/>
       </w:rPr>
+    </w:lvl>
+  </w:abstractNum>
+  <w:abstractNum w:abstractNumId="9" w15:restartNumberingAfterBreak="0">
+    <w:nsid w:val="345C6417"/>
+    <w:multiLevelType w:val="singleLevel"/>
+    <w:tmpl w:val="0409000F"/>
+    <w:lvl w:ilvl="0">
+      <w:start w:val="1"/>
+      <w:numFmt w:val="decimal"/>
+      <w:lvlText w:val="%1."/>
+      <w:lvlJc w:val="left"/>
+      <w:pPr>
+        <w:ind w:left="720" w:hanging="360"/>
+      </w:pPr>
+    </w:lvl>
+  </w:abstractNum>
+  <w:abstractNum w:abstractNumId="10" w15:restartNumberingAfterBreak="0">
+    <w:nsid w:val="5E3D2508"/>
+    <w:multiLevelType w:val="hybridMultilevel"/>
+    <w:tmpl w:val="D9C858E4"/>
+    <w:lvl w:ilvl="0" w:tplc="0409000F">
+      <w:start w:val="1"/>
+      <w:numFmt w:val="decimal"/>
+      <w:lvlText w:val="%1."/>
+      <w:lvlJc w:val="left"/>
+      <w:pPr>
+        <w:ind w:left="360" w:hanging="360"/>
+      </w:pPr>
+    </w:lvl>
+    <w:lvl w:ilvl="1" w:tplc="04090019" w:tentative="1">
+      <w:start w:val="1"/>
+      <w:numFmt w:val="lowerLetter"/>
+      <w:lvlText w:val="%2."/>
+      <w:lvlJc w:val="left"/>
+      <w:pPr>
+        <w:ind w:left="1080" w:hanging="360"/>
+      </w:pPr>
+    </w:lvl>
+    <w:lvl w:ilvl="2" w:tplc="0409001B" w:tentative="1">
+      <w:start w:val="1"/>
+      <w:numFmt w:val="lowerRoman"/>
+      <w:lvlText w:val="%3."/>
+      <w:lvlJc w:val="right"/>
+      <w:pPr>
+        <w:ind w:left="1800" w:hanging="180"/>
+      </w:pPr>
+    </w:lvl>
+    <w:lvl w:ilvl="3" w:tplc="0409000F" w:tentative="1">
+      <w:start w:val="1"/>
+      <w:numFmt w:val="decimal"/>
+      <w:lvlText w:val="%4."/>
+      <w:lvlJc w:val="left"/>
+      <w:pPr>
+        <w:ind w:left="2520" w:hanging="360"/>
+      </w:pPr>
+    </w:lvl>
+    <w:lvl w:ilvl="4" w:tplc="04090019" w:tentative="1">
+      <w:start w:val="1"/>
+      <w:numFmt w:val="lowerLetter"/>
+      <w:lvlText w:val="%5."/>
+      <w:lvlJc w:val="left"/>
+      <w:pPr>
+        <w:ind w:left="3240" w:hanging="360"/>
+      </w:pPr>
+    </w:lvl>
+    <w:lvl w:ilvl="5" w:tplc="0409001B" w:tentative="1">
+      <w:start w:val="1"/>
+      <w:numFmt w:val="lowerRoman"/>
+      <w:lvlText w:val="%6."/>
+      <w:lvlJc w:val="right"/>
+      <w:pPr>
+        <w:ind w:left="3960" w:hanging="180"/>
+      </w:pPr>
+    </w:lvl>
+    <w:lvl w:ilvl="6" w:tplc="0409000F" w:tentative="1">
+      <w:start w:val="1"/>
+      <w:numFmt w:val="decimal"/>
+      <w:lvlText w:val="%7."/>
+      <w:lvlJc w:val="left"/>
+      <w:pPr>
+        <w:ind w:left="4680" w:hanging="360"/>
+      </w:pPr>
+    </w:lvl>
+    <w:lvl w:ilvl="7" w:tplc="04090019" w:tentative="1">
+      <w:start w:val="1"/>
+      <w:numFmt w:val="lowerLetter"/>
+      <w:lvlText w:val="%8."/>
+      <w:lvlJc w:val="left"/>
+      <w:pPr>
+        <w:ind w:left="5400" w:hanging="360"/>
+      </w:pPr>
+    </w:lvl>
+    <w:lvl w:ilvl="8" w:tplc="0409001B" w:tentative="1">
+      <w:start w:val="1"/>
+      <w:numFmt w:val="lowerRoman"/>
+      <w:lvlText w:val="%9."/>
+      <w:lvlJc w:val="right"/>
+      <w:pPr>
+        <w:ind w:left="6120" w:hanging="180"/>
+      </w:pPr>
+    </w:lvl>
+  </w:abstractNum>
+  <w:abstractNum w:abstractNumId="11" w15:restartNumberingAfterBreak="0">
+    <w:nsid w:val="5FAF7620"/>
+    <w:multiLevelType w:val="singleLevel"/>
+    <w:tmpl w:val="0409000F"/>
+    <w:lvl w:ilvl="0">
+      <w:start w:val="1"/>
+      <w:numFmt w:val="decimal"/>
+      <w:lvlText w:val="%1."/>
+      <w:lvlJc w:val="left"/>
+      <w:pPr>
+        <w:ind w:left="720" w:hanging="360"/>
+      </w:pPr>
+    </w:lvl>
+  </w:abstractNum>
+  <w:abstractNum w:abstractNumId="12" w15:restartNumberingAfterBreak="0">
+    <w:nsid w:val="6D176838"/>
+    <w:multiLevelType w:val="singleLevel"/>
+    <w:tmpl w:val="0409000F"/>
+    <w:lvl w:ilvl="0">
+      <w:start w:val="1"/>
+      <w:numFmt w:val="decimal"/>
+      <w:lvlText w:val="%1."/>
+      <w:lvlJc w:val="left"/>
+      <w:pPr>
+        <w:ind w:left="720" w:hanging="360"/>
+      </w:pPr>
     </w:lvl>
   </w:abstractNum>
   <w:num w:numId="1" w16cid:durableId="715734825">
@@ -6287,6 +6511,24 @@
     <w:lvlOverride w:ilvl="0">
       <w:startOverride w:val="1"/>
     </w:lvlOverride>
+  </w:num>
+  <w:num w:numId="12" w16cid:durableId="1682587093">
+    <w:abstractNumId w:val="7"/>
+    <w:lvlOverride w:ilvl="0">
+      <w:startOverride w:val="1"/>
+    </w:lvlOverride>
+  </w:num>
+  <w:num w:numId="13" w16cid:durableId="170532043">
+    <w:abstractNumId w:val="10"/>
+  </w:num>
+  <w:num w:numId="14" w16cid:durableId="432823334">
+    <w:abstractNumId w:val="12"/>
+  </w:num>
+  <w:num w:numId="15" w16cid:durableId="629825227">
+    <w:abstractNumId w:val="11"/>
+  </w:num>
+  <w:num w:numId="16" w16cid:durableId="561674159">
+    <w:abstractNumId w:val="9"/>
   </w:num>
 </w:numbering>
 </file>
@@ -7256,7 +7498,6 @@
         <w:numId w:val="5"/>
       </w:numPr>
       <w:spacing w:after="80"/>
-      <w:ind w:left="540" w:hanging="271"/>
       <w:contextualSpacing/>
     </w:pPr>
   </w:style>

</xml_diff>

<commit_message>
Fix setup wizard and expand first-time documentation
</commit_message>
<xml_diff>
--- a/docs/guides/Delphi App Translation Studio Engineering Guide.docx
+++ b/docs/guides/Delphi App Translation Studio Engineering Guide.docx
@@ -13,7 +13,7 @@
           <w:noProof/>
         </w:rPr>
         <w:drawing>
-          <wp:inline distT="0" distB="0" distL="0" distR="0" wp14:anchorId="35D9D5B7" wp14:editId="00E8A7D9">
+          <wp:inline distT="0" distB="0" distL="0" distR="0" wp14:anchorId="6B8115A9" wp14:editId="5228DECB">
             <wp:extent cx="1371600" cy="1371600"/>
             <wp:effectExtent l="0" t="0" r="0" b="0"/>
             <wp:docPr id="1" name="Picture 1"/>
@@ -122,12 +122,6 @@
           <w:color w:val="5D7693"/>
         </w:rPr>
         <w:br/>
-      </w:r>
-      <w:r>
-        <w:rPr>
-          <w:rFonts w:ascii="Aptos" w:hAnsi="Aptos"/>
-          <w:color w:val="5D7693"/>
-        </w:rPr>
         <w:t>Last changed: August 10, 2026</w:t>
       </w:r>
       <w:r>
@@ -179,7 +173,7 @@
       <w:r>
         <w:fldChar w:fldCharType="separate"/>
       </w:r>
-      <w:hyperlink w:anchor="_Toc237169179" w:history="1">
+      <w:hyperlink w:anchor="_Toc237272063" w:history="1">
         <w:r>
           <w:rPr>
             <w:rStyle w:val="Hyperlink"/>
@@ -206,7 +200,7 @@
             <w:noProof/>
             <w:webHidden/>
           </w:rPr>
-          <w:instrText xml:space="preserve"> PAGEREF _Toc237169179 \h </w:instrText>
+          <w:instrText xml:space="preserve"> PAGEREF _Toc237272063 \h </w:instrText>
         </w:r>
         <w:r>
           <w:rPr>
@@ -247,7 +241,7 @@
           <w:noProof/>
         </w:rPr>
       </w:pPr>
-      <w:hyperlink w:anchor="_Toc237169180" w:history="1">
+      <w:hyperlink w:anchor="_Toc237272064" w:history="1">
         <w:r>
           <w:rPr>
             <w:rStyle w:val="Hyperlink"/>
@@ -274,7 +268,7 @@
             <w:noProof/>
             <w:webHidden/>
           </w:rPr>
-          <w:instrText xml:space="preserve"> PAGEREF _Toc237169180 \h </w:instrText>
+          <w:instrText xml:space="preserve"> PAGEREF _Toc237272064 \h </w:instrText>
         </w:r>
         <w:r>
           <w:rPr>
@@ -315,7 +309,7 @@
           <w:noProof/>
         </w:rPr>
       </w:pPr>
-      <w:hyperlink w:anchor="_Toc237169181" w:history="1">
+      <w:hyperlink w:anchor="_Toc237272065" w:history="1">
         <w:r>
           <w:rPr>
             <w:rStyle w:val="Hyperlink"/>
@@ -342,7 +336,7 @@
             <w:noProof/>
             <w:webHidden/>
           </w:rPr>
-          <w:instrText xml:space="preserve"> PAGEREF _Toc237169181 \h </w:instrText>
+          <w:instrText xml:space="preserve"> PAGEREF _Toc237272065 \h </w:instrText>
         </w:r>
         <w:r>
           <w:rPr>
@@ -383,7 +377,7 @@
           <w:noProof/>
         </w:rPr>
       </w:pPr>
-      <w:hyperlink w:anchor="_Toc237169182" w:history="1">
+      <w:hyperlink w:anchor="_Toc237272066" w:history="1">
         <w:r>
           <w:rPr>
             <w:rStyle w:val="Hyperlink"/>
@@ -410,7 +404,7 @@
             <w:noProof/>
             <w:webHidden/>
           </w:rPr>
-          <w:instrText xml:space="preserve"> PAGEREF _Toc237169182 \h </w:instrText>
+          <w:instrText xml:space="preserve"> PAGEREF _Toc237272066 \h </w:instrText>
         </w:r>
         <w:r>
           <w:rPr>
@@ -451,7 +445,7 @@
           <w:noProof/>
         </w:rPr>
       </w:pPr>
-      <w:hyperlink w:anchor="_Toc237169183" w:history="1">
+      <w:hyperlink w:anchor="_Toc237272067" w:history="1">
         <w:r>
           <w:rPr>
             <w:rStyle w:val="Hyperlink"/>
@@ -478,7 +472,7 @@
             <w:noProof/>
             <w:webHidden/>
           </w:rPr>
-          <w:instrText xml:space="preserve"> PAGEREF _Toc237169183 \h </w:instrText>
+          <w:instrText xml:space="preserve"> PAGEREF _Toc237272067 \h </w:instrText>
         </w:r>
         <w:r>
           <w:rPr>
@@ -519,7 +513,7 @@
           <w:noProof/>
         </w:rPr>
       </w:pPr>
-      <w:hyperlink w:anchor="_Toc237169184" w:history="1">
+      <w:hyperlink w:anchor="_Toc237272068" w:history="1">
         <w:r>
           <w:rPr>
             <w:rStyle w:val="Hyperlink"/>
@@ -546,7 +540,7 @@
             <w:noProof/>
             <w:webHidden/>
           </w:rPr>
-          <w:instrText xml:space="preserve"> PAGEREF _Toc237169184 \h </w:instrText>
+          <w:instrText xml:space="preserve"> PAGEREF _Toc237272068 \h </w:instrText>
         </w:r>
         <w:r>
           <w:rPr>
@@ -587,7 +581,7 @@
           <w:noProof/>
         </w:rPr>
       </w:pPr>
-      <w:hyperlink w:anchor="_Toc237169185" w:history="1">
+      <w:hyperlink w:anchor="_Toc237272069" w:history="1">
         <w:r>
           <w:rPr>
             <w:rStyle w:val="Hyperlink"/>
@@ -614,7 +608,7 @@
             <w:noProof/>
             <w:webHidden/>
           </w:rPr>
-          <w:instrText xml:space="preserve"> PAGEREF _Toc237169185 \h </w:instrText>
+          <w:instrText xml:space="preserve"> PAGEREF _Toc237272069 \h </w:instrText>
         </w:r>
         <w:r>
           <w:rPr>
@@ -655,7 +649,7 @@
           <w:noProof/>
         </w:rPr>
       </w:pPr>
-      <w:hyperlink w:anchor="_Toc237169186" w:history="1">
+      <w:hyperlink w:anchor="_Toc237272070" w:history="1">
         <w:r>
           <w:rPr>
             <w:rStyle w:val="Hyperlink"/>
@@ -682,7 +676,7 @@
             <w:noProof/>
             <w:webHidden/>
           </w:rPr>
-          <w:instrText xml:space="preserve"> PAGEREF _Toc237169186 \h </w:instrText>
+          <w:instrText xml:space="preserve"> PAGEREF _Toc237272070 \h </w:instrText>
         </w:r>
         <w:r>
           <w:rPr>
@@ -723,7 +717,7 @@
           <w:noProof/>
         </w:rPr>
       </w:pPr>
-      <w:hyperlink w:anchor="_Toc237169187" w:history="1">
+      <w:hyperlink w:anchor="_Toc237272071" w:history="1">
         <w:r>
           <w:rPr>
             <w:rStyle w:val="Hyperlink"/>
@@ -750,7 +744,7 @@
             <w:noProof/>
             <w:webHidden/>
           </w:rPr>
-          <w:instrText xml:space="preserve"> PAGEREF _Toc237169187 \h </w:instrText>
+          <w:instrText xml:space="preserve"> PAGEREF _Toc237272071 \h </w:instrText>
         </w:r>
         <w:r>
           <w:rPr>
@@ -791,7 +785,7 @@
           <w:noProof/>
         </w:rPr>
       </w:pPr>
-      <w:hyperlink w:anchor="_Toc237169188" w:history="1">
+      <w:hyperlink w:anchor="_Toc237272072" w:history="1">
         <w:r>
           <w:rPr>
             <w:rStyle w:val="Hyperlink"/>
@@ -818,7 +812,7 @@
             <w:noProof/>
             <w:webHidden/>
           </w:rPr>
-          <w:instrText xml:space="preserve"> PAGEREF _Toc237169188 \h </w:instrText>
+          <w:instrText xml:space="preserve"> PAGEREF _Toc237272072 \h </w:instrText>
         </w:r>
         <w:r>
           <w:rPr>
@@ -859,7 +853,7 @@
           <w:noProof/>
         </w:rPr>
       </w:pPr>
-      <w:hyperlink w:anchor="_Toc237169189" w:history="1">
+      <w:hyperlink w:anchor="_Toc237272073" w:history="1">
         <w:r>
           <w:rPr>
             <w:rStyle w:val="Hyperlink"/>
@@ -886,7 +880,7 @@
             <w:noProof/>
             <w:webHidden/>
           </w:rPr>
-          <w:instrText xml:space="preserve"> PAGEREF _Toc237169189 \h </w:instrText>
+          <w:instrText xml:space="preserve"> PAGEREF _Toc237272073 \h </w:instrText>
         </w:r>
         <w:r>
           <w:rPr>
@@ -907,6 +901,74 @@
             <w:webHidden/>
           </w:rPr>
           <w:t>4</w:t>
+        </w:r>
+        <w:r>
+          <w:rPr>
+            <w:noProof/>
+            <w:webHidden/>
+          </w:rPr>
+          <w:fldChar w:fldCharType="end"/>
+        </w:r>
+      </w:hyperlink>
+    </w:p>
+    <w:p>
+      <w:pPr>
+        <w:pStyle w:val="TOC2"/>
+        <w:tabs>
+          <w:tab w:val="right" w:leader="dot" w:pos="9350"/>
+        </w:tabs>
+        <w:rPr>
+          <w:noProof/>
+        </w:rPr>
+      </w:pPr>
+      <w:hyperlink w:anchor="_Toc237272074" w:history="1">
+        <w:r>
+          <w:rPr>
+            <w:rStyle w:val="Hyperlink"/>
+            <w:noProof/>
+          </w:rPr>
+          <w:t>6.1 Setup Wizard Architecture</w:t>
+        </w:r>
+        <w:r>
+          <w:rPr>
+            <w:noProof/>
+            <w:webHidden/>
+          </w:rPr>
+          <w:tab/>
+        </w:r>
+        <w:r>
+          <w:rPr>
+            <w:noProof/>
+            <w:webHidden/>
+          </w:rPr>
+          <w:fldChar w:fldCharType="begin"/>
+        </w:r>
+        <w:r>
+          <w:rPr>
+            <w:noProof/>
+            <w:webHidden/>
+          </w:rPr>
+          <w:instrText xml:space="preserve"> PAGEREF _Toc237272074 \h </w:instrText>
+        </w:r>
+        <w:r>
+          <w:rPr>
+            <w:noProof/>
+            <w:webHidden/>
+          </w:rPr>
+        </w:r>
+        <w:r>
+          <w:rPr>
+            <w:noProof/>
+            <w:webHidden/>
+          </w:rPr>
+          <w:fldChar w:fldCharType="separate"/>
+        </w:r>
+        <w:r>
+          <w:rPr>
+            <w:noProof/>
+            <w:webHidden/>
+          </w:rPr>
+          <w:t>5</w:t>
         </w:r>
         <w:r>
           <w:rPr>
@@ -927,7 +989,7 @@
           <w:noProof/>
         </w:rPr>
       </w:pPr>
-      <w:hyperlink w:anchor="_Toc237169190" w:history="1">
+      <w:hyperlink w:anchor="_Toc237272075" w:history="1">
         <w:r>
           <w:rPr>
             <w:rStyle w:val="Hyperlink"/>
@@ -954,7 +1016,7 @@
             <w:noProof/>
             <w:webHidden/>
           </w:rPr>
-          <w:instrText xml:space="preserve"> PAGEREF _Toc237169190 \h </w:instrText>
+          <w:instrText xml:space="preserve"> PAGEREF _Toc237272075 \h </w:instrText>
         </w:r>
         <w:r>
           <w:rPr>
@@ -974,7 +1036,7 @@
             <w:noProof/>
             <w:webHidden/>
           </w:rPr>
-          <w:t>5</w:t>
+          <w:t>6</w:t>
         </w:r>
         <w:r>
           <w:rPr>
@@ -995,7 +1057,7 @@
           <w:noProof/>
         </w:rPr>
       </w:pPr>
-      <w:hyperlink w:anchor="_Toc237169191" w:history="1">
+      <w:hyperlink w:anchor="_Toc237272076" w:history="1">
         <w:r>
           <w:rPr>
             <w:rStyle w:val="Hyperlink"/>
@@ -1022,7 +1084,7 @@
             <w:noProof/>
             <w:webHidden/>
           </w:rPr>
-          <w:instrText xml:space="preserve"> PAGEREF _Toc237169191 \h </w:instrText>
+          <w:instrText xml:space="preserve"> PAGEREF _Toc237272076 \h </w:instrText>
         </w:r>
         <w:r>
           <w:rPr>
@@ -1063,7 +1125,7 @@
           <w:noProof/>
         </w:rPr>
       </w:pPr>
-      <w:hyperlink w:anchor="_Toc237169192" w:history="1">
+      <w:hyperlink w:anchor="_Toc237272077" w:history="1">
         <w:r>
           <w:rPr>
             <w:rStyle w:val="Hyperlink"/>
@@ -1090,7 +1152,7 @@
             <w:noProof/>
             <w:webHidden/>
           </w:rPr>
-          <w:instrText xml:space="preserve"> PAGEREF _Toc237169192 \h </w:instrText>
+          <w:instrText xml:space="preserve"> PAGEREF _Toc237272077 \h </w:instrText>
         </w:r>
         <w:r>
           <w:rPr>
@@ -1110,7 +1172,7 @@
             <w:noProof/>
             <w:webHidden/>
           </w:rPr>
-          <w:t>6</w:t>
+          <w:t>7</w:t>
         </w:r>
         <w:r>
           <w:rPr>
@@ -1131,7 +1193,7 @@
           <w:noProof/>
         </w:rPr>
       </w:pPr>
-      <w:hyperlink w:anchor="_Toc237169193" w:history="1">
+      <w:hyperlink w:anchor="_Toc237272078" w:history="1">
         <w:r>
           <w:rPr>
             <w:rStyle w:val="Hyperlink"/>
@@ -1158,7 +1220,7 @@
             <w:noProof/>
             <w:webHidden/>
           </w:rPr>
-          <w:instrText xml:space="preserve"> PAGEREF _Toc237169193 \h </w:instrText>
+          <w:instrText xml:space="preserve"> PAGEREF _Toc237272078 \h </w:instrText>
         </w:r>
         <w:r>
           <w:rPr>
@@ -1178,7 +1240,7 @@
             <w:noProof/>
             <w:webHidden/>
           </w:rPr>
-          <w:t>6</w:t>
+          <w:t>7</w:t>
         </w:r>
         <w:r>
           <w:rPr>
@@ -1199,7 +1261,7 @@
           <w:noProof/>
         </w:rPr>
       </w:pPr>
-      <w:hyperlink w:anchor="_Toc237169194" w:history="1">
+      <w:hyperlink w:anchor="_Toc237272079" w:history="1">
         <w:r>
           <w:rPr>
             <w:rStyle w:val="Hyperlink"/>
@@ -1226,7 +1288,7 @@
             <w:noProof/>
             <w:webHidden/>
           </w:rPr>
-          <w:instrText xml:space="preserve"> PAGEREF _Toc237169194 \h </w:instrText>
+          <w:instrText xml:space="preserve"> PAGEREF _Toc237272079 \h </w:instrText>
         </w:r>
         <w:r>
           <w:rPr>
@@ -1267,7 +1329,7 @@
           <w:noProof/>
         </w:rPr>
       </w:pPr>
-      <w:hyperlink w:anchor="_Toc237169195" w:history="1">
+      <w:hyperlink w:anchor="_Toc237272080" w:history="1">
         <w:r>
           <w:rPr>
             <w:rStyle w:val="Hyperlink"/>
@@ -1294,7 +1356,7 @@
             <w:noProof/>
             <w:webHidden/>
           </w:rPr>
-          <w:instrText xml:space="preserve"> PAGEREF _Toc237169195 \h </w:instrText>
+          <w:instrText xml:space="preserve"> PAGEREF _Toc237272080 \h </w:instrText>
         </w:r>
         <w:r>
           <w:rPr>
@@ -1335,7 +1397,7 @@
           <w:noProof/>
         </w:rPr>
       </w:pPr>
-      <w:hyperlink w:anchor="_Toc237169196" w:history="1">
+      <w:hyperlink w:anchor="_Toc237272081" w:history="1">
         <w:r>
           <w:rPr>
             <w:rStyle w:val="Hyperlink"/>
@@ -1362,7 +1424,7 @@
             <w:noProof/>
             <w:webHidden/>
           </w:rPr>
-          <w:instrText xml:space="preserve"> PAGEREF _Toc237169196 \h </w:instrText>
+          <w:instrText xml:space="preserve"> PAGEREF _Toc237272081 \h </w:instrText>
         </w:r>
         <w:r>
           <w:rPr>
@@ -1382,7 +1444,7 @@
             <w:noProof/>
             <w:webHidden/>
           </w:rPr>
-          <w:t>8</w:t>
+          <w:t>9</w:t>
         </w:r>
         <w:r>
           <w:rPr>
@@ -1403,7 +1465,7 @@
           <w:noProof/>
         </w:rPr>
       </w:pPr>
-      <w:hyperlink w:anchor="_Toc237169197" w:history="1">
+      <w:hyperlink w:anchor="_Toc237272082" w:history="1">
         <w:r>
           <w:rPr>
             <w:rStyle w:val="Hyperlink"/>
@@ -1430,7 +1492,7 @@
             <w:noProof/>
             <w:webHidden/>
           </w:rPr>
-          <w:instrText xml:space="preserve"> PAGEREF _Toc237169197 \h </w:instrText>
+          <w:instrText xml:space="preserve"> PAGEREF _Toc237272082 \h </w:instrText>
         </w:r>
         <w:r>
           <w:rPr>
@@ -1450,7 +1512,7 @@
             <w:noProof/>
             <w:webHidden/>
           </w:rPr>
-          <w:t>8</w:t>
+          <w:t>9</w:t>
         </w:r>
         <w:r>
           <w:rPr>
@@ -1471,7 +1533,7 @@
           <w:noProof/>
         </w:rPr>
       </w:pPr>
-      <w:hyperlink w:anchor="_Toc237169198" w:history="1">
+      <w:hyperlink w:anchor="_Toc237272083" w:history="1">
         <w:r>
           <w:rPr>
             <w:rStyle w:val="Hyperlink"/>
@@ -1498,7 +1560,7 @@
             <w:noProof/>
             <w:webHidden/>
           </w:rPr>
-          <w:instrText xml:space="preserve"> PAGEREF _Toc237169198 \h </w:instrText>
+          <w:instrText xml:space="preserve"> PAGEREF _Toc237272083 \h </w:instrText>
         </w:r>
         <w:r>
           <w:rPr>
@@ -1539,7 +1601,7 @@
           <w:noProof/>
         </w:rPr>
       </w:pPr>
-      <w:hyperlink w:anchor="_Toc237169199" w:history="1">
+      <w:hyperlink w:anchor="_Toc237272084" w:history="1">
         <w:r>
           <w:rPr>
             <w:rStyle w:val="Hyperlink"/>
@@ -1566,7 +1628,7 @@
             <w:noProof/>
             <w:webHidden/>
           </w:rPr>
-          <w:instrText xml:space="preserve"> PAGEREF _Toc237169199 \h </w:instrText>
+          <w:instrText xml:space="preserve"> PAGEREF _Toc237272084 \h </w:instrText>
         </w:r>
         <w:r>
           <w:rPr>
@@ -1607,7 +1669,7 @@
           <w:noProof/>
         </w:rPr>
       </w:pPr>
-      <w:hyperlink w:anchor="_Toc237169200" w:history="1">
+      <w:hyperlink w:anchor="_Toc237272085" w:history="1">
         <w:r>
           <w:rPr>
             <w:rStyle w:val="Hyperlink"/>
@@ -1634,7 +1696,7 @@
             <w:noProof/>
             <w:webHidden/>
           </w:rPr>
-          <w:instrText xml:space="preserve"> PAGEREF _Toc237169200 \h </w:instrText>
+          <w:instrText xml:space="preserve"> PAGEREF _Toc237272085 \h </w:instrText>
         </w:r>
         <w:r>
           <w:rPr>
@@ -1654,7 +1716,7 @@
             <w:noProof/>
             <w:webHidden/>
           </w:rPr>
-          <w:t>9</w:t>
+          <w:t>10</w:t>
         </w:r>
         <w:r>
           <w:rPr>
@@ -1675,7 +1737,7 @@
           <w:noProof/>
         </w:rPr>
       </w:pPr>
-      <w:hyperlink w:anchor="_Toc237169201" w:history="1">
+      <w:hyperlink w:anchor="_Toc237272086" w:history="1">
         <w:r>
           <w:rPr>
             <w:rStyle w:val="Hyperlink"/>
@@ -1702,7 +1764,7 @@
             <w:noProof/>
             <w:webHidden/>
           </w:rPr>
-          <w:instrText xml:space="preserve"> PAGEREF _Toc237169201 \h </w:instrText>
+          <w:instrText xml:space="preserve"> PAGEREF _Toc237272086 \h </w:instrText>
         </w:r>
         <w:r>
           <w:rPr>
@@ -1743,7 +1805,7 @@
           <w:noProof/>
         </w:rPr>
       </w:pPr>
-      <w:hyperlink w:anchor="_Toc237169202" w:history="1">
+      <w:hyperlink w:anchor="_Toc237272087" w:history="1">
         <w:r>
           <w:rPr>
             <w:rStyle w:val="Hyperlink"/>
@@ -1770,7 +1832,7 @@
             <w:noProof/>
             <w:webHidden/>
           </w:rPr>
-          <w:instrText xml:space="preserve"> PAGEREF _Toc237169202 \h </w:instrText>
+          <w:instrText xml:space="preserve"> PAGEREF _Toc237272087 \h </w:instrText>
         </w:r>
         <w:r>
           <w:rPr>
@@ -1790,7 +1852,7 @@
             <w:noProof/>
             <w:webHidden/>
           </w:rPr>
-          <w:t>10</w:t>
+          <w:t>11</w:t>
         </w:r>
         <w:r>
           <w:rPr>
@@ -1811,7 +1873,7 @@
           <w:noProof/>
         </w:rPr>
       </w:pPr>
-      <w:hyperlink w:anchor="_Toc237169203" w:history="1">
+      <w:hyperlink w:anchor="_Toc237272088" w:history="1">
         <w:r>
           <w:rPr>
             <w:rStyle w:val="Hyperlink"/>
@@ -1838,7 +1900,7 @@
             <w:noProof/>
             <w:webHidden/>
           </w:rPr>
-          <w:instrText xml:space="preserve"> PAGEREF _Toc237169203 \h </w:instrText>
+          <w:instrText xml:space="preserve"> PAGEREF _Toc237272088 \h </w:instrText>
         </w:r>
         <w:r>
           <w:rPr>
@@ -1858,7 +1920,7 @@
             <w:noProof/>
             <w:webHidden/>
           </w:rPr>
-          <w:t>10</w:t>
+          <w:t>11</w:t>
         </w:r>
         <w:r>
           <w:rPr>
@@ -1879,7 +1941,7 @@
           <w:noProof/>
         </w:rPr>
       </w:pPr>
-      <w:hyperlink w:anchor="_Toc237169204" w:history="1">
+      <w:hyperlink w:anchor="_Toc237272089" w:history="1">
         <w:r>
           <w:rPr>
             <w:rStyle w:val="Hyperlink"/>
@@ -1906,7 +1968,7 @@
             <w:noProof/>
             <w:webHidden/>
           </w:rPr>
-          <w:instrText xml:space="preserve"> PAGEREF _Toc237169204 \h </w:instrText>
+          <w:instrText xml:space="preserve"> PAGEREF _Toc237272089 \h </w:instrText>
         </w:r>
         <w:r>
           <w:rPr>
@@ -1947,7 +2009,7 @@
           <w:noProof/>
         </w:rPr>
       </w:pPr>
-      <w:hyperlink w:anchor="_Toc237169205" w:history="1">
+      <w:hyperlink w:anchor="_Toc237272090" w:history="1">
         <w:r>
           <w:rPr>
             <w:rStyle w:val="Hyperlink"/>
@@ -1974,7 +2036,7 @@
             <w:noProof/>
             <w:webHidden/>
           </w:rPr>
-          <w:instrText xml:space="preserve"> PAGEREF _Toc237169205 \h </w:instrText>
+          <w:instrText xml:space="preserve"> PAGEREF _Toc237272090 \h </w:instrText>
         </w:r>
         <w:r>
           <w:rPr>
@@ -2015,7 +2077,7 @@
           <w:noProof/>
         </w:rPr>
       </w:pPr>
-      <w:hyperlink w:anchor="_Toc237169206" w:history="1">
+      <w:hyperlink w:anchor="_Toc237272091" w:history="1">
         <w:r>
           <w:rPr>
             <w:rStyle w:val="Hyperlink"/>
@@ -2042,7 +2104,7 @@
             <w:noProof/>
             <w:webHidden/>
           </w:rPr>
-          <w:instrText xml:space="preserve"> PAGEREF _Toc237169206 \h </w:instrText>
+          <w:instrText xml:space="preserve"> PAGEREF _Toc237272091 \h </w:instrText>
         </w:r>
         <w:r>
           <w:rPr>
@@ -2062,7 +2124,7 @@
             <w:noProof/>
             <w:webHidden/>
           </w:rPr>
-          <w:t>12</w:t>
+          <w:t>13</w:t>
         </w:r>
         <w:r>
           <w:rPr>
@@ -2083,7 +2145,7 @@
           <w:noProof/>
         </w:rPr>
       </w:pPr>
-      <w:hyperlink w:anchor="_Toc237169207" w:history="1">
+      <w:hyperlink w:anchor="_Toc237272092" w:history="1">
         <w:r>
           <w:rPr>
             <w:rStyle w:val="Hyperlink"/>
@@ -2110,7 +2172,7 @@
             <w:noProof/>
             <w:webHidden/>
           </w:rPr>
-          <w:instrText xml:space="preserve"> PAGEREF _Toc237169207 \h </w:instrText>
+          <w:instrText xml:space="preserve"> PAGEREF _Toc237272092 \h </w:instrText>
         </w:r>
         <w:r>
           <w:rPr>
@@ -2151,7 +2213,7 @@
           <w:noProof/>
         </w:rPr>
       </w:pPr>
-      <w:hyperlink w:anchor="_Toc237169208" w:history="1">
+      <w:hyperlink w:anchor="_Toc237272093" w:history="1">
         <w:r>
           <w:rPr>
             <w:rStyle w:val="Hyperlink"/>
@@ -2178,7 +2240,7 @@
             <w:noProof/>
             <w:webHidden/>
           </w:rPr>
-          <w:instrText xml:space="preserve"> PAGEREF _Toc237169208 \h </w:instrText>
+          <w:instrText xml:space="preserve"> PAGEREF _Toc237272093 \h </w:instrText>
         </w:r>
         <w:r>
           <w:rPr>
@@ -2198,7 +2260,7 @@
             <w:noProof/>
             <w:webHidden/>
           </w:rPr>
-          <w:t>13</w:t>
+          <w:t>14</w:t>
         </w:r>
         <w:r>
           <w:rPr>
@@ -2219,7 +2281,7 @@
           <w:noProof/>
         </w:rPr>
       </w:pPr>
-      <w:hyperlink w:anchor="_Toc237169209" w:history="1">
+      <w:hyperlink w:anchor="_Toc237272094" w:history="1">
         <w:r>
           <w:rPr>
             <w:rStyle w:val="Hyperlink"/>
@@ -2246,7 +2308,7 @@
             <w:noProof/>
             <w:webHidden/>
           </w:rPr>
-          <w:instrText xml:space="preserve"> PAGEREF _Toc237169209 \h </w:instrText>
+          <w:instrText xml:space="preserve"> PAGEREF _Toc237272094 \h </w:instrText>
         </w:r>
         <w:r>
           <w:rPr>
@@ -2266,7 +2328,7 @@
             <w:noProof/>
             <w:webHidden/>
           </w:rPr>
-          <w:t>13</w:t>
+          <w:t>14</w:t>
         </w:r>
         <w:r>
           <w:rPr>
@@ -2287,7 +2349,7 @@
           <w:noProof/>
         </w:rPr>
       </w:pPr>
-      <w:hyperlink w:anchor="_Toc237169210" w:history="1">
+      <w:hyperlink w:anchor="_Toc237272095" w:history="1">
         <w:r>
           <w:rPr>
             <w:rStyle w:val="Hyperlink"/>
@@ -2314,7 +2376,7 @@
             <w:noProof/>
             <w:webHidden/>
           </w:rPr>
-          <w:instrText xml:space="preserve"> PAGEREF _Toc237169210 \h </w:instrText>
+          <w:instrText xml:space="preserve"> PAGEREF _Toc237272095 \h </w:instrText>
         </w:r>
         <w:r>
           <w:rPr>
@@ -2367,8 +2429,9 @@
       <w:pPr>
         <w:pStyle w:val="Heading1"/>
       </w:pPr>
-      <w:bookmarkStart w:id="0" w:name="_Toc237169179"/>
-      <w:r>
+      <w:bookmarkStart w:id="0" w:name="_Toc237272063"/>
+      <w:r>
+        <w:lastRenderedPageBreak/>
         <w:t>1. Product Scope and Invariants</w:t>
       </w:r>
       <w:bookmarkEnd w:id="0"/>
@@ -2435,7 +2498,7 @@
       <w:pPr>
         <w:pStyle w:val="Heading1"/>
       </w:pPr>
-      <w:bookmarkStart w:id="1" w:name="_Toc237169180"/>
+      <w:bookmarkStart w:id="1" w:name="_Toc237272064"/>
       <w:r>
         <w:t>2. Repository and Build Layout</w:t>
       </w:r>
@@ -2674,6 +2737,7 @@
           </w:tcPr>
           <w:p>
             <w:r>
+              <w:lastRenderedPageBreak/>
               <w:t>source\components</w:t>
             </w:r>
           </w:p>
@@ -2926,7 +2990,7 @@
       <w:pPr>
         <w:pStyle w:val="Heading2"/>
       </w:pPr>
-      <w:bookmarkStart w:id="2" w:name="_Toc237169181"/>
+      <w:bookmarkStart w:id="2" w:name="_Toc237272065"/>
       <w:r>
         <w:t>2.1 Toolchain</w:t>
       </w:r>
@@ -2935,6 +2999,9 @@
     <w:p>
       <w:pPr>
         <w:pStyle w:val="CodeBlock"/>
+        <w:rPr>
+          <w:rFonts w:hint="eastAsia"/>
+        </w:rPr>
       </w:pPr>
       <w:r>
         <w:t>call "C:\Program Files (x86)\Embarcadero\Studio\37.0\bin\rsvars.bat"</w:t>
@@ -2957,7 +3024,7 @@
       <w:pPr>
         <w:pStyle w:val="Heading1"/>
       </w:pPr>
-      <w:bookmarkStart w:id="3" w:name="_Toc237169182"/>
+      <w:bookmarkStart w:id="3" w:name="_Toc237272066"/>
       <w:r>
         <w:t>3. System Architecture</w:t>
       </w:r>
@@ -3098,6 +3165,7 @@
           </w:tcPr>
           <w:p>
             <w:r>
+              <w:lastRenderedPageBreak/>
               <w:t>Catalog</w:t>
             </w:r>
           </w:p>
@@ -3415,7 +3483,7 @@
       <w:pPr>
         <w:pStyle w:val="Heading1"/>
       </w:pPr>
-      <w:bookmarkStart w:id="4" w:name="_Toc237169183"/>
+      <w:bookmarkStart w:id="4" w:name="_Toc237272067"/>
       <w:r>
         <w:t>4. Core Data Model and JSON</w:t>
       </w:r>
@@ -3430,7 +3498,7 @@
       <w:pPr>
         <w:pStyle w:val="Heading2"/>
       </w:pPr>
-      <w:bookmarkStart w:id="5" w:name="_Toc237169184"/>
+      <w:bookmarkStart w:id="5" w:name="_Toc237272068"/>
       <w:r>
         <w:t>4.1 Stable keys</w:t>
       </w:r>
@@ -3472,7 +3540,7 @@
       <w:pPr>
         <w:pStyle w:val="Heading2"/>
       </w:pPr>
-      <w:bookmarkStart w:id="6" w:name="_Toc237169185"/>
+      <w:bookmarkStart w:id="6" w:name="_Toc237272069"/>
       <w:r>
         <w:t>4.2 Development catalog</w:t>
       </w:r>
@@ -3481,6 +3549,9 @@
     <w:p>
       <w:pPr>
         <w:pStyle w:val="CodeBlock"/>
+        <w:rPr>
+          <w:rFonts w:hint="eastAsia"/>
+        </w:rPr>
       </w:pPr>
       <w:r>
         <w:t>{</w:t>
@@ -3499,6 +3570,9 @@
       </w:r>
       <w:r>
         <w:br/>
+      </w:r>
+      <w:r>
+        <w:lastRenderedPageBreak/>
         <w:t xml:space="preserve">  "locale": {"languageCode": "it-IT", "nativeLanguageName": "Italiano"},</w:t>
       </w:r>
       <w:r>
@@ -3515,6 +3589,8 @@
       </w:r>
       <w:r>
         <w:br/>
+      </w:r>
+      <w:r>
         <w:t xml:space="preserve">               "runtimeApplication": "automatic"}]</w:t>
       </w:r>
       <w:r>
@@ -3526,7 +3602,7 @@
       <w:pPr>
         <w:pStyle w:val="Heading2"/>
       </w:pPr>
-      <w:bookmarkStart w:id="7" w:name="_Toc237169186"/>
+      <w:bookmarkStart w:id="7" w:name="_Toc237272070"/>
       <w:r>
         <w:t>4.3 Runtime pack</w:t>
       </w:r>
@@ -3535,6 +3611,9 @@
     <w:p>
       <w:pPr>
         <w:pStyle w:val="CodeBlock"/>
+        <w:rPr>
+          <w:rFonts w:hint="eastAsia"/>
+        </w:rPr>
       </w:pPr>
       <w:r>
         <w:t>{</w:t>
@@ -3577,7 +3656,7 @@
       <w:pPr>
         <w:pStyle w:val="Heading1"/>
       </w:pPr>
-      <w:bookmarkStart w:id="8" w:name="_Toc237169187"/>
+      <w:bookmarkStart w:id="8" w:name="_Toc237272071"/>
       <w:r>
         <w:t>5. Project Detection and Scanning</w:t>
       </w:r>
@@ -3597,7 +3676,7 @@
       <w:pPr>
         <w:pStyle w:val="Heading2"/>
       </w:pPr>
-      <w:bookmarkStart w:id="9" w:name="_Toc237169188"/>
+      <w:bookmarkStart w:id="9" w:name="_Toc237272072"/>
       <w:r>
         <w:t>5.1 Incremental merge</w:t>
       </w:r>
@@ -3679,7 +3758,7 @@
       <w:pPr>
         <w:pStyle w:val="Heading1"/>
       </w:pPr>
-      <w:bookmarkStart w:id="10" w:name="_Toc237169189"/>
+      <w:bookmarkStart w:id="10" w:name="_Toc237272073"/>
       <w:r>
         <w:t>6. Studio UI and Workflow State</w:t>
       </w:r>
@@ -3687,7 +3766,11 @@
     </w:p>
     <w:p>
       <w:r>
-        <w:t>DAT.Studio.MainForm.fmx contains the complete orange-and-blue interface. The form persists WindowState=wsMaximized, uses client-aligned workflow cards, anchors resizable work areas to every relevant edge, and keeps the status card at the bottom. The workflow selection rectangle moves among Project, Scan, Translate, Validation, Export, Integration, and Provider Settings. Language and provider choices, Translate Automatically, key-management actions, and all other controls are persisted designer objects. DAT.Studio.MainForm.pas contains event and state logic only; it does not construct controls.</w:t>
+        <w:t xml:space="preserve">DAT.Studio.MainForm.fmx contains the complete orange-and-blue interface. The form persists WindowState=wsMaximized, uses client-aligned workflow cards, anchors resizable work areas to every relevant edge, and keeps the status card at the bottom. The workflow selection rectangle moves among </w:t>
+      </w:r>
+      <w:r>
+        <w:lastRenderedPageBreak/>
+        <w:t>Project, Scan, Translate, Validation, Export, Integration, and Provider Settings. Language and provider choices, Translate Automatically, key-management actions, and all other controls are persisted designer objects. DAT.Studio.MainForm.pas contains event and state logic only; it does not construct controls.</w:t>
       </w:r>
     </w:p>
     <w:p>
@@ -3746,13 +3829,83 @@
     </w:tbl>
     <w:p>
       <w:pPr>
+        <w:pStyle w:val="Heading2"/>
+      </w:pPr>
+      <w:bookmarkStart w:id="11" w:name="_Toc237272074"/>
+      <w:r>
+        <w:t>6.1 Setup Wizard Architecture</w:t>
+      </w:r>
+      <w:bookmarkEnd w:id="11"/>
+    </w:p>
+    <w:p>
+      <w:r>
+        <w:t>DAT.Studio.SetupWizard is a separate, designer-authored FMX modal form opened by Start Setup Wizard. It is borderless, fixed-size, centered, and deliberately omits menu and system controls. Its eight hidden TabControl pages, left navigation rail, footer controls, labels, dialogs, check boxes, memos, and layout geometry are all persisted in DAT.Studio.SetupWizard.fmx and remain editable in the Form Designer.</w:t>
+      </w:r>
+    </w:p>
+    <w:p>
+      <w:r>
+        <w:t>The Wizard owns isolated project-profile, scan-result, catalog, provider-key, backup, and component-kit state. Steps already reached may be revisited; future steps remain disabled. Changing the project or target language invalidates downstream scan/catalog state. Before final processing, the target project is read only except for an explicitly saved provider credential outside the project. During final processing, navigation and closing are disabled.</w:t>
+      </w:r>
+    </w:p>
+    <w:p>
+      <w:r>
+        <w:t>Final processing optionally creates a timestamped ZIP, translates eligible unresolved entries, saves the development catalog, validates, exports the runtime JSON pack, generates the component kit, writes Wizard-Completion-Report.txt, and generates four deployment commands. Each command launches the system Windows PowerShell executable with -NoProfile -ExecutionPolicy Bypass. The Wizard never edits target Pascal, form, DPR, or DPROJ files and never writes RAD Studio's package registry.</w:t>
+      </w:r>
+    </w:p>
+    <w:tbl>
+      <w:tblPr>
+        <w:tblW w:w="9360" w:type="dxa"/>
+        <w:jc w:val="center"/>
+        <w:tblLayout w:type="fixed"/>
+        <w:tblCellMar>
+          <w:top w:w="80" w:type="dxa"/>
+          <w:left w:w="120" w:type="dxa"/>
+          <w:bottom w:w="80" w:type="dxa"/>
+          <w:right w:w="120" w:type="dxa"/>
+        </w:tblCellMar>
+        <w:tblLook w:val="04A0" w:firstRow="1" w:lastRow="0" w:firstColumn="1" w:lastColumn="0" w:noHBand="0" w:noVBand="1"/>
+      </w:tblPr>
+      <w:tblGrid>
+        <w:gridCol w:w="9360"/>
+      </w:tblGrid>
+      <w:tr>
+        <w:trPr>
+          <w:jc w:val="center"/>
+        </w:trPr>
+        <w:tc>
+          <w:tcPr>
+            <w:tcW w:w="9360" w:type="dxa"/>
+            <w:shd w:val="clear" w:color="auto" w:fill="EAF3FF"/>
+            <w:vAlign w:val="center"/>
+          </w:tcPr>
+          <w:p>
+            <w:pPr>
+              <w:pStyle w:val="Callout"/>
+            </w:pPr>
+            <w:r>
+              <w:rPr>
+                <w:b/>
+                <w:color w:val="234C80"/>
+              </w:rPr>
+              <w:t xml:space="preserve">Wizard regression requirement. </w:t>
+            </w:r>
+            <w:r>
+              <w:t>StudioFormSmokeTests must instantiate the Wizard and verify every primary designer component, including dlgOpenProject. The project-selection access violation of August 10, 2026 was caused by a declared TOpenDialog omitted from the FMX resource; the explicit presence assertion prevents that class of streaming omission from returning.</w:t>
+            </w:r>
+          </w:p>
+        </w:tc>
+      </w:tr>
+    </w:tbl>
+    <w:p>
+      <w:pPr>
         <w:pStyle w:val="Heading1"/>
       </w:pPr>
-      <w:bookmarkStart w:id="11" w:name="_Toc237169190"/>
-      <w:r>
+      <w:bookmarkStart w:id="12" w:name="_Toc237272075"/>
+      <w:r>
+        <w:lastRenderedPageBreak/>
         <w:t>7. Provider Settings and Secret Storage</w:t>
       </w:r>
-      <w:bookmarkEnd w:id="11"/>
+      <w:bookmarkEnd w:id="12"/>
     </w:p>
     <w:p>
       <w:r>
@@ -4016,11 +4169,11 @@
       <w:pPr>
         <w:pStyle w:val="Heading1"/>
       </w:pPr>
-      <w:bookmarkStart w:id="12" w:name="_Toc237169191"/>
+      <w:bookmarkStart w:id="13" w:name="_Toc237272076"/>
       <w:r>
         <w:t>8. Provider HTTP Clients</w:t>
       </w:r>
-      <w:bookmarkEnd w:id="12"/>
+      <w:bookmarkEnd w:id="13"/>
     </w:p>
     <w:p>
       <w:r>
@@ -4194,6 +4347,7 @@
           </w:tcPr>
           <w:p>
             <w:r>
+              <w:lastRenderedPageBreak/>
               <w:t>DeepL API Pro</w:t>
             </w:r>
           </w:p>
@@ -4307,11 +4461,11 @@
       <w:pPr>
         <w:pStyle w:val="Heading2"/>
       </w:pPr>
-      <w:bookmarkStart w:id="13" w:name="_Toc237169192"/>
+      <w:bookmarkStart w:id="14" w:name="_Toc237272077"/>
       <w:r>
         <w:t>8.1 Reliability and cancellation</w:t>
       </w:r>
-      <w:bookmarkEnd w:id="13"/>
+      <w:bookmarkEnd w:id="14"/>
     </w:p>
     <w:p>
       <w:pPr>
@@ -4365,11 +4519,11 @@
       <w:pPr>
         <w:pStyle w:val="Heading2"/>
       </w:pPr>
-      <w:bookmarkStart w:id="14" w:name="_Toc237169193"/>
+      <w:bookmarkStart w:id="15" w:name="_Toc237272078"/>
       <w:r>
         <w:t>8.2 Official protocol references</w:t>
       </w:r>
-      <w:bookmarkEnd w:id="14"/>
+      <w:bookmarkEnd w:id="15"/>
     </w:p>
     <w:p>
       <w:pPr>
@@ -4415,11 +4569,11 @@
       <w:pPr>
         <w:pStyle w:val="Heading1"/>
       </w:pPr>
-      <w:bookmarkStart w:id="15" w:name="_Toc237169194"/>
+      <w:bookmarkStart w:id="16" w:name="_Toc237272079"/>
       <w:r>
         <w:t>9. Automatic Provider Translation and Review</w:t>
       </w:r>
-      <w:bookmarkEnd w:id="15"/>
+      <w:bookmarkEnd w:id="16"/>
     </w:p>
     <w:p>
       <w:r>
@@ -4428,7 +4582,11 @@
     </w:p>
     <w:p>
       <w:r>
-        <w:t>Eligible source strings are copied into ordered arrays and sent through DAT.Provider.Client in bounded batches. Reviewed, Approved, Excluded, and Obsolete entries are not overwritten. Provider results are mapped back by index, marked Machine translated, tagged with Google or DeepL provenance, and saved to the canonical development catalog automatically.</w:t>
+        <w:t xml:space="preserve">Eligible source strings are copied into ordered arrays and sent through DAT.Provider.Client in bounded batches. Reviewed, Approved, Excluded, and Obsolete entries are not overwritten. Provider results are </w:t>
+      </w:r>
+      <w:r>
+        <w:lastRenderedPageBreak/>
+        <w:t>mapped back by index, marked Machine translated, tagged with Google or DeepL provenance, and saved to the canonical development catalog automatically.</w:t>
       </w:r>
     </w:p>
     <w:p>
@@ -4506,15 +4664,18 @@
       <w:pPr>
         <w:pStyle w:val="Heading1"/>
       </w:pPr>
-      <w:bookmarkStart w:id="16" w:name="_Toc237169195"/>
+      <w:bookmarkStart w:id="17" w:name="_Toc237272080"/>
       <w:r>
         <w:t>10. Validation and Runtime Pack Export</w:t>
       </w:r>
-      <w:bookmarkEnd w:id="16"/>
-    </w:p>
-    <w:p>
-      <w:r>
-        <w:t>DAT.Validation.Catalog validates metadata, missing target text, duplicates, changed source, Delphi indexed and sequential Format arguments, accelerators, inconsistent repeated-source terminology, and status conditions. Export is blocked by errors. Common runtime placeholders such as -- are informational when intentionally unchanged. The UI explains severity and maps a double-clicked entry issue back to the Translate list. Manual resourcestring wiring is reported separately from structural errors. DAT.Core.RuntimePack serializes only runtime-required metadata and strings and records a source-catalog checksum.</w:t>
+      <w:bookmarkEnd w:id="17"/>
+    </w:p>
+    <w:p>
+      <w:r>
+        <w:t>DAT.Validation.Catalog validates metadata, missing target text, duplicates, changed source, Delphi indexed and sequential Format arguments, accelerators, inconsistent repeated-source terminology, and status conditions. Export is blocked by errors. Common runtime placeholders such as -- are informational when intentionally unchanged. The UI explains severity and maps a double-clicked entry issue back to the Translate list. Manual resourcestring wiring is reported separately from structural errors. DAT.Core.R</w:t>
+      </w:r>
+      <w:r>
+        <w:t>untimePack serializes only runtime-required metadata and strings and records a source-catalog checksum.</w:t>
       </w:r>
     </w:p>
     <w:p>
@@ -4526,15 +4687,19 @@
       <w:pPr>
         <w:pStyle w:val="Heading1"/>
       </w:pPr>
-      <w:bookmarkStart w:id="17" w:name="_Toc237169196"/>
-      <w:r>
+      <w:bookmarkStart w:id="18" w:name="_Toc237272081"/>
+      <w:r>
+        <w:lastRenderedPageBreak/>
         <w:t>11. Runtime Engine</w:t>
       </w:r>
-      <w:bookmarkEnd w:id="17"/>
-    </w:p>
-    <w:p>
-      <w:r>
-        <w:t>DAT.Runtime.LanguagePack loads and discovers JSON packs, checks application identity, rejects empty/invalid packs, canonicalizes native language names, de-duplicates exact locale codes, and suppresses a generic locale when a regional variant exists. DAT.Runtime.Preference reads/writes the selected locale. DAT.Runtime.Manager owns the active pack, discovery, preference, translation lookup, and locale format settings. The source language loads its generated JSON pack when present and falls back to designer text only for older deployments without that pack.</w:t>
+      <w:bookmarkEnd w:id="18"/>
+    </w:p>
+    <w:p>
+      <w:r>
+        <w:t>DAT.Runtime.LanguagePack loads and discovers JSON packs, checks application identity, rejects empty/invalid packs, canonicalizes native language names, de-duplicates exact locale codes, and suppresses a generic locale when a regional variant exists. DAT.Runtime.Preference reads/writes the selected locale. DAT.Runtime.Manager owns the active pack, discovery, preference, translation lookup, and locale format settings. The source language loads its generated JSON pack when present and falls back to designer te</w:t>
+      </w:r>
+      <w:r>
+        <w:t>xt only for older deployments without that pack.</w:t>
       </w:r>
     </w:p>
     <w:p>
@@ -4546,11 +4711,11 @@
       <w:pPr>
         <w:pStyle w:val="Heading2"/>
       </w:pPr>
-      <w:bookmarkStart w:id="18" w:name="_Toc237169197"/>
+      <w:bookmarkStart w:id="19" w:name="_Toc237272082"/>
       <w:r>
         <w:t>11.1 Component manager core</w:t>
       </w:r>
-      <w:bookmarkEnd w:id="18"/>
+      <w:bookmarkEnd w:id="19"/>
     </w:p>
     <w:p>
       <w:r>
@@ -4559,7 +4724,10 @@
     </w:p>
     <w:p>
       <w:r>
-        <w:t>TDATFMXLanguageManager subscribes additively to TFormBeforeShownMessage and TFormReleasedMessage. It translates after streaming but before OnShow/first paint and never replaces a global handler. TDATVCLLanguageManager owns a private TApplicationEvents, discovers visible forms on throttled idle, and inspects modal forms before display. VCL has no public additive before-show notification for every dynamic modeless form; such a form can paint once in the source language unless the application calls ApplyToForm before Show.</w:t>
+        <w:t>TDATFMXLanguageManager subscribes additively to TFormBeforeShownMessage and TFormReleasedMessage. It translates after streaming but before OnShow/first paint and never replaces a global handler. TDATVCLLanguageManager owns a private TApplicationEvents, discovers visible forms on throttled idle, and inspects modal forms before display. VCL has no public additive before-show notification for every dynamic modeless form; such a form can paint once in the source language unless the application calls ApplyToForm</w:t>
+      </w:r>
+      <w:r>
+        <w:t xml:space="preserve"> before Show.</w:t>
       </w:r>
     </w:p>
     <w:p>
@@ -4571,11 +4739,11 @@
       <w:pPr>
         <w:pStyle w:val="Heading2"/>
       </w:pPr>
-      <w:bookmarkStart w:id="19" w:name="_Toc237169198"/>
+      <w:bookmarkStart w:id="20" w:name="_Toc237272083"/>
       <w:r>
         <w:t>11.2 Optional selectors</w:t>
       </w:r>
-      <w:bookmarkEnd w:id="19"/>
+      <w:bookmarkEnd w:id="20"/>
     </w:p>
     <w:p>
       <w:r>
@@ -4586,11 +4754,11 @@
       <w:pPr>
         <w:pStyle w:val="Heading2"/>
       </w:pPr>
-      <w:bookmarkStart w:id="20" w:name="_Toc237169199"/>
+      <w:bookmarkStart w:id="21" w:name="_Toc237272084"/>
       <w:r>
         <w:t>11.3 Deployment paths</w:t>
       </w:r>
-      <w:bookmarkEnd w:id="20"/>
+      <w:bookmarkEnd w:id="21"/>
     </w:p>
     <w:p>
       <w:pPr>
@@ -4605,6 +4773,7 @@
         <w:pStyle w:val="ListBullet"/>
       </w:pPr>
       <w:r>
+        <w:lastRenderedPageBreak/>
         <w:t>Preference: %LOCALAPPDATA%\&lt;ApplicationId&gt;\language.ini.</w:t>
       </w:r>
     </w:p>
@@ -4628,11 +4797,11 @@
       <w:pPr>
         <w:pStyle w:val="Heading1"/>
       </w:pPr>
-      <w:bookmarkStart w:id="21" w:name="_Toc237169200"/>
+      <w:bookmarkStart w:id="22" w:name="_Toc237272085"/>
       <w:r>
         <w:t>12. Component Packages and Integration Modes</w:t>
       </w:r>
-      <w:bookmarkEnd w:id="21"/>
+      <w:bookmarkEnd w:id="22"/>
     </w:p>
     <w:p>
       <w:r>
@@ -4641,7 +4810,10 @@
     </w:p>
     <w:p>
       <w:r>
-        <w:t>The Studio's Show Design BPL action selects the matching, verified, self-contained package under bin\packages\Win32\Release. The developer installs that stable file with RAD Studio's Component &gt; Install Packages &gt; Add command. The Studio does not copy BPLs to public Delphi folders, write Known Packages registry values, close/restart RAD Studio, or expose automatic package installation. Delphi therefore remains the sole owner of design-package registration. Generated per-project kits contain no BPLs and are regenerated from a clean output directory, so they can be replaced without invalidating Delphi's registered package path.</w:t>
+        <w:t xml:space="preserve">The Studio's Show Design BPL action selects the matching, verified, self-contained package under bin\packages\Win32\Release. The developer installs that stable file with RAD Studio's Component &gt; Install Packages &gt; Add command. The Studio does not copy BPLs to public Delphi folders, write Known Packages registry values, close/restart RAD Studio, or expose automatic package installation. Delphi therefore remains the sole owner of design-package registration. Generated per-project kits contain no BPLs and are </w:t>
+      </w:r>
+      <w:r>
+        <w:t>regenerated from a clean output directory, so they can be replaced without invalidating Delphi's registered package path.</w:t>
       </w:r>
     </w:p>
     <w:p>
@@ -4658,11 +4830,11 @@
       <w:pPr>
         <w:pStyle w:val="Heading2"/>
       </w:pPr>
-      <w:bookmarkStart w:id="22" w:name="_Toc237169201"/>
+      <w:bookmarkStart w:id="23" w:name="_Toc237272086"/>
       <w:r>
         <w:t>12.1 Component startup contract</w:t>
       </w:r>
-      <w:bookmarkEnd w:id="22"/>
+      <w:bookmarkEnd w:id="23"/>
     </w:p>
     <w:p>
       <w:pPr>
@@ -4709,6 +4881,7 @@
         <w:pStyle w:val="ListBullet"/>
       </w:pPr>
       <w:r>
+        <w:lastRenderedPageBreak/>
         <w:t>The generated en-US pack makes switching back to source text deterministic.</w:t>
       </w:r>
     </w:p>
@@ -4768,11 +4941,11 @@
       <w:pPr>
         <w:pStyle w:val="Heading1"/>
       </w:pPr>
-      <w:bookmarkStart w:id="23" w:name="_Toc237169202"/>
+      <w:bookmarkStart w:id="24" w:name="_Toc237272087"/>
       <w:r>
         <w:t>13. Self-Localization</w:t>
       </w:r>
-      <w:bookmarkEnd w:id="23"/>
+      <w:bookmarkEnd w:id="24"/>
     </w:p>
     <w:p>
       <w:r>
@@ -4783,11 +4956,11 @@
       <w:pPr>
         <w:pStyle w:val="Heading1"/>
       </w:pPr>
-      <w:bookmarkStart w:id="24" w:name="_Toc237169203"/>
+      <w:bookmarkStart w:id="25" w:name="_Toc237272088"/>
       <w:r>
         <w:t>14. Error Handling and Diagnostics</w:t>
       </w:r>
-      <w:bookmarkEnd w:id="24"/>
+      <w:bookmarkEnd w:id="25"/>
     </w:p>
     <w:p>
       <w:pPr>
@@ -4841,11 +5014,11 @@
       <w:pPr>
         <w:pStyle w:val="Heading1"/>
       </w:pPr>
-      <w:bookmarkStart w:id="25" w:name="_Toc237169204"/>
+      <w:bookmarkStart w:id="26" w:name="_Toc237272089"/>
       <w:r>
         <w:t>15. Test Strategy and Verified Matrix</w:t>
       </w:r>
-      <w:bookmarkEnd w:id="25"/>
+      <w:bookmarkEnd w:id="26"/>
     </w:p>
     <w:tbl>
       <w:tblPr>
@@ -4983,6 +5156,7 @@
           </w:tcPr>
           <w:p>
             <w:r>
+              <w:lastRenderedPageBreak/>
               <w:t>Package/selector suites</w:t>
             </w:r>
           </w:p>
@@ -5200,18 +5374,21 @@
     </w:tbl>
     <w:p>
       <w:r>
-        <w:t>On August 9, 2026, the complete release harness passed uninterrupted. Debug and Release component packages, Win32/Win64 manager suites, scanner/catalog/provider contracts, component non-mutation, runtime and advanced integration all passed. The Studio built in Debug and Release for both architectures, streamed its FMX form directly, launched normally, and self-localized to Italian in all four configurations. Disposable real-application pilots also built and opened translated first forms on Win32/Win64 for Website Analytics (FMX) and Courier Herald Reader (VCL).</w:t>
+        <w:t>On August 9, 2026, the complete release harness passed uninterrupted. Debug and Release component packages, Win32/Win64 manager suites, scanner/catalog/provider contracts, component non-mutation, runtime and advanced integration all passed. The Studio built in Debug and Release for both architectures, streamed its FMX form directly, launched normally, and self-localized to Italian in all four configurations. Disposable real-application pilots also built and opened translated first forms on Win32/Win64 for W</w:t>
+      </w:r>
+      <w:r>
+        <w:t>ebsite Analytics (FMX) and Courier Herald Reader (VCL).</w:t>
       </w:r>
     </w:p>
     <w:p>
       <w:pPr>
         <w:pStyle w:val="Heading2"/>
       </w:pPr>
-      <w:bookmarkStart w:id="26" w:name="_Toc237169205"/>
+      <w:bookmarkStart w:id="27" w:name="_Toc237272090"/>
       <w:r>
         <w:t>15.1 Optional live provider testing</w:t>
       </w:r>
-      <w:bookmarkEnd w:id="26"/>
+      <w:bookmarkEnd w:id="27"/>
     </w:p>
     <w:p>
       <w:r>
@@ -5222,11 +5399,12 @@
       <w:pPr>
         <w:pStyle w:val="Heading1"/>
       </w:pPr>
-      <w:bookmarkStart w:id="27" w:name="_Toc237169206"/>
-      <w:r>
+      <w:bookmarkStart w:id="28" w:name="_Toc237272091"/>
+      <w:r>
+        <w:lastRenderedPageBreak/>
         <w:t>16. Security Review</w:t>
       </w:r>
-      <w:bookmarkEnd w:id="27"/>
+      <w:bookmarkEnd w:id="28"/>
     </w:p>
     <w:tbl>
       <w:tblPr>
@@ -5523,11 +5701,11 @@
       <w:pPr>
         <w:pStyle w:val="Heading1"/>
       </w:pPr>
-      <w:bookmarkStart w:id="28" w:name="_Toc237169207"/>
+      <w:bookmarkStart w:id="29" w:name="_Toc237272092"/>
       <w:r>
         <w:t>17. Release and Contribution Workflow</w:t>
       </w:r>
-      <w:bookmarkEnd w:id="28"/>
+      <w:bookmarkEnd w:id="29"/>
     </w:p>
     <w:p>
       <w:pPr>
@@ -5634,6 +5812,7 @@
         </w:numPr>
       </w:pPr>
       <w:r>
+        <w:lastRenderedPageBreak/>
         <w:t>Review status, stage only intended files, commit clearly, and push every configured remote.</w:t>
       </w:r>
     </w:p>
@@ -5641,11 +5820,11 @@
       <w:pPr>
         <w:pStyle w:val="Heading1"/>
       </w:pPr>
-      <w:bookmarkStart w:id="29" w:name="_Toc237169208"/>
+      <w:bookmarkStart w:id="30" w:name="_Toc237272093"/>
       <w:r>
         <w:t>18. Known Boundaries and Future-Compatible Design</w:t>
       </w:r>
-      <w:bookmarkEnd w:id="29"/>
+      <w:bookmarkEnd w:id="30"/>
     </w:p>
     <w:p>
       <w:pPr>
@@ -5715,33 +5894,36 @@
       <w:pPr>
         <w:pStyle w:val="Heading1"/>
       </w:pPr>
-      <w:bookmarkStart w:id="30" w:name="_Toc237169209"/>
+      <w:bookmarkStart w:id="31" w:name="_Toc237272094"/>
       <w:r>
         <w:t>19. Documentation Generation</w:t>
       </w:r>
-      <w:bookmarkEnd w:id="30"/>
-    </w:p>
-    <w:p>
-      <w:r>
-        <w:t>The editable guides are generated from actual source and engineering notes with python-docx. Each DOCX contains a real Word TOC field, a dedicated TOC section, and a new-page content section. Microsoft Word COM updates every field and TOC, repaginates, saves the DOCX, and creates the companion PDF with ExportAsFixedFormat. PDF pages are rendered to images and inspected before release. LibreOffice is not used for this project.</w:t>
+      <w:bookmarkEnd w:id="31"/>
+    </w:p>
+    <w:p>
+      <w:r>
+        <w:t xml:space="preserve">The editable guides are generated from actual source and engineering notes with python-docx. Each DOCX contains a real Word TOC field, a dedicated TOC section, and a new-page content section. Microsoft Word COM updates and saves the real TOC. Word ExportAsFixedFormat is attempted first for companion PDFs; when the local Word exporter is unresponsive, the approved HTML/CSS and browser-print fallback produces the PDFs. Every PDF page is rendered to images and inspected before release. LibreOffice is not used </w:t>
+      </w:r>
+      <w:r>
+        <w:t>for this project.</w:t>
       </w:r>
     </w:p>
     <w:p>
       <w:pPr>
         <w:pStyle w:val="Heading1"/>
       </w:pPr>
-      <w:bookmarkStart w:id="31" w:name="_Toc237169210"/>
+      <w:bookmarkStart w:id="32" w:name="_Toc237272095"/>
       <w:r>
         <w:t>20. Source References</w:t>
       </w:r>
-      <w:bookmarkEnd w:id="31"/>
+      <w:bookmarkEnd w:id="32"/>
     </w:p>
     <w:p>
       <w:pPr>
         <w:pStyle w:val="ListBullet"/>
       </w:pPr>
       <w:r>
-        <w:t>Repository source, forms, project metadata, schemas, and smoke tests as of August 9, 2026.</w:t>
+        <w:t>Repository source, forms, project metadata, schemas, and smoke tests as of August 10, 2026.</w:t>
       </w:r>
     </w:p>
     <w:p>
@@ -5781,156 +5963,10 @@
         <w:pStyle w:val="ListBullet"/>
       </w:pPr>
       <w:r>
+        <w:lastRenderedPageBreak/>
         <w:t>Google API-key guidance: https://docs.cloud.google.com/docs/authentication/api-keys-best-practices</w:t>
       </w:r>
     </w:p>
-    <w:p>
-      <w:pPr>
-        <w:spacing w:after="200" w:line="276" w:lineRule="auto"/>
-      </w:pPr>
-      <w:r>
-        <w:br w:type="page"/>
-      </w:r>
-    </w:p>
-    <w:p>
-      <w:pPr>
-        <w:pStyle w:val="Heading1"/>
-      </w:pPr>
-      <w:r>
-        <w:t>Guided Setup Wizard Architecture</w:t>
-      </w:r>
-    </w:p>
-    <w:p>
-      <w:r>
-        <w:t>DAT.Studio.SetupWizard is a designer-authored FMX modal form. It is intentionally borderless, fixed-size, centered, and has no menu or system controls. All controls and layout parameters remain editable in the FMX designer. The main Studio launches it from Start Guided Setup while retaining the existing workflow as the advanced fallback.</w:t>
-      </w:r>
-    </w:p>
-    <w:p>
-      <w:pPr>
-        <w:pStyle w:val="ListNumber"/>
-        <w:numPr>
-          <w:ilvl w:val="0"/>
-          <w:numId w:val="16"/>
-        </w:numPr>
-      </w:pPr>
-      <w:r>
-        <w:t>The wizard owns isolated project-profile, scan-result, catalog, provider-key, backup, and component-kit state. No target source integration engine is invoked.</w:t>
-      </w:r>
-    </w:p>
-    <w:p>
-      <w:pPr>
-        <w:pStyle w:val="ListNumber"/>
-        <w:numPr>
-          <w:ilvl w:val="0"/>
-          <w:numId w:val="16"/>
-        </w:numPr>
-      </w:pPr>
-      <w:r>
-        <w:t>The left rail permits navigation only to steps already reached. A changed project or target language invalidates downstream scan/catalog state.</w:t>
-      </w:r>
-    </w:p>
-    <w:p>
-      <w:pPr>
-        <w:pStyle w:val="ListNumber"/>
-        <w:numPr>
-          <w:ilvl w:val="0"/>
-          <w:numId w:val="16"/>
-        </w:numPr>
-      </w:pPr>
-      <w:r>
-        <w:t>Pre-final activities are read-only with respect to the target except an explicitly saved provider credential, which is stored through Windows Credential Manager.</w:t>
-      </w:r>
-    </w:p>
-    <w:p>
-      <w:pPr>
-        <w:pStyle w:val="ListNumber"/>
-        <w:numPr>
-          <w:ilvl w:val="0"/>
-          <w:numId w:val="16"/>
-        </w:numPr>
-      </w:pPr>
-      <w:r>
-        <w:t>Final processing optionally creates a timestamped ZIP in Documents\Delphi App Translation Backups, translates only unresolved eligible entries, saves the development catalog, validates, exports the runtime JSON pack, and generates the component kit.</w:t>
-      </w:r>
-    </w:p>
-    <w:p>
-      <w:pPr>
-        <w:pStyle w:val="ListNumber"/>
-        <w:numPr>
-          <w:ilvl w:val="0"/>
-          <w:numId w:val="16"/>
-        </w:numPr>
-      </w:pPr>
-      <w:r>
-        <w:t>Blocking validation errors stop final processing before component-kit completion. Reviewed and approved translations are never resent automatically.</w:t>
-      </w:r>
-    </w:p>
-    <w:p>
-      <w:pPr>
-        <w:pStyle w:val="ListNumber"/>
-        <w:numPr>
-          <w:ilvl w:val="0"/>
-          <w:numId w:val="16"/>
-        </w:numPr>
-      </w:pPr>
-      <w:r>
-        <w:t>During final processing, Back, Cancel, the rail, and close-query approval are disabled. On failure, control is restored and the progress log identifies the stopping point.</w:t>
-      </w:r>
-    </w:p>
-    <w:p>
-      <w:pPr>
-        <w:pStyle w:val="ListNumber"/>
-        <w:numPr>
-          <w:ilvl w:val="0"/>
-          <w:numId w:val="16"/>
-        </w:numPr>
-      </w:pPr>
-      <w:r>
-        <w:t>The wizard generates four exact deployment commands for Win32 and Win64 Debug and Release. Every command launches the system Windows PowerShell executable with -NoProfile -ExecutionPolicy Bypass.</w:t>
-      </w:r>
-    </w:p>
-    <w:p>
-      <w:pPr>
-        <w:pStyle w:val="ListNumber"/>
-        <w:numPr>
-          <w:ilvl w:val="0"/>
-          <w:numId w:val="16"/>
-        </w:numPr>
-      </w:pPr>
-      <w:r>
-        <w:t>Run Pack Deployment executes the same generated script only for target output folders that exist. Missing output folders are skipped.</w:t>
-      </w:r>
-    </w:p>
-    <w:p>
-      <w:pPr>
-        <w:pStyle w:val="ListNumber"/>
-        <w:numPr>
-          <w:ilvl w:val="0"/>
-          <w:numId w:val="16"/>
-        </w:numPr>
-      </w:pPr>
-      <w:r>
-        <w:t>The component package remains a manual RAD Studio operation through Component &gt; Install Packages &gt; Add. The wizard never writes the IDE package registry and never uses the Install Component wizard.</w:t>
-      </w:r>
-    </w:p>
-    <w:p>
-      <w:pPr>
-        <w:pStyle w:val="ListNumber"/>
-        <w:numPr>
-          <w:ilvl w:val="0"/>
-          <w:numId w:val="16"/>
-        </w:numPr>
-      </w:pPr>
-      <w:r>
-        <w:t>Wizard-Completion-Report.txt is written into the generated kit and records the project, language, catalog, runtime pack, backup, manual step, and deployment commands.</w:t>
-      </w:r>
-    </w:p>
-    <w:p>
-      <w:r>
-        <w:t>The form source is source\studio\DAT.Studio.SetupWizard.pas and its editable designer resource is source\studio\DAT.Studio.SetupWizard.fmx. The unit is registered in the DPR and DPROJ. Release validation must compile Win32 and Win64 Debug and Release and instantiate the wizard form to verify FMX streaming.</w:t>
-      </w:r>
-    </w:p>
-    <w:p/>
     <w:sectPr>
       <w:headerReference w:type="default" r:id="rId13"/>
       <w:footerReference w:type="default" r:id="rId14"/>
@@ -6345,190 +6381,44 @@
       </w:rPr>
     </w:lvl>
   </w:abstractNum>
-  <w:abstractNum w:abstractNumId="9" w15:restartNumberingAfterBreak="0">
-    <w:nsid w:val="345C6417"/>
-    <w:multiLevelType w:val="singleLevel"/>
-    <w:tmpl w:val="0409000F"/>
-    <w:lvl w:ilvl="0">
-      <w:start w:val="1"/>
-      <w:numFmt w:val="decimal"/>
-      <w:lvlText w:val="%1."/>
-      <w:lvlJc w:val="left"/>
-      <w:pPr>
-        <w:ind w:left="720" w:hanging="360"/>
-      </w:pPr>
-    </w:lvl>
-  </w:abstractNum>
-  <w:abstractNum w:abstractNumId="10" w15:restartNumberingAfterBreak="0">
-    <w:nsid w:val="5E3D2508"/>
-    <w:multiLevelType w:val="hybridMultilevel"/>
-    <w:tmpl w:val="D9C858E4"/>
-    <w:lvl w:ilvl="0" w:tplc="0409000F">
-      <w:start w:val="1"/>
-      <w:numFmt w:val="decimal"/>
-      <w:lvlText w:val="%1."/>
-      <w:lvlJc w:val="left"/>
-      <w:pPr>
-        <w:ind w:left="360" w:hanging="360"/>
-      </w:pPr>
-    </w:lvl>
-    <w:lvl w:ilvl="1" w:tplc="04090019" w:tentative="1">
-      <w:start w:val="1"/>
-      <w:numFmt w:val="lowerLetter"/>
-      <w:lvlText w:val="%2."/>
-      <w:lvlJc w:val="left"/>
-      <w:pPr>
-        <w:ind w:left="1080" w:hanging="360"/>
-      </w:pPr>
-    </w:lvl>
-    <w:lvl w:ilvl="2" w:tplc="0409001B" w:tentative="1">
-      <w:start w:val="1"/>
-      <w:numFmt w:val="lowerRoman"/>
-      <w:lvlText w:val="%3."/>
-      <w:lvlJc w:val="right"/>
-      <w:pPr>
-        <w:ind w:left="1800" w:hanging="180"/>
-      </w:pPr>
-    </w:lvl>
-    <w:lvl w:ilvl="3" w:tplc="0409000F" w:tentative="1">
-      <w:start w:val="1"/>
-      <w:numFmt w:val="decimal"/>
-      <w:lvlText w:val="%4."/>
-      <w:lvlJc w:val="left"/>
-      <w:pPr>
-        <w:ind w:left="2520" w:hanging="360"/>
-      </w:pPr>
-    </w:lvl>
-    <w:lvl w:ilvl="4" w:tplc="04090019" w:tentative="1">
-      <w:start w:val="1"/>
-      <w:numFmt w:val="lowerLetter"/>
-      <w:lvlText w:val="%5."/>
-      <w:lvlJc w:val="left"/>
-      <w:pPr>
-        <w:ind w:left="3240" w:hanging="360"/>
-      </w:pPr>
-    </w:lvl>
-    <w:lvl w:ilvl="5" w:tplc="0409001B" w:tentative="1">
-      <w:start w:val="1"/>
-      <w:numFmt w:val="lowerRoman"/>
-      <w:lvlText w:val="%6."/>
-      <w:lvlJc w:val="right"/>
-      <w:pPr>
-        <w:ind w:left="3960" w:hanging="180"/>
-      </w:pPr>
-    </w:lvl>
-    <w:lvl w:ilvl="6" w:tplc="0409000F" w:tentative="1">
-      <w:start w:val="1"/>
-      <w:numFmt w:val="decimal"/>
-      <w:lvlText w:val="%7."/>
-      <w:lvlJc w:val="left"/>
-      <w:pPr>
-        <w:ind w:left="4680" w:hanging="360"/>
-      </w:pPr>
-    </w:lvl>
-    <w:lvl w:ilvl="7" w:tplc="04090019" w:tentative="1">
-      <w:start w:val="1"/>
-      <w:numFmt w:val="lowerLetter"/>
-      <w:lvlText w:val="%8."/>
-      <w:lvlJc w:val="left"/>
-      <w:pPr>
-        <w:ind w:left="5400" w:hanging="360"/>
-      </w:pPr>
-    </w:lvl>
-    <w:lvl w:ilvl="8" w:tplc="0409001B" w:tentative="1">
-      <w:start w:val="1"/>
-      <w:numFmt w:val="lowerRoman"/>
-      <w:lvlText w:val="%9."/>
-      <w:lvlJc w:val="right"/>
-      <w:pPr>
-        <w:ind w:left="6120" w:hanging="180"/>
-      </w:pPr>
-    </w:lvl>
-  </w:abstractNum>
-  <w:abstractNum w:abstractNumId="11" w15:restartNumberingAfterBreak="0">
-    <w:nsid w:val="5FAF7620"/>
-    <w:multiLevelType w:val="singleLevel"/>
-    <w:tmpl w:val="0409000F"/>
-    <w:lvl w:ilvl="0">
-      <w:start w:val="1"/>
-      <w:numFmt w:val="decimal"/>
-      <w:lvlText w:val="%1."/>
-      <w:lvlJc w:val="left"/>
-      <w:pPr>
-        <w:ind w:left="720" w:hanging="360"/>
-      </w:pPr>
-    </w:lvl>
-  </w:abstractNum>
-  <w:abstractNum w:abstractNumId="12" w15:restartNumberingAfterBreak="0">
-    <w:nsid w:val="6D176838"/>
-    <w:multiLevelType w:val="singleLevel"/>
-    <w:tmpl w:val="0409000F"/>
-    <w:lvl w:ilvl="0">
-      <w:start w:val="1"/>
-      <w:numFmt w:val="decimal"/>
-      <w:lvlText w:val="%1."/>
-      <w:lvlJc w:val="left"/>
-      <w:pPr>
-        <w:ind w:left="720" w:hanging="360"/>
-      </w:pPr>
-    </w:lvl>
-  </w:abstractNum>
-  <w:num w:numId="1" w16cid:durableId="715734825">
+  <w:num w:numId="1" w16cid:durableId="1000890675">
     <w:abstractNumId w:val="8"/>
   </w:num>
-  <w:num w:numId="2" w16cid:durableId="995500562">
+  <w:num w:numId="2" w16cid:durableId="665325939">
     <w:abstractNumId w:val="6"/>
   </w:num>
-  <w:num w:numId="3" w16cid:durableId="708146172">
+  <w:num w:numId="3" w16cid:durableId="1984846173">
     <w:abstractNumId w:val="5"/>
   </w:num>
-  <w:num w:numId="4" w16cid:durableId="567689029">
+  <w:num w:numId="4" w16cid:durableId="146014697">
     <w:abstractNumId w:val="4"/>
   </w:num>
-  <w:num w:numId="5" w16cid:durableId="207497837">
+  <w:num w:numId="5" w16cid:durableId="662203934">
     <w:abstractNumId w:val="7"/>
   </w:num>
-  <w:num w:numId="6" w16cid:durableId="1492717991">
+  <w:num w:numId="6" w16cid:durableId="1190071932">
     <w:abstractNumId w:val="3"/>
   </w:num>
-  <w:num w:numId="7" w16cid:durableId="1642005939">
+  <w:num w:numId="7" w16cid:durableId="964971698">
     <w:abstractNumId w:val="2"/>
   </w:num>
-  <w:num w:numId="8" w16cid:durableId="700281636">
+  <w:num w:numId="8" w16cid:durableId="266548458">
     <w:abstractNumId w:val="1"/>
   </w:num>
-  <w:num w:numId="9" w16cid:durableId="1714888122">
+  <w:num w:numId="9" w16cid:durableId="1016351125">
     <w:abstractNumId w:val="0"/>
   </w:num>
-  <w:num w:numId="10" w16cid:durableId="109664435">
+  <w:num w:numId="10" w16cid:durableId="1298755520">
     <w:abstractNumId w:val="7"/>
     <w:lvlOverride w:ilvl="0">
       <w:startOverride w:val="1"/>
     </w:lvlOverride>
   </w:num>
-  <w:num w:numId="11" w16cid:durableId="168061974">
+  <w:num w:numId="11" w16cid:durableId="1862041458">
     <w:abstractNumId w:val="7"/>
     <w:lvlOverride w:ilvl="0">
       <w:startOverride w:val="1"/>
     </w:lvlOverride>
-  </w:num>
-  <w:num w:numId="12" w16cid:durableId="1682587093">
-    <w:abstractNumId w:val="7"/>
-    <w:lvlOverride w:ilvl="0">
-      <w:startOverride w:val="1"/>
-    </w:lvlOverride>
-  </w:num>
-  <w:num w:numId="13" w16cid:durableId="170532043">
-    <w:abstractNumId w:val="10"/>
-  </w:num>
-  <w:num w:numId="14" w16cid:durableId="432823334">
-    <w:abstractNumId w:val="12"/>
-  </w:num>
-  <w:num w:numId="15" w16cid:durableId="629825227">
-    <w:abstractNumId w:val="11"/>
-  </w:num>
-  <w:num w:numId="16" w16cid:durableId="561674159">
-    <w:abstractNumId w:val="9"/>
   </w:num>
 </w:numbering>
 </file>
@@ -7498,6 +7388,7 @@
         <w:numId w:val="5"/>
       </w:numPr>
       <w:spacing w:after="80"/>
+      <w:ind w:left="540" w:hanging="271"/>
       <w:contextualSpacing/>
     </w:pPr>
   </w:style>
@@ -17953,7 +17844,7 @@
     <w:autoRedefine/>
     <w:uiPriority w:val="39"/>
     <w:unhideWhenUsed/>
-    <w:rsid w:val="00563E43"/>
+    <w:rsid w:val="00C20D4F"/>
     <w:pPr>
       <w:spacing w:after="100"/>
     </w:pPr>
@@ -17965,7 +17856,7 @@
     <w:autoRedefine/>
     <w:uiPriority w:val="39"/>
     <w:unhideWhenUsed/>
-    <w:rsid w:val="00563E43"/>
+    <w:rsid w:val="00C20D4F"/>
     <w:pPr>
       <w:spacing w:after="100"/>
       <w:ind w:left="220"/>
@@ -17976,7 +17867,7 @@
     <w:basedOn w:val="DefaultParagraphFont"/>
     <w:uiPriority w:val="99"/>
     <w:unhideWhenUsed/>
-    <w:rsid w:val="00563E43"/>
+    <w:rsid w:val="00C20D4F"/>
     <w:rPr>
       <w:color w:val="0000FF" w:themeColor="hyperlink"/>
       <w:u w:val="single"/>

</xml_diff>

<commit_message>
Resolve current setup to-do documentation
</commit_message>
<xml_diff>
--- a/docs/guides/Delphi App Translation Studio Engineering Guide.docx
+++ b/docs/guides/Delphi App Translation Studio Engineering Guide.docx
@@ -3258,6 +3258,39 @@
         <w:t>Google API-key guidance: https://docs.cloud.google.com/docs/authentication/api-keys-best-practices</w:t>
       </w:r>
     </w:p>
+    <w:p>
+      <w:r>
+        <w:br w:type="page"/>
+      </w:r>
+    </w:p>
+    <w:p>
+      <w:pPr>
+        <w:pStyle w:val="Heading1"/>
+      </w:pPr>
+      <w:r>
+        <w:t>Current Workflow Update - August 14, 2026</w:t>
+      </w:r>
+    </w:p>
+    <w:p>
+      <w:r>
+        <w:t>The Setup Wizard is the preferred first-run path. Install or confirm the DAT design package first, place the language manager and selector on the target form if needed, save the project, then run the Wizard.</w:t>
+      </w:r>
+    </w:p>
+    <w:p>
+      <w:r>
+        <w:t>The Wizard performs the scan, automatic translation, review, validation, runtime-pack export, component-kit generation, deployment configuration, and optional build/deploy from the finish page.</w:t>
+      </w:r>
+    </w:p>
+    <w:p>
+      <w:r>
+        <w:t>Finish remains disabled while selected build/deploy work is active. Portable destinations can receive JSON packs and, when replace/create is authorized, the executable.</w:t>
+      </w:r>
+    </w:p>
+    <w:p>
+      <w:r>
+        <w:t>The Maintenance Studio remains available for later changes, additional languages, glossary edits, complete reset, and troubleshooting.</w:t>
+      </w:r>
+    </w:p>
     <w:sectPr>
       <w:headerReference w:type="default" r:id="rId14"/>
       <w:footerReference w:type="default" r:id="rId15"/>

</xml_diff>

<commit_message>
Revert "Resolve current setup to-do documentation"
This reverts commit 5cacceaa75431ac31c77d31a5409bd366acc6a26.
</commit_message>
<xml_diff>
--- a/docs/guides/Delphi App Translation Studio Engineering Guide.docx
+++ b/docs/guides/Delphi App Translation Studio Engineering Guide.docx
@@ -3258,39 +3258,6 @@
         <w:t>Google API-key guidance: https://docs.cloud.google.com/docs/authentication/api-keys-best-practices</w:t>
       </w:r>
     </w:p>
-    <w:p>
-      <w:r>
-        <w:br w:type="page"/>
-      </w:r>
-    </w:p>
-    <w:p>
-      <w:pPr>
-        <w:pStyle w:val="Heading1"/>
-      </w:pPr>
-      <w:r>
-        <w:t>Current Workflow Update - August 14, 2026</w:t>
-      </w:r>
-    </w:p>
-    <w:p>
-      <w:r>
-        <w:t>The Setup Wizard is the preferred first-run path. Install or confirm the DAT design package first, place the language manager and selector on the target form if needed, save the project, then run the Wizard.</w:t>
-      </w:r>
-    </w:p>
-    <w:p>
-      <w:r>
-        <w:t>The Wizard performs the scan, automatic translation, review, validation, runtime-pack export, component-kit generation, deployment configuration, and optional build/deploy from the finish page.</w:t>
-      </w:r>
-    </w:p>
-    <w:p>
-      <w:r>
-        <w:t>Finish remains disabled while selected build/deploy work is active. Portable destinations can receive JSON packs and, when replace/create is authorized, the executable.</w:t>
-      </w:r>
-    </w:p>
-    <w:p>
-      <w:r>
-        <w:t>The Maintenance Studio remains available for later changes, additional languages, glossary edits, complete reset, and troubleshooting.</w:t>
-      </w:r>
-    </w:p>
     <w:sectPr>
       <w:headerReference w:type="default" r:id="rId14"/>
       <w:footerReference w:type="default" r:id="rId15"/>

</xml_diff>

<commit_message>
Complete universal localization stabilization
</commit_message>
<xml_diff>
--- a/docs/guides/Delphi App Translation Studio Engineering Guide.docx
+++ b/docs/guides/Delphi App Translation Studio Engineering Guide.docx
@@ -4048,7 +4048,7 @@
           </w:tcPr>
           <w:p>
             <w:r>
-              <w:t>Deterministic order, pruned output trees, cancellation, identical duplicate suppression, and visible conflicting duplicates.</w:t>
+              <w:t>Deterministic order, pruned output trees, category counts, cancellation, identical duplicate suppression, visible conflicting duplicates, and explicit manifest-only external JSON prose.</w:t>
             </w:r>
           </w:p>
         </w:tc>
@@ -4124,7 +4124,7 @@
           </w:tcPr>
           <w:p>
             <w:r>
-              <w:t>Long Studio work executes outside the UI thread, queues progress safely, observes cancellation, and contains no production ProcessMessages loop.</w:t>
+              <w:t>Long Studio work executes outside the UI thread, queues visible progress safely, observes cancellation, exposes File &gt; Exit, and contains no production ProcessMessages loop.</w:t>
             </w:r>
           </w:p>
         </w:tc>
@@ -4135,7 +4135,83 @@
           </w:tcPr>
           <w:p>
             <w:r>
-              <w:t>Studio responsiveness contract and launch tests</w:t>
+              <w:t>Studio form, responsiveness, and launch tests</w:t>
+            </w:r>
+          </w:p>
+        </w:tc>
+      </w:tr>
+      <w:tr>
+        <w:trPr>
+          <w:cantSplit/>
+        </w:trPr>
+        <w:tc>
+          <w:tcPr>
+            <w:tcW w:type="dxa" w:w="1800"/>
+            <w:vAlign w:val="center"/>
+          </w:tcPr>
+          <w:p>
+            <w:r>
+              <w:t>Locale selection</w:t>
+            </w:r>
+          </w:p>
+        </w:tc>
+        <w:tc>
+          <w:tcPr>
+            <w:tcW w:type="dxa" w:w="3900"/>
+            <w:vAlign w:val="center"/>
+          </w:tcPr>
+          <w:p>
+            <w:r>
+              <w:t>New projects require an explicit target locale; reopening a catalog restores saved locale facts without a programmatic combo-box change overwriting them.</w:t>
+            </w:r>
+          </w:p>
+        </w:tc>
+        <w:tc>
+          <w:tcPr>
+            <w:tcW w:type="dxa" w:w="3660"/>
+            <w:vAlign w:val="center"/>
+          </w:tcPr>
+          <w:p>
+            <w:r>
+              <w:t>StudioFormSmokeTests and locale-facts tests</w:t>
+            </w:r>
+          </w:p>
+        </w:tc>
+      </w:tr>
+      <w:tr>
+        <w:trPr>
+          <w:cantSplit/>
+        </w:trPr>
+        <w:tc>
+          <w:tcPr>
+            <w:tcW w:type="dxa" w:w="1800"/>
+            <w:vAlign w:val="center"/>
+          </w:tcPr>
+          <w:p>
+            <w:r>
+              <w:t>Semantic states</w:t>
+            </w:r>
+          </w:p>
+        </w:tc>
+        <w:tc>
+          <w:tcPr>
+            <w:tcW w:type="dxa" w:w="3900"/>
+            <w:vAlign w:val="center"/>
+          </w:tcPr>
+          <w:p>
+            <w:r>
+              <w:t>Exact UI-state concepts such as On and Off use authoritative per-locale terminology; directional words and unrelated uses remain untouched.</w:t>
+            </w:r>
+          </w:p>
+        </w:tc>
+        <w:tc>
+          <w:tcPr>
+            <w:tcW w:type="dxa" w:w="3660"/>
+            <w:vAlign w:val="center"/>
+          </w:tcPr>
+          <w:p>
+            <w:r>
+              <w:t>FoundationSmokeTests terminology matrix</w:t>
             </w:r>
           </w:p>
         </w:tc>
@@ -4152,6 +4228,42 @@
     <w:p>
       <w:r>
         <w:t>DAT.Core.Diagnostics is the common boundary for persistence recovery, rejected packs, fallback decisions, scan cancellation/conflicts, package publication, deployment rollback, and runtime lifecycle failures. Messages contain operation, artifact, and corrective context but never provider keys or raw authenticated responses.</w:t>
+      </w:r>
+    </w:p>
+    <w:p>
+      <w:pPr>
+        <w:pStyle w:val="Heading2"/>
+      </w:pPr>
+      <w:r>
+        <w:t>21.2 Universal FMX geometry and fitting</w:t>
+      </w:r>
+    </w:p>
+    <w:p>
+      <w:r>
+        <w:t>DAT.Runtime.FMX snapshots designer geometry before translation and restores that snapshot before every subsequent direction change. Mirroring resolves the effective width from the immediate parent, saved parent geometry, and an owning tab control when FMX reports inactive-page placeholders. Near-full-width cards preserve the measured content gutter on both sides; transport controls move as a block without reversing machine order.</w:t>
+      </w:r>
+    </w:p>
+    <w:p>
+      <w:r>
+        <w:t>The conservative fitting pass is independent of language codes. It measures rendered text, protects the nearest same-row neighbor, preserves a button that already fits, grows into available space, lowers font size only to the readable floor, and wraps only when required. A bounded two-pass container check adds bottom padding and cascades only directly stacked siblings, preventing clipping without creating a recurring layout loop.</w:t>
+      </w:r>
+    </w:p>
+    <w:p>
+      <w:pPr>
+        <w:pStyle w:val="Heading2"/>
+      </w:pPr>
+      <w:r>
+        <w:t>21.3 Declared external resource text</w:t>
+      </w:r>
+    </w:p>
+    <w:p>
+      <w:r>
+        <w:t>Project-owned JSON is data until the project explicitly declares otherwise. A schema-version 1 dat-translatable-resources.json manifest may name only directories inside the selected project, file-name patterns without path traversal, and non-empty JSON property names. The scanner validates duplicate members, rejects malformed JSON and missing/outside directories, scans only declared string properties, and leaves every undeclared field untouched.</w:t>
+      </w:r>
+    </w:p>
+    <w:p>
+      <w:r>
+        <w:t>This boundary is required for generated HTML reference pages and other data-driven interfaces: the host project declares exactly which note, caption, or description properties are operator-facing. The Translation Studio never guesses that every string in an arbitrary JSON file is safe to translate.</w:t>
       </w:r>
     </w:p>
     <w:sectPr>

</xml_diff>

<commit_message>
Refine setup wizard and reconcile scan totals
</commit_message>
<xml_diff>
--- a/docs/guides/Delphi App Translation Studio Engineering Guide.docx
+++ b/docs/guides/Delphi App Translation Studio Engineering Guide.docx
@@ -109,7 +109,7 @@
         </w:rPr>
         <w:t>Version 1.0</w:t>
         <w:br/>
-        <w:t>Last changed: August 27, 2026</w:t>
+        <w:t>Last changed: August 30, 2026</w:t>
         <w:br/>
         <w:t>Windows • Delphi VCL and FireMonkey • Win32 and Win64</w:t>
       </w:r>
@@ -1745,7 +1745,7 @@
     </w:p>
     <w:p>
       <w:r>
-        <w:t>DAT.Studio.SetupWizard is a separate, designer-authored FMX modal form opened by Start Setup Wizard. It is borderless, fixed-size, centered, and deliberately omits menu and system controls. Its nine hidden TabControl pages, including the Deployment Destinations page, left navigation rail, footer controls, labels, dialogs, lists, check boxes, memos, and layout geometry are all persisted in DAT.Studio.SetupWizard.fmx and remain editable in the Form Designer. A designer-authored modal backdrop dims and blocks the Studio while the Wizard is open so the two blue interfaces remain visually distinct.</w:t>
+        <w:t>DAT.Studio.SetupWizard is a separate, designer-authored FMX modal form opened by Start Setup Wizard. It is borderless, fixed-size, centered, and deliberately omits menu and system controls. Its eight hidden TabControl pages, including the Deployment Destinations page, left navigation rail, footer controls, labels, dialogs, lists, check boxes, memos, and layout geometry are all persisted in DAT.Studio.SetupWizard.fmx and remain editable in the Form Designer. A designer-authored modal backdrop dims and blocks the Studio while the Wizard is open so the two blue interfaces remain visually distinct.</w:t>
       </w:r>
     </w:p>
     <w:p>
@@ -3152,7 +3152,7 @@
     </w:tbl>
     <w:p>
       <w:r>
-        <w:t>The August 27, 2026 stabilization gate requires the complete verification harness and Phase 10 release validation to pass without interruption. The gate covers Debug and Release packages, Win32/Win64 manager suites, scanner/catalog/provider contracts, atomic persistence and recovery, strict packs, component non-mutation, runtime and advanced integration, Studio builds, direct FMX form streaming, launch, self-localization, and disposable real-application pilots.</w:t>
+        <w:t>The August 30, 2026 stabilization gate requires the complete verification harness and Phase 10 release validation to pass without interruption. The gate covers Debug and Release packages, Win32/Win64 manager suites, scanner/catalog/provider contracts, atomic persistence and recovery, strict packs, component non-mutation, runtime and advanced integration, Studio builds, direct FMX form streaming, launch, self-localization, and disposable real-application pilots.</w:t>
       </w:r>
     </w:p>
     <w:p>
@@ -3639,7 +3639,7 @@
         <w:pStyle w:val="ListBullet"/>
       </w:pPr>
       <w:r>
-        <w:t>Repository source, forms, project metadata, schemas, and smoke tests as of August 27, 2026.</w:t>
+        <w:t>Repository source, forms, project metadata, schemas, and smoke tests as of August 30, 2026.</w:t>
       </w:r>
     </w:p>
     <w:p>

</xml_diff>

<commit_message>
docs: explain translation as a development workflow
</commit_message>
<xml_diff>
--- a/docs/guides/Delphi App Translation Studio Engineering Guide.docx
+++ b/docs/guides/Delphi App Translation Studio Engineering Guide.docx
@@ -317,7 +317,7 @@
                 <w:color w:val="5D7693"/>
                 <w:sz w:val="18"/>
               </w:rPr>
-              <w:t>5</w:t>
+              <w:t>6</w:t>
             </w:r>
           </w:p>
         </w:tc>
@@ -481,7 +481,7 @@
                 <w:color w:val="5D7693"/>
                 <w:sz w:val="18"/>
               </w:rPr>
-              <w:t>9</w:t>
+              <w:t>10</w:t>
             </w:r>
           </w:p>
         </w:tc>
@@ -503,47 +503,6 @@
                 <w:sz w:val="18"/>
               </w:rPr>
               <w:t>9. Provider Pipeline and Credential Security</w:t>
-            </w:r>
-          </w:p>
-        </w:tc>
-        <w:tc>
-          <w:tcPr>
-            <w:tcW w:type="dxa" w:w="1160"/>
-          </w:tcPr>
-          <w:p>
-            <w:pPr>
-              <w:spacing w:after="20"/>
-              <w:jc w:val="right"/>
-            </w:pPr>
-            <w:r>
-              <w:rPr>
-                <w:rFonts w:ascii="Aptos" w:hAnsi="Aptos"/>
-                <w:b/>
-                <w:color w:val="5D7693"/>
-                <w:sz w:val="18"/>
-              </w:rPr>
-              <w:t>10</w:t>
-            </w:r>
-          </w:p>
-        </w:tc>
-      </w:tr>
-      <w:tr>
-        <w:tc>
-          <w:tcPr>
-            <w:tcW w:type="dxa" w:w="8200"/>
-          </w:tcPr>
-          <w:p>
-            <w:pPr>
-              <w:keepLines/>
-              <w:spacing w:after="20"/>
-            </w:pPr>
-            <w:r>
-              <w:rPr>
-                <w:rFonts w:ascii="Aptos" w:hAnsi="Aptos"/>
-                <w:color w:val="234C80"/>
-                <w:sz w:val="18"/>
-              </w:rPr>
-              <w:t>10. Localization Review, Measurement, Layout, and Hyphenation</w:t>
             </w:r>
           </w:p>
         </w:tc>
@@ -584,7 +543,7 @@
                 <w:color w:val="234C80"/>
                 <w:sz w:val="18"/>
               </w:rPr>
-              <w:t>11. Validation and Runtime Pack Export</w:t>
+              <w:t>10. Localization Review, Measurement, Layout, and Hyphenation</w:t>
             </w:r>
           </w:p>
         </w:tc>
@@ -625,7 +584,7 @@
                 <w:color w:val="234C80"/>
                 <w:sz w:val="18"/>
               </w:rPr>
-              <w:t>12. Offline Runtime Manager and Pack Admission</w:t>
+              <w:t>11. Validation and Runtime Pack Export</w:t>
             </w:r>
           </w:p>
         </w:tc>
@@ -666,7 +625,7 @@
                 <w:color w:val="234C80"/>
                 <w:sz w:val="18"/>
               </w:rPr>
-              <w:t>13. VCL Runtime Application and Lifecycle</w:t>
+              <w:t>12. Offline Runtime Manager and Pack Admission</w:t>
             </w:r>
           </w:p>
         </w:tc>
@@ -707,7 +666,7 @@
                 <w:color w:val="234C80"/>
                 <w:sz w:val="18"/>
               </w:rPr>
-              <w:t>14. FMX Runtime Application and Lifecycle</w:t>
+              <w:t>13. VCL Runtime Application and Lifecycle</w:t>
             </w:r>
           </w:p>
         </w:tc>
@@ -748,7 +707,7 @@
                 <w:color w:val="234C80"/>
                 <w:sz w:val="18"/>
               </w:rPr>
-              <w:t>15. Components, Design Packages, and Designer Contract</w:t>
+              <w:t>14. FMX Runtime Application and Lifecycle</w:t>
             </w:r>
           </w:p>
         </w:tc>
@@ -789,6 +748,47 @@
                 <w:color w:val="234C80"/>
                 <w:sz w:val="18"/>
               </w:rPr>
+              <w:t>15. Components, Design Packages, and Designer Contract</w:t>
+            </w:r>
+          </w:p>
+        </w:tc>
+        <w:tc>
+          <w:tcPr>
+            <w:tcW w:type="dxa" w:w="1160"/>
+          </w:tcPr>
+          <w:p>
+            <w:pPr>
+              <w:spacing w:after="20"/>
+              <w:jc w:val="right"/>
+            </w:pPr>
+            <w:r>
+              <w:rPr>
+                <w:rFonts w:ascii="Aptos" w:hAnsi="Aptos"/>
+                <w:b/>
+                <w:color w:val="5D7693"/>
+                <w:sz w:val="18"/>
+              </w:rPr>
+              <w:t>14</w:t>
+            </w:r>
+          </w:p>
+        </w:tc>
+      </w:tr>
+      <w:tr>
+        <w:tc>
+          <w:tcPr>
+            <w:tcW w:type="dxa" w:w="8200"/>
+          </w:tcPr>
+          <w:p>
+            <w:pPr>
+              <w:keepLines/>
+              <w:spacing w:after="20"/>
+            </w:pPr>
+            <w:r>
+              <w:rPr>
+                <w:rFonts w:ascii="Aptos" w:hAnsi="Aptos"/>
+                <w:color w:val="234C80"/>
+                <w:sz w:val="18"/>
+              </w:rPr>
               <w:t>16. ComponentSource and Target dependencies</w:t>
             </w:r>
           </w:p>
@@ -891,7 +891,7 @@
                 <w:color w:val="5D7693"/>
                 <w:sz w:val="18"/>
               </w:rPr>
-              <w:t>16</w:t>
+              <w:t>17</w:t>
             </w:r>
           </w:p>
         </w:tc>
@@ -1014,7 +1014,7 @@
                 <w:color w:val="5D7693"/>
                 <w:sz w:val="18"/>
               </w:rPr>
-              <w:t>18</w:t>
+              <w:t>19</w:t>
             </w:r>
           </w:p>
         </w:tc>
@@ -1459,6 +1459,34 @@
     <w:p>
       <w:r>
         <w:t>A term is introduced here before later chapters depend on it. The final reference chapters describe every production PAS unit individually, every test/spike/contract Pascal program, every Delphi project/package file, each JSON schema and FMX/DFM resource, and the important build and verification tools.</w:t>
+      </w:r>
+    </w:p>
+    <w:p>
+      <w:pPr>
+        <w:pStyle w:val="Heading2"/>
+      </w:pPr>
+      <w:r>
+        <w:t>1.1 Engineering Boundary: Localization Is a Development Workflow</w:t>
+      </w:r>
+    </w:p>
+    <w:p>
+      <w:r>
+        <w:t>Localization is performed against a Delphi source project during active development; it is not post-processing applied to a finished EXE. The scanner, catalog, review, pack, component, and deployment contracts assume that developers can rescan after source changes, inspect the results in application context, and make deliberate source or layout adjustments when the application requires them.</w:t>
+      </w:r>
+    </w:p>
+    <w:p>
+      <w:r>
+        <w:t>Automation has a defined boundary. Stable keys, source-aware merging, provider batching, structural validation, reversible baseline restoration, and framework-specific applicators make repeatable translation practical, but they cannot infer every sentence assembled from live data or make every linguistic, terminology, layout, and bidirectional-text decision on behalf of the application owner.</w:t>
+      </w:r>
+    </w:p>
+    <w:p>
+      <w:r>
+        <w:t>Engineering and release review must therefore cover semantic keys for dynamic text, specialized terminology, custom and third-party controls, protected identifiers, right-to-left and mixed-direction paragraphs, clipping, wrapping, and behavior after repeated language changes. A small and structurally simple project may need almost no manual adjustment; the architecture must nevertheless preserve a clear path for developer review and correction wherever it is needed.</w:t>
+      </w:r>
+    </w:p>
+    <w:p>
+      <w:r>
+        <w:t>The Studio’s engineering objective is to perform the safe translation work automatically and as accurately as possible, preserve application behavior and source ownership, and provide precise evidence for anything that still requires developer judgment.</w:t>
       </w:r>
     </w:p>
     <w:tbl>

</xml_diff>

<commit_message>
Prepare privacy-clean Apache 2.0 beta source release
</commit_message>
<xml_diff>
--- a/docs/guides/Delphi App Translation Studio Engineering Guide.docx
+++ b/docs/guides/Delphi App Translation Studio Engineering Guide.docx
@@ -317,7 +317,7 @@
                 <w:color w:val="5D7693"/>
                 <w:sz w:val="18"/>
               </w:rPr>
-              <w:t>6</w:t>
+              <w:t>5</w:t>
             </w:r>
           </w:p>
         </w:tc>
@@ -481,7 +481,7 @@
                 <w:color w:val="5D7693"/>
                 <w:sz w:val="18"/>
               </w:rPr>
-              <w:t>10</w:t>
+              <w:t>9</w:t>
             </w:r>
           </w:p>
         </w:tc>
@@ -503,6 +503,47 @@
                 <w:sz w:val="18"/>
               </w:rPr>
               <w:t>9. Provider Pipeline and Credential Security</w:t>
+            </w:r>
+          </w:p>
+        </w:tc>
+        <w:tc>
+          <w:tcPr>
+            <w:tcW w:type="dxa" w:w="1160"/>
+          </w:tcPr>
+          <w:p>
+            <w:pPr>
+              <w:spacing w:after="20"/>
+              <w:jc w:val="right"/>
+            </w:pPr>
+            <w:r>
+              <w:rPr>
+                <w:rFonts w:ascii="Aptos" w:hAnsi="Aptos"/>
+                <w:b/>
+                <w:color w:val="5D7693"/>
+                <w:sz w:val="18"/>
+              </w:rPr>
+              <w:t>10</w:t>
+            </w:r>
+          </w:p>
+        </w:tc>
+      </w:tr>
+      <w:tr>
+        <w:tc>
+          <w:tcPr>
+            <w:tcW w:type="dxa" w:w="8200"/>
+          </w:tcPr>
+          <w:p>
+            <w:pPr>
+              <w:keepLines/>
+              <w:spacing w:after="20"/>
+            </w:pPr>
+            <w:r>
+              <w:rPr>
+                <w:rFonts w:ascii="Aptos" w:hAnsi="Aptos"/>
+                <w:color w:val="234C80"/>
+                <w:sz w:val="18"/>
+              </w:rPr>
+              <w:t>10. Localization Review, Measurement, Layout, and Hyphenation</w:t>
             </w:r>
           </w:p>
         </w:tc>
@@ -543,7 +584,7 @@
                 <w:color w:val="234C80"/>
                 <w:sz w:val="18"/>
               </w:rPr>
-              <w:t>10. Localization Review, Measurement, Layout, and Hyphenation</w:t>
+              <w:t>11. Validation and Runtime Pack Export</w:t>
             </w:r>
           </w:p>
         </w:tc>
@@ -584,7 +625,7 @@
                 <w:color w:val="234C80"/>
                 <w:sz w:val="18"/>
               </w:rPr>
-              <w:t>11. Validation and Runtime Pack Export</w:t>
+              <w:t>12. Offline Runtime Manager and Pack Admission</w:t>
             </w:r>
           </w:p>
         </w:tc>
@@ -625,7 +666,7 @@
                 <w:color w:val="234C80"/>
                 <w:sz w:val="18"/>
               </w:rPr>
-              <w:t>12. Offline Runtime Manager and Pack Admission</w:t>
+              <w:t>13. VCL Runtime Application and Lifecycle</w:t>
             </w:r>
           </w:p>
         </w:tc>
@@ -666,7 +707,7 @@
                 <w:color w:val="234C80"/>
                 <w:sz w:val="18"/>
               </w:rPr>
-              <w:t>13. VCL Runtime Application and Lifecycle</w:t>
+              <w:t>14. FMX Runtime Application and Lifecycle</w:t>
             </w:r>
           </w:p>
         </w:tc>
@@ -707,7 +748,7 @@
                 <w:color w:val="234C80"/>
                 <w:sz w:val="18"/>
               </w:rPr>
-              <w:t>14. FMX Runtime Application and Lifecycle</w:t>
+              <w:t>15. Components, Design Packages, and Designer Contract</w:t>
             </w:r>
           </w:p>
         </w:tc>
@@ -748,47 +789,6 @@
                 <w:color w:val="234C80"/>
                 <w:sz w:val="18"/>
               </w:rPr>
-              <w:t>15. Components, Design Packages, and Designer Contract</w:t>
-            </w:r>
-          </w:p>
-        </w:tc>
-        <w:tc>
-          <w:tcPr>
-            <w:tcW w:type="dxa" w:w="1160"/>
-          </w:tcPr>
-          <w:p>
-            <w:pPr>
-              <w:spacing w:after="20"/>
-              <w:jc w:val="right"/>
-            </w:pPr>
-            <w:r>
-              <w:rPr>
-                <w:rFonts w:ascii="Aptos" w:hAnsi="Aptos"/>
-                <w:b/>
-                <w:color w:val="5D7693"/>
-                <w:sz w:val="18"/>
-              </w:rPr>
-              <w:t>14</w:t>
-            </w:r>
-          </w:p>
-        </w:tc>
-      </w:tr>
-      <w:tr>
-        <w:tc>
-          <w:tcPr>
-            <w:tcW w:type="dxa" w:w="8200"/>
-          </w:tcPr>
-          <w:p>
-            <w:pPr>
-              <w:keepLines/>
-              <w:spacing w:after="20"/>
-            </w:pPr>
-            <w:r>
-              <w:rPr>
-                <w:rFonts w:ascii="Aptos" w:hAnsi="Aptos"/>
-                <w:color w:val="234C80"/>
-                <w:sz w:val="18"/>
-              </w:rPr>
               <w:t>16. ComponentSource and Target dependencies</w:t>
             </w:r>
           </w:p>
@@ -891,7 +891,7 @@
                 <w:color w:val="5D7693"/>
                 <w:sz w:val="18"/>
               </w:rPr>
-              <w:t>17</w:t>
+              <w:t>16</w:t>
             </w:r>
           </w:p>
         </w:tc>
@@ -1014,7 +1014,7 @@
                 <w:color w:val="5D7693"/>
                 <w:sz w:val="18"/>
               </w:rPr>
-              <w:t>19</w:t>
+              <w:t>18</w:t>
             </w:r>
           </w:p>
         </w:tc>
@@ -1137,7 +1137,7 @@
                 <w:color w:val="5D7693"/>
                 <w:sz w:val="18"/>
               </w:rPr>
-              <w:t>59</w:t>
+              <w:t>60</w:t>
             </w:r>
           </w:p>
         </w:tc>
@@ -1178,7 +1178,7 @@
                 <w:color w:val="5D7693"/>
                 <w:sz w:val="18"/>
               </w:rPr>
-              <w:t>77</w:t>
+              <w:t>80</w:t>
             </w:r>
           </w:p>
         </w:tc>
@@ -1219,7 +1219,7 @@
                 <w:color w:val="5D7693"/>
                 <w:sz w:val="18"/>
               </w:rPr>
-              <w:t>79</w:t>
+              <w:t>82</w:t>
             </w:r>
           </w:p>
         </w:tc>
@@ -1241,47 +1241,6 @@
                 <w:sz w:val="18"/>
               </w:rPr>
               <w:t>27. Build, Verification, and Documentation Tool Reference</w:t>
-            </w:r>
-          </w:p>
-        </w:tc>
-        <w:tc>
-          <w:tcPr>
-            <w:tcW w:type="dxa" w:w="1160"/>
-          </w:tcPr>
-          <w:p>
-            <w:pPr>
-              <w:spacing w:after="20"/>
-              <w:jc w:val="right"/>
-            </w:pPr>
-            <w:r>
-              <w:rPr>
-                <w:rFonts w:ascii="Aptos" w:hAnsi="Aptos"/>
-                <w:b/>
-                <w:color w:val="5D7693"/>
-                <w:sz w:val="18"/>
-              </w:rPr>
-              <w:t>83</w:t>
-            </w:r>
-          </w:p>
-        </w:tc>
-      </w:tr>
-      <w:tr>
-        <w:tc>
-          <w:tcPr>
-            <w:tcW w:type="dxa" w:w="8200"/>
-          </w:tcPr>
-          <w:p>
-            <w:pPr>
-              <w:keepLines/>
-              <w:spacing w:after="20"/>
-            </w:pPr>
-            <w:r>
-              <w:rPr>
-                <w:rFonts w:ascii="Aptos" w:hAnsi="Aptos"/>
-                <w:color w:val="234C80"/>
-                <w:sz w:val="18"/>
-              </w:rPr>
-              <w:t>28. Dependency Graph Reading Guide</w:t>
             </w:r>
           </w:p>
         </w:tc>
@@ -1322,89 +1281,7 @@
                 <w:color w:val="234C80"/>
                 <w:sz w:val="18"/>
               </w:rPr>
-              <w:t>29. Safe Change Procedure</w:t>
-            </w:r>
-          </w:p>
-        </w:tc>
-        <w:tc>
-          <w:tcPr>
-            <w:tcW w:type="dxa" w:w="1160"/>
-          </w:tcPr>
-          <w:p>
-            <w:pPr>
-              <w:spacing w:after="20"/>
-              <w:jc w:val="right"/>
-            </w:pPr>
-            <w:r>
-              <w:rPr>
-                <w:rFonts w:ascii="Aptos" w:hAnsi="Aptos"/>
-                <w:b/>
-                <w:color w:val="5D7693"/>
-                <w:sz w:val="18"/>
-              </w:rPr>
-              <w:t>87</w:t>
-            </w:r>
-          </w:p>
-        </w:tc>
-      </w:tr>
-      <w:tr>
-        <w:tc>
-          <w:tcPr>
-            <w:tcW w:type="dxa" w:w="8200"/>
-          </w:tcPr>
-          <w:p>
-            <w:pPr>
-              <w:keepLines/>
-              <w:spacing w:after="20"/>
-            </w:pPr>
-            <w:r>
-              <w:rPr>
-                <w:rFonts w:ascii="Aptos" w:hAnsi="Aptos"/>
-                <w:color w:val="234C80"/>
-                <w:sz w:val="18"/>
-              </w:rPr>
-              <w:t>30. Engineering Release Checklist</w:t>
-            </w:r>
-          </w:p>
-        </w:tc>
-        <w:tc>
-          <w:tcPr>
-            <w:tcW w:type="dxa" w:w="1160"/>
-          </w:tcPr>
-          <w:p>
-            <w:pPr>
-              <w:spacing w:after="20"/>
-              <w:jc w:val="right"/>
-            </w:pPr>
-            <w:r>
-              <w:rPr>
-                <w:rFonts w:ascii="Aptos" w:hAnsi="Aptos"/>
-                <w:b/>
-                <w:color w:val="5D7693"/>
-                <w:sz w:val="18"/>
-              </w:rPr>
-              <w:t>88</w:t>
-            </w:r>
-          </w:p>
-        </w:tc>
-      </w:tr>
-      <w:tr>
-        <w:tc>
-          <w:tcPr>
-            <w:tcW w:type="dxa" w:w="8200"/>
-          </w:tcPr>
-          <w:p>
-            <w:pPr>
-              <w:keepLines/>
-              <w:spacing w:after="20"/>
-            </w:pPr>
-            <w:r>
-              <w:rPr>
-                <w:rFonts w:ascii="Aptos" w:hAnsi="Aptos"/>
-                <w:color w:val="234C80"/>
-                <w:sz w:val="18"/>
-              </w:rPr>
-              <w:t>31. Quick Path and Identifier Reference</w:t>
+              <w:t>28. Dependency Graph Reading Guide</w:t>
             </w:r>
           </w:p>
         </w:tc>
@@ -1425,6 +1302,129 @@
                 <w:sz w:val="18"/>
               </w:rPr>
               <w:t>89</w:t>
+            </w:r>
+          </w:p>
+        </w:tc>
+      </w:tr>
+      <w:tr>
+        <w:tc>
+          <w:tcPr>
+            <w:tcW w:type="dxa" w:w="8200"/>
+          </w:tcPr>
+          <w:p>
+            <w:pPr>
+              <w:keepLines/>
+              <w:spacing w:after="20"/>
+            </w:pPr>
+            <w:r>
+              <w:rPr>
+                <w:rFonts w:ascii="Aptos" w:hAnsi="Aptos"/>
+                <w:color w:val="234C80"/>
+                <w:sz w:val="18"/>
+              </w:rPr>
+              <w:t>29. Safe Change Procedure</w:t>
+            </w:r>
+          </w:p>
+        </w:tc>
+        <w:tc>
+          <w:tcPr>
+            <w:tcW w:type="dxa" w:w="1160"/>
+          </w:tcPr>
+          <w:p>
+            <w:pPr>
+              <w:spacing w:after="20"/>
+              <w:jc w:val="right"/>
+            </w:pPr>
+            <w:r>
+              <w:rPr>
+                <w:rFonts w:ascii="Aptos" w:hAnsi="Aptos"/>
+                <w:b/>
+                <w:color w:val="5D7693"/>
+                <w:sz w:val="18"/>
+              </w:rPr>
+              <w:t>90</w:t>
+            </w:r>
+          </w:p>
+        </w:tc>
+      </w:tr>
+      <w:tr>
+        <w:tc>
+          <w:tcPr>
+            <w:tcW w:type="dxa" w:w="8200"/>
+          </w:tcPr>
+          <w:p>
+            <w:pPr>
+              <w:keepLines/>
+              <w:spacing w:after="20"/>
+            </w:pPr>
+            <w:r>
+              <w:rPr>
+                <w:rFonts w:ascii="Aptos" w:hAnsi="Aptos"/>
+                <w:color w:val="234C80"/>
+                <w:sz w:val="18"/>
+              </w:rPr>
+              <w:t>30. Engineering Release Checklist</w:t>
+            </w:r>
+          </w:p>
+        </w:tc>
+        <w:tc>
+          <w:tcPr>
+            <w:tcW w:type="dxa" w:w="1160"/>
+          </w:tcPr>
+          <w:p>
+            <w:pPr>
+              <w:spacing w:after="20"/>
+              <w:jc w:val="right"/>
+            </w:pPr>
+            <w:r>
+              <w:rPr>
+                <w:rFonts w:ascii="Aptos" w:hAnsi="Aptos"/>
+                <w:b/>
+                <w:color w:val="5D7693"/>
+                <w:sz w:val="18"/>
+              </w:rPr>
+              <w:t>90</w:t>
+            </w:r>
+          </w:p>
+        </w:tc>
+      </w:tr>
+      <w:tr>
+        <w:tc>
+          <w:tcPr>
+            <w:tcW w:type="dxa" w:w="8200"/>
+          </w:tcPr>
+          <w:p>
+            <w:pPr>
+              <w:keepLines/>
+              <w:spacing w:after="20"/>
+            </w:pPr>
+            <w:r>
+              <w:rPr>
+                <w:rFonts w:ascii="Aptos" w:hAnsi="Aptos"/>
+                <w:color w:val="234C80"/>
+                <w:sz w:val="18"/>
+              </w:rPr>
+              <w:t>31. Quick Path and Identifier Reference</w:t>
+            </w:r>
+          </w:p>
+        </w:tc>
+        <w:tc>
+          <w:tcPr>
+            <w:tcW w:type="dxa" w:w="1160"/>
+          </w:tcPr>
+          <w:p>
+            <w:pPr>
+              <w:spacing w:after="20"/>
+              <w:jc w:val="right"/>
+            </w:pPr>
+            <w:r>
+              <w:rPr>
+                <w:rFonts w:ascii="Aptos" w:hAnsi="Aptos"/>
+                <w:b/>
+                <w:color w:val="5D7693"/>
+                <w:sz w:val="18"/>
+              </w:rPr>
+              <w:t>92</w:t>
             </w:r>
           </w:p>
         </w:tc>

</xml_diff>

<commit_message>
Document glossary maintenance and safe cancel workflow
</commit_message>
<xml_diff>
--- a/docs/guides/Delphi App Translation Studio Engineering Guide.docx
+++ b/docs/guides/Delphi App Translation Studio Engineering Guide.docx
@@ -112,7 +112,7 @@
         </w:rPr>
         <w:t>Version 1.0</w:t>
         <w:br/>
-        <w:t>Last changed: August 30, 2026</w:t>
+        <w:t>Last changed: August 31, 2026</w:t>
         <w:br/>
         <w:t>Windows • Delphi VCL and FireMonkey • Win32 and Win64</w:t>
       </w:r>
@@ -522,7 +522,7 @@
                 <w:color w:val="5D7693"/>
                 <w:sz w:val="18"/>
               </w:rPr>
-              <w:t>14</w:t>
+              <w:t>15</w:t>
             </w:r>
           </w:p>
         </w:tc>
@@ -544,47 +544,6 @@
                 <w:sz w:val="18"/>
               </w:rPr>
               <w:t>10. Localization Review, Measurement, Layout, and Hyphenation</w:t>
-            </w:r>
-          </w:p>
-        </w:tc>
-        <w:tc>
-          <w:tcPr>
-            <w:tcW w:type="dxa" w:w="1160"/>
-          </w:tcPr>
-          <w:p>
-            <w:pPr>
-              <w:spacing w:after="20"/>
-              <w:jc w:val="right"/>
-            </w:pPr>
-            <w:r>
-              <w:rPr>
-                <w:rFonts w:ascii="Aptos" w:hAnsi="Aptos"/>
-                <w:b/>
-                <w:color w:val="5D7693"/>
-                <w:sz w:val="18"/>
-              </w:rPr>
-              <w:t>15</w:t>
-            </w:r>
-          </w:p>
-        </w:tc>
-      </w:tr>
-      <w:tr>
-        <w:tc>
-          <w:tcPr>
-            <w:tcW w:type="dxa" w:w="8200"/>
-          </w:tcPr>
-          <w:p>
-            <w:pPr>
-              <w:keepLines/>
-              <w:spacing w:after="20"/>
-            </w:pPr>
-            <w:r>
-              <w:rPr>
-                <w:rFonts w:ascii="Aptos" w:hAnsi="Aptos"/>
-                <w:color w:val="234C80"/>
-                <w:sz w:val="18"/>
-              </w:rPr>
-              <w:t>11. Validation and Runtime Pack Export</w:t>
             </w:r>
           </w:p>
         </w:tc>
@@ -625,48 +584,7 @@
                 <w:color w:val="234C80"/>
                 <w:sz w:val="18"/>
               </w:rPr>
-              <w:t>12. Offline Runtime Manager and Pack Admission</w:t>
-            </w:r>
-          </w:p>
-        </w:tc>
-        <w:tc>
-          <w:tcPr>
-            <w:tcW w:type="dxa" w:w="1160"/>
-          </w:tcPr>
-          <w:p>
-            <w:pPr>
-              <w:spacing w:after="20"/>
-              <w:jc w:val="right"/>
-            </w:pPr>
-            <w:r>
-              <w:rPr>
-                <w:rFonts w:ascii="Aptos" w:hAnsi="Aptos"/>
-                <w:b/>
-                <w:color w:val="5D7693"/>
-                <w:sz w:val="18"/>
-              </w:rPr>
-              <w:t>16</w:t>
-            </w:r>
-          </w:p>
-        </w:tc>
-      </w:tr>
-      <w:tr>
-        <w:tc>
-          <w:tcPr>
-            <w:tcW w:type="dxa" w:w="8200"/>
-          </w:tcPr>
-          <w:p>
-            <w:pPr>
-              <w:keepLines/>
-              <w:spacing w:after="20"/>
-            </w:pPr>
-            <w:r>
-              <w:rPr>
-                <w:rFonts w:ascii="Aptos" w:hAnsi="Aptos"/>
-                <w:color w:val="234C80"/>
-                <w:sz w:val="18"/>
-              </w:rPr>
-              <w:t>13. VCL Runtime Application and Lifecycle</w:t>
+              <w:t>11. Validation and Runtime Pack Export</w:t>
             </w:r>
           </w:p>
         </w:tc>
@@ -707,7 +625,7 @@
                 <w:color w:val="234C80"/>
                 <w:sz w:val="18"/>
               </w:rPr>
-              <w:t>14. FMX Runtime Application and Lifecycle</w:t>
+              <w:t>12. Offline Runtime Manager and Pack Admission</w:t>
             </w:r>
           </w:p>
         </w:tc>
@@ -748,7 +666,7 @@
                 <w:color w:val="234C80"/>
                 <w:sz w:val="18"/>
               </w:rPr>
-              <w:t>15. Components, Design Packages, and Designer Contract</w:t>
+              <w:t>13. VCL Runtime Application and Lifecycle</w:t>
             </w:r>
           </w:p>
         </w:tc>
@@ -789,7 +707,7 @@
                 <w:color w:val="234C80"/>
                 <w:sz w:val="18"/>
               </w:rPr>
-              <w:t>16. ComponentSource and Target dependencies</w:t>
+              <w:t>14. FMX Runtime Application and Lifecycle</w:t>
             </w:r>
           </w:p>
         </w:tc>
@@ -830,7 +748,48 @@
                 <w:color w:val="234C80"/>
                 <w:sz w:val="18"/>
               </w:rPr>
-              <w:t>17. Integration, Build, Deployment, and Project Boundaries</w:t>
+              <w:t>15. Components, Design Packages, and Designer Contract</w:t>
+            </w:r>
+          </w:p>
+        </w:tc>
+        <w:tc>
+          <w:tcPr>
+            <w:tcW w:type="dxa" w:w="1160"/>
+          </w:tcPr>
+          <w:p>
+            <w:pPr>
+              <w:spacing w:after="20"/>
+              <w:jc w:val="right"/>
+            </w:pPr>
+            <w:r>
+              <w:rPr>
+                <w:rFonts w:ascii="Aptos" w:hAnsi="Aptos"/>
+                <w:b/>
+                <w:color w:val="5D7693"/>
+                <w:sz w:val="18"/>
+              </w:rPr>
+              <w:t>19</w:t>
+            </w:r>
+          </w:p>
+        </w:tc>
+      </w:tr>
+      <w:tr>
+        <w:tc>
+          <w:tcPr>
+            <w:tcW w:type="dxa" w:w="8200"/>
+          </w:tcPr>
+          <w:p>
+            <w:pPr>
+              <w:keepLines/>
+              <w:spacing w:after="20"/>
+            </w:pPr>
+            <w:r>
+              <w:rPr>
+                <w:rFonts w:ascii="Aptos" w:hAnsi="Aptos"/>
+                <w:color w:val="234C80"/>
+                <w:sz w:val="18"/>
+              </w:rPr>
+              <w:t>16. ComponentSource and Target dependencies</w:t>
             </w:r>
           </w:p>
         </w:tc>
@@ -871,7 +830,7 @@
                 <w:color w:val="234C80"/>
                 <w:sz w:val="18"/>
               </w:rPr>
-              <w:t>18. Studio Forms, State Machines, and Self-Localization</w:t>
+              <w:t>17. Integration, Build, Deployment, and Project Boundaries</w:t>
             </w:r>
           </w:p>
         </w:tc>
@@ -912,7 +871,7 @@
                 <w:color w:val="234C80"/>
                 <w:sz w:val="18"/>
               </w:rPr>
-              <w:t>19. Directionality, HTML, Dynamic Text, and Reversible Layout</w:t>
+              <w:t>18. Studio Forms, State Machines, and Self-Localization</w:t>
             </w:r>
           </w:p>
         </w:tc>
@@ -953,7 +912,7 @@
                 <w:color w:val="234C80"/>
                 <w:sz w:val="18"/>
               </w:rPr>
-              <w:t>20. Diagnostics, Failure Containment, and Performance</w:t>
+              <w:t>19. Directionality, HTML, Dynamic Text, and Reversible Layout</w:t>
             </w:r>
           </w:p>
         </w:tc>
@@ -994,7 +953,7 @@
                 <w:color w:val="234C80"/>
                 <w:sz w:val="18"/>
               </w:rPr>
-              <w:t>21. Security and Privacy Engineering</w:t>
+              <w:t>20. Diagnostics, Failure Containment, and Performance</w:t>
             </w:r>
           </w:p>
         </w:tc>
@@ -1035,7 +994,7 @@
                 <w:color w:val="234C80"/>
                 <w:sz w:val="18"/>
               </w:rPr>
-              <w:t>22. Test Architecture and Release Gates</w:t>
+              <w:t>21. Security and Privacy Engineering</w:t>
             </w:r>
           </w:p>
         </w:tc>
@@ -1055,7 +1014,7 @@
                 <w:color w:val="5D7693"/>
                 <w:sz w:val="18"/>
               </w:rPr>
-              <w:t>24</w:t>
+              <w:t>25</w:t>
             </w:r>
           </w:p>
         </w:tc>
@@ -1076,7 +1035,7 @@
                 <w:color w:val="234C80"/>
                 <w:sz w:val="18"/>
               </w:rPr>
-              <w:t>23. Production Pascal Unit Reference</w:t>
+              <w:t>22. Test Architecture and Release Gates</w:t>
             </w:r>
           </w:p>
         </w:tc>
@@ -1117,7 +1076,7 @@
                 <w:color w:val="234C80"/>
                 <w:sz w:val="18"/>
               </w:rPr>
-              <w:t>24. Test, Spike, and Contract Pascal Program Reference</w:t>
+              <w:t>23. Production Pascal Unit Reference</w:t>
             </w:r>
           </w:p>
         </w:tc>
@@ -1137,7 +1096,48 @@
                 <w:color w:val="5D7693"/>
                 <w:sz w:val="18"/>
               </w:rPr>
-              <w:t>68</w:t>
+              <w:t>28</w:t>
+            </w:r>
+          </w:p>
+        </w:tc>
+      </w:tr>
+      <w:tr>
+        <w:tc>
+          <w:tcPr>
+            <w:tcW w:type="dxa" w:w="8200"/>
+          </w:tcPr>
+          <w:p>
+            <w:pPr>
+              <w:keepLines/>
+              <w:spacing w:after="20"/>
+            </w:pPr>
+            <w:r>
+              <w:rPr>
+                <w:rFonts w:ascii="Aptos" w:hAnsi="Aptos"/>
+                <w:color w:val="234C80"/>
+                <w:sz w:val="18"/>
+              </w:rPr>
+              <w:t>24. Test, Spike, and Contract Pascal Program Reference</w:t>
+            </w:r>
+          </w:p>
+        </w:tc>
+        <w:tc>
+          <w:tcPr>
+            <w:tcW w:type="dxa" w:w="1160"/>
+          </w:tcPr>
+          <w:p>
+            <w:pPr>
+              <w:spacing w:after="20"/>
+              <w:jc w:val="right"/>
+            </w:pPr>
+            <w:r>
+              <w:rPr>
+                <w:rFonts w:ascii="Aptos" w:hAnsi="Aptos"/>
+                <w:b/>
+                <w:color w:val="5D7693"/>
+                <w:sz w:val="18"/>
+              </w:rPr>
+              <w:t>70</w:t>
             </w:r>
           </w:p>
         </w:tc>
@@ -1159,47 +1159,6 @@
                 <w:sz w:val="18"/>
               </w:rPr>
               <w:t>25. Delphi Project and Package File Reference</w:t>
-            </w:r>
-          </w:p>
-        </w:tc>
-        <w:tc>
-          <w:tcPr>
-            <w:tcW w:type="dxa" w:w="1160"/>
-          </w:tcPr>
-          <w:p>
-            <w:pPr>
-              <w:spacing w:after="20"/>
-              <w:jc w:val="right"/>
-            </w:pPr>
-            <w:r>
-              <w:rPr>
-                <w:rFonts w:ascii="Aptos" w:hAnsi="Aptos"/>
-                <w:b/>
-                <w:color w:val="5D7693"/>
-                <w:sz w:val="18"/>
-              </w:rPr>
-              <w:t>86</w:t>
-            </w:r>
-          </w:p>
-        </w:tc>
-      </w:tr>
-      <w:tr>
-        <w:tc>
-          <w:tcPr>
-            <w:tcW w:type="dxa" w:w="8200"/>
-          </w:tcPr>
-          <w:p>
-            <w:pPr>
-              <w:keepLines/>
-              <w:spacing w:after="20"/>
-            </w:pPr>
-            <w:r>
-              <w:rPr>
-                <w:rFonts w:ascii="Aptos" w:hAnsi="Aptos"/>
-                <w:color w:val="234C80"/>
-                <w:sz w:val="18"/>
-              </w:rPr>
-              <w:t>26. JSON Schema and Form Resource Reference</w:t>
             </w:r>
           </w:p>
         </w:tc>
@@ -1240,7 +1199,7 @@
                 <w:color w:val="234C80"/>
                 <w:sz w:val="18"/>
               </w:rPr>
-              <w:t>27. Build, Verification, and Documentation Tool Reference</w:t>
+              <w:t>26. JSON Schema and Form Resource Reference</w:t>
             </w:r>
           </w:p>
         </w:tc>
@@ -1260,7 +1219,48 @@
                 <w:color w:val="5D7693"/>
                 <w:sz w:val="18"/>
               </w:rPr>
-              <w:t>92</w:t>
+              <w:t>90</w:t>
+            </w:r>
+          </w:p>
+        </w:tc>
+      </w:tr>
+      <w:tr>
+        <w:tc>
+          <w:tcPr>
+            <w:tcW w:type="dxa" w:w="8200"/>
+          </w:tcPr>
+          <w:p>
+            <w:pPr>
+              <w:keepLines/>
+              <w:spacing w:after="20"/>
+            </w:pPr>
+            <w:r>
+              <w:rPr>
+                <w:rFonts w:ascii="Aptos" w:hAnsi="Aptos"/>
+                <w:color w:val="234C80"/>
+                <w:sz w:val="18"/>
+              </w:rPr>
+              <w:t>27. Build, Verification, and Documentation Tool Reference</w:t>
+            </w:r>
+          </w:p>
+        </w:tc>
+        <w:tc>
+          <w:tcPr>
+            <w:tcW w:type="dxa" w:w="1160"/>
+          </w:tcPr>
+          <w:p>
+            <w:pPr>
+              <w:spacing w:after="20"/>
+              <w:jc w:val="right"/>
+            </w:pPr>
+            <w:r>
+              <w:rPr>
+                <w:rFonts w:ascii="Aptos" w:hAnsi="Aptos"/>
+                <w:b/>
+                <w:color w:val="5D7693"/>
+                <w:sz w:val="18"/>
+              </w:rPr>
+              <w:t>94</w:t>
             </w:r>
           </w:p>
         </w:tc>
@@ -1282,88 +1282,6 @@
                 <w:sz w:val="18"/>
               </w:rPr>
               <w:t>28. Dependency Graph Reading Guide</w:t>
-            </w:r>
-          </w:p>
-        </w:tc>
-        <w:tc>
-          <w:tcPr>
-            <w:tcW w:type="dxa" w:w="1160"/>
-          </w:tcPr>
-          <w:p>
-            <w:pPr>
-              <w:spacing w:after="20"/>
-              <w:jc w:val="right"/>
-            </w:pPr>
-            <w:r>
-              <w:rPr>
-                <w:rFonts w:ascii="Aptos" w:hAnsi="Aptos"/>
-                <w:b/>
-                <w:color w:val="5D7693"/>
-                <w:sz w:val="18"/>
-              </w:rPr>
-              <w:t>95</w:t>
-            </w:r>
-          </w:p>
-        </w:tc>
-      </w:tr>
-      <w:tr>
-        <w:tc>
-          <w:tcPr>
-            <w:tcW w:type="dxa" w:w="8200"/>
-          </w:tcPr>
-          <w:p>
-            <w:pPr>
-              <w:keepLines/>
-              <w:spacing w:after="20"/>
-            </w:pPr>
-            <w:r>
-              <w:rPr>
-                <w:rFonts w:ascii="Aptos" w:hAnsi="Aptos"/>
-                <w:color w:val="234C80"/>
-                <w:sz w:val="18"/>
-              </w:rPr>
-              <w:t>29. Safe Change Procedure</w:t>
-            </w:r>
-          </w:p>
-        </w:tc>
-        <w:tc>
-          <w:tcPr>
-            <w:tcW w:type="dxa" w:w="1160"/>
-          </w:tcPr>
-          <w:p>
-            <w:pPr>
-              <w:spacing w:after="20"/>
-              <w:jc w:val="right"/>
-            </w:pPr>
-            <w:r>
-              <w:rPr>
-                <w:rFonts w:ascii="Aptos" w:hAnsi="Aptos"/>
-                <w:b/>
-                <w:color w:val="5D7693"/>
-                <w:sz w:val="18"/>
-              </w:rPr>
-              <w:t>96</w:t>
-            </w:r>
-          </w:p>
-        </w:tc>
-      </w:tr>
-      <w:tr>
-        <w:tc>
-          <w:tcPr>
-            <w:tcW w:type="dxa" w:w="8200"/>
-          </w:tcPr>
-          <w:p>
-            <w:pPr>
-              <w:keepLines/>
-              <w:spacing w:after="20"/>
-            </w:pPr>
-            <w:r>
-              <w:rPr>
-                <w:rFonts w:ascii="Aptos" w:hAnsi="Aptos"/>
-                <w:color w:val="234C80"/>
-                <w:sz w:val="18"/>
-              </w:rPr>
-              <w:t>30. Engineering Release Checklist</w:t>
             </w:r>
           </w:p>
         </w:tc>
@@ -1404,7 +1322,7 @@
                 <w:color w:val="234C80"/>
                 <w:sz w:val="18"/>
               </w:rPr>
-              <w:t>31. Quick Path and Identifier Reference</w:t>
+              <w:t>29. Safe Change Procedure</w:t>
             </w:r>
           </w:p>
         </w:tc>
@@ -1445,7 +1363,48 @@
                 <w:color w:val="234C80"/>
                 <w:sz w:val="18"/>
               </w:rPr>
-              <w:t>32. Appendix A - License Information</w:t>
+              <w:t>30. Engineering Release Checklist</w:t>
+            </w:r>
+          </w:p>
+        </w:tc>
+        <w:tc>
+          <w:tcPr>
+            <w:tcW w:type="dxa" w:w="1160"/>
+          </w:tcPr>
+          <w:p>
+            <w:pPr>
+              <w:spacing w:after="20"/>
+              <w:jc w:val="right"/>
+            </w:pPr>
+            <w:r>
+              <w:rPr>
+                <w:rFonts w:ascii="Aptos" w:hAnsi="Aptos"/>
+                <w:b/>
+                <w:color w:val="5D7693"/>
+                <w:sz w:val="18"/>
+              </w:rPr>
+              <w:t>99</w:t>
+            </w:r>
+          </w:p>
+        </w:tc>
+      </w:tr>
+      <w:tr>
+        <w:tc>
+          <w:tcPr>
+            <w:tcW w:type="dxa" w:w="8200"/>
+          </w:tcPr>
+          <w:p>
+            <w:pPr>
+              <w:keepLines/>
+              <w:spacing w:after="20"/>
+            </w:pPr>
+            <w:r>
+              <w:rPr>
+                <w:rFonts w:ascii="Aptos" w:hAnsi="Aptos"/>
+                <w:color w:val="234C80"/>
+                <w:sz w:val="18"/>
+              </w:rPr>
+              <w:t>31. Quick Path and Identifier Reference</w:t>
             </w:r>
           </w:p>
         </w:tc>
@@ -1466,6 +1425,47 @@
                 <w:sz w:val="18"/>
               </w:rPr>
               <w:t>101</w:t>
+            </w:r>
+          </w:p>
+        </w:tc>
+      </w:tr>
+      <w:tr>
+        <w:tc>
+          <w:tcPr>
+            <w:tcW w:type="dxa" w:w="8200"/>
+          </w:tcPr>
+          <w:p>
+            <w:pPr>
+              <w:keepLines/>
+              <w:spacing w:after="20"/>
+            </w:pPr>
+            <w:r>
+              <w:rPr>
+                <w:rFonts w:ascii="Aptos" w:hAnsi="Aptos"/>
+                <w:color w:val="234C80"/>
+                <w:sz w:val="18"/>
+              </w:rPr>
+              <w:t>32. Appendix A - License Information</w:t>
+            </w:r>
+          </w:p>
+        </w:tc>
+        <w:tc>
+          <w:tcPr>
+            <w:tcW w:type="dxa" w:w="1160"/>
+          </w:tcPr>
+          <w:p>
+            <w:pPr>
+              <w:spacing w:after="20"/>
+              <w:jc w:val="right"/>
+            </w:pPr>
+            <w:r>
+              <w:rPr>
+                <w:rFonts w:ascii="Aptos" w:hAnsi="Aptos"/>
+                <w:b/>
+                <w:color w:val="5D7693"/>
+                <w:sz w:val="18"/>
+              </w:rPr>
+              <w:t>103</w:t>
             </w:r>
           </w:p>
         </w:tc>
@@ -5976,6 +5976,100 @@
     </w:tbl>
     <w:p>
       <w:pPr>
+        <w:pStyle w:val="Heading2"/>
+      </w:pPr>
+      <w:r>
+        <w:t>8.1 Authoritative glossary ownership and path</w:t>
+      </w:r>
+    </w:p>
+    <w:p>
+      <w:r>
+        <w:t>TTranslationWorkspace.GlossaryFileName derives the authoritative path as %LOCALAPPDATA%\DelphiAppTranslationStudio\Workspaces\&lt;ApplicationId&gt;\Glossaries\&lt;ApplicationId&gt;.&lt;locale&gt;.glossary.json. The filename is built from the detected project identity and normalized target locale. The source and target language plus ApplicationId are also stored inside the JSON, so moving a file into another workspace does not silently change its identity.</w:t>
+      </w:r>
+    </w:p>
+    <w:p>
+      <w:r>
+        <w:t>TProjectGlossary owns a list of TProjectGlossaryTerm records. Each record carries SourceText, TargetText, optional SemanticConcept, optional ContextKind, optional DeveloperNote, CaseSensitive, and Approved. SaveToFile serializes schema version 1 and delegates to TAtomicTextFile, which validates the candidate before atomic replacement and preserves normal recovery artifacts.</w:t>
+      </w:r>
+    </w:p>
+    <w:p>
+      <w:pPr>
+        <w:pStyle w:val="Heading2"/>
+      </w:pPr>
+      <w:r>
+        <w:t>8.2 Matching and catalog-application rules</w:t>
+      </w:r>
+    </w:p>
+    <w:p>
+      <w:pPr>
+        <w:pStyle w:val="ListBullet"/>
+      </w:pPr>
+      <w:r>
+        <w:t>Only Approved terms with nonblank target text are eligible.</w:t>
+      </w:r>
+    </w:p>
+    <w:p>
+      <w:pPr>
+        <w:pStyle w:val="ListBullet"/>
+      </w:pPr>
+      <w:r>
+        <w:t>Case-sensitive terms require exact source text. Other terms compare trimmed source text without case sensitivity.</w:t>
+      </w:r>
+    </w:p>
+    <w:p>
+      <w:pPr>
+        <w:pStyle w:val="ListBullet"/>
+      </w:pPr>
+      <w:r>
+        <w:t>A nonblank ContextKind is a real filter and must match the entry. SemanticConcept is a preference, not a filter: an exact concept match wins, an untagged term is next, and a differently tagged but otherwise matching term remains a fallback.</w:t>
+      </w:r>
+    </w:p>
+    <w:p>
+      <w:pPr>
+        <w:pStyle w:val="ListBullet"/>
+      </w:pPr>
+      <w:r>
+        <w:t>ApplyToCatalog never overwrites Reviewed or Approved entries. Matching unresolved entries receive the preferred target, Project Glossary origin, high confidence, a review note, and Machine Translated status so human approval remains a separate decision.</w:t>
+      </w:r>
+    </w:p>
+    <w:p>
+      <w:pPr>
+        <w:pStyle w:val="ListBullet"/>
+      </w:pPr>
+      <w:r>
+        <w:t>Applying terms changes the development catalog only. It does not export a pack, call a provider, rescan source, deploy files, or edit the target project.</w:t>
+      </w:r>
+    </w:p>
+    <w:p>
+      <w:pPr>
+        <w:pStyle w:val="Heading2"/>
+      </w:pPr>
+      <w:r>
+        <w:t>8.3 Standalone Maintenance Studio glossary state</w:t>
+      </w:r>
+    </w:p>
+    <w:p>
+      <w:r>
+        <w:t>MainForm owns FProjectGlossary, FGlossaryFileName, FGlossaryDirty, and FUpdatingGlossaryLanguage. Opening the Glossary page derives the selected language file and loads it, or creates a new in-memory model when no file exists. This is intentionally independent of the Setup Wizard and independent of whether a development catalog has already been created.</w:t>
+      </w:r>
+    </w:p>
+    <w:p>
+      <w:r>
+        <w:t>The designer-owned page contains the language selector, exact file-path label, term list, source/target/concept/note editors, case-sensitive and approved check boxes, and New, Add / Update Term, Delete, Cancel Edits, Save Glossary, and Apply to Open Catalog buttons. FGlossaryDirty becomes true after add/update/delete. RefreshGlossary rebuilds the list and reports whether the model is new, saved, or pending.</w:t>
+      </w:r>
+    </w:p>
+    <w:p>
+      <w:r>
+        <w:t>ConfirmGlossaryChanges protects three transitions: changing the glossary language, opening another Delphi project, and closing Maintenance Studio. Yes saves atomically, No discards the in-memory changes, and Cancel vetoes the transition. Cancel Edits is narrower: after confirmation it reloads the selected glossary and remains on the page.</w:t>
+      </w:r>
+    </w:p>
+    <w:p>
+      <w:r>
+        <w:t>Apply to Open Catalog is enabled only when FTranslationCatalog exists and its locale equals the selected glossary locale. The handler saves dirty glossary work first, applies the terms, creates a development-catalog path when needed, saves through TCatalogJson, refreshes catalog UI, invalidates validation, and recomputes readiness. This makes the required revalidation/export boundary explicit.</w:t>
+      </w:r>
+    </w:p>
+    <w:p>
+      <w:pPr>
         <w:pStyle w:val="Heading1"/>
       </w:pPr>
       <w:r>
@@ -8115,12 +8209,17 @@
     </w:tbl>
     <w:p>
       <w:r>
-        <w:t>TfrmTranslationStudio is the landing and seven-page Maintenance state owner. TfrmSetupWizard is an eight-step validation state machine whose downstream state is invalidated when project/language/provider inputs change. TfrmLocalizationReview is modal within final processing and returns saved decisions to a continuation. DAT.Studio.Translation owns the Studio's own interface-language runtime.</w:t>
-      </w:r>
-    </w:p>
-    <w:p>
-      <w:r>
-        <w:t>The forms are designer-authored FMX resources. Runtime code should update state, enablement, text, and data; it should not rebuild the form hierarchy that belongs in the FMX designer. Default buttons, Enter/Esc behavior, hidden irrelevant buttons, and asynchronous provider state are explicit UI contracts.</w:t>
+        <w:t>TfrmTranslationStudio is the landing and eight-page Maintenance state owner: Project, Scan, Translate, Glossary, Validation, Export, Integration, and Provider Settings. TfrmSetupWizard is an eight-step validation state machine whose downstream state is invalidated when project/language/provider inputs change. TfrmLocalizationReview is modal within final processing and returns saved decisions to a continuation. DAT.Studio.Translation owns the Studio's own interface-language runtime.</w:t>
+      </w:r>
+    </w:p>
+    <w:p>
+      <w:r>
+        <w:t>The forms are designer-authored FMX resources. Runtime code updates state, enablement, text, and data; it does not rebuild the form hierarchy that belongs in the FMX designer. Default buttons, Enter/Esc behavior, hidden irrelevant buttons, and asynchronous provider state are explicit UI contracts. MainForm.SetWorkflowStep is the single page-routing contract: Glossary is step 4, later pages are steps 5 through 8, and the designer rail positions and page visibility must remain synchronized.</w:t>
+      </w:r>
+    </w:p>
+    <w:p>
+      <w:r>
+        <w:t>btnMaintenanceCancel is a persistent designer-owned Cancel button while Maintenance Studio is active and has the FMX Cancel property, so Esc calls Close. FormCloseQuery closes immediately only when no scan/provider operation is active and ConfirmGlossaryChanges permits it. Otherwise it sets atomic cancellation flags, records close-after-operation intent, vetoes the current close, and lets the queued completion handler call Close again after the operation reaches a safe boundary. The second close then performs the glossary Save/Discard/Cancel decision if needed.</w:t>
       </w:r>
     </w:p>
     <w:tbl>
@@ -8215,7 +8314,7 @@
           </w:tcPr>
           <w:p>
             <w:r>
-              <w:t>Opened project, scan result, catalog, selected maintenance page, provider/settings, validation/export/integration status.</w:t>
+              <w:t>Opened project, scan result, catalog, selected maintenance page, selected project/locale glossary and dirty state, provider/settings, validation/export/integration status.</w:t>
             </w:r>
           </w:p>
         </w:tc>
@@ -8226,7 +8325,7 @@
           </w:tcPr>
           <w:p>
             <w:r>
-              <w:t>Landing to Wizard or Maintenance; language refresh must rebuild current visible content immediately.</w:t>
+              <w:t>Landing to Wizard or Maintenance; page changes protect pending glossary work; Cancel/Esc safely bounds active work; language refresh rebuilds current visible content immediately.</w:t>
             </w:r>
           </w:p>
         </w:tc>
@@ -8995,6 +9094,44 @@
           </w:p>
         </w:tc>
       </w:tr>
+      <w:tr>
+        <w:trPr>
+          <w:cantSplit/>
+        </w:trPr>
+        <w:tc>
+          <w:tcPr>
+            <w:tcW w:type="dxa" w:w="1800"/>
+            <w:vAlign w:val="center"/>
+          </w:tcPr>
+          <w:p>
+            <w:r>
+              <w:t>Maintenance close</w:t>
+            </w:r>
+          </w:p>
+        </w:tc>
+        <w:tc>
+          <w:tcPr>
+            <w:tcW w:type="dxa" w:w="3900"/>
+            <w:vAlign w:val="center"/>
+          </w:tcPr>
+          <w:p>
+            <w:r>
+              <w:t>One close request plus any already-active scan/provider boundary.</w:t>
+            </w:r>
+          </w:p>
+        </w:tc>
+        <w:tc>
+          <w:tcPr>
+            <w:tcW w:type="dxa" w:w="3660"/>
+            <w:vAlign w:val="center"/>
+          </w:tcPr>
+          <w:p>
+            <w:r>
+              <w:t>Atomic cancel flag and deferred close; then glossary Save/Discard/Cancel. No UI-thread busy wait.</w:t>
+            </w:r>
+          </w:p>
+        </w:tc>
+      </w:tr>
     </w:tbl>
     <w:p>
       <w:pPr>
@@ -10390,7 +10527,7 @@
         <w:t xml:space="preserve">Direct production consumers: </w:t>
       </w:r>
       <w:r>
-        <w:t>DAT.Core.Interchange, DAT.Core.SharedDictionary, DAT.Provider.Glossary, DAT.Studio.LocalizationReview, DAT.Studio.SetupWizard</w:t>
+        <w:t>DAT.Core.Interchange, DAT.Core.SharedDictionary, DAT.Provider.Glossary, DAT.Studio.LocalizationReview, DAT.Studio.MainForm, DAT.Studio.SetupWizard</w:t>
       </w:r>
     </w:p>
     <w:p>
@@ -19872,7 +20009,7 @@
         <w:t xml:space="preserve">What it is: </w:t>
       </w:r>
       <w:r>
-        <w:t>Implements the landing screen and seven-page Maintenance Studio. It coordinates project detection, scanning, catalog editing, provider translation, validation, export, integration, settings, keyboard defaults, and status reporting.</w:t>
+        <w:t>Implements the landing screen and eight-page Maintenance Studio. It coordinates project detection, scanning, catalog editing, direct project-glossary maintenance, provider translation, validation, export, integration, settings, safe cancellation, keyboard defaults, and status reporting.</w:t>
       </w:r>
     </w:p>
     <w:p>
@@ -19917,7 +20054,7 @@
         <w:t xml:space="preserve">Direct DAT dependencies: </w:t>
       </w:r>
       <w:r>
-        <w:t>DAT.Core.BuildInfo, DAT.Core.CatalogJson, DAT.Core.LocaleFacts, DAT.Core.ProjectDetection, DAT.Core.RuntimePack, DAT.Core.Terminology, DAT.Core.TranslationWorkspace, DAT.Core.Types, DAT.Integration.BuildDeploy, DAT.Integration.ComponentPackage, DAT.Integration.Package, DAT.Provider.Client, DAT.Provider.CredentialStore, DAT.Provider.Settings, DAT.Provider.Types, DAT.Runtime.LanguagePack, DAT.Scan.CatalogMerge, DAT.Scan.Project, DAT.Scan.Types, DAT.Studio.SetupWizard, DAT.Studio.Translation, DAT.Validation.Catalog</w:t>
+        <w:t>DAT.Core.BuildInfo, DAT.Core.CatalogJson, DAT.Core.Glossary, DAT.Core.LocaleFacts, DAT.Core.ProjectDetection, DAT.Core.RuntimePack, DAT.Core.Terminology, DAT.Core.TranslationWorkspace, DAT.Core.Types, DAT.Integration.BuildDeploy, DAT.Integration.ComponentPackage, DAT.Integration.Package, DAT.Provider.Client, DAT.Provider.CredentialStore, DAT.Provider.Settings, DAT.Provider.Types, DAT.Runtime.LanguagePack, DAT.Scan.CatalogMerge, DAT.Scan.Project, DAT.Scan.Types, DAT.Studio.SetupWizard, DAT.Studio.Translation, DAT.Validation.Catalog</w:t>
       </w:r>
     </w:p>
     <w:p>
@@ -19962,7 +20099,7 @@
         <w:t xml:space="preserve">Change and validation risk: </w:t>
       </w:r>
       <w:r>
-        <w:t>The file contains 2,660 lines. Changes require the studio contract tests, a clean package/application build, and a runtime regression pass for both VCL and FMX whenever shared behavior changes.</w:t>
+        <w:t>The file contains 3,120 lines. Changes require the studio contract tests, a clean package/application build, and a runtime regression pass for both VCL and FMX whenever shared behavior changes.</w:t>
       </w:r>
     </w:p>
     <w:p>
@@ -23084,7 +23221,7 @@
         <w:t xml:space="preserve">What it verifies: </w:t>
       </w:r>
       <w:r>
-        <w:t>Streams and creates the production Studio forms to detect missing components, invalid properties, and form-resource regressions.</w:t>
+        <w:t>Streams and creates the production Studio forms to detect missing components, invalid properties, form-resource regressions, missing Glossary/Cancel event wiring, incomplete language lists, and workflow pages or actions that do not fit or activate.</w:t>
       </w:r>
     </w:p>
     <w:p>
@@ -26422,7 +26559,7 @@
         <w:t xml:space="preserve">What it is: </w:t>
       </w:r>
       <w:r>
-        <w:t>Designer-authored landing screen and seven Maintenance pages, navigation rail, dialogs, status, and control defaults.</w:t>
+        <w:t>Designer-authored landing screen and eight Maintenance pages, including the standalone Glossary page, expanded navigation rail, persistent Maintenance Cancel button, dialogs, status, and control defaults.</w:t>
       </w:r>
     </w:p>
     <w:p>
@@ -27647,7 +27784,7 @@
         <w:t xml:space="preserve">What it is: </w:t>
       </w:r>
       <w:r>
-        <w:t>Converts documentation DOCX files to companion PDFs through LibreOffice.</w:t>
+        <w:t>Creates alternate print PDFs from guide content through an HTML and Playwright rendering path.</w:t>
       </w:r>
     </w:p>
     <w:p>
@@ -27662,7 +27799,7 @@
         <w:t xml:space="preserve">Why it matters: </w:t>
       </w:r>
       <w:r>
-        <w:t>Keeps printable output tied to editable source documents.</w:t>
+        <w:t>Provides a separate print-rendering and page-map utility; it is not the maintained LibreOffice release-export path.</w:t>
       </w:r>
     </w:p>
     <w:p>
@@ -27812,7 +27949,7 @@
         <w:t xml:space="preserve">What it is: </w:t>
       </w:r>
       <w:r>
-        <w:t>Performs the maintained guide finalization workflow.</w:t>
+        <w:t>Exports the maintained companion PDFs directly from the editable DOCX guides through LibreOffice.</w:t>
       </w:r>
     </w:p>
     <w:p>
@@ -27827,7 +27964,7 @@
         <w:t xml:space="preserve">Why it matters: </w:t>
       </w:r>
       <w:r>
-        <w:t>Ensures DOCX/PDF artifacts and verification steps remain repeatable.</w:t>
+        <w:t>Keeps the release PDFs tied to the reviewed DOCX sources and makes finalization repeatable.</w:t>
       </w:r>
     </w:p>
     <w:p>

</xml_diff>

<commit_message>
Automate target dependency setup and deployment
</commit_message>
<xml_diff>
--- a/docs/guides/Delphi App Translation Studio Engineering Guide.docx
+++ b/docs/guides/Delphi App Translation Studio Engineering Guide.docx
@@ -112,7 +112,7 @@
         </w:rPr>
         <w:t>Version 1.0</w:t>
         <w:br/>
-        <w:t>Last changed: August 31, 2026</w:t>
+        <w:t>Last changed: September 1, 2026</w:t>
         <w:br/>
         <w:t>Windows • Delphi VCL and FireMonkey • Win32 and Win64</w:t>
       </w:r>
@@ -7417,6 +7417,11 @@
         <w:t>The design packages are Win32 IDE packages because RAD Studio is a Win32 design host even when the target application also builds Win64. Runtime packages are separated so a deployed application never links IDE registration code.</w:t>
       </w:r>
     </w:p>
+    <w:p>
+      <w:r>
+        <w:t>Generation copies the exact three-file framework bundle into &lt;Kit&gt;\DesignPackages\Win32\Release. VCL receives CoreRuntime, VCLRuntime, and VCLDesign; FMX receives CoreRuntime, FMXRuntime, and FMXDesign. The developer selects only the design BPL through Component &gt; Install Packages &gt; Add, but the required runtime BPLs must remain beside it. Automatic IDE package registration is intentionally outside the safety boundary.</w:t>
+      </w:r>
+    </w:p>
     <w:tbl>
       <w:tblPr>
         <w:tblStyle w:val="LightShading-Accent1"/>
@@ -7739,7 +7744,7 @@
     </w:p>
     <w:p>
       <w:r>
-        <w:t>The optional target-local dependencies folder is &lt;Target&gt;\dependencies\DelphiAppTranslation\source. It is not created automatically because the Studio cannot assume how a target project vendors third-party source or what repository policy permits.</w:t>
+        <w:t>The target-local dependency is &lt;Target&gt;\dependencies\DelphiAppTranslation. ConfigureProject creates or replaces this managed folder automatically after the required backup. source holds the complete PAS closure; deployment\Languages holds the canonical pack source; deployment\DelphiAppTranslation.targets performs future output deployment; license and manifests record provenance and integrity.</w:t>
       </w:r>
     </w:p>
     <w:tbl>
@@ -8105,12 +8110,17 @@
     </w:tbl>
     <w:p>
       <w:r>
-        <w:t>TComponentIntegrationPackageGenerator produces the recommended non-mutating kit. TTargetBuildDeployer runs selected builds and deploys packs. TIntegrationPackageGenerator and TDelphiIntegrationSourceEditor retain an advanced explicitly authorized source-edit path with preview/backup/restore, but it is not the Wizard default.</w:t>
-      </w:r>
-    </w:p>
-    <w:p>
-      <w:r>
-        <w:t>Wizard final processing passes ComponentSource to its own build environment without persisting a DPROJ edit. Manual IDE builds require the developer to set Search path in Project Options. Deployment verifies the intended executable/application directory before copying packs.</w:t>
+        <w:t>TComponentIntegrationPackageGenerator.Generate produces a staged, verified kit. ConfigureProject is the shared Wizard/Maintenance transaction: it validates kit identity, creates a dated DPROJ/dependency backup, stages the target dependency, verifies copied hashes, atomically promotes it, and writes one marked idempotent DPROJ block. It restores the saved DPROJ and previous dependency if any promotion or post-write validation fails.</w:t>
+      </w:r>
+    </w:p>
+    <w:p>
+      <w:r>
+        <w:t>The managed DPROJ block prepends $(MSBuildProjectDirectory)\dependencies\DelphiAppTranslation\source while retaining $(DCC_UnitSearchPath). It imports dependencies\DelphiAppTranslation\deployment\DelphiAppTranslation.targets. That target clears the old output Languages directory and copies the exact managed JSON set after every successful build, preventing obsolete locale files from surviving.</w:t>
+      </w:r>
+    </w:p>
+    <w:p>
+      <w:r>
+        <w:t>TTargetBuildDeployer runs the baseline Win32 Release build even when no output folder existed, refreshes other supported configurations already in use, locates the configured executable output, and performs an additional atomic/hash-validated deployment. Configured application destinations use the same atomic routine. TIntegrationPackageGenerator and TDelphiIntegrationSourceEditor remain advanced source-edit machinery and are not invoked by the component workflow.</w:t>
       </w:r>
     </w:p>
     <w:p>
@@ -8118,7 +8128,7 @@
         <w:pStyle w:val="ListBullet"/>
       </w:pPr>
       <w:r>
-        <w:t>Search path must preserve existing values and $(DCC_UnitSearchPath).</w:t>
+        <w:t>The managed block must be uniquely marked, repeatable, and preserve $(DCC_UnitSearchPath). A second run replaces it instead of appending another path/import.</w:t>
       </w:r>
     </w:p>
     <w:p>
@@ -8126,7 +8136,7 @@
         <w:pStyle w:val="ListBullet"/>
       </w:pPr>
       <w:r>
-        <w:t>All configurations/all platforms is the normal setting when one vendored dependency folder serves every target.</w:t>
+        <w:t>The dependency folder is Studio-owned as one versioned unit. Do not combine its files with older DAT copies beside the DPR or in a legacy DAT_Runtime folder.</w:t>
       </w:r>
     </w:p>
     <w:p>
@@ -8134,7 +8144,7 @@
         <w:pStyle w:val="ListBullet"/>
       </w:pPr>
       <w:r>
-        <w:t>Pack deployment is independent of executable compilation; a build can succeed while packs are stale or absent, so both results must be checked.</w:t>
+        <w:t>Pack deployment is part of both the managed post-build target and Studio build/deployment verification; stale target JSON is removed before the current set is promoted.</w:t>
       </w:r>
     </w:p>
     <w:p>
@@ -8150,7 +8160,15 @@
         <w:pStyle w:val="ListBullet"/>
       </w:pPr>
       <w:r>
-        <w:t>No integration code should write outside the explicitly selected Studio export, workspace, target dependency, or authorized application destinations.</w:t>
+        <w:t>No integration code writes target Pascal, DPR, DFM, or FMX source. Authorized writes are limited to Studio export/workspace, the target-managed dependency, the marked DPROJ block, transaction backups, build outputs, and configured destinations.</w:t>
+      </w:r>
+    </w:p>
+    <w:p>
+      <w:pPr>
+        <w:pStyle w:val="ListBullet"/>
+      </w:pPr>
+      <w:r>
+        <w:t>The BPL boundary is intentionally manual: the Studio locates and bundles exact files but never registers or unregisters a package in the IDE.</w:t>
       </w:r>
     </w:p>
     <w:p>
@@ -19216,7 +19234,7 @@
         <w:t xml:space="preserve">Change and validation risk: </w:t>
       </w:r>
       <w:r>
-        <w:t>The file contains 698 lines. Changes require the integration contract tests, a clean package/application build, and a runtime regression pass for both VCL and FMX whenever shared behavior changes.</w:t>
+        <w:t>The file contains 708 lines. Changes require the integration contract tests, a clean package/application build, and a runtime regression pass for both VCL and FMX whenever shared behavior changes.</w:t>
       </w:r>
     </w:p>
     <w:p>
@@ -19271,7 +19289,7 @@
         <w:t xml:space="preserve">What it is: </w:t>
       </w:r>
       <w:r>
-        <w:t>Generates the recommended non-mutating component integration kit: the complete framework-appropriate ComponentSource set, packs, manifest, README, deployment script, and completion report.</w:t>
+        <w:t>Generates and validates the complete framework-appropriate kit, including ComponentSource, packs, Apache license, manifest, README, deployment support, and the exact Win32 Release BPL bundle. ConfigureProject then stages and installs the project-local dependency and idempotent DPROJ automation block with rollback.</w:t>
       </w:r>
     </w:p>
     <w:p>
@@ -19361,7 +19379,7 @@
         <w:t xml:space="preserve">Change and validation risk: </w:t>
       </w:r>
       <w:r>
-        <w:t>The file contains 614 lines. Changes require the integration contract tests, a clean package/application build, and a runtime regression pass for both VCL and FMX whenever shared behavior changes.</w:t>
+        <w:t>The file contains 876 lines. Changes require the integration contract tests, a clean package/application build, and a runtime regression pass for both VCL and FMX whenever shared behavior changes.</w:t>
       </w:r>
     </w:p>
     <w:p>
@@ -20099,7 +20117,7 @@
         <w:t xml:space="preserve">Change and validation risk: </w:t>
       </w:r>
       <w:r>
-        <w:t>The file contains 3,120 lines. Changes require the studio contract tests, a clean package/application build, and a runtime regression pass for both VCL and FMX whenever shared behavior changes.</w:t>
+        <w:t>The file contains 3,156 lines. Changes require the studio contract tests, a clean package/application build, and a runtime regression pass for both VCL and FMX whenever shared behavior changes.</w:t>
       </w:r>
     </w:p>
     <w:p>
@@ -20244,7 +20262,7 @@
         <w:t xml:space="preserve">Change and validation risk: </w:t>
       </w:r>
       <w:r>
-        <w:t>The file contains 2,476 lines. Changes require the studio contract tests, a clean package/application build, and a runtime regression pass for both VCL and FMX whenever shared behavior changes.</w:t>
+        <w:t>The file contains 2,491 lines. Changes require the studio contract tests, a clean package/application build, and a runtime regression pass for both VCL and FMX whenever shared behavior changes.</w:t>
       </w:r>
     </w:p>
     <w:p>

</xml_diff>

<commit_message>
Publish glossary updates without rebuilding targets
</commit_message>
<xml_diff>
--- a/docs/guides/Delphi App Translation Studio Engineering Guide.docx
+++ b/docs/guides/Delphi App Translation Studio Engineering Guide.docx
@@ -891,7 +891,7 @@
                 <w:color w:val="5D7693"/>
                 <w:sz w:val="18"/>
               </w:rPr>
-              <w:t>23</w:t>
+              <w:t>22</w:t>
             </w:r>
           </w:p>
         </w:tc>
@@ -913,6 +913,47 @@
                 <w:sz w:val="18"/>
               </w:rPr>
               <w:t>19. Directionality, HTML, Dynamic Text, and Reversible Layout</w:t>
+            </w:r>
+          </w:p>
+        </w:tc>
+        <w:tc>
+          <w:tcPr>
+            <w:tcW w:type="dxa" w:w="1160"/>
+          </w:tcPr>
+          <w:p>
+            <w:pPr>
+              <w:spacing w:after="20"/>
+              <w:jc w:val="right"/>
+            </w:pPr>
+            <w:r>
+              <w:rPr>
+                <w:rFonts w:ascii="Aptos" w:hAnsi="Aptos"/>
+                <w:b/>
+                <w:color w:val="5D7693"/>
+                <w:sz w:val="18"/>
+              </w:rPr>
+              <w:t>23</w:t>
+            </w:r>
+          </w:p>
+        </w:tc>
+      </w:tr>
+      <w:tr>
+        <w:tc>
+          <w:tcPr>
+            <w:tcW w:type="dxa" w:w="8200"/>
+          </w:tcPr>
+          <w:p>
+            <w:pPr>
+              <w:keepLines/>
+              <w:spacing w:after="20"/>
+            </w:pPr>
+            <w:r>
+              <w:rPr>
+                <w:rFonts w:ascii="Aptos" w:hAnsi="Aptos"/>
+                <w:color w:val="234C80"/>
+                <w:sz w:val="18"/>
+              </w:rPr>
+              <w:t>20. Diagnostics, Failure Containment, and Performance</w:t>
             </w:r>
           </w:p>
         </w:tc>
@@ -953,7 +994,7 @@
                 <w:color w:val="234C80"/>
                 <w:sz w:val="18"/>
               </w:rPr>
-              <w:t>20. Diagnostics, Failure Containment, and Performance</w:t>
+              <w:t>21. Security and Privacy Engineering</w:t>
             </w:r>
           </w:p>
         </w:tc>
@@ -994,7 +1035,7 @@
                 <w:color w:val="234C80"/>
                 <w:sz w:val="18"/>
               </w:rPr>
-              <w:t>21. Security and Privacy Engineering</w:t>
+              <w:t>22. Test Architecture and Release Gates</w:t>
             </w:r>
           </w:p>
         </w:tc>
@@ -1035,7 +1076,7 @@
                 <w:color w:val="234C80"/>
                 <w:sz w:val="18"/>
               </w:rPr>
-              <w:t>22. Test Architecture and Release Gates</w:t>
+              <w:t>23. Production Pascal Unit Reference</w:t>
             </w:r>
           </w:p>
         </w:tc>
@@ -1055,7 +1096,7 @@
                 <w:color w:val="5D7693"/>
                 <w:sz w:val="18"/>
               </w:rPr>
-              <w:t>27</w:t>
+              <w:t>28</w:t>
             </w:r>
           </w:p>
         </w:tc>
@@ -1076,7 +1117,7 @@
                 <w:color w:val="234C80"/>
                 <w:sz w:val="18"/>
               </w:rPr>
-              <w:t>23. Production Pascal Unit Reference</w:t>
+              <w:t>24. Test, Spike, and Contract Pascal Program Reference</w:t>
             </w:r>
           </w:p>
         </w:tc>
@@ -1096,7 +1137,7 @@
                 <w:color w:val="5D7693"/>
                 <w:sz w:val="18"/>
               </w:rPr>
-              <w:t>29</w:t>
+              <w:t>70</w:t>
             </w:r>
           </w:p>
         </w:tc>
@@ -1117,7 +1158,7 @@
                 <w:color w:val="234C80"/>
                 <w:sz w:val="18"/>
               </w:rPr>
-              <w:t>24. Test, Spike, and Contract Pascal Program Reference</w:t>
+              <w:t>25. Delphi Project and Package File Reference</w:t>
             </w:r>
           </w:p>
         </w:tc>
@@ -1137,7 +1178,7 @@
                 <w:color w:val="5D7693"/>
                 <w:sz w:val="18"/>
               </w:rPr>
-              <w:t>71</w:t>
+              <w:t>88</w:t>
             </w:r>
           </w:p>
         </w:tc>
@@ -1158,7 +1199,7 @@
                 <w:color w:val="234C80"/>
                 <w:sz w:val="18"/>
               </w:rPr>
-              <w:t>25. Delphi Project and Package File Reference</w:t>
+              <w:t>26. JSON Schema and Form Resource Reference</w:t>
             </w:r>
           </w:p>
         </w:tc>
@@ -1178,7 +1219,7 @@
                 <w:color w:val="5D7693"/>
                 <w:sz w:val="18"/>
               </w:rPr>
-              <w:t>89</w:t>
+              <w:t>90</w:t>
             </w:r>
           </w:p>
         </w:tc>
@@ -1199,7 +1240,7 @@
                 <w:color w:val="234C80"/>
                 <w:sz w:val="18"/>
               </w:rPr>
-              <w:t>26. JSON Schema and Form Resource Reference</w:t>
+              <w:t>27. Build, Verification, and Documentation Tool Reference</w:t>
             </w:r>
           </w:p>
         </w:tc>
@@ -1219,7 +1260,7 @@
                 <w:color w:val="5D7693"/>
                 <w:sz w:val="18"/>
               </w:rPr>
-              <w:t>91</w:t>
+              <w:t>94</w:t>
             </w:r>
           </w:p>
         </w:tc>
@@ -1240,7 +1281,7 @@
                 <w:color w:val="234C80"/>
                 <w:sz w:val="18"/>
               </w:rPr>
-              <w:t>27. Build, Verification, and Documentation Tool Reference</w:t>
+              <w:t>28. Dependency Graph Reading Guide</w:t>
             </w:r>
           </w:p>
         </w:tc>
@@ -1260,7 +1301,7 @@
                 <w:color w:val="5D7693"/>
                 <w:sz w:val="18"/>
               </w:rPr>
-              <w:t>95</w:t>
+              <w:t>97</w:t>
             </w:r>
           </w:p>
         </w:tc>
@@ -1281,7 +1322,7 @@
                 <w:color w:val="234C80"/>
                 <w:sz w:val="18"/>
               </w:rPr>
-              <w:t>28. Dependency Graph Reading Guide</w:t>
+              <w:t>29. Safe Change Procedure</w:t>
             </w:r>
           </w:p>
         </w:tc>
@@ -1301,7 +1342,7 @@
                 <w:color w:val="5D7693"/>
                 <w:sz w:val="18"/>
               </w:rPr>
-              <w:t>98</w:t>
+              <w:t>99</w:t>
             </w:r>
           </w:p>
         </w:tc>
@@ -1322,7 +1363,7 @@
                 <w:color w:val="234C80"/>
                 <w:sz w:val="18"/>
               </w:rPr>
-              <w:t>29. Safe Change Procedure</w:t>
+              <w:t>30. Engineering Release Checklist</w:t>
             </w:r>
           </w:p>
         </w:tc>
@@ -1342,7 +1383,7 @@
                 <w:color w:val="5D7693"/>
                 <w:sz w:val="18"/>
               </w:rPr>
-              <w:t>100</w:t>
+              <w:t>99</w:t>
             </w:r>
           </w:p>
         </w:tc>
@@ -1363,7 +1404,7 @@
                 <w:color w:val="234C80"/>
                 <w:sz w:val="18"/>
               </w:rPr>
-              <w:t>30. Engineering Release Checklist</w:t>
+              <w:t>31. Quick Path and Identifier Reference</w:t>
             </w:r>
           </w:p>
         </w:tc>
@@ -1383,7 +1424,7 @@
                 <w:color w:val="5D7693"/>
                 <w:sz w:val="18"/>
               </w:rPr>
-              <w:t>100</w:t>
+              <w:t>101</w:t>
             </w:r>
           </w:p>
         </w:tc>
@@ -1404,7 +1445,7 @@
                 <w:color w:val="234C80"/>
                 <w:sz w:val="18"/>
               </w:rPr>
-              <w:t>31. Quick Path and Identifier Reference</w:t>
+              <w:t>32. Appendix A - License Information</w:t>
             </w:r>
           </w:p>
         </w:tc>
@@ -1424,48 +1465,7 @@
                 <w:color w:val="5D7693"/>
                 <w:sz w:val="18"/>
               </w:rPr>
-              <w:t>102</w:t>
-            </w:r>
-          </w:p>
-        </w:tc>
-      </w:tr>
-      <w:tr>
-        <w:tc>
-          <w:tcPr>
-            <w:tcW w:type="dxa" w:w="8200"/>
-          </w:tcPr>
-          <w:p>
-            <w:pPr>
-              <w:keepLines/>
-              <w:spacing w:after="20"/>
-            </w:pPr>
-            <w:r>
-              <w:rPr>
-                <w:rFonts w:ascii="Aptos" w:hAnsi="Aptos"/>
-                <w:color w:val="234C80"/>
-                <w:sz w:val="18"/>
-              </w:rPr>
-              <w:t>32. Appendix A - License Information</w:t>
-            </w:r>
-          </w:p>
-        </w:tc>
-        <w:tc>
-          <w:tcPr>
-            <w:tcW w:type="dxa" w:w="1160"/>
-          </w:tcPr>
-          <w:p>
-            <w:pPr>
-              <w:spacing w:after="20"/>
-              <w:jc w:val="right"/>
-            </w:pPr>
-            <w:r>
-              <w:rPr>
-                <w:rFonts w:ascii="Aptos" w:hAnsi="Aptos"/>
-                <w:b/>
-                <w:color w:val="5D7693"/>
-                <w:sz w:val="18"/>
-              </w:rPr>
-              <w:t>104</w:t>
+              <w:t>103</w:t>
             </w:r>
           </w:p>
         </w:tc>
@@ -6037,7 +6037,7 @@
         <w:pStyle w:val="ListBullet"/>
       </w:pPr>
       <w:r>
-        <w:t>Applying terms changes the development catalog only. It does not export a pack, call a provider, rescan source, deploy files, or edit the target project.</w:t>
+        <w:t>TProjectGlossary.ApplyToCatalog itself changes the supplied in-memory development catalog only. It does not export, deploy, call a provider, rescan, or edit target source. TGlossaryPublisher deliberately composes that narrow operation with validation, atomic persistence, runtime-pack export, and pack deployment.</w:t>
       </w:r>
     </w:p>
     <w:p>
@@ -6055,7 +6055,7 @@
     </w:p>
     <w:p>
       <w:r>
-        <w:t>The designer-owned page contains the language selector, exact file-path label, term list, source/target/concept/note editors, case-sensitive and approved check boxes, and New, Add / Update Term, Delete, Cancel Edits, Save Glossary, and Apply to Open Catalog buttons. FGlossaryDirty becomes true after add/update/delete. RefreshGlossary rebuilds the list and reports whether the model is new, saved, or pending.</w:t>
+        <w:t>The designer-owned page contains the language selector, exact file-path label, term list, source/target/concept/note editors, case-sensitive and approved check boxes, and New, Add / Update Term, Delete, Cancel Edits, Save Glossary, and Apply and Deploy buttons. FGlossaryDirty becomes true after add/update/delete. RefreshGlossary rebuilds the list and reports whether the model is new, saved, or pending.</w:t>
       </w:r>
     </w:p>
     <w:p>
@@ -6065,7 +6065,30 @@
     </w:p>
     <w:p>
       <w:r>
-        <w:t>Apply to Open Catalog is enabled only when FTranslationCatalog exists and its locale equals the selected glossary locale. The handler saves dirty glossary work first, applies the terms, creates a development-catalog path when needed, saves through TCatalogJson, refreshes catalog UI, invalidates validation, and recomputes readiness. This makes the required revalidation/export boundary explicit.</w:t>
+        <w:t>Apply and Deploy is enabled whenever a project glossary is loaded. The handler saves dirty glossary work first and calls TGlossaryPublisher. The publisher locates the matching workspace catalog itself, so the Translate page does not have to be open. If that catalog is currently displayed, MainForm reloads it after publication so the editor cannot retain a stale in-memory copy.</w:t>
+      </w:r>
+    </w:p>
+    <w:p>
+      <w:pPr>
+        <w:pStyle w:val="Heading2"/>
+      </w:pPr>
+      <w:r>
+        <w:t>8.4 Standalone glossary publication transaction</w:t>
+      </w:r>
+    </w:p>
+    <w:p>
+      <w:r>
+        <w:t>TGlossaryPublisher.Publish is the terminology-only publication boundary. Preflight verifies project identity, glossary identity and approved terms, the matching development catalog, framework and locale compatibility, the managed dependency Languages folder, and the syntax of remembered deployment destinations before replacing any artifact.</w:t>
+      </w:r>
+    </w:p>
+    <w:p>
+      <w:r>
+        <w:t>After ApplyToCatalog, TCatalogValidator must report no blocking errors. TRuntimePackBuilder serializes the candidate before any write, then TCatalogJson and TRuntimePackBuilder use their atomic persistence contracts to refresh the development catalog, canonical workspace pack, and managed dependency pack. SHA-256 equality proves that the canonical and dependency copies are identical before deployment begins.</w:t>
+      </w:r>
+    </w:p>
+    <w:p>
+      <w:r>
+        <w:t>TTargetBuildDeployer.ExistingBuildOutputDirectories resolves every existing supported Debug/Release output from DCC_ExeOutput patterns and conventional output trees. The publisher then atomically replaces Localization\Languages from the complete managed dependency pack directory at each deduplicated existing output and remembered destination. Missing destinations are reported and skipped; deployment failures are counted and reported without hiding successful canonical publication. No compiler is launched and no EXE, DPROJ, DPR, PAS, DFM, or FMX file is replaced.</w:t>
       </w:r>
     </w:p>
     <w:p>
@@ -8120,7 +8143,7 @@
     </w:p>
     <w:p>
       <w:r>
-        <w:t>TTargetBuildDeployer runs the baseline Win32 Release build even when no output folder existed, refreshes other supported configurations already in use, locates the configured executable output, and performs an additional atomic/hash-validated deployment. Configured application destinations use the same atomic routine. TIntegrationPackageGenerator and TDelphiIntegrationSourceEditor remain advanced source-edit machinery and are not invoked by the component workflow.</w:t>
+        <w:t>TTargetBuildDeployer runs the baseline Win32 Release build even when no output folder existed, refreshes other supported configurations already in use, locates the configured executable output, and performs an additional atomic/hash-validated deployment. ExistingBuildOutputDirectories is also the shared non-build discovery contract used by the Wizard and standalone glossary publication, preventing the two paths from drifting. Configured application destinations use the same atomic routine. TIntegrationPackageGenerator and TDelphiIntegrationSourceEditor remain advanced source-edit machinery and are not invoked by the component workflow.</w:t>
       </w:r>
     </w:p>
     <w:p>
@@ -10092,7 +10115,7 @@
         <w:t xml:space="preserve">Named test consumers: </w:t>
       </w:r>
       <w:r>
-        <w:t>AtomicPersistenceSmokeTests, FMXDesignStreamingTests, FMXDialogTranslationSmokeTests, FMXLanguageManagerTests, FoundationSmokeTests, LanguageManagerCoreTests, VCLDesignStreamingTests, VCLLanguageManagerTests</w:t>
+        <w:t>AtomicPersistenceSmokeTests, FMXDesignStreamingTests, FMXDialogTranslationSmokeTests, FMXLanguageManagerTests, FoundationSmokeTests, GlossaryPublishSmokeTests, LanguageManagerCoreTests, VCLDesignStreamingTests, VCLLanguageManagerTests</w:t>
       </w:r>
     </w:p>
     <w:p>
@@ -10367,7 +10390,7 @@
         <w:t xml:space="preserve">Direct production consumers: </w:t>
       </w:r>
       <w:r>
-        <w:t>DAT.Core.AITranslation, DAT.Review.Localization, DAT.Scan.CatalogMerge, DAT.Studio.MainForm, DAT.Studio.SetupWizard</w:t>
+        <w:t>DAT.Core.AITranslation, DAT.Integration.BuildDeploy, DAT.Review.Localization, DAT.Scan.CatalogMerge, DAT.Studio.MainForm, DAT.Studio.SetupWizard</w:t>
       </w:r>
     </w:p>
     <w:p>
@@ -10382,7 +10405,7 @@
         <w:t xml:space="preserve">Named test consumers: </w:t>
       </w:r>
       <w:r>
-        <w:t>FoundationSmokeTests, LayoutContracts, LayoutFittingSmokeTests, ProposalDecisionSmokeTests</w:t>
+        <w:t>FoundationSmokeTests, GlossaryPublishSmokeTests, LayoutContracts, LayoutFittingSmokeTests, ProposalDecisionSmokeTests</w:t>
       </w:r>
     </w:p>
     <w:p>
@@ -10527,7 +10550,7 @@
         <w:t xml:space="preserve">Named test consumers: </w:t>
       </w:r>
       <w:r>
-        <w:t>FMXDesignStreamingTests, LanguageManagerCoreTests, VCLDesignStreamingTests</w:t>
+        <w:t>FMXDesignStreamingTests, GlossaryPublishSmokeTests, LanguageManagerCoreTests, VCLDesignStreamingTests</w:t>
       </w:r>
     </w:p>
     <w:p>
@@ -10657,7 +10680,7 @@
         <w:t xml:space="preserve">Direct production consumers: </w:t>
       </w:r>
       <w:r>
-        <w:t>DAT.Core.Interchange, DAT.Core.SharedDictionary, DAT.Provider.Glossary, DAT.Studio.LocalizationReview, DAT.Studio.MainForm, DAT.Studio.SetupWizard</w:t>
+        <w:t>DAT.Core.Interchange, DAT.Core.SharedDictionary, DAT.Integration.BuildDeploy, DAT.Provider.Glossary, DAT.Studio.LocalizationReview, DAT.Studio.MainForm, DAT.Studio.SetupWizard</w:t>
       </w:r>
     </w:p>
     <w:p>
@@ -10672,7 +10695,7 @@
         <w:t xml:space="preserve">Named test consumers: </w:t>
       </w:r>
       <w:r>
-        <w:t>FoundationSmokeTests, ProviderGlossarySmokeTests, TranslationMemorySmokeTests</w:t>
+        <w:t>FoundationSmokeTests, GlossaryPublishSmokeTests, ProviderGlossarySmokeTests, TranslationMemorySmokeTests</w:t>
       </w:r>
     </w:p>
     <w:p>
@@ -10817,7 +10840,7 @@
         <w:t xml:space="preserve">Named test consumers: </w:t>
       </w:r>
       <w:r>
-        <w:t>FoundationSmokeTests, HyphenationSmokeTests, PackLayoutSmokeTests</w:t>
+        <w:t>FoundationSmokeTests, GlossaryPublishSmokeTests, HyphenationSmokeTests, PackLayoutSmokeTests</w:t>
       </w:r>
     </w:p>
     <w:p>
@@ -11107,7 +11130,7 @@
         <w:t xml:space="preserve">Named test consumers: </w:t>
       </w:r>
       <w:r>
-        <w:t>Coverage is indirect through subsystem and integration tests.</w:t>
+        <w:t>GlossaryPublishSmokeTests</w:t>
       </w:r>
     </w:p>
     <w:p>
@@ -11382,7 +11405,7 @@
         <w:t xml:space="preserve">Direct production consumers: </w:t>
       </w:r>
       <w:r>
-        <w:t>DAT.Integration.ComponentPackage, DAT.Integration.Package, DAT.Studio.MainForm, DAT.Studio.SetupWizard</w:t>
+        <w:t>DAT.Integration.BuildDeploy, DAT.Integration.ComponentPackage, DAT.Integration.Package, DAT.Studio.MainForm, DAT.Studio.SetupWizard</w:t>
       </w:r>
     </w:p>
     <w:p>
@@ -11397,7 +11420,7 @@
         <w:t xml:space="preserve">Named test consumers: </w:t>
       </w:r>
       <w:r>
-        <w:t>FoundationSmokeTests, HyphenationSmokeTests, PackLayoutSmokeTests</w:t>
+        <w:t>FoundationSmokeTests, GlossaryPublishSmokeTests, HyphenationSmokeTests, PackLayoutSmokeTests</w:t>
       </w:r>
     </w:p>
     <w:p>
@@ -11962,7 +11985,7 @@
         <w:t xml:space="preserve">Direct production consumers: </w:t>
       </w:r>
       <w:r>
-        <w:t>DAT.Integration.ComponentPackage, DAT.Integration.Package, DAT.Studio.MainForm, DAT.Studio.SetupWizard</w:t>
+        <w:t>DAT.Integration.BuildDeploy, DAT.Integration.ComponentPackage, DAT.Integration.Package, DAT.Studio.MainForm, DAT.Studio.SetupWizard</w:t>
       </w:r>
     </w:p>
     <w:p>
@@ -11977,7 +12000,7 @@
         <w:t xml:space="preserve">Named test consumers: </w:t>
       </w:r>
       <w:r>
-        <w:t>FoundationSmokeTests</w:t>
+        <w:t>FoundationSmokeTests, GlossaryPublishSmokeTests</w:t>
       </w:r>
     </w:p>
     <w:p>
@@ -12107,7 +12130,7 @@
         <w:t xml:space="preserve">Direct production consumers: </w:t>
       </w:r>
       <w:r>
-        <w:t>DAT.Core.AITranslation, DAT.Core.CatalogJson, DAT.Core.Glossary, DAT.Core.ProjectDetection, DAT.Core.RuntimePack, DAT.Core.SharedDictionary, DAT.Core.Terminology, DAT.Core.TranslationMemory, DAT.Core.TranslationWorkspace, DAT.Integration.ComponentPackage, DAT.Integration.MenuResource, DAT.Integration.Package, DAT.Review.ApplicationStrings, DAT.Review.Localization, DAT.Review.TextMeasurement, DAT.Review.TextMeasurement.FMX, DAT.Review.TextMeasurement.GDI, DAT.Scan.CatalogMerge, DAT.Scan.FormText, DAT.Scan.PascalResources, DAT.Scan.Project, DAT.Scan.Quality, DAT.Scan.Rules, DAT.Scan.Types, DAT.Studio.LocalizationReview, DAT.Studio.MainForm, DAT.Studio.SetupWizard, DAT.Validation.Catalog</w:t>
+        <w:t>DAT.Core.AITranslation, DAT.Core.CatalogJson, DAT.Core.Glossary, DAT.Core.ProjectDetection, DAT.Core.RuntimePack, DAT.Core.SharedDictionary, DAT.Core.Terminology, DAT.Core.TranslationMemory, DAT.Core.TranslationWorkspace, DAT.Integration.BuildDeploy, DAT.Integration.ComponentPackage, DAT.Integration.MenuResource, DAT.Integration.Package, DAT.Review.ApplicationStrings, DAT.Review.Localization, DAT.Review.TextMeasurement, DAT.Review.TextMeasurement.FMX, DAT.Review.TextMeasurement.GDI, DAT.Scan.CatalogMerge, DAT.Scan.FormText, DAT.Scan.PascalResources, DAT.Scan.Project, DAT.Scan.Quality, DAT.Scan.Rules, DAT.Scan.Types, DAT.Studio.LocalizationReview, DAT.Studio.MainForm, DAT.Studio.SetupWizard, DAT.Validation.Catalog</w:t>
       </w:r>
     </w:p>
     <w:p>
@@ -12122,7 +12145,7 @@
         <w:t xml:space="preserve">Named test consumers: </w:t>
       </w:r>
       <w:r>
-        <w:t>ApplicationStringSmokeTests, FormScanContracts, FoundationSmokeTests, HyphenationSmokeTests, LayoutContracts, LayoutFittingSmokeTests, PackLayoutSmokeTests, ProposalDecisionSmokeTests, ProviderGlossarySmokeTests, ScannerSmokeTests, TranslationMemorySmokeTests</w:t>
+        <w:t>ApplicationStringSmokeTests, FormScanContracts, FoundationSmokeTests, GlossaryPublishSmokeTests, HyphenationSmokeTests, LayoutContracts, LayoutFittingSmokeTests, PackLayoutSmokeTests, ProposalDecisionSmokeTests, ProviderGlossarySmokeTests, ScannerSmokeTests, TranslationMemorySmokeTests</w:t>
       </w:r>
     </w:p>
     <w:p>
@@ -16074,7 +16097,7 @@
         <w:t xml:space="preserve">Direct production consumers: </w:t>
       </w:r>
       <w:r>
-        <w:t>DAT.Core.RuntimePack, DAT.Studio.MainForm, DAT.Studio.SetupWizard</w:t>
+        <w:t>DAT.Core.RuntimePack, DAT.Integration.BuildDeploy, DAT.Studio.MainForm, DAT.Studio.SetupWizard</w:t>
       </w:r>
     </w:p>
     <w:p>
@@ -16089,7 +16112,7 @@
         <w:t xml:space="preserve">Named test consumers: </w:t>
       </w:r>
       <w:r>
-        <w:t>FoundationSmokeTests</w:t>
+        <w:t>FoundationSmokeTests, GlossaryPublishSmokeTests</w:t>
       </w:r>
     </w:p>
     <w:p>
@@ -16392,7 +16415,7 @@
         <w:t xml:space="preserve">Named test consumers: </w:t>
       </w:r>
       <w:r>
-        <w:t>FMXCaptionRewriteSmokeTests, FMXDesignStreamingTests, FMXDialogTranslationSmokeTests, FMXDiscoverySmokeTests, FMXGridOrderSmokeTests, FMXLanguageManagerTests, FMXManagerLifecycleSpikeTests, FMXMenuOrderSmokeTests, FMXRightToLeftSmokeTests, FMXRuntimeSmokeTests, FMXSplashHookSmokeTests, FMXStyledRuntimeSmokeTests, FMXWrapSmokeTests, FoundationSmokeTests, LanguageManagerCoreTests, LayoutOverrideSmokeTests, TemplateRewriteSmokeTests, VCLCaptionInterceptSmokeTests, VCLDesignStreamingTests, VCLDiscoverySmokeTests, VCLLanguageManagerTests, VCLManagerLifecycleSpikeTests, VCLManagerMDILifecycleSpikeTests, VCLRightToLeftSmokeTests, VCLRuntimeSmokeTests, VCLSplashHookSmokeTests, VCLSplashSmokeTests, VCLStatusPanelInterceptTests, VCLWrapSmokeTests</w:t>
+        <w:t>FMXCaptionRewriteSmokeTests, FMXDesignStreamingTests, FMXDialogTranslationSmokeTests, FMXDiscoverySmokeTests, FMXGridOrderSmokeTests, FMXLanguageManagerTests, FMXManagerLifecycleSpikeTests, FMXMenuOrderSmokeTests, FMXRightToLeftSmokeTests, FMXRuntimeSmokeTests, FMXSplashHookSmokeTests, FMXStyledRuntimeSmokeTests, FMXWrapSmokeTests, FoundationSmokeTests, GlossaryPublishSmokeTests, LanguageManagerCoreTests, LayoutOverrideSmokeTests, TemplateRewriteSmokeTests, VCLCaptionInterceptSmokeTests, VCLDesignStreamingTests, VCLDiscoverySmokeTests, VCLLanguageManagerTests, VCLManagerLifecycleSpikeTests, VCLManagerMDILifecycleSpikeTests, VCLRightToLeftSmokeTests, VCLRuntimeSmokeTests, VCLSplashHookSmokeTests, VCLSplashSmokeTests, VCLStatusPanelInterceptTests, VCLWrapSmokeTests</w:t>
       </w:r>
     </w:p>
     <w:p>
@@ -19256,7 +19279,7 @@
         <w:t xml:space="preserve">What it is: </w:t>
       </w:r>
       <w:r>
-        <w:t>Builds selected Delphi platform/configuration targets and deploys matching packs to detected or authorized application folders while reporting command, output, timeout, and destination results.</w:t>
+        <w:t>Builds selected Delphi platform/configuration targets, discovers existing configured output folders, atomically deploys complete compatible pack sets, and publishes standalone glossary corrections through the matching catalog without rebuilding or editing the target project. It reports command, output, timeout, catalog, pack, and destination results.</w:t>
       </w:r>
     </w:p>
     <w:p>
@@ -19286,7 +19309,7 @@
         <w:t xml:space="preserve">Public surface: </w:t>
       </w:r>
       <w:r>
-        <w:t>TTargetBuildDeployer</w:t>
+        <w:t>TGlossaryPublishResult, TGlossaryPublisher, TTargetBuildDeployer</w:t>
       </w:r>
     </w:p>
     <w:p>
@@ -19301,7 +19324,7 @@
         <w:t xml:space="preserve">Direct DAT dependencies: </w:t>
       </w:r>
       <w:r>
-        <w:t>DAT.Runtime.LanguagePack</w:t>
+        <w:t>DAT.Core.CatalogJson, DAT.Core.Glossary, DAT.Core.RuntimePack, DAT.Core.TranslationWorkspace, DAT.Core.Types, DAT.Runtime.LanguagePack, DAT.Validation.Catalog</w:t>
       </w:r>
     </w:p>
     <w:p>
@@ -19331,7 +19354,7 @@
         <w:t xml:space="preserve">Named test consumers: </w:t>
       </w:r>
       <w:r>
-        <w:t>FoundationSmokeTests</w:t>
+        <w:t>FoundationSmokeTests, GlossaryPublishSmokeTests</w:t>
       </w:r>
     </w:p>
     <w:p>
@@ -19346,7 +19369,7 @@
         <w:t xml:space="preserve">Change and validation risk: </w:t>
       </w:r>
       <w:r>
-        <w:t>The file contains 642 lines. Changes require the integration contract tests, a clean package/application build, and a runtime regression pass for both VCL and FMX whenever shared behavior changes.</w:t>
+        <w:t>The file contains 1,032 lines. Changes require the integration contract tests, a clean package/application build, and a runtime regression pass for both VCL and FMX whenever shared behavior changes.</w:t>
       </w:r>
     </w:p>
     <w:p>
@@ -20229,7 +20252,7 @@
         <w:t xml:space="preserve">Change and validation risk: </w:t>
       </w:r>
       <w:r>
-        <w:t>The file contains 3,151 lines. Changes require the studio contract tests, a clean package/application build, and a runtime regression pass for both VCL and FMX whenever shared behavior changes.</w:t>
+        <w:t>The file contains 3,174 lines. Changes require the studio contract tests, a clean package/application build, and a runtime regression pass for both VCL and FMX whenever shared behavior changes.</w:t>
       </w:r>
     </w:p>
     <w:p>
@@ -20374,7 +20397,7 @@
         <w:t xml:space="preserve">Change and validation risk: </w:t>
       </w:r>
       <w:r>
-        <w:t>The file contains 2,492 lines. Changes require the studio contract tests, a clean package/application build, and a runtime regression pass for both VCL and FMX whenever shared behavior changes.</w:t>
+        <w:t>The file contains 2,427 lines. Changes require the studio contract tests, a clean package/application build, and a runtime regression pass for both VCL and FMX whenever shared behavior changes.</w:t>
       </w:r>
     </w:p>
     <w:p>
@@ -22262,6 +22285,91 @@
       </w:r>
       <w:r>
         <w:t>DAT.Core.AITranslation, DAT.Core.AtomicFile, DAT.Core.CatalogJson, DAT.Core.Glossary, DAT.Core.Hyphenation, DAT.Core.ProjectDetection, DAT.Core.RuntimePack, DAT.Core.Terminology, DAT.Core.TranslationWorkspace, DAT.Core.Types, DAT.Integration.BuildDeploy, DAT.Integration.ComponentPackage, DAT.Integration.DelphiSource, DAT.Integration.MenuResource, DAT.Integration.Package, DAT.Provider.Batching, DAT.Provider.CalendarTerms, DAT.Provider.Client, DAT.Provider.LanguageCodes, DAT.Provider.Placeholders, DAT.Provider.Retry, DAT.Provider.Types, DAT.Review.ApplicationStrings, DAT.Review.CodeGeometry, DAT.Review.Localization, DAT.Review.TextMeasurement, DAT.Review.TextMeasurement.FMX, DAT.Review.TextMeasurement.GDI, DAT.Runtime.LanguagePack, DAT.Runtime.Manager, DAT.Runtime.Preference, DAT.Scan.CatalogMerge, DAT.Scan.Context, DAT.Scan.DomainProfile, DAT.Scan.FormText, DAT.Scan.PascalResources, DAT.Scan.Project, DAT.Scan.Quality, DAT.Scan.Rules, DAT.Scan.TextCodec, DAT.Scan.Types, DAT.Validation.Catalog</w:t>
+      </w:r>
+    </w:p>
+    <w:p>
+      <w:pPr>
+        <w:spacing w:after="60"/>
+      </w:pPr>
+      <w:r>
+        <w:rPr>
+          <w:b/>
+          <w:color w:val="234C80"/>
+        </w:rPr>
+        <w:t xml:space="preserve">Why it is important: </w:t>
+      </w:r>
+      <w:r>
+        <w:t>This executable isolates one contract so a regression produces a focused failure rather than being hidden inside a full application run.</w:t>
+      </w:r>
+    </w:p>
+    <w:p>
+      <w:pPr>
+        <w:spacing w:after="60"/>
+      </w:pPr>
+      <w:r>
+        <w:rPr>
+          <w:b/>
+          <w:color w:val="234C80"/>
+        </w:rPr>
+        <w:t xml:space="preserve">Required use: </w:t>
+      </w:r>
+      <w:r>
+        <w:t>Compile and run it through the maintained verification scripts or documented build matrix whenever its named subsystem changes.</w:t>
+      </w:r>
+    </w:p>
+    <w:p>
+      <w:pPr>
+        <w:pStyle w:val="Heading3"/>
+        <w:keepNext/>
+      </w:pPr>
+      <w:r>
+        <w:t>GlossaryPublishSmokeTests</w:t>
+      </w:r>
+    </w:p>
+    <w:p>
+      <w:pPr>
+        <w:keepNext/>
+        <w:spacing w:after="60"/>
+      </w:pPr>
+      <w:r>
+        <w:rPr>
+          <w:b/>
+          <w:color w:val="234C80"/>
+        </w:rPr>
+        <w:t xml:space="preserve">File: </w:t>
+      </w:r>
+      <w:r>
+        <w:t>tools\tests\GlossaryPublishSmokeTests.dpr</w:t>
+      </w:r>
+    </w:p>
+    <w:p>
+      <w:pPr>
+        <w:spacing w:after="60"/>
+      </w:pPr>
+      <w:r>
+        <w:rPr>
+          <w:b/>
+          <w:color w:val="234C80"/>
+        </w:rPr>
+        <w:t xml:space="preserve">What it verifies: </w:t>
+      </w:r>
+      <w:r>
+        <w:t>Exercises the Glossary Publish contract as an isolated Delphi console or GUI regression program.</w:t>
+      </w:r>
+    </w:p>
+    <w:p>
+      <w:pPr>
+        <w:spacing w:after="60"/>
+      </w:pPr>
+      <w:r>
+        <w:rPr>
+          <w:b/>
+          <w:color w:val="234C80"/>
+        </w:rPr>
+        <w:t xml:space="preserve">DAT units exercised directly: </w:t>
+      </w:r>
+      <w:r>
+        <w:t>DAT.Core.AtomicFile, DAT.Core.CatalogJson, DAT.Core.Diagnostics, DAT.Core.Glossary, DAT.Core.Hyphenation, DAT.Core.LocaleFacts, DAT.Core.RuntimePack, DAT.Core.TranslationWorkspace, DAT.Core.Types, DAT.Integration.BuildDeploy, DAT.Runtime.LanguagePack, DAT.Validation.Catalog</w:t>
       </w:r>
     </w:p>
     <w:p>
@@ -29052,6 +29160,14 @@
       </w:pPr>
       <w:r>
         <w:t>[ ] Development catalogs, settings, preferences, glossaries, layout overrides, and packs pass atomic/recovery tests.</w:t>
+      </w:r>
+    </w:p>
+    <w:p>
+      <w:pPr>
+        <w:pStyle w:val="ListBullet"/>
+      </w:pPr>
+      <w:r>
+        <w:t>[ ] GlossaryPublishSmokeTests proves catalog correction, canonical/dependency pack identity, complete deployment to existing Win32/Win64 Debug/Release outputs, unchanged DPROJ content, and no executable build or replacement.</w:t>
       </w:r>
     </w:p>
     <w:p>

</xml_diff>